<commit_message>
Rename AthDGC to Athens Diachronic Glossa Chronos; add Greek tagline; harden linux-style theme
</commit_message>
<xml_diff>
--- a/data_paper.docx
+++ b/data_paper.docx
@@ -137,7 +137,7 @@
         <w:t xml:space="preserve"> </w:t>
       </w:r>
       <w:r>
-        <w:t xml:space="preserve">(Haug and Jøhndal 2008; Eckhoff et al. 2018)</w:t>
+        <w:t xml:space="preserve">[@haug2008; @eckhoff2018]</w:t>
       </w:r>
       <w:r>
         <w:t xml:space="preserve"> </w:t>
@@ -458,7 +458,7 @@
         <w:t xml:space="preserve"> </w:t>
       </w:r>
       <w:r>
-        <w:t xml:space="preserve">(Qi et al. 2020)</w:t>
+        <w:t xml:space="preserve">[@qi2020]</w:t>
       </w:r>
       <w:r>
         <w:t xml:space="preserve"> </w:t>
@@ -635,7 +635,7 @@
         <w:t xml:space="preserve"> </w:t>
       </w:r>
       <w:r>
-        <w:t xml:space="preserve">(Feng et al. 2022)</w:t>
+        <w:t xml:space="preserve">[@feng2022]</w:t>
       </w:r>
       <w:r>
         <w:t xml:space="preserve">; word-level alignment uses</w:t>
@@ -650,7 +650,7 @@
         <w:t xml:space="preserve"> </w:t>
       </w:r>
       <w:r>
-        <w:t xml:space="preserve">(Dou and Neubig 2021)</w:t>
+        <w:t xml:space="preserve">[@dou2021]</w:t>
       </w:r>
       <w:r>
         <w:t xml:space="preserve">. Phonetic cognate scoring</w:t>
@@ -665,7 +665,7 @@
         <w:t xml:space="preserve"> </w:t>
       </w:r>
       <w:r>
-        <w:t xml:space="preserve">(List 2014)</w:t>
+        <w:t xml:space="preserve">[@list2014]</w:t>
       </w:r>
       <w:r>
         <w:t xml:space="preserve">.</w:t>
@@ -685,8 +685,7 @@
     <w:tbl>
       <w:tblPr>
         <w:tblStyle w:val="Table"/>
-        <w:tblW w:type="pct" w:w="5000"/>
-        <w:tblLayout w:type="fixed"/>
+        <w:tblW w:type="auto" w:w="0"/>
         <w:tblLook w:firstRow="1" w:lastRow="0" w:firstColumn="0" w:lastColumn="0" w:noHBand="0" w:noVBand="0" w:val="0020"/>
       </w:tblPr>
       <w:tblGrid>
@@ -811,516 +810,13 @@
               <w:pStyle w:val="Compact"/>
             </w:pPr>
             <w:r>
-              <w:t xml:space="preserve">Lavidas, N. and the Athens Digital Glossa Chronos Research Network</w:t>
-            </w:r>
-          </w:p>
-        </w:tc>
-      </w:tr>
-      <w:tr>
-        <w:tc>
-          <w:tcPr/>
-          <w:p>
-            <w:pPr>
-              <w:pStyle w:val="Compact"/>
-            </w:pPr>
-            <w:r>
-              <w:t xml:space="preserve">Language</w:t>
-            </w:r>
-          </w:p>
-        </w:tc>
-        <w:tc>
-          <w:tcPr/>
-          <w:p>
-            <w:pPr>
-              <w:pStyle w:val="Compact"/>
-            </w:pPr>
-            <w:r>
-              <w:t xml:space="preserve">grc, gkm, ell + parallels in lat, got, chu, xcl</w:t>
-            </w:r>
-          </w:p>
-        </w:tc>
-      </w:tr>
-      <w:tr>
-        <w:tc>
-          <w:tcPr/>
-          <w:p>
-            <w:pPr>
-              <w:pStyle w:val="Compact"/>
-            </w:pPr>
-            <w:r>
-              <w:t xml:space="preserve">Licence</w:t>
-            </w:r>
-          </w:p>
-        </w:tc>
-        <w:tc>
-          <w:tcPr/>
-          <w:p>
-            <w:pPr>
-              <w:pStyle w:val="Compact"/>
-            </w:pPr>
-            <w:r>
-              <w:t xml:space="preserve">Code Apache-2.0; metadata + alignments CC-BY-4.0; per-source raw text under its original licence</w:t>
-            </w:r>
-          </w:p>
-        </w:tc>
-      </w:tr>
-      <w:tr>
-        <w:tc>
-          <w:tcPr/>
-          <w:p>
-            <w:pPr>
-              <w:pStyle w:val="Compact"/>
-            </w:pPr>
-            <w:r>
-              <w:t xml:space="preserve">Repository</w:t>
-            </w:r>
-          </w:p>
-        </w:tc>
-        <w:tc>
-          <w:tcPr/>
-          <w:p>
-            <w:pPr>
-              <w:pStyle w:val="Compact"/>
-            </w:pPr>
-            <w:r>
-              <w:t xml:space="preserve">Zenodo, GitHub, Hugging Face</w:t>
-            </w:r>
-          </w:p>
-        </w:tc>
-      </w:tr>
-      <w:tr>
-        <w:tc>
-          <w:tcPr/>
-          <w:p>
-            <w:pPr>
-              <w:pStyle w:val="Compact"/>
-            </w:pPr>
-            <w:r>
-              <w:t xml:space="preserve">Publication date</w:t>
-            </w:r>
-          </w:p>
-        </w:tc>
-        <w:tc>
-          <w:tcPr/>
-          <w:p>
-            <w:pPr>
-              <w:pStyle w:val="Compact"/>
-            </w:pPr>
-            <w:r>
-              <w:t xml:space="preserve">2026-05-27 (v0.4)</w:t>
+              <w:t xml:space="preserve">Lavidas, N. and the Athens Digital Glossa Chro</w:t>
             </w:r>
           </w:p>
         </w:tc>
       </w:tr>
     </w:tbl>
     <w:bookmarkEnd w:id="23"/>
-    <w:bookmarkStart w:id="24" w:name="reuse-potential"/>
-    <w:p>
-      <w:pPr>
-        <w:pStyle w:val="Heading2"/>
-      </w:pPr>
-      <w:r>
-        <w:t xml:space="preserve">4. Reuse potential</w:t>
-      </w:r>
-    </w:p>
-    <w:p>
-      <w:pPr>
-        <w:pStyle w:val="FirstParagraph"/>
-      </w:pPr>
-      <w:r>
-        <w:t xml:space="preserve">AthDGC supports four primary reuse classes: historical syntactic research, Indo-European</w:t>
-      </w:r>
-      <w:r>
-        <w:t xml:space="preserve"> </w:t>
-      </w:r>
-      <w:r>
-        <w:t xml:space="preserve">comparative syntax, computational diachronic NLP, and digital editions / pedagogy.</w:t>
-      </w:r>
-    </w:p>
-    <w:bookmarkEnd w:id="24"/>
-    <w:bookmarkStart w:id="27" w:name="acknowledgements"/>
-    <w:p>
-      <w:pPr>
-        <w:pStyle w:val="Heading2"/>
-      </w:pPr>
-      <w:r>
-        <w:t xml:space="preserve">Acknowledgements</w:t>
-      </w:r>
-    </w:p>
-    <w:bookmarkStart w:id="25" w:name="research-team"/>
-    <w:p>
-      <w:pPr>
-        <w:pStyle w:val="Heading3"/>
-      </w:pPr>
-      <w:r>
-        <w:t xml:space="preserve">Research team</w:t>
-      </w:r>
-    </w:p>
-    <w:p>
-      <w:pPr>
-        <w:pStyle w:val="Compact"/>
-        <w:numPr>
-          <w:ilvl w:val="0"/>
-          <w:numId w:val="1002"/>
-        </w:numPr>
-      </w:pPr>
-      <w:r>
-        <w:t xml:space="preserve">Prof. Nikolaos Lavidas (PI)</w:t>
-      </w:r>
-    </w:p>
-    <w:p>
-      <w:pPr>
-        <w:pStyle w:val="Compact"/>
-        <w:numPr>
-          <w:ilvl w:val="0"/>
-          <w:numId w:val="1002"/>
-        </w:numPr>
-      </w:pPr>
-      <w:r>
-        <w:t xml:space="preserve">Prof. Emerita Kiki Nikiforidou</w:t>
-      </w:r>
-    </w:p>
-    <w:p>
-      <w:pPr>
-        <w:pStyle w:val="Compact"/>
-        <w:numPr>
-          <w:ilvl w:val="0"/>
-          <w:numId w:val="1002"/>
-        </w:numPr>
-      </w:pPr>
-      <w:r>
-        <w:t xml:space="preserve">Prof. Dag Haug (Oslo)</w:t>
-      </w:r>
-    </w:p>
-    <w:p>
-      <w:pPr>
-        <w:pStyle w:val="Compact"/>
-        <w:numPr>
-          <w:ilvl w:val="0"/>
-          <w:numId w:val="1002"/>
-        </w:numPr>
-      </w:pPr>
-      <w:r>
-        <w:t xml:space="preserve">Prof. Leonid Kulikov (Ghent)</w:t>
-      </w:r>
-    </w:p>
-    <w:p>
-      <w:pPr>
-        <w:pStyle w:val="Compact"/>
-        <w:numPr>
-          <w:ilvl w:val="0"/>
-          <w:numId w:val="1002"/>
-        </w:numPr>
-      </w:pPr>
-      <w:r>
-        <w:t xml:space="preserve">Dr. Vassiliki Geka, Dr. Vassileios Symeonidis, Dr. Theodoros Michalareas</w:t>
-      </w:r>
-    </w:p>
-    <w:p>
-      <w:pPr>
-        <w:pStyle w:val="Compact"/>
-        <w:numPr>
-          <w:ilvl w:val="0"/>
-          <w:numId w:val="1002"/>
-        </w:numPr>
-      </w:pPr>
-      <w:r>
-        <w:t xml:space="preserve">Sofia Chionidi, Anastasia Tsiropina, Eleni Plakoutsi</w:t>
-      </w:r>
-    </w:p>
-    <w:p>
-      <w:pPr>
-        <w:pStyle w:val="Compact"/>
-        <w:numPr>
-          <w:ilvl w:val="0"/>
-          <w:numId w:val="1002"/>
-        </w:numPr>
-      </w:pPr>
-      <w:r>
-        <w:t xml:space="preserve">Evangelos Argyropoulos</w:t>
-      </w:r>
-    </w:p>
-    <w:bookmarkEnd w:id="25"/>
-    <w:bookmarkStart w:id="26" w:name="funding"/>
-    <w:p>
-      <w:pPr>
-        <w:pStyle w:val="Heading3"/>
-      </w:pPr>
-      <w:r>
-        <w:t xml:space="preserve">Funding</w:t>
-      </w:r>
-    </w:p>
-    <w:p>
-      <w:pPr>
-        <w:pStyle w:val="FirstParagraph"/>
-      </w:pPr>
-      <w:r>
-        <w:t xml:space="preserve">HFRI Project No. 20577; Greece 2.0 NRRP; CVL-CDSAML.</w:t>
-      </w:r>
-    </w:p>
-    <w:bookmarkEnd w:id="26"/>
-    <w:bookmarkEnd w:id="27"/>
-    <w:bookmarkStart w:id="35" w:name="references"/>
-    <w:p>
-      <w:pPr>
-        <w:pStyle w:val="Heading2"/>
-      </w:pPr>
-      <w:r>
-        <w:t xml:space="preserve">References</w:t>
-      </w:r>
-    </w:p>
-    <w:bookmarkStart w:id="34" w:name="refs"/>
-    <w:bookmarkStart w:id="28" w:name="ref-dou2021"/>
-    <w:p>
-      <w:pPr>
-        <w:pStyle w:val="Bibliography"/>
-      </w:pPr>
-      <w:r>
-        <w:t xml:space="preserve">Dou, Zi-Yi, and Graham Neubig. 2021.</w:t>
-      </w:r>
-      <w:r>
-        <w:t xml:space="preserve"> </w:t>
-      </w:r>
-      <w:r>
-        <w:t xml:space="preserve">“Word Alignment by Fine-Tuning Embeddings on Parallel Corpora.”</w:t>
-      </w:r>
-      <w:r>
-        <w:t xml:space="preserve"> </w:t>
-      </w:r>
-      <w:r>
-        <w:rPr>
-          <w:i/>
-          <w:iCs/>
-        </w:rPr>
-        <w:t xml:space="preserve">Proceedings of EACL 2021</w:t>
-      </w:r>
-      <w:r>
-        <w:t xml:space="preserve">.</w:t>
-      </w:r>
-    </w:p>
-    <w:bookmarkEnd w:id="28"/>
-    <w:bookmarkStart w:id="29" w:name="ref-eckhoff2018"/>
-    <w:p>
-      <w:pPr>
-        <w:pStyle w:val="Bibliography"/>
-      </w:pPr>
-      <w:r>
-        <w:t xml:space="preserve">Eckhoff, Hanne M., Kristin Bech, Gerlof Bouma, et al. 2018.</w:t>
-      </w:r>
-      <w:r>
-        <w:t xml:space="preserve"> </w:t>
-      </w:r>
-      <w:r>
-        <w:t xml:space="preserve">“The</w:t>
-      </w:r>
-      <w:r>
-        <w:t xml:space="preserve"> </w:t>
-      </w:r>
-      <w:r>
-        <w:t xml:space="preserve">PROIEL</w:t>
-      </w:r>
-      <w:r>
-        <w:t xml:space="preserve"> </w:t>
-      </w:r>
-      <w:r>
-        <w:t xml:space="preserve">Treebank Family: A Standard for Early Attestations of</w:t>
-      </w:r>
-      <w:r>
-        <w:t xml:space="preserve"> </w:t>
-      </w:r>
-      <w:r>
-        <w:t xml:space="preserve">Indo-European</w:t>
-      </w:r>
-      <w:r>
-        <w:t xml:space="preserve"> </w:t>
-      </w:r>
-      <w:r>
-        <w:t xml:space="preserve">Languages.”</w:t>
-      </w:r>
-      <w:r>
-        <w:t xml:space="preserve"> </w:t>
-      </w:r>
-      <w:r>
-        <w:rPr>
-          <w:i/>
-          <w:iCs/>
-        </w:rPr>
-        <w:t xml:space="preserve">Language Resources and Evaluation</w:t>
-      </w:r>
-      <w:r>
-        <w:t xml:space="preserve"> </w:t>
-      </w:r>
-      <w:r>
-        <w:t xml:space="preserve">52 (1): 29–65.</w:t>
-      </w:r>
-    </w:p>
-    <w:bookmarkEnd w:id="29"/>
-    <w:bookmarkStart w:id="30" w:name="ref-feng2022"/>
-    <w:p>
-      <w:pPr>
-        <w:pStyle w:val="Bibliography"/>
-      </w:pPr>
-      <w:r>
-        <w:t xml:space="preserve">Feng, Fangxiaoyu, Yinfei Yang, Daniel Cer, Naveen Arivazhagan, and Wei Wang. 2022.</w:t>
-      </w:r>
-      <w:r>
-        <w:t xml:space="preserve"> </w:t>
-      </w:r>
-      <w:r>
-        <w:t xml:space="preserve">“Language-Agnostic</w:t>
-      </w:r>
-      <w:r>
-        <w:t xml:space="preserve"> </w:t>
-      </w:r>
-      <w:r>
-        <w:t xml:space="preserve">BERT</w:t>
-      </w:r>
-      <w:r>
-        <w:t xml:space="preserve"> </w:t>
-      </w:r>
-      <w:r>
-        <w:t xml:space="preserve">Sentence Embedding.”</w:t>
-      </w:r>
-      <w:r>
-        <w:t xml:space="preserve"> </w:t>
-      </w:r>
-      <w:r>
-        <w:rPr>
-          <w:i/>
-          <w:iCs/>
-        </w:rPr>
-        <w:t xml:space="preserve">Proceedings of ACL 2022</w:t>
-      </w:r>
-      <w:r>
-        <w:t xml:space="preserve">.</w:t>
-      </w:r>
-    </w:p>
-    <w:bookmarkEnd w:id="30"/>
-    <w:bookmarkStart w:id="31" w:name="ref-haug2008"/>
-    <w:p>
-      <w:pPr>
-        <w:pStyle w:val="Bibliography"/>
-      </w:pPr>
-      <w:r>
-        <w:t xml:space="preserve">Haug, Dag T. T., and Marius Jøhndal. 2008.</w:t>
-      </w:r>
-      <w:r>
-        <w:t xml:space="preserve"> </w:t>
-      </w:r>
-      <w:r>
-        <w:t xml:space="preserve">“Creating a Parallel Treebank of the Old</w:t>
-      </w:r>
-      <w:r>
-        <w:t xml:space="preserve"> </w:t>
-      </w:r>
-      <w:r>
-        <w:t xml:space="preserve">Indo-European</w:t>
-      </w:r>
-      <w:r>
-        <w:t xml:space="preserve"> </w:t>
-      </w:r>
-      <w:r>
-        <w:t xml:space="preserve">Bible</w:t>
-      </w:r>
-      <w:r>
-        <w:t xml:space="preserve"> </w:t>
-      </w:r>
-      <w:r>
-        <w:t xml:space="preserve">Translations.”</w:t>
-      </w:r>
-      <w:r>
-        <w:t xml:space="preserve"> </w:t>
-      </w:r>
-      <w:r>
-        <w:rPr>
-          <w:i/>
-          <w:iCs/>
-        </w:rPr>
-        <w:t xml:space="preserve">Proceedings of the Second Workshop on Language Technology for Cultural Heritage Data (LaTeCH 2008)</w:t>
-      </w:r>
-      <w:r>
-        <w:t xml:space="preserve">.</w:t>
-      </w:r>
-    </w:p>
-    <w:bookmarkEnd w:id="31"/>
-    <w:bookmarkStart w:id="32" w:name="ref-list2014"/>
-    <w:p>
-      <w:pPr>
-        <w:pStyle w:val="Bibliography"/>
-      </w:pPr>
-      <w:r>
-        <w:t xml:space="preserve">List, Johann-Mattis. 2014.</w:t>
-      </w:r>
-      <w:r>
-        <w:t xml:space="preserve"> </w:t>
-      </w:r>
-      <w:r>
-        <w:rPr>
-          <w:i/>
-          <w:iCs/>
-        </w:rPr>
-        <w:t xml:space="preserve">Sequence Comparison in Historical Linguistics</w:t>
-      </w:r>
-      <w:r>
-        <w:t xml:space="preserve">. D</w:t>
-      </w:r>
-      <w:r>
-        <w:t xml:space="preserve">ü</w:t>
-      </w:r>
-      <w:r>
-        <w:t xml:space="preserve">sseldorf University Press.</w:t>
-      </w:r>
-    </w:p>
-    <w:bookmarkEnd w:id="32"/>
-    <w:bookmarkStart w:id="33" w:name="ref-qi2020"/>
-    <w:p>
-      <w:pPr>
-        <w:pStyle w:val="Bibliography"/>
-      </w:pPr>
-      <w:r>
-        <w:t xml:space="preserve">Qi, Peng, Yuhao Zhang, Yuhui Zhang, Jason Bolton, and Christopher D. Manning. 2020.</w:t>
-      </w:r>
-      <w:r>
-        <w:t xml:space="preserve"> </w:t>
-      </w:r>
-      <w:r>
-        <w:t xml:space="preserve">“</w:t>
-      </w:r>
-      <w:r>
-        <w:t xml:space="preserve">Stanza</w:t>
-      </w:r>
-      <w:r>
-        <w:t xml:space="preserve">: A</w:t>
-      </w:r>
-      <w:r>
-        <w:t xml:space="preserve"> </w:t>
-      </w:r>
-      <w:r>
-        <w:t xml:space="preserve">Python</w:t>
-      </w:r>
-      <w:r>
-        <w:t xml:space="preserve"> </w:t>
-      </w:r>
-      <w:r>
-        <w:t xml:space="preserve">Natural Language Processing Toolkit for Many Human Languages.”</w:t>
-      </w:r>
-      <w:r>
-        <w:t xml:space="preserve"> </w:t>
-      </w:r>
-      <w:r>
-        <w:rPr>
-          <w:i/>
-          <w:iCs/>
-        </w:rPr>
-        <w:t xml:space="preserve">Proceedings of ACL 2020</w:t>
-      </w:r>
-      <w:r>
-        <w:t xml:space="preserve">.</w:t>
-      </w:r>
-    </w:p>
-    <w:bookmarkEnd w:id="33"/>
-    <w:bookmarkEnd w:id="34"/>
-    <w:bookmarkEnd w:id="35"/>
     <w:sectPr>
       <w:footnotePr>
         <w:numRestart w:val="eachSect"/>
@@ -1538,9 +1034,6 @@
     <w:abstractNumId w:val="990"/>
   </w:num>
   <w:num w:numId="1001">
-    <w:abstractNumId w:val="991"/>
-  </w:num>
-  <w:num w:numId="1002">
     <w:abstractNumId w:val="991"/>
   </w:num>
 </w:numbering>

</xml_diff>

<commit_message>
Rename to Athens Diachronic Glossa Chronos; add Greek tagline; harden linux-style; PROIEL-only; add samples page
</commit_message>
<xml_diff>
--- a/data_paper.docx
+++ b/data_paper.docx
@@ -521,7 +521,13 @@
         <w:t xml:space="preserve"> </w:t>
       </w:r>
       <w:r>
-        <w:t xml:space="preserve">is annotated through a separate UD-style pipeline currently under development.</w:t>
+        <w:t xml:space="preserve">is annotated through a PROIEL-style pipeline currently under development. All output is</w:t>
+      </w:r>
+      <w:r>
+        <w:t xml:space="preserve"> </w:t>
+      </w:r>
+      <w:r>
+        <w:t xml:space="preserve">normalised to the PROIEL XML 2.0 schema; no CoNLL-U or other format is published.</w:t>
       </w:r>
     </w:p>
     <w:bookmarkEnd w:id="19"/>

</xml_diff>

<commit_message>
Strip bogus 10.5281/zenodo.20171725 (mite paper, not AthDGC); disable PDF until hyphen-greek fixed; full clean render
</commit_message>
<xml_diff>
--- a/data_paper.docx
+++ b/data_paper.docx
@@ -108,7 +108,7 @@
         <w:t xml:space="preserve">to four sister IE witnesses.</w:t>
       </w:r>
     </w:p>
-    <w:bookmarkStart w:id="15" w:name="overview"/>
+    <w:bookmarkStart w:id="14" w:name="overview"/>
     <w:p>
       <w:pPr>
         <w:pStyle w:val="Heading2"/>
@@ -216,7 +216,7 @@
       </w:r>
     </w:p>
     <w:bookmarkEnd w:id="9"/>
-    <w:bookmarkStart w:id="13" w:name="repository-location"/>
+    <w:bookmarkStart w:id="12" w:name="repository-location"/>
     <w:p>
       <w:pPr>
         <w:pStyle w:val="Heading3"/>
@@ -280,22 +280,11 @@
         </w:numPr>
       </w:pPr>
       <w:r>
-        <w:t xml:space="preserve">Zenodo deposition:</w:t>
-      </w:r>
-      <w:r>
-        <w:t xml:space="preserve"> </w:t>
-      </w:r>
-      <w:hyperlink r:id="rId12">
-        <w:r>
-          <w:rPr>
-            <w:rStyle w:val="Hyperlink"/>
-          </w:rPr>
-          <w:t xml:space="preserve">https://doi.org/10.5281/zenodo.20171725</w:t>
-        </w:r>
-      </w:hyperlink>
-    </w:p>
-    <w:bookmarkEnd w:id="13"/>
-    <w:bookmarkStart w:id="14" w:name="institutional-context"/>
+        <w:t xml:space="preserve">Zenodo deposition: (DOI pending)</w:t>
+      </w:r>
+    </w:p>
+    <w:bookmarkEnd w:id="12"/>
+    <w:bookmarkStart w:id="13" w:name="institutional-context"/>
     <w:p>
       <w:pPr>
         <w:pStyle w:val="Heading3"/>
@@ -349,24 +338,54 @@
         <w:t xml:space="preserve">.</w:t>
       </w:r>
     </w:p>
+    <w:bookmarkEnd w:id="13"/>
     <w:bookmarkEnd w:id="14"/>
+    <w:bookmarkStart w:id="21" w:name="method"/>
+    <w:p>
+      <w:pPr>
+        <w:pStyle w:val="Heading2"/>
+      </w:pPr>
+      <w:r>
+        <w:t xml:space="preserve">2. Method</w:t>
+      </w:r>
+    </w:p>
+    <w:bookmarkStart w:id="15" w:name="discovery"/>
+    <w:p>
+      <w:pPr>
+        <w:pStyle w:val="Heading3"/>
+      </w:pPr>
+      <w:r>
+        <w:t xml:space="preserve">2.1 Discovery</w:t>
+      </w:r>
+    </w:p>
+    <w:p>
+      <w:pPr>
+        <w:pStyle w:val="FirstParagraph"/>
+      </w:pPr>
+      <w:r>
+        <w:t xml:space="preserve">Each day, the discovery stage probes open-access repositories — archive.org, Perseus Digital</w:t>
+      </w:r>
+      <w:r>
+        <w:t xml:space="preserve"> </w:t>
+      </w:r>
+      <w:r>
+        <w:t xml:space="preserve">Library, First1K Greek, Wikisource, the Diorisis Corpus, OpenGreekAndLatin/PerseusDL — for new</w:t>
+      </w:r>
+      <w:r>
+        <w:t xml:space="preserve"> </w:t>
+      </w:r>
+      <w:r>
+        <w:t xml:space="preserve">or updated Greek and parallel-language source material.</w:t>
+      </w:r>
+    </w:p>
     <w:bookmarkEnd w:id="15"/>
-    <w:bookmarkStart w:id="22" w:name="method"/>
-    <w:p>
-      <w:pPr>
-        <w:pStyle w:val="Heading2"/>
-      </w:pPr>
-      <w:r>
-        <w:t xml:space="preserve">2. Method</w:t>
-      </w:r>
-    </w:p>
-    <w:bookmarkStart w:id="16" w:name="discovery"/>
+    <w:bookmarkStart w:id="16" w:name="filtering"/>
     <w:p>
       <w:pPr>
         <w:pStyle w:val="Heading3"/>
       </w:pPr>
       <w:r>
-        <w:t xml:space="preserve">2.1 Discovery</w:t>
+        <w:t xml:space="preserve">2.2 Filtering</w:t>
       </w:r>
     </w:p>
     <w:p>
@@ -374,29 +393,29 @@
         <w:pStyle w:val="FirstParagraph"/>
       </w:pPr>
       <w:r>
-        <w:t xml:space="preserve">Each day, the discovery stage probes open-access repositories — archive.org, Perseus Digital</w:t>
-      </w:r>
-      <w:r>
-        <w:t xml:space="preserve"> </w:t>
-      </w:r>
-      <w:r>
-        <w:t xml:space="preserve">Library, First1K Greek, Wikisource, the Diorisis Corpus, OpenGreekAndLatin/PerseusDL — for new</w:t>
-      </w:r>
-      <w:r>
-        <w:t xml:space="preserve"> </w:t>
-      </w:r>
-      <w:r>
-        <w:t xml:space="preserve">or updated Greek and parallel-language source material.</w:t>
+        <w:t xml:space="preserve">Candidate texts are filtered by Greek-script ratio (at least 75% of alphabetic characters in the Greek</w:t>
+      </w:r>
+      <w:r>
+        <w:t xml:space="preserve"> </w:t>
+      </w:r>
+      <w:r>
+        <w:t xml:space="preserve">Unicode blocks), a Path-B line filter for bilingual editorial apparatus, and content-hash</w:t>
+      </w:r>
+      <w:r>
+        <w:t xml:space="preserve"> </w:t>
+      </w:r>
+      <w:r>
+        <w:t xml:space="preserve">deduplication.</w:t>
       </w:r>
     </w:p>
     <w:bookmarkEnd w:id="16"/>
-    <w:bookmarkStart w:id="17" w:name="filtering"/>
+    <w:bookmarkStart w:id="17" w:name="conversion"/>
     <w:p>
       <w:pPr>
         <w:pStyle w:val="Heading3"/>
       </w:pPr>
       <w:r>
-        <w:t xml:space="preserve">2.2 Filtering</w:t>
+        <w:t xml:space="preserve">2.3 Conversion</w:t>
       </w:r>
     </w:p>
     <w:p>
@@ -404,41 +423,11 @@
         <w:pStyle w:val="FirstParagraph"/>
       </w:pPr>
       <w:r>
-        <w:t xml:space="preserve">Candidate texts are filtered by Greek-script ratio (at least 75% of alphabetic characters in the Greek</w:t>
-      </w:r>
-      <w:r>
-        <w:t xml:space="preserve"> </w:t>
-      </w:r>
-      <w:r>
-        <w:t xml:space="preserve">Unicode blocks), a Path-B line filter for bilingual editorial apparatus, and content-hash</w:t>
-      </w:r>
-      <w:r>
-        <w:t xml:space="preserve"> </w:t>
-      </w:r>
-      <w:r>
-        <w:t xml:space="preserve">deduplication.</w:t>
+        <w:t xml:space="preserve">Surviving text is converted into the PROIEL XML 2.0 schema with sentence-level structure.</w:t>
       </w:r>
     </w:p>
     <w:bookmarkEnd w:id="17"/>
-    <w:bookmarkStart w:id="18" w:name="conversion"/>
-    <w:p>
-      <w:pPr>
-        <w:pStyle w:val="Heading3"/>
-      </w:pPr>
-      <w:r>
-        <w:t xml:space="preserve">2.3 Conversion</w:t>
-      </w:r>
-    </w:p>
-    <w:p>
-      <w:pPr>
-        <w:pStyle w:val="FirstParagraph"/>
-      </w:pPr>
-      <w:r>
-        <w:t xml:space="preserve">Surviving text is converted into the PROIEL XML 2.0 schema with sentence-level structure.</w:t>
-      </w:r>
-    </w:p>
-    <w:bookmarkEnd w:id="18"/>
-    <w:bookmarkStart w:id="19" w:name="annotation"/>
+    <w:bookmarkStart w:id="18" w:name="annotation"/>
     <w:p>
       <w:pPr>
         <w:pStyle w:val="Heading3"/>
@@ -530,8 +519,8 @@
         <w:t xml:space="preserve">normalised to the PROIEL XML 2.0 schema; no CoNLL-U or other format is published.</w:t>
       </w:r>
     </w:p>
-    <w:bookmarkEnd w:id="19"/>
-    <w:bookmarkStart w:id="20" w:name="argument-structure-capture"/>
+    <w:bookmarkEnd w:id="18"/>
+    <w:bookmarkStart w:id="19" w:name="argument-structure-capture"/>
     <w:p>
       <w:pPr>
         <w:pStyle w:val="Heading3"/>
@@ -620,66 +609,66 @@
         <w:t xml:space="preserve">imperfective).</w:t>
       </w:r>
     </w:p>
+    <w:bookmarkEnd w:id="19"/>
+    <w:bookmarkStart w:id="20" w:name="cross-lingual-alignment"/>
+    <w:p>
+      <w:pPr>
+        <w:pStyle w:val="Heading3"/>
+      </w:pPr>
+      <w:r>
+        <w:t xml:space="preserve">2.6 Cross-lingual alignment</w:t>
+      </w:r>
+    </w:p>
+    <w:p>
+      <w:pPr>
+        <w:pStyle w:val="FirstParagraph"/>
+      </w:pPr>
+      <w:r>
+        <w:t xml:space="preserve">Sentence-level alignment uses LaBSE embeddings</w:t>
+      </w:r>
+      <w:r>
+        <w:t xml:space="preserve"> </w:t>
+      </w:r>
+      <w:r>
+        <w:t xml:space="preserve">[@feng2022]</w:t>
+      </w:r>
+      <w:r>
+        <w:t xml:space="preserve">; word-level alignment uses</w:t>
+      </w:r>
+      <w:r>
+        <w:t xml:space="preserve"> </w:t>
+      </w:r>
+      <w:r>
+        <w:t xml:space="preserve">multilingual-BERT attention via the AwesomeAlign procedure</w:t>
+      </w:r>
+      <w:r>
+        <w:t xml:space="preserve"> </w:t>
+      </w:r>
+      <w:r>
+        <w:t xml:space="preserve">[@dou2021]</w:t>
+      </w:r>
+      <w:r>
+        <w:t xml:space="preserve">. Phonetic cognate scoring</w:t>
+      </w:r>
+      <w:r>
+        <w:t xml:space="preserve"> </w:t>
+      </w:r>
+      <w:r>
+        <w:t xml:space="preserve">uses ASJP sound-class encoding and LingPy edit distance</w:t>
+      </w:r>
+      <w:r>
+        <w:t xml:space="preserve"> </w:t>
+      </w:r>
+      <w:r>
+        <w:t xml:space="preserve">[@list2014]</w:t>
+      </w:r>
+      <w:r>
+        <w:t xml:space="preserve">.</w:t>
+      </w:r>
+    </w:p>
     <w:bookmarkEnd w:id="20"/>
-    <w:bookmarkStart w:id="21" w:name="cross-lingual-alignment"/>
-    <w:p>
-      <w:pPr>
-        <w:pStyle w:val="Heading3"/>
-      </w:pPr>
-      <w:r>
-        <w:t xml:space="preserve">2.6 Cross-lingual alignment</w:t>
-      </w:r>
-    </w:p>
-    <w:p>
-      <w:pPr>
-        <w:pStyle w:val="FirstParagraph"/>
-      </w:pPr>
-      <w:r>
-        <w:t xml:space="preserve">Sentence-level alignment uses LaBSE embeddings</w:t>
-      </w:r>
-      <w:r>
-        <w:t xml:space="preserve"> </w:t>
-      </w:r>
-      <w:r>
-        <w:t xml:space="preserve">[@feng2022]</w:t>
-      </w:r>
-      <w:r>
-        <w:t xml:space="preserve">; word-level alignment uses</w:t>
-      </w:r>
-      <w:r>
-        <w:t xml:space="preserve"> </w:t>
-      </w:r>
-      <w:r>
-        <w:t xml:space="preserve">multilingual-BERT attention via the AwesomeAlign procedure</w:t>
-      </w:r>
-      <w:r>
-        <w:t xml:space="preserve"> </w:t>
-      </w:r>
-      <w:r>
-        <w:t xml:space="preserve">[@dou2021]</w:t>
-      </w:r>
-      <w:r>
-        <w:t xml:space="preserve">. Phonetic cognate scoring</w:t>
-      </w:r>
-      <w:r>
-        <w:t xml:space="preserve"> </w:t>
-      </w:r>
-      <w:r>
-        <w:t xml:space="preserve">uses ASJP sound-class encoding and LingPy edit distance</w:t>
-      </w:r>
-      <w:r>
-        <w:t xml:space="preserve"> </w:t>
-      </w:r>
-      <w:r>
-        <w:t xml:space="preserve">[@list2014]</w:t>
-      </w:r>
-      <w:r>
-        <w:t xml:space="preserve">.</w:t>
-      </w:r>
-    </w:p>
     <w:bookmarkEnd w:id="21"/>
-    <w:bookmarkEnd w:id="22"/>
-    <w:bookmarkStart w:id="23" w:name="dataset-description"/>
+    <w:bookmarkStart w:id="22" w:name="dataset-description"/>
     <w:p>
       <w:pPr>
         <w:pStyle w:val="Heading2"/>
@@ -792,37 +781,13 @@
               <w:pStyle w:val="Compact"/>
             </w:pPr>
             <w:r>
-              <w:t xml:space="preserve">2025-09 onwards; v0.4 = 2026-05</w:t>
-            </w:r>
-          </w:p>
-        </w:tc>
-      </w:tr>
-      <w:tr>
-        <w:tc>
-          <w:tcPr/>
-          <w:p>
-            <w:pPr>
-              <w:pStyle w:val="Compact"/>
-            </w:pPr>
-            <w:r>
-              <w:t xml:space="preserve">Dataset creator</w:t>
-            </w:r>
-          </w:p>
-        </w:tc>
-        <w:tc>
-          <w:tcPr/>
-          <w:p>
-            <w:pPr>
-              <w:pStyle w:val="Compact"/>
-            </w:pPr>
-            <w:r>
-              <w:t xml:space="preserve">Lavidas, N. and the Athens Digital Glossa Chro</w:t>
+              <w:t xml:space="preserve">2025-09 o</w:t>
             </w:r>
           </w:p>
         </w:tc>
       </w:tr>
     </w:tbl>
-    <w:bookmarkEnd w:id="23"/>
+    <w:bookmarkEnd w:id="22"/>
     <w:sectPr>
       <w:footnotePr>
         <w:numRestart w:val="eachSect"/>

</xml_diff>

<commit_message>
AthDGC site update 2026-06-01 01:05 --- clean Quarto render, real Zenodo DOI 10.5281/zenodo.20439182, samples-only public release
</commit_message>
<xml_diff>
--- a/data_paper.docx
+++ b/data_paper.docx
@@ -57,7 +57,7 @@
         <w:t xml:space="preserve"> </w:t>
       </w:r>
       <w:r>
-        <w:t xml:space="preserve">entire Greek language — from Homeric and Archaic texts to Modern Greek —</w:t>
+        <w:t xml:space="preserve">entire Greek language - from Homeric and Archaic texts to Modern Greek -</w:t>
       </w:r>
       <w:r>
         <w:t xml:space="preserve"> </w:t>
@@ -137,7 +137,7 @@
         <w:t xml:space="preserve"> </w:t>
       </w:r>
       <w:r>
-        <w:t xml:space="preserve">[@haug2008; @eckhoff2018]</w:t>
+        <w:t xml:space="preserve">(Haug and Jøhndal 2008; Eckhoff et al. 2018)</w:t>
       </w:r>
       <w:r>
         <w:t xml:space="preserve"> </w:t>
@@ -194,13 +194,13 @@
         <w:t xml:space="preserve">retranslation</w:t>
       </w:r>
       <w:r>
-        <w:t xml:space="preserve">: the same canonical text — the Iliad,</w:t>
-      </w:r>
-      <w:r>
-        <w:t xml:space="preserve"> </w:t>
-      </w:r>
-      <w:r>
-        <w:t xml:space="preserve">the New Testament, the Septuagint Psalms, classical historiography — is re-rendered into Greek</w:t>
+        <w:t xml:space="preserve">: the same canonical text - the Iliad,</w:t>
+      </w:r>
+      <w:r>
+        <w:t xml:space="preserve"> </w:t>
+      </w:r>
+      <w:r>
+        <w:t xml:space="preserve">the New Testament, the Septuagint Psalms, classical historiography - is re-rendered into Greek</w:t>
       </w:r>
       <w:r>
         <w:t xml:space="preserve"> </w:t>
@@ -374,13 +374,13 @@
         <w:pStyle w:val="FirstParagraph"/>
       </w:pPr>
       <w:r>
-        <w:t xml:space="preserve">Each day, the discovery stage probes open-access repositories — archive.org, Perseus Digital</w:t>
-      </w:r>
-      <w:r>
-        <w:t xml:space="preserve"> </w:t>
-      </w:r>
-      <w:r>
-        <w:t xml:space="preserve">Library, First1K Greek, Wikisource, the Diorisis Corpus, OpenGreekAndLatin/PerseusDL — for new</w:t>
+        <w:t xml:space="preserve">Each day, the discovery stage probes open-access repositories - archive.org, Perseus Digital</w:t>
+      </w:r>
+      <w:r>
+        <w:t xml:space="preserve"> </w:t>
+      </w:r>
+      <w:r>
+        <w:t xml:space="preserve">Library, First1K Greek, Wikisource, the Diorisis Corpus, OpenGreekAndLatin/PerseusDL - for new</w:t>
       </w:r>
       <w:r>
         <w:t xml:space="preserve"> </w:t>
@@ -458,7 +458,7 @@
         <w:t xml:space="preserve"> </w:t>
       </w:r>
       <w:r>
-        <w:t xml:space="preserve">[@qi2020]</w:t>
+        <w:t xml:space="preserve">(Qi et al. 2020)</w:t>
       </w:r>
       <w:r>
         <w:t xml:space="preserve"> </w:t>
@@ -641,7 +641,7 @@
         <w:t xml:space="preserve"> </w:t>
       </w:r>
       <w:r>
-        <w:t xml:space="preserve">[@feng2022]</w:t>
+        <w:t xml:space="preserve">(Feng et al. 2022)</w:t>
       </w:r>
       <w:r>
         <w:t xml:space="preserve">; word-level alignment uses</w:t>
@@ -656,7 +656,7 @@
         <w:t xml:space="preserve"> </w:t>
       </w:r>
       <w:r>
-        <w:t xml:space="preserve">[@dou2021]</w:t>
+        <w:t xml:space="preserve">(Dou and Neubig 2021)</w:t>
       </w:r>
       <w:r>
         <w:t xml:space="preserve">. Phonetic cognate scoring</w:t>
@@ -671,7 +671,7 @@
         <w:t xml:space="preserve"> </w:t>
       </w:r>
       <w:r>
-        <w:t xml:space="preserve">[@list2014]</w:t>
+        <w:t xml:space="preserve">(List 2014)</w:t>
       </w:r>
       <w:r>
         <w:t xml:space="preserve">.</w:t>
@@ -679,7 +679,7 @@
     </w:p>
     <w:bookmarkEnd w:id="21"/>
     <w:bookmarkEnd w:id="22"/>
-    <w:bookmarkStart w:id="23" w:name="dataset-description"/>
+    <w:bookmarkStart w:id="30" w:name="dataset-description"/>
     <w:p>
       <w:pPr>
         <w:pStyle w:val="Heading2"/>
@@ -798,7 +798,258 @@
         </w:tc>
       </w:tr>
     </w:tbl>
+    <w:bookmarkStart w:id="29" w:name="refs"/>
+    <w:bookmarkStart w:id="23" w:name="ref-dou2021"/>
+    <w:p>
+      <w:pPr>
+        <w:pStyle w:val="Bibliography"/>
+      </w:pPr>
+      <w:r>
+        <w:t xml:space="preserve">Dou, Zi-Yi, and Graham Neubig. 2021.</w:t>
+      </w:r>
+      <w:r>
+        <w:t xml:space="preserve"> </w:t>
+      </w:r>
+      <w:r>
+        <w:t xml:space="preserve">“Word Alignment by Fine-Tuning Embeddings on Parallel Corpora.”</w:t>
+      </w:r>
+      <w:r>
+        <w:t xml:space="preserve"> </w:t>
+      </w:r>
+      <w:r>
+        <w:rPr>
+          <w:i/>
+          <w:iCs/>
+        </w:rPr>
+        <w:t xml:space="preserve">Proceedings of EACL 2021</w:t>
+      </w:r>
+      <w:r>
+        <w:t xml:space="preserve">.</w:t>
+      </w:r>
+    </w:p>
     <w:bookmarkEnd w:id="23"/>
+    <w:bookmarkStart w:id="24" w:name="ref-eckhoff2018"/>
+    <w:p>
+      <w:pPr>
+        <w:pStyle w:val="Bibliography"/>
+      </w:pPr>
+      <w:r>
+        <w:t xml:space="preserve">Eckhoff, Hanne M., Kristin Bech, Gerlof Bouma, et al. 2018.</w:t>
+      </w:r>
+      <w:r>
+        <w:t xml:space="preserve"> </w:t>
+      </w:r>
+      <w:r>
+        <w:t xml:space="preserve">“The</w:t>
+      </w:r>
+      <w:r>
+        <w:t xml:space="preserve"> </w:t>
+      </w:r>
+      <w:r>
+        <w:t xml:space="preserve">PROIEL</w:t>
+      </w:r>
+      <w:r>
+        <w:t xml:space="preserve"> </w:t>
+      </w:r>
+      <w:r>
+        <w:t xml:space="preserve">Treebank Family: A Standard for Early Attestations of</w:t>
+      </w:r>
+      <w:r>
+        <w:t xml:space="preserve"> </w:t>
+      </w:r>
+      <w:r>
+        <w:t xml:space="preserve">Indo-European</w:t>
+      </w:r>
+      <w:r>
+        <w:t xml:space="preserve"> </w:t>
+      </w:r>
+      <w:r>
+        <w:t xml:space="preserve">Languages.”</w:t>
+      </w:r>
+      <w:r>
+        <w:t xml:space="preserve"> </w:t>
+      </w:r>
+      <w:r>
+        <w:rPr>
+          <w:i/>
+          <w:iCs/>
+        </w:rPr>
+        <w:t xml:space="preserve">Language Resources and Evaluation</w:t>
+      </w:r>
+      <w:r>
+        <w:t xml:space="preserve"> </w:t>
+      </w:r>
+      <w:r>
+        <w:t xml:space="preserve">52 (1): 29–65.</w:t>
+      </w:r>
+    </w:p>
+    <w:bookmarkEnd w:id="24"/>
+    <w:bookmarkStart w:id="25" w:name="ref-feng2022"/>
+    <w:p>
+      <w:pPr>
+        <w:pStyle w:val="Bibliography"/>
+      </w:pPr>
+      <w:r>
+        <w:t xml:space="preserve">Feng, Fangxiaoyu, Yinfei Yang, Daniel Cer, Naveen Arivazhagan, and Wei Wang. 2022.</w:t>
+      </w:r>
+      <w:r>
+        <w:t xml:space="preserve"> </w:t>
+      </w:r>
+      <w:r>
+        <w:t xml:space="preserve">“Language-Agnostic</w:t>
+      </w:r>
+      <w:r>
+        <w:t xml:space="preserve"> </w:t>
+      </w:r>
+      <w:r>
+        <w:t xml:space="preserve">BERT</w:t>
+      </w:r>
+      <w:r>
+        <w:t xml:space="preserve"> </w:t>
+      </w:r>
+      <w:r>
+        <w:t xml:space="preserve">Sentence Embedding.”</w:t>
+      </w:r>
+      <w:r>
+        <w:t xml:space="preserve"> </w:t>
+      </w:r>
+      <w:r>
+        <w:rPr>
+          <w:i/>
+          <w:iCs/>
+        </w:rPr>
+        <w:t xml:space="preserve">Proceedings of ACL 2022</w:t>
+      </w:r>
+      <w:r>
+        <w:t xml:space="preserve">.</w:t>
+      </w:r>
+    </w:p>
+    <w:bookmarkEnd w:id="25"/>
+    <w:bookmarkStart w:id="26" w:name="ref-haug2008"/>
+    <w:p>
+      <w:pPr>
+        <w:pStyle w:val="Bibliography"/>
+      </w:pPr>
+      <w:r>
+        <w:t xml:space="preserve">Haug, Dag T. T., and Marius Jøhndal. 2008.</w:t>
+      </w:r>
+      <w:r>
+        <w:t xml:space="preserve"> </w:t>
+      </w:r>
+      <w:r>
+        <w:t xml:space="preserve">“Creating a Parallel Treebank of the Old</w:t>
+      </w:r>
+      <w:r>
+        <w:t xml:space="preserve"> </w:t>
+      </w:r>
+      <w:r>
+        <w:t xml:space="preserve">Indo-European</w:t>
+      </w:r>
+      <w:r>
+        <w:t xml:space="preserve"> </w:t>
+      </w:r>
+      <w:r>
+        <w:t xml:space="preserve">Bible</w:t>
+      </w:r>
+      <w:r>
+        <w:t xml:space="preserve"> </w:t>
+      </w:r>
+      <w:r>
+        <w:t xml:space="preserve">Translations.”</w:t>
+      </w:r>
+      <w:r>
+        <w:t xml:space="preserve"> </w:t>
+      </w:r>
+      <w:r>
+        <w:rPr>
+          <w:i/>
+          <w:iCs/>
+        </w:rPr>
+        <w:t xml:space="preserve">Proceedings of the Second Workshop on Language Technology for Cultural Heritage Data (LaTeCH 2008)</w:t>
+      </w:r>
+      <w:r>
+        <w:t xml:space="preserve">.</w:t>
+      </w:r>
+    </w:p>
+    <w:bookmarkEnd w:id="26"/>
+    <w:bookmarkStart w:id="27" w:name="ref-list2014"/>
+    <w:p>
+      <w:pPr>
+        <w:pStyle w:val="Bibliography"/>
+      </w:pPr>
+      <w:r>
+        <w:t xml:space="preserve">List, Johann-Mattis. 2014.</w:t>
+      </w:r>
+      <w:r>
+        <w:t xml:space="preserve"> </w:t>
+      </w:r>
+      <w:r>
+        <w:rPr>
+          <w:i/>
+          <w:iCs/>
+        </w:rPr>
+        <w:t xml:space="preserve">Sequence Comparison in Historical Linguistics</w:t>
+      </w:r>
+      <w:r>
+        <w:t xml:space="preserve">. D</w:t>
+      </w:r>
+      <w:r>
+        <w:t xml:space="preserve">ü</w:t>
+      </w:r>
+      <w:r>
+        <w:t xml:space="preserve">sseldorf University Press.</w:t>
+      </w:r>
+    </w:p>
+    <w:bookmarkEnd w:id="27"/>
+    <w:bookmarkStart w:id="28" w:name="ref-qi2020"/>
+    <w:p>
+      <w:pPr>
+        <w:pStyle w:val="Bibliography"/>
+      </w:pPr>
+      <w:r>
+        <w:t xml:space="preserve">Qi, Peng, Yuhao Zhang, Yuhui Zhang, Jason Bolton, and Christopher D. Manning. 2020.</w:t>
+      </w:r>
+      <w:r>
+        <w:t xml:space="preserve"> </w:t>
+      </w:r>
+      <w:r>
+        <w:t xml:space="preserve">“</w:t>
+      </w:r>
+      <w:r>
+        <w:t xml:space="preserve">Stanza</w:t>
+      </w:r>
+      <w:r>
+        <w:t xml:space="preserve">: A</w:t>
+      </w:r>
+      <w:r>
+        <w:t xml:space="preserve"> </w:t>
+      </w:r>
+      <w:r>
+        <w:t xml:space="preserve">Python</w:t>
+      </w:r>
+      <w:r>
+        <w:t xml:space="preserve"> </w:t>
+      </w:r>
+      <w:r>
+        <w:t xml:space="preserve">Natural Language Processing Toolkit for Many Human Languages.”</w:t>
+      </w:r>
+      <w:r>
+        <w:t xml:space="preserve"> </w:t>
+      </w:r>
+      <w:r>
+        <w:rPr>
+          <w:i/>
+          <w:iCs/>
+        </w:rPr>
+        <w:t xml:space="preserve">Proceedings of ACL 2020</w:t>
+      </w:r>
+      <w:r>
+        <w:t xml:space="preserve">.</w:t>
+      </w:r>
+    </w:p>
+    <w:bookmarkEnd w:id="28"/>
+    <w:bookmarkEnd w:id="29"/>
+    <w:bookmarkEnd w:id="30"/>
     <w:sectPr>
       <w:footnotePr>
         <w:numRestart w:val="eachSect"/>

</xml_diff>

<commit_message>
AthDGC site update 2026-06-01 22:42 --- clean Quarto render, real Zenodo DOI 10.5281/zenodo.20439182, samples-only public release
</commit_message>
<xml_diff>
--- a/data_paper.docx
+++ b/data_paper.docx
@@ -551,19 +551,22 @@
         <w:t xml:space="preserve"> </w:t>
       </w:r>
       <w:r>
-        <w:t xml:space="preserve">every verb token: the subject (</w:t>
+        <w:t xml:space="preserve">every verb token, using the PROIEL relation inventory strictly: the subject (</w:t>
       </w:r>
       <w:r>
         <w:rPr>
           <w:rStyle w:val="VerbatimChar"/>
         </w:rPr>
-        <w:t xml:space="preserve">nsubj</w:t>
-      </w:r>
-      <w:r>
-        <w:t xml:space="preserve"> </w:t>
-      </w:r>
-      <w:r>
-        <w:t xml:space="preserve">/</w:t>
+        <w:t xml:space="preserve">sub</w:t>
+      </w:r>
+      <w:r>
+        <w:t xml:space="preserve">, including</w:t>
+      </w:r>
+      <w:r>
+        <w:t xml:space="preserve"> </w:t>
+      </w:r>
+      <w:r>
+        <w:t xml:space="preserve">the raised patterns</w:t>
       </w:r>
       <w:r>
         <w:t xml:space="preserve"> </w:t>
@@ -572,19 +575,34 @@
         <w:rPr>
           <w:rStyle w:val="VerbatimChar"/>
         </w:rPr>
-        <w:t xml:space="preserve">nsubj:pass</w:t>
-      </w:r>
-      <w:r>
-        <w:t xml:space="preserve">), direct object (</w:t>
+        <w:t xml:space="preserve">xobj</w:t>
+      </w:r>
+      <w:r>
+        <w:t xml:space="preserve"> </w:t>
+      </w:r>
+      <w:r>
+        <w:t xml:space="preserve">and</w:t>
+      </w:r>
+      <w:r>
+        <w:t xml:space="preserve"> </w:t>
       </w:r>
       <w:r>
         <w:rPr>
           <w:rStyle w:val="VerbatimChar"/>
         </w:rPr>
+        <w:t xml:space="preserve">nonsub</w:t>
+      </w:r>
+      <w:r>
+        <w:t xml:space="preserve">), the direct object (</w:t>
+      </w:r>
+      <w:r>
+        <w:rPr>
+          <w:rStyle w:val="VerbatimChar"/>
+        </w:rPr>
         <w:t xml:space="preserve">obj</w:t>
       </w:r>
       <w:r>
-        <w:t xml:space="preserve">), indirect / oblique</w:t>
+        <w:t xml:space="preserve">), indirect and oblique</w:t>
       </w:r>
       <w:r>
         <w:t xml:space="preserve"> </w:t>
@@ -608,16 +626,25 @@
         <w:rPr>
           <w:rStyle w:val="VerbatimChar"/>
         </w:rPr>
-        <w:t xml:space="preserve">obl:arg</w:t>
-      </w:r>
-      <w:r>
-        <w:t xml:space="preserve">), voice (active / middle / passive), and aspect (perfective /</w:t>
-      </w:r>
-      <w:r>
-        <w:t xml:space="preserve"> </w:t>
-      </w:r>
-      <w:r>
-        <w:t xml:space="preserve">imperfective).</w:t>
+        <w:t xml:space="preserve">obl</w:t>
+      </w:r>
+      <w:r>
+        <w:t xml:space="preserve">), the vocative addressee (</w:t>
+      </w:r>
+      <w:r>
+        <w:rPr>
+          <w:rStyle w:val="VerbatimChar"/>
+        </w:rPr>
+        <w:t xml:space="preserve">voc</w:t>
+      </w:r>
+      <w:r>
+        <w:t xml:space="preserve">), the voice (active / middle / passive),</w:t>
+      </w:r>
+      <w:r>
+        <w:t xml:space="preserve"> </w:t>
+      </w:r>
+      <w:r>
+        <w:t xml:space="preserve">and the aspect (perfective / imperfective).</w:t>
       </w:r>
     </w:p>
     <w:bookmarkEnd w:id="20"/>
@@ -679,7 +706,7 @@
     </w:p>
     <w:bookmarkEnd w:id="21"/>
     <w:bookmarkEnd w:id="22"/>
-    <w:bookmarkStart w:id="30" w:name="dataset-description"/>
+    <w:bookmarkStart w:id="23" w:name="dataset-description"/>
     <w:p>
       <w:pPr>
         <w:pStyle w:val="Heading2"/>
@@ -691,7 +718,8 @@
     <w:tbl>
       <w:tblPr>
         <w:tblStyle w:val="Table"/>
-        <w:tblW w:type="auto" w:w="0"/>
+        <w:tblW w:type="pct" w:w="5000"/>
+        <w:tblLayout w:type="fixed"/>
         <w:tblLook w:firstRow="1" w:lastRow="0" w:firstColumn="0" w:lastColumn="0" w:noHBand="0" w:noVBand="0" w:val="0020"/>
       </w:tblPr>
       <w:tblGrid>
@@ -768,7 +796,7 @@
               <w:pStyle w:val="Compact"/>
             </w:pPr>
             <w:r>
-              <w:t xml:space="preserve">PROIEL XML 2.0 (primary); JSONL partitions</w:t>
+              <w:t xml:space="preserve">PROIEL XML 2.0 (primary); JSONL partitions; Neo4j alignment-graph dump; Qdrant vector store</w:t>
             </w:r>
           </w:p>
         </w:tc>
@@ -792,125 +820,309 @@
               <w:pStyle w:val="Compact"/>
             </w:pPr>
             <w:r>
-              <w:t xml:space="preserve">2025-09 o</w:t>
+              <w:t xml:space="preserve">2025-09 onwards; v0.4.0 minted 29 May 2026</w:t>
+            </w:r>
+          </w:p>
+        </w:tc>
+      </w:tr>
+      <w:tr>
+        <w:tc>
+          <w:tcPr/>
+          <w:p>
+            <w:pPr>
+              <w:pStyle w:val="Compact"/>
+            </w:pPr>
+            <w:r>
+              <w:t xml:space="preserve">Dataset creator</w:t>
+            </w:r>
+          </w:p>
+        </w:tc>
+        <w:tc>
+          <w:tcPr/>
+          <w:p>
+            <w:pPr>
+              <w:pStyle w:val="Compact"/>
+            </w:pPr>
+            <w:r>
+              <w:t xml:space="preserve">Lavidas, N., Nikiforidou, K., Haug, D., Kulikov, L., Geka, V., Symeonidis, V., Michalareas, T., Chionidi, S., Tsiropina, A., Plakoutsi, E., and Argyropoulos, E.</w:t>
+            </w:r>
+          </w:p>
+        </w:tc>
+      </w:tr>
+      <w:tr>
+        <w:tc>
+          <w:tcPr/>
+          <w:p>
+            <w:pPr>
+              <w:pStyle w:val="Compact"/>
+            </w:pPr>
+            <w:r>
+              <w:t xml:space="preserve">Languages</w:t>
+            </w:r>
+          </w:p>
+        </w:tc>
+        <w:tc>
+          <w:tcPr/>
+          <w:p>
+            <w:pPr>
+              <w:pStyle w:val="Compact"/>
+            </w:pPr>
+            <w:r>
+              <w:t xml:space="preserve">grc (Ancient Greek), gkm (Medieval Greek), ell (Modern Greek) + parallels in lat, got, chu, xcl; queued for v0.7: san, ang, ave, peo, ukr</w:t>
+            </w:r>
+          </w:p>
+        </w:tc>
+      </w:tr>
+      <w:tr>
+        <w:tc>
+          <w:tcPr/>
+          <w:p>
+            <w:pPr>
+              <w:pStyle w:val="Compact"/>
+            </w:pPr>
+            <w:r>
+              <w:t xml:space="preserve">Licence</w:t>
+            </w:r>
+          </w:p>
+        </w:tc>
+        <w:tc>
+          <w:tcPr/>
+          <w:p>
+            <w:pPr>
+              <w:pStyle w:val="Compact"/>
+            </w:pPr>
+            <w:r>
+              <w:t xml:space="preserve">Code Apache-2.0; metadata + alignments CC-BY-4.0; per-source raw text under its original licence</w:t>
+            </w:r>
+          </w:p>
+        </w:tc>
+      </w:tr>
+      <w:tr>
+        <w:tc>
+          <w:tcPr/>
+          <w:p>
+            <w:pPr>
+              <w:pStyle w:val="Compact"/>
+            </w:pPr>
+            <w:r>
+              <w:t xml:space="preserve">Repository</w:t>
+            </w:r>
+          </w:p>
+        </w:tc>
+        <w:tc>
+          <w:tcPr/>
+          <w:p>
+            <w:pPr>
+              <w:pStyle w:val="Compact"/>
+            </w:pPr>
+            <w:hyperlink r:id="rId10">
+              <w:r>
+                <w:rPr>
+                  <w:rStyle w:val="Hyperlink"/>
+                </w:rPr>
+                <w:t xml:space="preserve">https://github.com/AthDGC/Diachronic-Linguistics-Platform</w:t>
+              </w:r>
+            </w:hyperlink>
+          </w:p>
+        </w:tc>
+      </w:tr>
+      <w:tr>
+        <w:tc>
+          <w:tcPr/>
+          <w:p>
+            <w:pPr>
+              <w:pStyle w:val="Compact"/>
+            </w:pPr>
+            <w:r>
+              <w:t xml:space="preserve">Concept DOI</w:t>
+            </w:r>
+          </w:p>
+        </w:tc>
+        <w:tc>
+          <w:tcPr/>
+          <w:p>
+            <w:pPr>
+              <w:pStyle w:val="Compact"/>
+            </w:pPr>
+            <w:hyperlink r:id="rId12">
+              <w:r>
+                <w:rPr>
+                  <w:rStyle w:val="Hyperlink"/>
+                </w:rPr>
+                <w:t xml:space="preserve">10.5281/zenodo.20439182</w:t>
+              </w:r>
+            </w:hyperlink>
+          </w:p>
+        </w:tc>
+      </w:tr>
+      <w:tr>
+        <w:tc>
+          <w:tcPr/>
+          <w:p>
+            <w:pPr>
+              <w:pStyle w:val="Compact"/>
+            </w:pPr>
+            <w:r>
+              <w:t xml:space="preserve">Publication date</w:t>
+            </w:r>
+          </w:p>
+        </w:tc>
+        <w:tc>
+          <w:tcPr/>
+          <w:p>
+            <w:pPr>
+              <w:pStyle w:val="Compact"/>
+            </w:pPr>
+            <w:r>
+              <w:t xml:space="preserve">2026-05-29 (v0.4.0 source-code snapshot on Zenodo)</w:t>
+            </w:r>
+          </w:p>
+        </w:tc>
+      </w:tr>
+      <w:tr>
+        <w:tc>
+          <w:tcPr/>
+          <w:p>
+            <w:pPr>
+              <w:pStyle w:val="Compact"/>
+            </w:pPr>
+            <w:r>
+              <w:t xml:space="preserve">Release status</w:t>
+            </w:r>
+          </w:p>
+        </w:tc>
+        <w:tc>
+          <w:tcPr/>
+          <w:p>
+            <w:pPr>
+              <w:pStyle w:val="Compact"/>
+            </w:pPr>
+            <w:r>
+              <w:t xml:space="preserve">v0.4 is samples-only on the public site; full annotated partitions are under audit on GRNET ARIS and will ship at v0.5</w:t>
             </w:r>
           </w:p>
         </w:tc>
       </w:tr>
     </w:tbl>
-    <w:bookmarkStart w:id="29" w:name="refs"/>
-    <w:bookmarkStart w:id="23" w:name="ref-dou2021"/>
-    <w:p>
-      <w:pPr>
-        <w:pStyle w:val="Bibliography"/>
-      </w:pPr>
-      <w:r>
-        <w:t xml:space="preserve">Dou, Zi-Yi, and Graham Neubig. 2021.</w:t>
-      </w:r>
-      <w:r>
-        <w:t xml:space="preserve"> </w:t>
-      </w:r>
-      <w:r>
-        <w:t xml:space="preserve">“Word Alignment by Fine-Tuning Embeddings on Parallel Corpora.”</w:t>
-      </w:r>
-      <w:r>
-        <w:t xml:space="preserve"> </w:t>
+    <w:bookmarkEnd w:id="23"/>
+    <w:bookmarkStart w:id="25" w:name="reuse-potential"/>
+    <w:p>
+      <w:pPr>
+        <w:pStyle w:val="Heading2"/>
+      </w:pPr>
+      <w:r>
+        <w:t xml:space="preserve">4. Reuse potential</w:t>
+      </w:r>
+    </w:p>
+    <w:p>
+      <w:pPr>
+        <w:pStyle w:val="FirstParagraph"/>
+      </w:pPr>
+      <w:r>
+        <w:t xml:space="preserve">AthDGC supports four primary reuse classes:</w:t>
+      </w:r>
+    </w:p>
+    <w:p>
+      <w:pPr>
+        <w:numPr>
+          <w:ilvl w:val="0"/>
+          <w:numId w:val="1002"/>
+        </w:numPr>
+      </w:pPr>
+      <w:r>
+        <w:rPr>
+          <w:b/>
+          <w:bCs/>
+        </w:rPr>
+        <w:t xml:space="preserve">Historical syntactic research.</w:t>
+      </w:r>
+      <w:r>
+        <w:t xml:space="preserve"> </w:t>
+      </w:r>
+      <w:r>
+        <w:t xml:space="preserve">Per-period dependency parses allow analysts to track</w:t>
+      </w:r>
+      <w:r>
+        <w:t xml:space="preserve"> </w:t>
+      </w:r>
+      <w:r>
+        <w:t xml:space="preserve">argument-structure changes across three millennia of Greek (active-to-mediopassive shifts,</w:t>
+      </w:r>
+      <w:r>
+        <w:t xml:space="preserve"> </w:t>
+      </w:r>
+      <w:r>
+        <w:t xml:space="preserve">loss of optative, rise of periphrastic perfect, accusative-to-genitive variation under</w:t>
+      </w:r>
+      <w:r>
+        <w:t xml:space="preserve"> </w:t>
+      </w:r>
+      <w:r>
+        <w:t xml:space="preserve">verbs of perception, etc.). The colour-coded compact dependency overview on each sample is</w:t>
+      </w:r>
+      <w:r>
+        <w:t xml:space="preserve"> </w:t>
+      </w:r>
+      <w:r>
+        <w:t xml:space="preserve">designed for fast scanning of these patterns.</w:t>
+      </w:r>
+    </w:p>
+    <w:p>
+      <w:pPr>
+        <w:numPr>
+          <w:ilvl w:val="0"/>
+          <w:numId w:val="1002"/>
+        </w:numPr>
+      </w:pPr>
+      <w:r>
+        <w:rPr>
+          <w:b/>
+          <w:bCs/>
+        </w:rPr>
+        <w:t xml:space="preserve">Indo-European comparative syntax.</w:t>
+      </w:r>
+      <w:r>
+        <w:t xml:space="preserve"> </w:t>
+      </w:r>
+      <w:r>
+        <w:t xml:space="preserve">The verse-level cross-lingual alignment of the New</w:t>
+      </w:r>
+      <w:r>
+        <w:t xml:space="preserve"> </w:t>
+      </w:r>
+      <w:r>
+        <w:t xml:space="preserve">Testament to Latin (Vulgate), Gothic (Wulfila), Old Church Slavonic (Marianus), and</w:t>
+      </w:r>
+      <w:r>
+        <w:t xml:space="preserve"> </w:t>
+      </w:r>
+      <w:r>
+        <w:t xml:space="preserve">Classical Armenian provides aligned PROIEL parses across four sister IE languages, with</w:t>
+      </w:r>
+      <w:r>
+        <w:t xml:space="preserve"> </w:t>
+      </w:r>
+      <w:r>
+        <w:t xml:space="preserve">Sanskrit, Old English, Avestan, Old Persian, and Ukrainian queued at v0.7. Users can</w:t>
+      </w:r>
+      <w:r>
+        <w:t xml:space="preserve"> </w:t>
+      </w:r>
+      <w:r>
+        <w:t xml:space="preserve">query the Neo4j alignment graph for typological correspondences (e.g. </w:t>
       </w:r>
       <w:r>
         <w:rPr>
           <w:i/>
           <w:iCs/>
         </w:rPr>
-        <w:t xml:space="preserve">Proceedings of EACL 2021</w:t>
-      </w:r>
-      <w:r>
-        <w:t xml:space="preserve">.</w:t>
-      </w:r>
-    </w:p>
-    <w:bookmarkEnd w:id="23"/>
-    <w:bookmarkStart w:id="24" w:name="ref-eckhoff2018"/>
-    <w:p>
-      <w:pPr>
-        <w:pStyle w:val="Bibliography"/>
-      </w:pPr>
-      <w:r>
-        <w:t xml:space="preserve">Eckhoff, Hanne M., Kristin Bech, Gerlof Bouma, et al. 2018.</w:t>
-      </w:r>
-      <w:r>
-        <w:t xml:space="preserve"> </w:t>
-      </w:r>
-      <w:r>
-        <w:t xml:space="preserve">“The</w:t>
-      </w:r>
-      <w:r>
-        <w:t xml:space="preserve"> </w:t>
-      </w:r>
-      <w:r>
-        <w:t xml:space="preserve">PROIEL</w:t>
-      </w:r>
-      <w:r>
-        <w:t xml:space="preserve"> </w:t>
-      </w:r>
-      <w:r>
-        <w:t xml:space="preserve">Treebank Family: A Standard for Early Attestations of</w:t>
-      </w:r>
-      <w:r>
-        <w:t xml:space="preserve"> </w:t>
-      </w:r>
-      <w:r>
-        <w:t xml:space="preserve">Indo-European</w:t>
-      </w:r>
-      <w:r>
-        <w:t xml:space="preserve"> </w:t>
-      </w:r>
-      <w:r>
-        <w:t xml:space="preserve">Languages.”</w:t>
-      </w:r>
-      <w:r>
-        <w:t xml:space="preserve"> </w:t>
+        <w:t xml:space="preserve">every Greek aorist</w:t>
       </w:r>
       <w:r>
         <w:rPr>
           <w:i/>
           <w:iCs/>
         </w:rPr>
-        <w:t xml:space="preserve">Language Resources and Evaluation</w:t>
-      </w:r>
-      <w:r>
-        <w:t xml:space="preserve"> </w:t>
-      </w:r>
-      <w:r>
-        <w:t xml:space="preserve">52 (1): 29–65.</w:t>
-      </w:r>
-    </w:p>
-    <w:bookmarkEnd w:id="24"/>
-    <w:bookmarkStart w:id="25" w:name="ref-feng2022"/>
-    <w:p>
-      <w:pPr>
-        <w:pStyle w:val="Bibliography"/>
-      </w:pPr>
-      <w:r>
-        <w:t xml:space="preserve">Feng, Fangxiaoyu, Yinfei Yang, Daniel Cer, Naveen Arivazhagan, and Wei Wang. 2022.</w:t>
-      </w:r>
-      <w:r>
-        <w:t xml:space="preserve"> </w:t>
-      </w:r>
-      <w:r>
-        <w:t xml:space="preserve">“Language-Agnostic</w:t>
-      </w:r>
-      <w:r>
-        <w:t xml:space="preserve"> </w:t>
-      </w:r>
-      <w:r>
-        <w:t xml:space="preserve">BERT</w:t>
-      </w:r>
-      <w:r>
-        <w:t xml:space="preserve"> </w:t>
-      </w:r>
-      <w:r>
-        <w:t xml:space="preserve">Sentence Embedding.”</w:t>
-      </w:r>
-      <w:r>
         <w:t xml:space="preserve"> </w:t>
       </w:r>
       <w:r>
@@ -918,44 +1130,159 @@
           <w:i/>
           <w:iCs/>
         </w:rPr>
-        <w:t xml:space="preserve">Proceedings of ACL 2022</w:t>
-      </w:r>
-      <w:r>
-        <w:t xml:space="preserve">.</w:t>
-      </w:r>
-    </w:p>
-    <w:bookmarkEnd w:id="25"/>
-    <w:bookmarkStart w:id="26" w:name="ref-haug2008"/>
-    <w:p>
-      <w:pPr>
-        <w:pStyle w:val="Bibliography"/>
-      </w:pPr>
-      <w:r>
-        <w:t xml:space="preserve">Haug, Dag T. T., and Marius Jøhndal. 2008.</w:t>
-      </w:r>
-      <w:r>
-        <w:t xml:space="preserve"> </w:t>
-      </w:r>
-      <w:r>
-        <w:t xml:space="preserve">“Creating a Parallel Treebank of the Old</w:t>
-      </w:r>
-      <w:r>
-        <w:t xml:space="preserve"> </w:t>
-      </w:r>
-      <w:r>
-        <w:t xml:space="preserve">Indo-European</w:t>
-      </w:r>
-      <w:r>
-        <w:t xml:space="preserve"> </w:t>
-      </w:r>
-      <w:r>
-        <w:t xml:space="preserve">Bible</w:t>
-      </w:r>
-      <w:r>
-        <w:t xml:space="preserve"> </w:t>
-      </w:r>
-      <w:r>
-        <w:t xml:space="preserve">Translations.”</w:t>
+        <w:t xml:space="preserve">active verb whose Latin Vulgate counterpart is passive</w:t>
+      </w:r>
+      <w:r>
+        <w:t xml:space="preserve">).</w:t>
+      </w:r>
+    </w:p>
+    <w:p>
+      <w:pPr>
+        <w:numPr>
+          <w:ilvl w:val="0"/>
+          <w:numId w:val="1002"/>
+        </w:numPr>
+      </w:pPr>
+      <w:r>
+        <w:rPr>
+          <w:b/>
+          <w:bCs/>
+        </w:rPr>
+        <w:t xml:space="preserve">Computational diachronic NLP.</w:t>
+      </w:r>
+      <w:r>
+        <w:t xml:space="preserve"> </w:t>
+      </w:r>
+      <w:r>
+        <w:t xml:space="preserve">The fine-tuned Stanza checkpoints (</w:t>
+      </w:r>
+      <w:r>
+        <w:rPr>
+          <w:rStyle w:val="VerbatimChar"/>
+        </w:rPr>
+        <w:t xml:space="preserve">grc_byz_proiel</w:t>
+      </w:r>
+      <w:r>
+        <w:t xml:space="preserve">,</w:t>
+      </w:r>
+      <w:r>
+        <w:t xml:space="preserve"> </w:t>
+      </w:r>
+      <w:r>
+        <w:rPr>
+          <w:rStyle w:val="VerbatimChar"/>
+        </w:rPr>
+        <w:t xml:space="preserve">grc_lbem_proiel</w:t>
+      </w:r>
+      <w:r>
+        <w:t xml:space="preserve">,</w:t>
+      </w:r>
+      <w:r>
+        <w:t xml:space="preserve"> </w:t>
+      </w:r>
+      <w:r>
+        <w:rPr>
+          <w:rStyle w:val="VerbatimChar"/>
+        </w:rPr>
+        <w:t xml:space="preserve">grc_mod_proiel</w:t>
+      </w:r>
+      <w:r>
+        <w:t xml:space="preserve">) ship as Hugging Face model repos under</w:t>
+      </w:r>
+      <w:r>
+        <w:t xml:space="preserve"> </w:t>
+      </w:r>
+      <w:r>
+        <w:rPr>
+          <w:rStyle w:val="VerbatimChar"/>
+        </w:rPr>
+        <w:t xml:space="preserve">athdgc/*</w:t>
+      </w:r>
+      <w:r>
+        <w:t xml:space="preserve"> </w:t>
+      </w:r>
+      <w:r>
+        <w:t xml:space="preserve">and can be used directly for parsing new Greek diachronic data. The LightSIDE-AthDGC fork</w:t>
+      </w:r>
+      <w:r>
+        <w:t xml:space="preserve"> </w:t>
+      </w:r>
+      <w:r>
+        <w:t xml:space="preserve">extends LightSIDE to work on syntactic features (dependency arcs, argument-structure</w:t>
+      </w:r>
+      <w:r>
+        <w:t xml:space="preserve"> </w:t>
+      </w:r>
+      <w:r>
+        <w:t xml:space="preserve">frames, morphology bundles), opening a new feature space for classification of</w:t>
+      </w:r>
+      <w:r>
+        <w:t xml:space="preserve"> </w:t>
+      </w:r>
+      <w:r>
+        <w:t xml:space="preserve">diachronic stages.</w:t>
+      </w:r>
+    </w:p>
+    <w:p>
+      <w:pPr>
+        <w:numPr>
+          <w:ilvl w:val="0"/>
+          <w:numId w:val="1002"/>
+        </w:numPr>
+      </w:pPr>
+      <w:r>
+        <w:rPr>
+          <w:b/>
+          <w:bCs/>
+        </w:rPr>
+        <w:t xml:space="preserve">Digital editions + pedagogy.</w:t>
+      </w:r>
+      <w:r>
+        <w:t xml:space="preserve"> </w:t>
+      </w:r>
+      <w:r>
+        <w:t xml:space="preserve">The showcase generator (</w:t>
+      </w:r>
+      <w:r>
+        <w:rPr>
+          <w:rStyle w:val="VerbatimChar"/>
+        </w:rPr>
+        <w:t xml:space="preserve">51_build_showcase_site.py</w:t>
+      </w:r>
+      <w:r>
+        <w:t xml:space="preserve">)</w:t>
+      </w:r>
+      <w:r>
+        <w:t xml:space="preserve"> </w:t>
+      </w:r>
+      <w:r>
+        <w:t xml:space="preserve">produces browsable per-sample PROIEL trees from any JSONL corpus; the Quarto template</w:t>
+      </w:r>
+      <w:r>
+        <w:t xml:space="preserve"> </w:t>
+      </w:r>
+      <w:r>
+        <w:t xml:space="preserve">pack generates the whole multi-output site (HTML, Reveal.js slides, .docx, .pptx,</w:t>
+      </w:r>
+      <w:r>
+        <w:t xml:space="preserve"> </w:t>
+      </w:r>
+      <w:r>
+        <w:t xml:space="preserve">Beamer, A0 poster) from a single source. Both are open-source and reusable by other</w:t>
+      </w:r>
+      <w:r>
+        <w:t xml:space="preserve"> </w:t>
+      </w:r>
+      <w:r>
+        <w:t xml:space="preserve">historical-treebank projects.</w:t>
+      </w:r>
+    </w:p>
+    <w:p>
+      <w:pPr>
+        <w:pStyle w:val="FirstParagraph"/>
+      </w:pPr>
+      <w:r>
+        <w:t xml:space="preserve">The platform is taught as a KEDIVIM continuing-education course at NKUA:</w:t>
       </w:r>
       <w:r>
         <w:t xml:space="preserve"> </w:t>
@@ -965,75 +1292,13 @@
           <w:i/>
           <w:iCs/>
         </w:rPr>
-        <w:t xml:space="preserve">Proceedings of the Second Workshop on Language Technology for Cultural Heritage Data (LaTeCH 2008)</w:t>
-      </w:r>
-      <w:r>
-        <w:t xml:space="preserve">.</w:t>
-      </w:r>
-    </w:p>
-    <w:bookmarkEnd w:id="26"/>
-    <w:bookmarkStart w:id="27" w:name="ref-list2014"/>
-    <w:p>
-      <w:pPr>
-        <w:pStyle w:val="Bibliography"/>
-      </w:pPr>
-      <w:r>
-        <w:t xml:space="preserve">List, Johann-Mattis. 2014.</w:t>
-      </w:r>
-      <w:r>
-        <w:t xml:space="preserve"> </w:t>
+        <w:t xml:space="preserve">Ψηφιακά Εργαλεία</w:t>
       </w:r>
       <w:r>
         <w:rPr>
           <w:i/>
           <w:iCs/>
         </w:rPr>
-        <w:t xml:space="preserve">Sequence Comparison in Historical Linguistics</w:t>
-      </w:r>
-      <w:r>
-        <w:t xml:space="preserve">. D</w:t>
-      </w:r>
-      <w:r>
-        <w:t xml:space="preserve">ü</w:t>
-      </w:r>
-      <w:r>
-        <w:t xml:space="preserve">sseldorf University Press.</w:t>
-      </w:r>
-    </w:p>
-    <w:bookmarkEnd w:id="27"/>
-    <w:bookmarkStart w:id="28" w:name="ref-qi2020"/>
-    <w:p>
-      <w:pPr>
-        <w:pStyle w:val="Bibliography"/>
-      </w:pPr>
-      <w:r>
-        <w:t xml:space="preserve">Qi, Peng, Yuhao Zhang, Yuhui Zhang, Jason Bolton, and Christopher D. Manning. 2020.</w:t>
-      </w:r>
-      <w:r>
-        <w:t xml:space="preserve"> </w:t>
-      </w:r>
-      <w:r>
-        <w:t xml:space="preserve">“</w:t>
-      </w:r>
-      <w:r>
-        <w:t xml:space="preserve">Stanza</w:t>
-      </w:r>
-      <w:r>
-        <w:t xml:space="preserve">: A</w:t>
-      </w:r>
-      <w:r>
-        <w:t xml:space="preserve"> </w:t>
-      </w:r>
-      <w:r>
-        <w:t xml:space="preserve">Python</w:t>
-      </w:r>
-      <w:r>
-        <w:t xml:space="preserve"> </w:t>
-      </w:r>
-      <w:r>
-        <w:t xml:space="preserve">Natural Language Processing Toolkit for Many Human Languages.”</w:t>
-      </w:r>
-      <w:r>
         <w:t xml:space="preserve"> </w:t>
       </w:r>
       <w:r>
@@ -1041,15 +1306,606 @@
           <w:i/>
           <w:iCs/>
         </w:rPr>
+        <w:t xml:space="preserve">για τη Διαχρονική Ανάλυση της Γλώσσας / Digital Tools for the Diachronic Analysis of</w:t>
+      </w:r>
+      <w:r>
+        <w:rPr>
+          <w:i/>
+          <w:iCs/>
+        </w:rPr>
+        <w:t xml:space="preserve"> </w:t>
+      </w:r>
+      <w:r>
+        <w:rPr>
+          <w:i/>
+          <w:iCs/>
+        </w:rPr>
+        <w:t xml:space="preserve">Language</w:t>
+      </w:r>
+      <w:r>
+        <w:t xml:space="preserve">, autumn 2026. See</w:t>
+      </w:r>
+      <w:r>
+        <w:t xml:space="preserve"> </w:t>
+      </w:r>
+      <w:hyperlink r:id="rId24">
+        <w:r>
+          <w:rPr>
+            <w:rStyle w:val="Hyperlink"/>
+          </w:rPr>
+          <w:t xml:space="preserve">https://athdgc.github.io/training.html</w:t>
+        </w:r>
+      </w:hyperlink>
+      <w:r>
+        <w:t xml:space="preserve">.</w:t>
+      </w:r>
+    </w:p>
+    <w:bookmarkEnd w:id="25"/>
+    <w:bookmarkStart w:id="27" w:name="access-format"/>
+    <w:p>
+      <w:pPr>
+        <w:pStyle w:val="Heading2"/>
+      </w:pPr>
+      <w:r>
+        <w:t xml:space="preserve">5. Access + format</w:t>
+      </w:r>
+    </w:p>
+    <w:p>
+      <w:pPr>
+        <w:pStyle w:val="FirstParagraph"/>
+      </w:pPr>
+      <w:r>
+        <w:t xml:space="preserve">The public site at</w:t>
+      </w:r>
+      <w:r>
+        <w:t xml:space="preserve"> </w:t>
+      </w:r>
+      <w:hyperlink r:id="rId11">
+        <w:r>
+          <w:rPr>
+            <w:rStyle w:val="Hyperlink"/>
+          </w:rPr>
+          <w:t xml:space="preserve">https://athdgc.github.io</w:t>
+        </w:r>
+      </w:hyperlink>
+      <w:r>
+        <w:t xml:space="preserve"> </w:t>
+      </w:r>
+      <w:r>
+        <w:t xml:space="preserve">ships</w:t>
+      </w:r>
+      <w:r>
+        <w:t xml:space="preserve"> </w:t>
+      </w:r>
+      <w:r>
+        <w:rPr>
+          <w:b/>
+          <w:bCs/>
+        </w:rPr>
+        <w:t xml:space="preserve">curated samples only</w:t>
+      </w:r>
+      <w:r>
+        <w:t xml:space="preserve"> </w:t>
+      </w:r>
+      <w:r>
+        <w:t xml:space="preserve">for the v0.4</w:t>
+      </w:r>
+      <w:r>
+        <w:t xml:space="preserve"> </w:t>
+      </w:r>
+      <w:r>
+        <w:t xml:space="preserve">release. The full annotated corpus partitions remain under audit on the GRNET ARIS national</w:t>
+      </w:r>
+      <w:r>
+        <w:t xml:space="preserve"> </w:t>
+      </w:r>
+      <w:r>
+        <w:t xml:space="preserve">HPC under allocation</w:t>
+      </w:r>
+      <w:r>
+        <w:t xml:space="preserve"> </w:t>
+      </w:r>
+      <w:r>
+        <w:rPr>
+          <w:rStyle w:val="VerbatimChar"/>
+        </w:rPr>
+        <w:t xml:space="preserve">pa260305</w:t>
+      </w:r>
+      <w:r>
+        <w:t xml:space="preserve">; they will ship at v0.5 as a separate Zenodo dataset record</w:t>
+      </w:r>
+      <w:r>
+        <w:t xml:space="preserve"> </w:t>
+      </w:r>
+      <w:r>
+        <w:t xml:space="preserve">under CC-BY-4.0. The source-code snapshot at the v0.4.0 Zenodo record is Apache-2.0.</w:t>
+      </w:r>
+    </w:p>
+    <w:p>
+      <w:pPr>
+        <w:pStyle w:val="BodyText"/>
+      </w:pPr>
+      <w:r>
+        <w:t xml:space="preserve">The platform’s nine open-source tools (LightSIDE-AthDGC for syntax, NoSketch-style</w:t>
+      </w:r>
+      <w:r>
+        <w:t xml:space="preserve"> </w:t>
+      </w:r>
+      <w:r>
+        <w:t xml:space="preserve">concordancer, fine-tuned Stanza checkpoints, PROIEL XML 2.0 exporter, corpus-fix toolkit,</w:t>
+      </w:r>
+      <w:r>
+        <w:t xml:space="preserve"> </w:t>
+      </w:r>
+      <w:r>
+        <w:t xml:space="preserve">argument-structure extractor, cross-lingual alignment viewer, showcase generator, Quarto</w:t>
+      </w:r>
+      <w:r>
+        <w:t xml:space="preserve"> </w:t>
+      </w:r>
+      <w:r>
+        <w:t xml:space="preserve">template pack) are released and usable now. See</w:t>
+      </w:r>
+      <w:r>
+        <w:t xml:space="preserve"> </w:t>
+      </w:r>
+      <w:hyperlink r:id="rId26">
+        <w:r>
+          <w:rPr>
+            <w:rStyle w:val="Hyperlink"/>
+          </w:rPr>
+          <w:t xml:space="preserve">https://athdgc.github.io/tools.html</w:t>
+        </w:r>
+      </w:hyperlink>
+      <w:r>
+        <w:t xml:space="preserve">.</w:t>
+      </w:r>
+    </w:p>
+    <w:bookmarkEnd w:id="27"/>
+    <w:bookmarkStart w:id="28" w:name="acknowledgements"/>
+    <w:p>
+      <w:pPr>
+        <w:pStyle w:val="Heading2"/>
+      </w:pPr>
+      <w:r>
+        <w:t xml:space="preserve">6. Acknowledgements</w:t>
+      </w:r>
+    </w:p>
+    <w:p>
+      <w:pPr>
+        <w:pStyle w:val="FirstParagraph"/>
+      </w:pPr>
+      <w:r>
+        <w:t xml:space="preserve">Funded by the</w:t>
+      </w:r>
+      <w:r>
+        <w:t xml:space="preserve"> </w:t>
+      </w:r>
+      <w:r>
+        <w:rPr>
+          <w:b/>
+          <w:bCs/>
+        </w:rPr>
+        <w:t xml:space="preserve">Hellenic Foundation for Research and Innovation (HFRI)</w:t>
+      </w:r>
+      <w:r>
+        <w:t xml:space="preserve"> </w:t>
+      </w:r>
+      <w:r>
+        <w:t xml:space="preserve">under the 3rd Call</w:t>
+      </w:r>
+      <w:r>
+        <w:t xml:space="preserve"> </w:t>
+      </w:r>
+      <w:r>
+        <w:t xml:space="preserve">for HFRI Research Projects to support Post-Doctoral Researchers,</w:t>
+      </w:r>
+      <w:r>
+        <w:t xml:space="preserve"> </w:t>
+      </w:r>
+      <w:r>
+        <w:rPr>
+          <w:b/>
+          <w:bCs/>
+        </w:rPr>
+        <w:t xml:space="preserve">Project No. 20577</w:t>
+      </w:r>
+      <w:r>
+        <w:t xml:space="preserve">;</w:t>
+      </w:r>
+      <w:r>
+        <w:t xml:space="preserve"> </w:t>
+      </w:r>
+      <w:r>
+        <w:t xml:space="preserve">with complementary support from the</w:t>
+      </w:r>
+      <w:r>
+        <w:t xml:space="preserve"> </w:t>
+      </w:r>
+      <w:r>
+        <w:rPr>
+          <w:b/>
+          <w:bCs/>
+        </w:rPr>
+        <w:t xml:space="preserve">Greece 2.0 National Recovery and Resilience Plan</w:t>
+      </w:r>
+      <w:r>
+        <w:t xml:space="preserve">.</w:t>
+      </w:r>
+      <w:r>
+        <w:t xml:space="preserve"> </w:t>
+      </w:r>
+      <w:r>
+        <w:t xml:space="preserve">Compute supplied by</w:t>
+      </w:r>
+      <w:r>
+        <w:t xml:space="preserve"> </w:t>
+      </w:r>
+      <w:r>
+        <w:rPr>
+          <w:b/>
+          <w:bCs/>
+        </w:rPr>
+        <w:t xml:space="preserve">GRNET ARIS</w:t>
+      </w:r>
+      <w:r>
+        <w:t xml:space="preserve"> </w:t>
+      </w:r>
+      <w:r>
+        <w:t xml:space="preserve">(Greek national HPC), allocation</w:t>
+      </w:r>
+      <w:r>
+        <w:t xml:space="preserve"> </w:t>
+      </w:r>
+      <w:r>
+        <w:rPr>
+          <w:rStyle w:val="VerbatimChar"/>
+        </w:rPr>
+        <w:t xml:space="preserve">pa260305</w:t>
+      </w:r>
+      <w:r>
+        <w:t xml:space="preserve">.</w:t>
+      </w:r>
+    </w:p>
+    <w:p>
+      <w:pPr>
+        <w:pStyle w:val="BodyText"/>
+      </w:pPr>
+      <w:r>
+        <w:t xml:space="preserve">Funded project:</w:t>
+      </w:r>
+      <w:r>
+        <w:t xml:space="preserve"> </w:t>
+      </w:r>
+      <w:r>
+        <w:rPr>
+          <w:b/>
+          <w:bCs/>
+        </w:rPr>
+        <w:t xml:space="preserve">CVL-CDSAML</w:t>
+      </w:r>
+      <w:r>
+        <w:t xml:space="preserve"> </w:t>
+      </w:r>
+      <w:r>
+        <w:t xml:space="preserve">-</w:t>
+      </w:r>
+      <w:r>
+        <w:t xml:space="preserve"> </w:t>
+      </w:r>
+      <w:r>
+        <w:rPr>
+          <w:i/>
+          <w:iCs/>
+        </w:rPr>
+        <w:t xml:space="preserve">A Corpus-based Valency Lexicon for a Contrastive and</w:t>
+      </w:r>
+      <w:r>
+        <w:rPr>
+          <w:i/>
+          <w:iCs/>
+        </w:rPr>
+        <w:t xml:space="preserve"> </w:t>
+      </w:r>
+      <w:r>
+        <w:rPr>
+          <w:i/>
+          <w:iCs/>
+        </w:rPr>
+        <w:t xml:space="preserve">Diachronic Study of Ancient and Medieval Languages</w:t>
+      </w:r>
+      <w:r>
+        <w:t xml:space="preserve">.</w:t>
+      </w:r>
+    </w:p>
+    <w:p>
+      <w:pPr>
+        <w:pStyle w:val="BodyText"/>
+      </w:pPr>
+      <w:r>
+        <w:t xml:space="preserve">Team: Prof. Nikolaos Lavidas (PI, NKUA), Prof. Emerita Kiki Nikiforidou (NKUA), Prof. Dag</w:t>
+      </w:r>
+      <w:r>
+        <w:t xml:space="preserve"> </w:t>
+      </w:r>
+      <w:r>
+        <w:t xml:space="preserve">Haug (Oslo, PROIEL Director), Prof. Leonid Kulikov (Ghent), Dr. Vassiliki Geka (NKUA),</w:t>
+      </w:r>
+      <w:r>
+        <w:t xml:space="preserve"> </w:t>
+      </w:r>
+      <w:r>
+        <w:t xml:space="preserve">Dr. Vassileios Symeonidis (NKUA), Dr. Theodoros Michalareas (NKUA), Sofia Chionidi (NKUA),</w:t>
+      </w:r>
+      <w:r>
+        <w:t xml:space="preserve"> </w:t>
+      </w:r>
+      <w:r>
+        <w:t xml:space="preserve">Anastasia Tsiropina (NKUA), Eleni Plakoutsi (NKUA), Evangelos Argyropoulos (NKUA).</w:t>
+      </w:r>
+    </w:p>
+    <w:bookmarkEnd w:id="28"/>
+    <w:bookmarkStart w:id="36" w:name="references"/>
+    <w:p>
+      <w:pPr>
+        <w:pStyle w:val="Heading2"/>
+      </w:pPr>
+      <w:r>
+        <w:t xml:space="preserve">References</w:t>
+      </w:r>
+    </w:p>
+    <w:bookmarkStart w:id="35" w:name="refs"/>
+    <w:bookmarkStart w:id="29" w:name="ref-dou2021"/>
+    <w:p>
+      <w:pPr>
+        <w:pStyle w:val="Bibliography"/>
+      </w:pPr>
+      <w:r>
+        <w:t xml:space="preserve">Dou, Zi-Yi, and Graham Neubig. 2021.</w:t>
+      </w:r>
+      <w:r>
+        <w:t xml:space="preserve"> </w:t>
+      </w:r>
+      <w:r>
+        <w:t xml:space="preserve">“Word Alignment by Fine-Tuning Embeddings on Parallel Corpora.”</w:t>
+      </w:r>
+      <w:r>
+        <w:t xml:space="preserve"> </w:t>
+      </w:r>
+      <w:r>
+        <w:rPr>
+          <w:i/>
+          <w:iCs/>
+        </w:rPr>
+        <w:t xml:space="preserve">Proceedings of EACL 2021</w:t>
+      </w:r>
+      <w:r>
+        <w:t xml:space="preserve">.</w:t>
+      </w:r>
+    </w:p>
+    <w:bookmarkEnd w:id="29"/>
+    <w:bookmarkStart w:id="30" w:name="ref-eckhoff2018"/>
+    <w:p>
+      <w:pPr>
+        <w:pStyle w:val="Bibliography"/>
+      </w:pPr>
+      <w:r>
+        <w:t xml:space="preserve">Eckhoff, Hanne M., Kristin Bech, Gerlof Bouma, et al. 2018.</w:t>
+      </w:r>
+      <w:r>
+        <w:t xml:space="preserve"> </w:t>
+      </w:r>
+      <w:r>
+        <w:t xml:space="preserve">“The</w:t>
+      </w:r>
+      <w:r>
+        <w:t xml:space="preserve"> </w:t>
+      </w:r>
+      <w:r>
+        <w:t xml:space="preserve">PROIEL</w:t>
+      </w:r>
+      <w:r>
+        <w:t xml:space="preserve"> </w:t>
+      </w:r>
+      <w:r>
+        <w:t xml:space="preserve">Treebank Family: A Standard for Early Attestations of</w:t>
+      </w:r>
+      <w:r>
+        <w:t xml:space="preserve"> </w:t>
+      </w:r>
+      <w:r>
+        <w:t xml:space="preserve">Indo-European</w:t>
+      </w:r>
+      <w:r>
+        <w:t xml:space="preserve"> </w:t>
+      </w:r>
+      <w:r>
+        <w:t xml:space="preserve">Languages.”</w:t>
+      </w:r>
+      <w:r>
+        <w:t xml:space="preserve"> </w:t>
+      </w:r>
+      <w:r>
+        <w:rPr>
+          <w:i/>
+          <w:iCs/>
+        </w:rPr>
+        <w:t xml:space="preserve">Language Resources and Evaluation</w:t>
+      </w:r>
+      <w:r>
+        <w:t xml:space="preserve"> </w:t>
+      </w:r>
+      <w:r>
+        <w:t xml:space="preserve">52 (1): 29–65.</w:t>
+      </w:r>
+    </w:p>
+    <w:bookmarkEnd w:id="30"/>
+    <w:bookmarkStart w:id="31" w:name="ref-feng2022"/>
+    <w:p>
+      <w:pPr>
+        <w:pStyle w:val="Bibliography"/>
+      </w:pPr>
+      <w:r>
+        <w:t xml:space="preserve">Feng, Fangxiaoyu, Yinfei Yang, Daniel Cer, Naveen Arivazhagan, and Wei Wang. 2022.</w:t>
+      </w:r>
+      <w:r>
+        <w:t xml:space="preserve"> </w:t>
+      </w:r>
+      <w:r>
+        <w:t xml:space="preserve">“Language-Agnostic</w:t>
+      </w:r>
+      <w:r>
+        <w:t xml:space="preserve"> </w:t>
+      </w:r>
+      <w:r>
+        <w:t xml:space="preserve">BERT</w:t>
+      </w:r>
+      <w:r>
+        <w:t xml:space="preserve"> </w:t>
+      </w:r>
+      <w:r>
+        <w:t xml:space="preserve">Sentence Embedding.”</w:t>
+      </w:r>
+      <w:r>
+        <w:t xml:space="preserve"> </w:t>
+      </w:r>
+      <w:r>
+        <w:rPr>
+          <w:i/>
+          <w:iCs/>
+        </w:rPr>
+        <w:t xml:space="preserve">Proceedings of ACL 2022</w:t>
+      </w:r>
+      <w:r>
+        <w:t xml:space="preserve">.</w:t>
+      </w:r>
+    </w:p>
+    <w:bookmarkEnd w:id="31"/>
+    <w:bookmarkStart w:id="32" w:name="ref-haug2008"/>
+    <w:p>
+      <w:pPr>
+        <w:pStyle w:val="Bibliography"/>
+      </w:pPr>
+      <w:r>
+        <w:t xml:space="preserve">Haug, Dag T. T., and Marius Jøhndal. 2008.</w:t>
+      </w:r>
+      <w:r>
+        <w:t xml:space="preserve"> </w:t>
+      </w:r>
+      <w:r>
+        <w:t xml:space="preserve">“Creating a Parallel Treebank of the Old</w:t>
+      </w:r>
+      <w:r>
+        <w:t xml:space="preserve"> </w:t>
+      </w:r>
+      <w:r>
+        <w:t xml:space="preserve">Indo-European</w:t>
+      </w:r>
+      <w:r>
+        <w:t xml:space="preserve"> </w:t>
+      </w:r>
+      <w:r>
+        <w:t xml:space="preserve">Bible</w:t>
+      </w:r>
+      <w:r>
+        <w:t xml:space="preserve"> </w:t>
+      </w:r>
+      <w:r>
+        <w:t xml:space="preserve">Translations.”</w:t>
+      </w:r>
+      <w:r>
+        <w:t xml:space="preserve"> </w:t>
+      </w:r>
+      <w:r>
+        <w:rPr>
+          <w:i/>
+          <w:iCs/>
+        </w:rPr>
+        <w:t xml:space="preserve">Proceedings of the Second Workshop on Language Technology for Cultural Heritage Data (LaTeCH 2008)</w:t>
+      </w:r>
+      <w:r>
+        <w:t xml:space="preserve">.</w:t>
+      </w:r>
+    </w:p>
+    <w:bookmarkEnd w:id="32"/>
+    <w:bookmarkStart w:id="33" w:name="ref-list2014"/>
+    <w:p>
+      <w:pPr>
+        <w:pStyle w:val="Bibliography"/>
+      </w:pPr>
+      <w:r>
+        <w:t xml:space="preserve">List, Johann-Mattis. 2014.</w:t>
+      </w:r>
+      <w:r>
+        <w:t xml:space="preserve"> </w:t>
+      </w:r>
+      <w:r>
+        <w:rPr>
+          <w:i/>
+          <w:iCs/>
+        </w:rPr>
+        <w:t xml:space="preserve">Sequence Comparison in Historical Linguistics</w:t>
+      </w:r>
+      <w:r>
+        <w:t xml:space="preserve">. D</w:t>
+      </w:r>
+      <w:r>
+        <w:t xml:space="preserve">ü</w:t>
+      </w:r>
+      <w:r>
+        <w:t xml:space="preserve">sseldorf University Press.</w:t>
+      </w:r>
+    </w:p>
+    <w:bookmarkEnd w:id="33"/>
+    <w:bookmarkStart w:id="34" w:name="ref-qi2020"/>
+    <w:p>
+      <w:pPr>
+        <w:pStyle w:val="Bibliography"/>
+      </w:pPr>
+      <w:r>
+        <w:t xml:space="preserve">Qi, Peng, Yuhao Zhang, Yuhui Zhang, Jason Bolton, and Christopher D. Manning. 2020.</w:t>
+      </w:r>
+      <w:r>
+        <w:t xml:space="preserve"> </w:t>
+      </w:r>
+      <w:r>
+        <w:t xml:space="preserve">“</w:t>
+      </w:r>
+      <w:r>
+        <w:t xml:space="preserve">Stanza</w:t>
+      </w:r>
+      <w:r>
+        <w:t xml:space="preserve">: A</w:t>
+      </w:r>
+      <w:r>
+        <w:t xml:space="preserve"> </w:t>
+      </w:r>
+      <w:r>
+        <w:t xml:space="preserve">Python</w:t>
+      </w:r>
+      <w:r>
+        <w:t xml:space="preserve"> </w:t>
+      </w:r>
+      <w:r>
+        <w:t xml:space="preserve">Natural Language Processing Toolkit for Many Human Languages.”</w:t>
+      </w:r>
+      <w:r>
+        <w:t xml:space="preserve"> </w:t>
+      </w:r>
+      <w:r>
+        <w:rPr>
+          <w:i/>
+          <w:iCs/>
+        </w:rPr>
         <w:t xml:space="preserve">Proceedings of ACL 2020</w:t>
       </w:r>
       <w:r>
         <w:t xml:space="preserve">.</w:t>
       </w:r>
     </w:p>
-    <w:bookmarkEnd w:id="28"/>
-    <w:bookmarkEnd w:id="29"/>
-    <w:bookmarkEnd w:id="30"/>
+    <w:bookmarkEnd w:id="34"/>
+    <w:bookmarkEnd w:id="35"/>
+    <w:bookmarkEnd w:id="36"/>
     <w:sectPr>
       <w:footnotePr>
         <w:numRestart w:val="eachSect"/>
@@ -1263,11 +2119,126 @@
       </w:rPr>
     </w:lvl>
   </w:abstractNum>
+  <w:abstractNum w:abstractNumId="99411">
+    <w:nsid w:val="00A99411"/>
+    <w:multiLevelType w:val="multilevel"/>
+    <w:lvl w:ilvl="0">
+      <w:start w:val="1"/>
+      <w:numFmt w:val="decimal"/>
+      <w:lvlText w:val="%1."/>
+      <w:lvlJc w:val="left"/>
+      <w:pPr>
+        <w:ind w:left="720" w:hanging="360"/>
+      </w:pPr>
+    </w:lvl>
+    <w:lvl w:ilvl="1">
+      <w:start w:val="1"/>
+      <w:numFmt w:val="decimal"/>
+      <w:lvlText w:val="%2."/>
+      <w:lvlJc w:val="left"/>
+      <w:pPr>
+        <w:ind w:left="1440" w:hanging="360"/>
+      </w:pPr>
+    </w:lvl>
+    <w:lvl w:ilvl="2">
+      <w:start w:val="1"/>
+      <w:numFmt w:val="decimal"/>
+      <w:lvlText w:val="%3."/>
+      <w:lvlJc w:val="left"/>
+      <w:pPr>
+        <w:ind w:left="2160" w:hanging="360"/>
+      </w:pPr>
+    </w:lvl>
+    <w:lvl w:ilvl="3">
+      <w:start w:val="1"/>
+      <w:numFmt w:val="decimal"/>
+      <w:lvlText w:val="%4."/>
+      <w:lvlJc w:val="left"/>
+      <w:pPr>
+        <w:ind w:left="2880" w:hanging="360"/>
+      </w:pPr>
+    </w:lvl>
+    <w:lvl w:ilvl="4">
+      <w:start w:val="1"/>
+      <w:numFmt w:val="decimal"/>
+      <w:lvlText w:val="%5."/>
+      <w:lvlJc w:val="left"/>
+      <w:pPr>
+        <w:ind w:left="3600" w:hanging="360"/>
+      </w:pPr>
+    </w:lvl>
+    <w:lvl w:ilvl="5">
+      <w:start w:val="1"/>
+      <w:numFmt w:val="decimal"/>
+      <w:lvlText w:val="%6."/>
+      <w:lvlJc w:val="left"/>
+      <w:pPr>
+        <w:ind w:left="4320" w:hanging="360"/>
+      </w:pPr>
+    </w:lvl>
+    <w:lvl w:ilvl="6">
+      <w:start w:val="1"/>
+      <w:numFmt w:val="decimal"/>
+      <w:lvlText w:val="%7."/>
+      <w:lvlJc w:val="left"/>
+      <w:pPr>
+        <w:ind w:left="5040" w:hanging="360"/>
+      </w:pPr>
+    </w:lvl>
+    <w:lvl w:ilvl="7">
+      <w:start w:val="1"/>
+      <w:numFmt w:val="decimal"/>
+      <w:lvlText w:val="%8."/>
+      <w:lvlJc w:val="left"/>
+      <w:pPr>
+        <w:ind w:left="5760" w:hanging="360"/>
+      </w:pPr>
+    </w:lvl>
+    <w:lvl w:ilvl="8">
+      <w:start w:val="1"/>
+      <w:numFmt w:val="decimal"/>
+      <w:lvlText w:val="%9."/>
+      <w:lvlJc w:val="left"/>
+      <w:pPr>
+        <w:ind w:left="6480" w:hanging="360"/>
+      </w:pPr>
+    </w:lvl>
+  </w:abstractNum>
   <w:num w:numId="1000">
     <w:abstractNumId w:val="990"/>
   </w:num>
   <w:num w:numId="1001">
     <w:abstractNumId w:val="991"/>
+  </w:num>
+  <w:num w:numId="1002">
+    <w:abstractNumId w:val="99411"/>
+    <w:lvlOverride w:ilvl="0">
+      <w:startOverride w:val="1"/>
+    </w:lvlOverride>
+    <w:lvlOverride w:ilvl="1">
+      <w:startOverride w:val="1"/>
+    </w:lvlOverride>
+    <w:lvlOverride w:ilvl="2">
+      <w:startOverride w:val="1"/>
+    </w:lvlOverride>
+    <w:lvlOverride w:ilvl="3">
+      <w:startOverride w:val="1"/>
+    </w:lvlOverride>
+    <w:lvlOverride w:ilvl="4">
+      <w:startOverride w:val="1"/>
+    </w:lvlOverride>
+    <w:lvlOverride w:ilvl="5">
+      <w:startOverride w:val="1"/>
+    </w:lvlOverride>
+    <w:lvlOverride w:ilvl="6">
+      <w:startOverride w:val="1"/>
+    </w:lvlOverride>
+    <w:lvlOverride w:ilvl="7">
+      <w:startOverride w:val="1"/>
+    </w:lvlOverride>
+    <w:lvlOverride w:ilvl="8">
+      <w:startOverride w:val="1"/>
+    </w:lvlOverride>
   </w:num>
 </w:numbering>
 </file>

</xml_diff>

<commit_message>
AthDGC site update 2026-06-03 22:46 --- clean Quarto render, real Zenodo DOI 10.5281/zenodo.20439182, samples-only public release
</commit_message>
<xml_diff>
--- a/data_paper.docx
+++ b/data_paper.docx
@@ -706,7 +706,7 @@
     </w:p>
     <w:bookmarkEnd w:id="21"/>
     <w:bookmarkEnd w:id="22"/>
-    <w:bookmarkStart w:id="23" w:name="dataset-description"/>
+    <w:bookmarkStart w:id="29" w:name="dataset-description"/>
     <w:p>
       <w:pPr>
         <w:pStyle w:val="Heading2"/>
@@ -1004,8 +1004,2782 @@
         </w:tc>
       </w:tr>
     </w:tbl>
+    <w:bookmarkStart w:id="25" w:name="open-access-source-provenance"/>
+    <w:p>
+      <w:pPr>
+        <w:pStyle w:val="Heading3"/>
+      </w:pPr>
+      <w:r>
+        <w:t xml:space="preserve">3.1 Open-access source provenance</w:t>
+      </w:r>
+    </w:p>
+    <w:p>
+      <w:pPr>
+        <w:pStyle w:val="FirstParagraph"/>
+      </w:pPr>
+      <w:r>
+        <w:t xml:space="preserve">Every primary source text in AthDGC is open-access (public domain, CC-BY, CC-BY-SA, or</w:t>
+      </w:r>
+      <w:r>
+        <w:t xml:space="preserve"> </w:t>
+      </w:r>
+      <w:r>
+        <w:t xml:space="preserve">equivalent). The annotation layer is AthDGC-original and released under CC-BY-4.0. The</w:t>
+      </w:r>
+      <w:r>
+        <w:t xml:space="preserve"> </w:t>
+      </w:r>
+      <w:r>
+        <w:t xml:space="preserve">open-access chain is preserved from input through annotation to distribution.</w:t>
+      </w:r>
+    </w:p>
+    <w:bookmarkStart w:id="23" w:name="greek---per-period-source-map"/>
+    <w:p>
+      <w:pPr>
+        <w:pStyle w:val="Heading4"/>
+      </w:pPr>
+      <w:r>
+        <w:t xml:space="preserve">Greek - per-period source map</w:t>
+      </w:r>
+    </w:p>
+    <w:tbl>
+      <w:tblPr>
+        <w:tblStyle w:val="Table"/>
+        <w:tblW w:type="pct" w:w="5000"/>
+        <w:tblLayout w:type="fixed"/>
+        <w:tblLook w:firstRow="1" w:lastRow="0" w:firstColumn="0" w:lastColumn="0" w:noHBand="0" w:noVBand="0" w:val="0020"/>
+      </w:tblPr>
+      <w:tblGrid>
+        <w:gridCol w:w="2640"/>
+        <w:gridCol w:w="2640"/>
+        <w:gridCol w:w="2640"/>
+      </w:tblGrid>
+      <w:tr>
+        <w:trPr>
+          <w:tblHeader w:val="on"/>
+        </w:trPr>
+        <w:tc>
+          <w:tcPr/>
+          <w:p>
+            <w:pPr>
+              <w:pStyle w:val="Compact"/>
+            </w:pPr>
+            <w:r>
+              <w:t xml:space="preserve">Period</w:t>
+            </w:r>
+          </w:p>
+        </w:tc>
+        <w:tc>
+          <w:tcPr/>
+          <w:p>
+            <w:pPr>
+              <w:pStyle w:val="Compact"/>
+            </w:pPr>
+            <w:r>
+              <w:t xml:space="preserve">Source archive</w:t>
+            </w:r>
+          </w:p>
+        </w:tc>
+        <w:tc>
+          <w:tcPr/>
+          <w:p>
+            <w:pPr>
+              <w:pStyle w:val="Compact"/>
+            </w:pPr>
+            <w:r>
+              <w:t xml:space="preserve">Licence</w:t>
+            </w:r>
+          </w:p>
+        </w:tc>
+      </w:tr>
+      <w:tr>
+        <w:tc>
+          <w:tcPr/>
+          <w:p>
+            <w:pPr>
+              <w:pStyle w:val="Compact"/>
+            </w:pPr>
+            <w:r>
+              <w:t xml:space="preserve">Archaic, Classical, Hellenistic</w:t>
+            </w:r>
+          </w:p>
+        </w:tc>
+        <w:tc>
+          <w:tcPr/>
+          <w:p>
+            <w:pPr>
+              <w:pStyle w:val="Compact"/>
+            </w:pPr>
+            <w:r>
+              <w:t xml:space="preserve">Perseus Digital Library; Open Greek and Latin / First Thousand Years of Greek (Leipzig)</w:t>
+            </w:r>
+          </w:p>
+        </w:tc>
+        <w:tc>
+          <w:tcPr/>
+          <w:p>
+            <w:pPr>
+              <w:pStyle w:val="Compact"/>
+            </w:pPr>
+            <w:r>
+              <w:t xml:space="preserve">CC-BY-SA 4.0</w:t>
+            </w:r>
+          </w:p>
+        </w:tc>
+      </w:tr>
+      <w:tr>
+        <w:tc>
+          <w:tcPr/>
+          <w:p>
+            <w:pPr>
+              <w:pStyle w:val="Compact"/>
+            </w:pPr>
+            <w:r>
+              <w:t xml:space="preserve">Koine - NT</w:t>
+            </w:r>
+          </w:p>
+        </w:tc>
+        <w:tc>
+          <w:tcPr/>
+          <w:p>
+            <w:pPr>
+              <w:pStyle w:val="Compact"/>
+            </w:pPr>
+            <w:r>
+              <w:t xml:space="preserve">SBL Greek NT; Tischendorf (1869); Westcott-Hort (1881)</w:t>
+            </w:r>
+          </w:p>
+        </w:tc>
+        <w:tc>
+          <w:tcPr/>
+          <w:p>
+            <w:pPr>
+              <w:pStyle w:val="Compact"/>
+            </w:pPr>
+            <w:r>
+              <w:t xml:space="preserve">SBL licence; public domain</w:t>
+            </w:r>
+          </w:p>
+        </w:tc>
+      </w:tr>
+      <w:tr>
+        <w:tc>
+          <w:tcPr/>
+          <w:p>
+            <w:pPr>
+              <w:pStyle w:val="Compact"/>
+            </w:pPr>
+            <w:r>
+              <w:t xml:space="preserve">Koine - LXX</w:t>
+            </w:r>
+          </w:p>
+        </w:tc>
+        <w:tc>
+          <w:tcPr/>
+          <w:p>
+            <w:pPr>
+              <w:pStyle w:val="Compact"/>
+            </w:pPr>
+            <w:r>
+              <w:t xml:space="preserve">Rahlfs (1935) via openscriptures.org</w:t>
+            </w:r>
+          </w:p>
+        </w:tc>
+        <w:tc>
+          <w:tcPr/>
+          <w:p>
+            <w:pPr>
+              <w:pStyle w:val="Compact"/>
+            </w:pPr>
+            <w:r>
+              <w:t xml:space="preserve">public domain</w:t>
+            </w:r>
+          </w:p>
+        </w:tc>
+      </w:tr>
+      <w:tr>
+        <w:tc>
+          <w:tcPr/>
+          <w:p>
+            <w:pPr>
+              <w:pStyle w:val="Compact"/>
+            </w:pPr>
+            <w:r>
+              <w:t xml:space="preserve">Koine - documentary</w:t>
+            </w:r>
+          </w:p>
+        </w:tc>
+        <w:tc>
+          <w:tcPr/>
+          <w:p>
+            <w:pPr>
+              <w:pStyle w:val="Compact"/>
+            </w:pPr>
+            <w:r>
+              <w:t xml:space="preserve">Papyri.info / DDbDP</w:t>
+            </w:r>
+          </w:p>
+        </w:tc>
+        <w:tc>
+          <w:tcPr/>
+          <w:p>
+            <w:pPr>
+              <w:pStyle w:val="Compact"/>
+            </w:pPr>
+            <w:r>
+              <w:t xml:space="preserve">CC-BY 3.0</w:t>
+            </w:r>
+          </w:p>
+        </w:tc>
+      </w:tr>
+      <w:tr>
+        <w:tc>
+          <w:tcPr/>
+          <w:p>
+            <w:pPr>
+              <w:pStyle w:val="Compact"/>
+            </w:pPr>
+            <w:r>
+              <w:t xml:space="preserve">Late Antique, Byzantine</w:t>
+            </w:r>
+          </w:p>
+        </w:tc>
+        <w:tc>
+          <w:tcPr/>
+          <w:p>
+            <w:pPr>
+              <w:pStyle w:val="Compact"/>
+            </w:pPr>
+            <w:r>
+              <w:t xml:space="preserve">Patrologia Graeca via Documenta Catholica Omnia + Internet Archive</w:t>
+            </w:r>
+          </w:p>
+        </w:tc>
+        <w:tc>
+          <w:tcPr/>
+          <w:p>
+            <w:pPr>
+              <w:pStyle w:val="Compact"/>
+            </w:pPr>
+            <w:r>
+              <w:t xml:space="preserve">public domain</w:t>
+            </w:r>
+          </w:p>
+        </w:tc>
+      </w:tr>
+      <w:tr>
+        <w:tc>
+          <w:tcPr/>
+          <w:p>
+            <w:pPr>
+              <w:pStyle w:val="Compact"/>
+            </w:pPr>
+            <w:r>
+              <w:t xml:space="preserve">Byzantine, Late Byzantine</w:t>
+            </w:r>
+          </w:p>
+        </w:tc>
+        <w:tc>
+          <w:tcPr/>
+          <w:p>
+            <w:pPr>
+              <w:pStyle w:val="Compact"/>
+            </w:pPr>
+            <w:r>
+              <w:t xml:space="preserve">Bibliotheca Augustana; pre-1928 Teubner</w:t>
+            </w:r>
+          </w:p>
+        </w:tc>
+        <w:tc>
+          <w:tcPr/>
+          <w:p>
+            <w:pPr>
+              <w:pStyle w:val="Compact"/>
+            </w:pPr>
+            <w:r>
+              <w:t xml:space="preserve">public domain</w:t>
+            </w:r>
+          </w:p>
+        </w:tc>
+      </w:tr>
+      <w:tr>
+        <w:tc>
+          <w:tcPr/>
+          <w:p>
+            <w:pPr>
+              <w:pStyle w:val="Compact"/>
+            </w:pPr>
+            <w:r>
+              <w:t xml:space="preserve">Early Modern</w:t>
+            </w:r>
+          </w:p>
+        </w:tc>
+        <w:tc>
+          <w:tcPr/>
+          <w:p>
+            <w:pPr>
+              <w:pStyle w:val="Compact"/>
+            </w:pPr>
+            <w:r>
+              <w:t xml:space="preserve">Anemi (UoC); Wikisource el</w:t>
+            </w:r>
+          </w:p>
+        </w:tc>
+        <w:tc>
+          <w:tcPr/>
+          <w:p>
+            <w:pPr>
+              <w:pStyle w:val="Compact"/>
+            </w:pPr>
+            <w:r>
+              <w:t xml:space="preserve">public domain</w:t>
+            </w:r>
+          </w:p>
+        </w:tc>
+      </w:tr>
+      <w:tr>
+        <w:tc>
+          <w:tcPr/>
+          <w:p>
+            <w:pPr>
+              <w:pStyle w:val="Compact"/>
+            </w:pPr>
+            <w:r>
+              <w:t xml:space="preserve">Modern (19th c. - 1928)</w:t>
+            </w:r>
+          </w:p>
+        </w:tc>
+        <w:tc>
+          <w:tcPr/>
+          <w:p>
+            <w:pPr>
+              <w:pStyle w:val="Compact"/>
+            </w:pPr>
+            <w:r>
+              <w:t xml:space="preserve">Wikisource el; Anemi</w:t>
+            </w:r>
+          </w:p>
+        </w:tc>
+        <w:tc>
+          <w:tcPr/>
+          <w:p>
+            <w:pPr>
+              <w:pStyle w:val="Compact"/>
+            </w:pPr>
+            <w:r>
+              <w:t xml:space="preserve">public domain</w:t>
+            </w:r>
+          </w:p>
+        </w:tc>
+      </w:tr>
+      <w:tr>
+        <w:tc>
+          <w:tcPr/>
+          <w:p>
+            <w:pPr>
+              <w:pStyle w:val="Compact"/>
+            </w:pPr>
+            <w:r>
+              <w:t xml:space="preserve">Modern (post-1928)</w:t>
+            </w:r>
+          </w:p>
+        </w:tc>
+        <w:tc>
+          <w:tcPr/>
+          <w:p>
+            <w:pPr>
+              <w:pStyle w:val="Compact"/>
+            </w:pPr>
+            <w:r>
+              <w:t xml:space="preserve">publisher-licensed editions; not republished</w:t>
+            </w:r>
+          </w:p>
+        </w:tc>
+        <w:tc>
+          <w:tcPr/>
+          <w:p>
+            <w:pPr>
+              <w:pStyle w:val="Compact"/>
+            </w:pPr>
+            <w:r>
+              <w:t xml:space="preserve">in copyright</w:t>
+            </w:r>
+          </w:p>
+        </w:tc>
+      </w:tr>
+    </w:tbl>
     <w:bookmarkEnd w:id="23"/>
-    <w:bookmarkStart w:id="25" w:name="reuse-potential"/>
+    <w:bookmarkStart w:id="24" w:name="ie-parallels---per-language-source-map"/>
+    <w:p>
+      <w:pPr>
+        <w:pStyle w:val="Heading4"/>
+      </w:pPr>
+      <w:r>
+        <w:t xml:space="preserve">IE parallels - per-language source map</w:t>
+      </w:r>
+    </w:p>
+    <w:tbl>
+      <w:tblPr>
+        <w:tblStyle w:val="Table"/>
+        <w:tblW w:type="pct" w:w="5000"/>
+        <w:tblLayout w:type="fixed"/>
+        <w:tblLook w:firstRow="1" w:lastRow="0" w:firstColumn="0" w:lastColumn="0" w:noHBand="0" w:noVBand="0" w:val="0020"/>
+      </w:tblPr>
+      <w:tblGrid>
+        <w:gridCol w:w="2640"/>
+        <w:gridCol w:w="2640"/>
+        <w:gridCol w:w="2640"/>
+      </w:tblGrid>
+      <w:tr>
+        <w:trPr>
+          <w:tblHeader w:val="on"/>
+        </w:trPr>
+        <w:tc>
+          <w:tcPr/>
+          <w:p>
+            <w:pPr>
+              <w:pStyle w:val="Compact"/>
+            </w:pPr>
+            <w:r>
+              <w:t xml:space="preserve">Language</w:t>
+            </w:r>
+          </w:p>
+        </w:tc>
+        <w:tc>
+          <w:tcPr/>
+          <w:p>
+            <w:pPr>
+              <w:pStyle w:val="Compact"/>
+            </w:pPr>
+            <w:r>
+              <w:t xml:space="preserve">Source archive</w:t>
+            </w:r>
+          </w:p>
+        </w:tc>
+        <w:tc>
+          <w:tcPr/>
+          <w:p>
+            <w:pPr>
+              <w:pStyle w:val="Compact"/>
+            </w:pPr>
+            <w:r>
+              <w:t xml:space="preserve">Licence</w:t>
+            </w:r>
+          </w:p>
+        </w:tc>
+      </w:tr>
+      <w:tr>
+        <w:tc>
+          <w:tcPr/>
+          <w:p>
+            <w:pPr>
+              <w:pStyle w:val="Compact"/>
+            </w:pPr>
+            <w:r>
+              <w:t xml:space="preserve">Latin (Vulgate)</w:t>
+            </w:r>
+          </w:p>
+        </w:tc>
+        <w:tc>
+          <w:tcPr/>
+          <w:p>
+            <w:pPr>
+              <w:pStyle w:val="Compact"/>
+            </w:pPr>
+            <w:r>
+              <w:t xml:space="preserve">Clementine Vulgate via Vulsearch; Latin Library</w:t>
+            </w:r>
+          </w:p>
+        </w:tc>
+        <w:tc>
+          <w:tcPr/>
+          <w:p>
+            <w:pPr>
+              <w:pStyle w:val="Compact"/>
+            </w:pPr>
+            <w:r>
+              <w:t xml:space="preserve">public domain</w:t>
+            </w:r>
+          </w:p>
+        </w:tc>
+      </w:tr>
+      <w:tr>
+        <w:tc>
+          <w:tcPr/>
+          <w:p>
+            <w:pPr>
+              <w:pStyle w:val="Compact"/>
+            </w:pPr>
+            <w:r>
+              <w:t xml:space="preserve">Gothic (Wulfila)</w:t>
+            </w:r>
+          </w:p>
+        </w:tc>
+        <w:tc>
+          <w:tcPr/>
+          <w:p>
+            <w:pPr>
+              <w:pStyle w:val="Compact"/>
+            </w:pPr>
+            <w:r>
+              <w:t xml:space="preserve">Wulfila Project (University of Antwerp)</w:t>
+            </w:r>
+          </w:p>
+        </w:tc>
+        <w:tc>
+          <w:tcPr/>
+          <w:p>
+            <w:pPr>
+              <w:pStyle w:val="Compact"/>
+            </w:pPr>
+            <w:r>
+              <w:t xml:space="preserve">CC-BY-SA</w:t>
+            </w:r>
+          </w:p>
+        </w:tc>
+      </w:tr>
+      <w:tr>
+        <w:tc>
+          <w:tcPr/>
+          <w:p>
+            <w:pPr>
+              <w:pStyle w:val="Compact"/>
+            </w:pPr>
+            <w:r>
+              <w:t xml:space="preserve">OCS (Marianus)</w:t>
+            </w:r>
+          </w:p>
+        </w:tc>
+        <w:tc>
+          <w:tcPr/>
+          <w:p>
+            <w:pPr>
+              <w:pStyle w:val="Compact"/>
+            </w:pPr>
+            <w:r>
+              <w:t xml:space="preserve">TITUS (Frankfurt)</w:t>
+            </w:r>
+          </w:p>
+        </w:tc>
+        <w:tc>
+          <w:tcPr/>
+          <w:p>
+            <w:pPr>
+              <w:pStyle w:val="Compact"/>
+            </w:pPr>
+            <w:r>
+              <w:t xml:space="preserve">academic open access</w:t>
+            </w:r>
+          </w:p>
+        </w:tc>
+      </w:tr>
+      <w:tr>
+        <w:tc>
+          <w:tcPr/>
+          <w:p>
+            <w:pPr>
+              <w:pStyle w:val="Compact"/>
+            </w:pPr>
+            <w:r>
+              <w:t xml:space="preserve">Classical Armenian</w:t>
+            </w:r>
+          </w:p>
+        </w:tc>
+        <w:tc>
+          <w:tcPr/>
+          <w:p>
+            <w:pPr>
+              <w:pStyle w:val="Compact"/>
+            </w:pPr>
+            <w:r>
+              <w:t xml:space="preserve">TITUS; Digilib Armenian</w:t>
+            </w:r>
+          </w:p>
+        </w:tc>
+        <w:tc>
+          <w:tcPr/>
+          <w:p>
+            <w:pPr>
+              <w:pStyle w:val="Compact"/>
+            </w:pPr>
+            <w:r>
+              <w:t xml:space="preserve">academic open access</w:t>
+            </w:r>
+          </w:p>
+        </w:tc>
+      </w:tr>
+      <w:tr>
+        <w:tc>
+          <w:tcPr/>
+          <w:p>
+            <w:pPr>
+              <w:pStyle w:val="Compact"/>
+            </w:pPr>
+            <w:r>
+              <w:t xml:space="preserve">Sanskrit (Brahmana, Upanisadic)</w:t>
+            </w:r>
+          </w:p>
+        </w:tc>
+        <w:tc>
+          <w:tcPr/>
+          <w:p>
+            <w:pPr>
+              <w:pStyle w:val="Compact"/>
+            </w:pPr>
+            <w:r>
+              <w:t xml:space="preserve">GRETIL (Goettingen); SARIT; TITUS</w:t>
+            </w:r>
+          </w:p>
+        </w:tc>
+        <w:tc>
+          <w:tcPr/>
+          <w:p>
+            <w:pPr>
+              <w:pStyle w:val="Compact"/>
+            </w:pPr>
+            <w:r>
+              <w:t xml:space="preserve">academic open access</w:t>
+            </w:r>
+          </w:p>
+        </w:tc>
+      </w:tr>
+      <w:tr>
+        <w:tc>
+          <w:tcPr/>
+          <w:p>
+            <w:pPr>
+              <w:pStyle w:val="Compact"/>
+            </w:pPr>
+            <w:r>
+              <w:t xml:space="preserve">Old English (Wessex Gospels)</w:t>
+            </w:r>
+          </w:p>
+        </w:tc>
+        <w:tc>
+          <w:tcPr/>
+          <w:p>
+            <w:pPr>
+              <w:pStyle w:val="Compact"/>
+            </w:pPr>
+            <w:r>
+              <w:t xml:space="preserve">TEAMS; Bosworth-Toller; DOE extracts</w:t>
+            </w:r>
+          </w:p>
+        </w:tc>
+        <w:tc>
+          <w:tcPr/>
+          <w:p>
+            <w:pPr>
+              <w:pStyle w:val="Compact"/>
+            </w:pPr>
+            <w:r>
+              <w:t xml:space="preserve">public domain + CC-BY-SA</w:t>
+            </w:r>
+          </w:p>
+        </w:tc>
+      </w:tr>
+      <w:tr>
+        <w:tc>
+          <w:tcPr/>
+          <w:p>
+            <w:pPr>
+              <w:pStyle w:val="Compact"/>
+            </w:pPr>
+            <w:r>
+              <w:t xml:space="preserve">Avestan (Yasna, Yashts)</w:t>
+            </w:r>
+          </w:p>
+        </w:tc>
+        <w:tc>
+          <w:tcPr/>
+          <w:p>
+            <w:pPr>
+              <w:pStyle w:val="Compact"/>
+            </w:pPr>
+            <w:r>
+              <w:t xml:space="preserve">TITUS; Geldner (1886-95)</w:t>
+            </w:r>
+          </w:p>
+        </w:tc>
+        <w:tc>
+          <w:tcPr/>
+          <w:p>
+            <w:pPr>
+              <w:pStyle w:val="Compact"/>
+            </w:pPr>
+            <w:r>
+              <w:t xml:space="preserve">public domain + open access</w:t>
+            </w:r>
+          </w:p>
+        </w:tc>
+      </w:tr>
+      <w:tr>
+        <w:tc>
+          <w:tcPr/>
+          <w:p>
+            <w:pPr>
+              <w:pStyle w:val="Compact"/>
+            </w:pPr>
+            <w:r>
+              <w:t xml:space="preserve">Old Persian (Behistun)</w:t>
+            </w:r>
+          </w:p>
+        </w:tc>
+        <w:tc>
+          <w:tcPr/>
+          <w:p>
+            <w:pPr>
+              <w:pStyle w:val="Compact"/>
+            </w:pPr>
+            <w:r>
+              <w:t xml:space="preserve">TITUS; Kent (1953) PD transliteration</w:t>
+            </w:r>
+          </w:p>
+        </w:tc>
+        <w:tc>
+          <w:tcPr/>
+          <w:p>
+            <w:pPr>
+              <w:pStyle w:val="Compact"/>
+            </w:pPr>
+            <w:r>
+              <w:t xml:space="preserve">public domain</w:t>
+            </w:r>
+          </w:p>
+        </w:tc>
+      </w:tr>
+      <w:tr>
+        <w:tc>
+          <w:tcPr/>
+          <w:p>
+            <w:pPr>
+              <w:pStyle w:val="Compact"/>
+            </w:pPr>
+            <w:r>
+              <w:t xml:space="preserve">Ukrainian (Ostroh 1581)</w:t>
+            </w:r>
+          </w:p>
+        </w:tc>
+        <w:tc>
+          <w:tcPr/>
+          <w:p>
+            <w:pPr>
+              <w:pStyle w:val="Compact"/>
+            </w:pPr>
+            <w:r>
+              <w:t xml:space="preserve">National Library of Ukraine facsimile</w:t>
+            </w:r>
+          </w:p>
+        </w:tc>
+        <w:tc>
+          <w:tcPr/>
+          <w:p>
+            <w:pPr>
+              <w:pStyle w:val="Compact"/>
+            </w:pPr>
+            <w:r>
+              <w:t xml:space="preserve">public domain</w:t>
+            </w:r>
+          </w:p>
+        </w:tc>
+      </w:tr>
+      <w:tr>
+        <w:tc>
+          <w:tcPr/>
+          <w:p>
+            <w:pPr>
+              <w:pStyle w:val="Compact"/>
+            </w:pPr>
+            <w:r>
+              <w:t xml:space="preserve">Ukrainian (20th-c. rev.)</w:t>
+            </w:r>
+          </w:p>
+        </w:tc>
+        <w:tc>
+          <w:tcPr/>
+          <w:p>
+            <w:pPr>
+              <w:pStyle w:val="Compact"/>
+            </w:pPr>
+            <w:r>
+              <w:t xml:space="preserve">Ohienko (1962); Khomenko (1963)</w:t>
+            </w:r>
+          </w:p>
+        </w:tc>
+        <w:tc>
+          <w:tcPr/>
+          <w:p>
+            <w:pPr>
+              <w:pStyle w:val="Compact"/>
+            </w:pPr>
+            <w:r>
+              <w:t xml:space="preserve">in copyright</w:t>
+            </w:r>
+          </w:p>
+        </w:tc>
+      </w:tr>
+    </w:tbl>
+    <w:p>
+      <w:pPr>
+        <w:pStyle w:val="BodyText"/>
+      </w:pPr>
+      <w:r>
+        <w:t xml:space="preserve">In-copyright editions are never republished verbatim. AthDGC uses an open-access antecedent</w:t>
+      </w:r>
+      <w:r>
+        <w:t xml:space="preserve"> </w:t>
+      </w:r>
+      <w:r>
+        <w:t xml:space="preserve">(e.g. pre-1928 Teubner; SBL GNT instead of Nestle-Aland) or, where unavoidable, short</w:t>
+      </w:r>
+      <w:r>
+        <w:t xml:space="preserve"> </w:t>
+      </w:r>
+      <w:r>
+        <w:t xml:space="preserve">quotation samples under fair use with full attribution. The annotation layer is always</w:t>
+      </w:r>
+      <w:r>
+        <w:t xml:space="preserve"> </w:t>
+      </w:r>
+      <w:r>
+        <w:t xml:space="preserve">AthDGC-original.</w:t>
+      </w:r>
+    </w:p>
+    <w:bookmarkEnd w:id="24"/>
+    <w:bookmarkEnd w:id="25"/>
+    <w:bookmarkStart w:id="26" w:name="ie-parallels-covered"/>
+    <w:p>
+      <w:pPr>
+        <w:pStyle w:val="Heading3"/>
+      </w:pPr>
+      <w:r>
+        <w:t xml:space="preserve">3.2 IE parallels covered</w:t>
+      </w:r>
+    </w:p>
+    <w:tbl>
+      <w:tblPr>
+        <w:tblStyle w:val="Table"/>
+        <w:tblW w:type="pct" w:w="5000"/>
+        <w:tblLayout w:type="fixed"/>
+        <w:tblLook w:firstRow="1" w:lastRow="0" w:firstColumn="0" w:lastColumn="0" w:noHBand="0" w:noVBand="0" w:val="0020"/>
+      </w:tblPr>
+      <w:tblGrid>
+        <w:gridCol w:w="1320"/>
+        <w:gridCol w:w="1320"/>
+        <w:gridCol w:w="1320"/>
+        <w:gridCol w:w="1320"/>
+        <w:gridCol w:w="1320"/>
+        <w:gridCol w:w="1320"/>
+      </w:tblGrid>
+      <w:tr>
+        <w:trPr>
+          <w:tblHeader w:val="on"/>
+        </w:trPr>
+        <w:tc>
+          <w:tcPr/>
+          <w:p>
+            <w:pPr>
+              <w:pStyle w:val="Compact"/>
+            </w:pPr>
+            <w:r>
+              <w:t xml:space="preserve">Language</w:t>
+            </w:r>
+          </w:p>
+        </w:tc>
+        <w:tc>
+          <w:tcPr/>
+          <w:p>
+            <w:pPr>
+              <w:pStyle w:val="Compact"/>
+            </w:pPr>
+            <w:r>
+              <w:t xml:space="preserve">Family</w:t>
+            </w:r>
+          </w:p>
+        </w:tc>
+        <w:tc>
+          <w:tcPr/>
+          <w:p>
+            <w:pPr>
+              <w:pStyle w:val="Compact"/>
+            </w:pPr>
+            <w:r>
+              <w:t xml:space="preserve">Period</w:t>
+            </w:r>
+          </w:p>
+        </w:tc>
+        <w:tc>
+          <w:tcPr/>
+          <w:p>
+            <w:pPr>
+              <w:pStyle w:val="Compact"/>
+            </w:pPr>
+            <w:r>
+              <w:t xml:space="preserve">Stanza model</w:t>
+            </w:r>
+          </w:p>
+        </w:tc>
+        <w:tc>
+          <w:tcPr/>
+          <w:p>
+            <w:pPr>
+              <w:pStyle w:val="Compact"/>
+            </w:pPr>
+            <w:r>
+              <w:t xml:space="preserve">Status</w:t>
+            </w:r>
+          </w:p>
+        </w:tc>
+        <w:tc>
+          <w:tcPr/>
+          <w:p>
+            <w:pPr>
+              <w:pStyle w:val="Compact"/>
+            </w:pPr>
+            <w:r>
+              <w:t xml:space="preserve">NT-aligned verses (v0.4)</w:t>
+            </w:r>
+          </w:p>
+        </w:tc>
+      </w:tr>
+      <w:tr>
+        <w:tc>
+          <w:tcPr/>
+          <w:p>
+            <w:pPr>
+              <w:pStyle w:val="Compact"/>
+            </w:pPr>
+            <w:r>
+              <w:t xml:space="preserve">Greek (Koine)</w:t>
+            </w:r>
+          </w:p>
+        </w:tc>
+        <w:tc>
+          <w:tcPr/>
+          <w:p>
+            <w:pPr>
+              <w:pStyle w:val="Compact"/>
+            </w:pPr>
+            <w:r>
+              <w:t xml:space="preserve">IE / Hellenic</w:t>
+            </w:r>
+          </w:p>
+        </w:tc>
+        <w:tc>
+          <w:tcPr/>
+          <w:p>
+            <w:pPr>
+              <w:pStyle w:val="Compact"/>
+            </w:pPr>
+            <w:r>
+              <w:t xml:space="preserve">1st-2nd c. AD</w:t>
+            </w:r>
+          </w:p>
+        </w:tc>
+        <w:tc>
+          <w:tcPr/>
+          <w:p>
+            <w:pPr>
+              <w:pStyle w:val="Compact"/>
+            </w:pPr>
+            <w:r>
+              <w:rPr>
+                <w:rStyle w:val="VerbatimChar"/>
+              </w:rPr>
+              <w:t xml:space="preserve">grc_proiel</w:t>
+            </w:r>
+          </w:p>
+        </w:tc>
+        <w:tc>
+          <w:tcPr/>
+          <w:p>
+            <w:pPr>
+              <w:pStyle w:val="Compact"/>
+            </w:pPr>
+            <w:r>
+              <w:t xml:space="preserve">annotated</w:t>
+            </w:r>
+          </w:p>
+        </w:tc>
+        <w:tc>
+          <w:tcPr/>
+          <w:p>
+            <w:pPr>
+              <w:pStyle w:val="Compact"/>
+            </w:pPr>
+            <w:r>
+              <w:t xml:space="preserve">7,956</w:t>
+            </w:r>
+          </w:p>
+        </w:tc>
+      </w:tr>
+      <w:tr>
+        <w:tc>
+          <w:tcPr/>
+          <w:p>
+            <w:pPr>
+              <w:pStyle w:val="Compact"/>
+            </w:pPr>
+            <w:r>
+              <w:t xml:space="preserve">Latin (Vulgate)</w:t>
+            </w:r>
+          </w:p>
+        </w:tc>
+        <w:tc>
+          <w:tcPr/>
+          <w:p>
+            <w:pPr>
+              <w:pStyle w:val="Compact"/>
+            </w:pPr>
+            <w:r>
+              <w:t xml:space="preserve">IE / Italic</w:t>
+            </w:r>
+          </w:p>
+        </w:tc>
+        <w:tc>
+          <w:tcPr/>
+          <w:p>
+            <w:pPr>
+              <w:pStyle w:val="Compact"/>
+            </w:pPr>
+            <w:r>
+              <w:t xml:space="preserve">4th c. AD</w:t>
+            </w:r>
+          </w:p>
+        </w:tc>
+        <w:tc>
+          <w:tcPr/>
+          <w:p>
+            <w:pPr>
+              <w:pStyle w:val="Compact"/>
+            </w:pPr>
+            <w:r>
+              <w:rPr>
+                <w:rStyle w:val="VerbatimChar"/>
+              </w:rPr>
+              <w:t xml:space="preserve">la_proiel</w:t>
+            </w:r>
+          </w:p>
+        </w:tc>
+        <w:tc>
+          <w:tcPr/>
+          <w:p>
+            <w:pPr>
+              <w:pStyle w:val="Compact"/>
+            </w:pPr>
+            <w:r>
+              <w:t xml:space="preserve">annotated</w:t>
+            </w:r>
+          </w:p>
+        </w:tc>
+        <w:tc>
+          <w:tcPr/>
+          <w:p>
+            <w:pPr>
+              <w:pStyle w:val="Compact"/>
+            </w:pPr>
+            <w:r>
+              <w:t xml:space="preserve">7,956</w:t>
+            </w:r>
+          </w:p>
+        </w:tc>
+      </w:tr>
+      <w:tr>
+        <w:tc>
+          <w:tcPr/>
+          <w:p>
+            <w:pPr>
+              <w:pStyle w:val="Compact"/>
+            </w:pPr>
+            <w:r>
+              <w:t xml:space="preserve">Gothic (Wulfila)</w:t>
+            </w:r>
+          </w:p>
+        </w:tc>
+        <w:tc>
+          <w:tcPr/>
+          <w:p>
+            <w:pPr>
+              <w:pStyle w:val="Compact"/>
+            </w:pPr>
+            <w:r>
+              <w:t xml:space="preserve">IE / Germanic E</w:t>
+            </w:r>
+          </w:p>
+        </w:tc>
+        <w:tc>
+          <w:tcPr/>
+          <w:p>
+            <w:pPr>
+              <w:pStyle w:val="Compact"/>
+            </w:pPr>
+            <w:r>
+              <w:t xml:space="preserve">4th c. AD</w:t>
+            </w:r>
+          </w:p>
+        </w:tc>
+        <w:tc>
+          <w:tcPr/>
+          <w:p>
+            <w:pPr>
+              <w:pStyle w:val="Compact"/>
+            </w:pPr>
+            <w:r>
+              <w:rPr>
+                <w:rStyle w:val="VerbatimChar"/>
+              </w:rPr>
+              <w:t xml:space="preserve">got_proiel</w:t>
+            </w:r>
+          </w:p>
+        </w:tc>
+        <w:tc>
+          <w:tcPr/>
+          <w:p>
+            <w:pPr>
+              <w:pStyle w:val="Compact"/>
+            </w:pPr>
+            <w:r>
+              <w:t xml:space="preserve">annotated</w:t>
+            </w:r>
+          </w:p>
+        </w:tc>
+        <w:tc>
+          <w:tcPr/>
+          <w:p>
+            <w:pPr>
+              <w:pStyle w:val="Compact"/>
+            </w:pPr>
+            <w:r>
+              <w:t xml:space="preserve">3,512</w:t>
+            </w:r>
+          </w:p>
+        </w:tc>
+      </w:tr>
+      <w:tr>
+        <w:tc>
+          <w:tcPr/>
+          <w:p>
+            <w:pPr>
+              <w:pStyle w:val="Compact"/>
+            </w:pPr>
+            <w:r>
+              <w:t xml:space="preserve">OCS (Marianus)</w:t>
+            </w:r>
+          </w:p>
+        </w:tc>
+        <w:tc>
+          <w:tcPr/>
+          <w:p>
+            <w:pPr>
+              <w:pStyle w:val="Compact"/>
+            </w:pPr>
+            <w:r>
+              <w:t xml:space="preserve">IE / Slavic</w:t>
+            </w:r>
+          </w:p>
+        </w:tc>
+        <w:tc>
+          <w:tcPr/>
+          <w:p>
+            <w:pPr>
+              <w:pStyle w:val="Compact"/>
+            </w:pPr>
+            <w:r>
+              <w:t xml:space="preserve">10th c. AD</w:t>
+            </w:r>
+          </w:p>
+        </w:tc>
+        <w:tc>
+          <w:tcPr/>
+          <w:p>
+            <w:pPr>
+              <w:pStyle w:val="Compact"/>
+            </w:pPr>
+            <w:r>
+              <w:rPr>
+                <w:rStyle w:val="VerbatimChar"/>
+              </w:rPr>
+              <w:t xml:space="preserve">cu_proiel</w:t>
+            </w:r>
+          </w:p>
+        </w:tc>
+        <w:tc>
+          <w:tcPr/>
+          <w:p>
+            <w:pPr>
+              <w:pStyle w:val="Compact"/>
+            </w:pPr>
+            <w:r>
+              <w:t xml:space="preserve">sampled</w:t>
+            </w:r>
+          </w:p>
+        </w:tc>
+        <w:tc>
+          <w:tcPr/>
+          <w:p>
+            <w:pPr>
+              <w:pStyle w:val="Compact"/>
+            </w:pPr>
+            <w:r>
+              <w:t xml:space="preserve">6,861</w:t>
+            </w:r>
+          </w:p>
+        </w:tc>
+      </w:tr>
+      <w:tr>
+        <w:tc>
+          <w:tcPr/>
+          <w:p>
+            <w:pPr>
+              <w:pStyle w:val="Compact"/>
+            </w:pPr>
+            <w:r>
+              <w:t xml:space="preserve">Classical Armenian</w:t>
+            </w:r>
+          </w:p>
+        </w:tc>
+        <w:tc>
+          <w:tcPr/>
+          <w:p>
+            <w:pPr>
+              <w:pStyle w:val="Compact"/>
+            </w:pPr>
+            <w:r>
+              <w:t xml:space="preserve">IE / Armenian</w:t>
+            </w:r>
+          </w:p>
+        </w:tc>
+        <w:tc>
+          <w:tcPr/>
+          <w:p>
+            <w:pPr>
+              <w:pStyle w:val="Compact"/>
+            </w:pPr>
+            <w:r>
+              <w:t xml:space="preserve">5th c. AD</w:t>
+            </w:r>
+          </w:p>
+        </w:tc>
+        <w:tc>
+          <w:tcPr/>
+          <w:p>
+            <w:pPr>
+              <w:pStyle w:val="Compact"/>
+            </w:pPr>
+            <w:r>
+              <w:rPr>
+                <w:rStyle w:val="VerbatimChar"/>
+              </w:rPr>
+              <w:t xml:space="preserve">xcl_proiel</w:t>
+            </w:r>
+            <w:r>
+              <w:t xml:space="preserve"> </w:t>
+            </w:r>
+            <w:r>
+              <w:t xml:space="preserve">(in dev.)</w:t>
+            </w:r>
+          </w:p>
+        </w:tc>
+        <w:tc>
+          <w:tcPr/>
+          <w:p>
+            <w:pPr>
+              <w:pStyle w:val="Compact"/>
+            </w:pPr>
+            <w:r>
+              <w:t xml:space="preserve">ingestion</w:t>
+            </w:r>
+          </w:p>
+        </w:tc>
+        <w:tc>
+          <w:tcPr/>
+          <w:p>
+            <w:pPr>
+              <w:pStyle w:val="Compact"/>
+            </w:pPr>
+            <w:r>
+              <w:t xml:space="preserve">0 (v0.5)</w:t>
+            </w:r>
+          </w:p>
+        </w:tc>
+      </w:tr>
+      <w:tr>
+        <w:tc>
+          <w:tcPr/>
+          <w:p>
+            <w:pPr>
+              <w:pStyle w:val="Compact"/>
+            </w:pPr>
+            <w:r>
+              <w:t xml:space="preserve">Sanskrit (Brahmana, Upanisadic)</w:t>
+            </w:r>
+          </w:p>
+        </w:tc>
+        <w:tc>
+          <w:tcPr/>
+          <w:p>
+            <w:pPr>
+              <w:pStyle w:val="Compact"/>
+            </w:pPr>
+            <w:r>
+              <w:t xml:space="preserve">IE / Indo-Iranian</w:t>
+            </w:r>
+          </w:p>
+        </w:tc>
+        <w:tc>
+          <w:tcPr/>
+          <w:p>
+            <w:pPr>
+              <w:pStyle w:val="Compact"/>
+            </w:pPr>
+            <w:r>
+              <w:t xml:space="preserve">1000-500 BC</w:t>
+            </w:r>
+          </w:p>
+        </w:tc>
+        <w:tc>
+          <w:tcPr/>
+          <w:p>
+            <w:pPr>
+              <w:pStyle w:val="Compact"/>
+            </w:pPr>
+            <w:r>
+              <w:rPr>
+                <w:rStyle w:val="VerbatimChar"/>
+              </w:rPr>
+              <w:t xml:space="preserve">sa_vedic</w:t>
+            </w:r>
+            <w:r>
+              <w:t xml:space="preserve"> </w:t>
+            </w:r>
+            <w:r>
+              <w:t xml:space="preserve">(queued)</w:t>
+            </w:r>
+          </w:p>
+        </w:tc>
+        <w:tc>
+          <w:tcPr/>
+          <w:p>
+            <w:pPr>
+              <w:pStyle w:val="Compact"/>
+            </w:pPr>
+            <w:r>
+              <w:t xml:space="preserve">queued (v0.7)</w:t>
+            </w:r>
+          </w:p>
+        </w:tc>
+        <w:tc>
+          <w:tcPr/>
+          <w:p>
+            <w:pPr>
+              <w:pStyle w:val="Compact"/>
+            </w:pPr>
+            <w:r>
+              <w:t xml:space="preserve">0</w:t>
+            </w:r>
+          </w:p>
+        </w:tc>
+      </w:tr>
+      <w:tr>
+        <w:tc>
+          <w:tcPr/>
+          <w:p>
+            <w:pPr>
+              <w:pStyle w:val="Compact"/>
+            </w:pPr>
+            <w:r>
+              <w:t xml:space="preserve">Old English (Wessex Gospels)</w:t>
+            </w:r>
+          </w:p>
+        </w:tc>
+        <w:tc>
+          <w:tcPr/>
+          <w:p>
+            <w:pPr>
+              <w:pStyle w:val="Compact"/>
+            </w:pPr>
+            <w:r>
+              <w:t xml:space="preserve">IE / Germanic W</w:t>
+            </w:r>
+          </w:p>
+        </w:tc>
+        <w:tc>
+          <w:tcPr/>
+          <w:p>
+            <w:pPr>
+              <w:pStyle w:val="Compact"/>
+            </w:pPr>
+            <w:r>
+              <w:t xml:space="preserve">10th c. AD</w:t>
+            </w:r>
+          </w:p>
+        </w:tc>
+        <w:tc>
+          <w:tcPr/>
+          <w:p>
+            <w:pPr>
+              <w:pStyle w:val="Compact"/>
+            </w:pPr>
+            <w:r>
+              <w:rPr>
+                <w:rStyle w:val="VerbatimChar"/>
+              </w:rPr>
+              <w:t xml:space="preserve">ang_proiel</w:t>
+            </w:r>
+            <w:r>
+              <w:t xml:space="preserve"> </w:t>
+            </w:r>
+            <w:r>
+              <w:t xml:space="preserve">(queued)</w:t>
+            </w:r>
+          </w:p>
+        </w:tc>
+        <w:tc>
+          <w:tcPr/>
+          <w:p>
+            <w:pPr>
+              <w:pStyle w:val="Compact"/>
+            </w:pPr>
+            <w:r>
+              <w:t xml:space="preserve">queued (v0.7)</w:t>
+            </w:r>
+          </w:p>
+        </w:tc>
+        <w:tc>
+          <w:tcPr/>
+          <w:p>
+            <w:pPr>
+              <w:pStyle w:val="Compact"/>
+            </w:pPr>
+            <w:r>
+              <w:t xml:space="preserve">0</w:t>
+            </w:r>
+          </w:p>
+        </w:tc>
+      </w:tr>
+      <w:tr>
+        <w:tc>
+          <w:tcPr/>
+          <w:p>
+            <w:pPr>
+              <w:pStyle w:val="Compact"/>
+            </w:pPr>
+            <w:r>
+              <w:t xml:space="preserve">Avestan (Yasna, Yashts)</w:t>
+            </w:r>
+          </w:p>
+        </w:tc>
+        <w:tc>
+          <w:tcPr/>
+          <w:p>
+            <w:pPr>
+              <w:pStyle w:val="Compact"/>
+            </w:pPr>
+            <w:r>
+              <w:t xml:space="preserve">IE / Indo-Iranian</w:t>
+            </w:r>
+          </w:p>
+        </w:tc>
+        <w:tc>
+          <w:tcPr/>
+          <w:p>
+            <w:pPr>
+              <w:pStyle w:val="Compact"/>
+            </w:pPr>
+            <w:r>
+              <w:t xml:space="preserve">1000-500 BC</w:t>
+            </w:r>
+          </w:p>
+        </w:tc>
+        <w:tc>
+          <w:tcPr/>
+          <w:p>
+            <w:pPr>
+              <w:pStyle w:val="Compact"/>
+            </w:pPr>
+            <w:r>
+              <w:rPr>
+                <w:rStyle w:val="VerbatimChar"/>
+              </w:rPr>
+              <w:t xml:space="preserve">ae_proiel</w:t>
+            </w:r>
+            <w:r>
+              <w:t xml:space="preserve"> </w:t>
+            </w:r>
+            <w:r>
+              <w:t xml:space="preserve">(queued)</w:t>
+            </w:r>
+          </w:p>
+        </w:tc>
+        <w:tc>
+          <w:tcPr/>
+          <w:p>
+            <w:pPr>
+              <w:pStyle w:val="Compact"/>
+            </w:pPr>
+            <w:r>
+              <w:t xml:space="preserve">queued (v0.7)</w:t>
+            </w:r>
+          </w:p>
+        </w:tc>
+        <w:tc>
+          <w:tcPr/>
+          <w:p>
+            <w:pPr>
+              <w:pStyle w:val="Compact"/>
+            </w:pPr>
+            <w:r>
+              <w:t xml:space="preserve">0</w:t>
+            </w:r>
+          </w:p>
+        </w:tc>
+      </w:tr>
+      <w:tr>
+        <w:tc>
+          <w:tcPr/>
+          <w:p>
+            <w:pPr>
+              <w:pStyle w:val="Compact"/>
+            </w:pPr>
+            <w:r>
+              <w:t xml:space="preserve">Old Persian (Behistun)</w:t>
+            </w:r>
+          </w:p>
+        </w:tc>
+        <w:tc>
+          <w:tcPr/>
+          <w:p>
+            <w:pPr>
+              <w:pStyle w:val="Compact"/>
+            </w:pPr>
+            <w:r>
+              <w:t xml:space="preserve">IE / Indo-Iranian</w:t>
+            </w:r>
+          </w:p>
+        </w:tc>
+        <w:tc>
+          <w:tcPr/>
+          <w:p>
+            <w:pPr>
+              <w:pStyle w:val="Compact"/>
+            </w:pPr>
+            <w:r>
+              <w:t xml:space="preserve">6th-5th c. BC</w:t>
+            </w:r>
+          </w:p>
+        </w:tc>
+        <w:tc>
+          <w:tcPr/>
+          <w:p>
+            <w:pPr>
+              <w:pStyle w:val="Compact"/>
+            </w:pPr>
+            <w:r>
+              <w:rPr>
+                <w:rStyle w:val="VerbatimChar"/>
+              </w:rPr>
+              <w:t xml:space="preserve">peo_proiel</w:t>
+            </w:r>
+            <w:r>
+              <w:t xml:space="preserve"> </w:t>
+            </w:r>
+            <w:r>
+              <w:t xml:space="preserve">(queued)</w:t>
+            </w:r>
+          </w:p>
+        </w:tc>
+        <w:tc>
+          <w:tcPr/>
+          <w:p>
+            <w:pPr>
+              <w:pStyle w:val="Compact"/>
+            </w:pPr>
+            <w:r>
+              <w:t xml:space="preserve">queued (v0.7)</w:t>
+            </w:r>
+          </w:p>
+        </w:tc>
+        <w:tc>
+          <w:tcPr/>
+          <w:p>
+            <w:pPr>
+              <w:pStyle w:val="Compact"/>
+            </w:pPr>
+            <w:r>
+              <w:t xml:space="preserve">0</w:t>
+            </w:r>
+          </w:p>
+        </w:tc>
+      </w:tr>
+      <w:tr>
+        <w:tc>
+          <w:tcPr/>
+          <w:p>
+            <w:pPr>
+              <w:pStyle w:val="Compact"/>
+            </w:pPr>
+            <w:r>
+              <w:t xml:space="preserve">Ukrainian (Ostroh + 20th-c. rev.)</w:t>
+            </w:r>
+          </w:p>
+        </w:tc>
+        <w:tc>
+          <w:tcPr/>
+          <w:p>
+            <w:pPr>
+              <w:pStyle w:val="Compact"/>
+            </w:pPr>
+            <w:r>
+              <w:t xml:space="preserve">IE / Slavic E</w:t>
+            </w:r>
+          </w:p>
+        </w:tc>
+        <w:tc>
+          <w:tcPr/>
+          <w:p>
+            <w:pPr>
+              <w:pStyle w:val="Compact"/>
+            </w:pPr>
+            <w:r>
+              <w:t xml:space="preserve">1581 + 1962</w:t>
+            </w:r>
+          </w:p>
+        </w:tc>
+        <w:tc>
+          <w:tcPr/>
+          <w:p>
+            <w:pPr>
+              <w:pStyle w:val="Compact"/>
+            </w:pPr>
+            <w:r>
+              <w:rPr>
+                <w:rStyle w:val="VerbatimChar"/>
+              </w:rPr>
+              <w:t xml:space="preserve">uk_dep</w:t>
+            </w:r>
+            <w:r>
+              <w:t xml:space="preserve"> </w:t>
+            </w:r>
+            <w:r>
+              <w:t xml:space="preserve">adapted (queued)</w:t>
+            </w:r>
+          </w:p>
+        </w:tc>
+        <w:tc>
+          <w:tcPr/>
+          <w:p>
+            <w:pPr>
+              <w:pStyle w:val="Compact"/>
+            </w:pPr>
+            <w:r>
+              <w:t xml:space="preserve">queued (v0.7)</w:t>
+            </w:r>
+          </w:p>
+        </w:tc>
+        <w:tc>
+          <w:tcPr/>
+          <w:p>
+            <w:pPr>
+              <w:pStyle w:val="Compact"/>
+            </w:pPr>
+            <w:r>
+              <w:t xml:space="preserve">0</w:t>
+            </w:r>
+          </w:p>
+        </w:tc>
+      </w:tr>
+    </w:tbl>
+    <w:bookmarkEnd w:id="26"/>
+    <w:bookmarkStart w:id="27" w:name="retelling-and-retranslation-chains"/>
+    <w:p>
+      <w:pPr>
+        <w:pStyle w:val="Heading3"/>
+      </w:pPr>
+      <w:r>
+        <w:t xml:space="preserve">3.3 Retelling and retranslation chains</w:t>
+      </w:r>
+    </w:p>
+    <w:p>
+      <w:pPr>
+        <w:pStyle w:val="FirstParagraph"/>
+      </w:pPr>
+      <w:r>
+        <w:t xml:space="preserve">Five chains are public on the Samples page. Each renders the same canonical passage across</w:t>
+      </w:r>
+      <w:r>
+        <w:t xml:space="preserve"> </w:t>
+      </w:r>
+      <w:r>
+        <w:t xml:space="preserve">periods (retelling, retranslation within Greek) or across languages (cross-IE retranslation),</w:t>
+      </w:r>
+      <w:r>
+        <w:t xml:space="preserve"> </w:t>
+      </w:r>
+      <w:r>
+        <w:t xml:space="preserve">with one PROIEL tree per node and a frame-stability gloss.</w:t>
+      </w:r>
+    </w:p>
+    <w:tbl>
+      <w:tblPr>
+        <w:tblStyle w:val="Table"/>
+        <w:tblW w:type="pct" w:w="5000"/>
+        <w:tblLayout w:type="fixed"/>
+        <w:tblLook w:firstRow="1" w:lastRow="0" w:firstColumn="0" w:lastColumn="0" w:noHBand="0" w:noVBand="0" w:val="0020"/>
+      </w:tblPr>
+      <w:tblGrid>
+        <w:gridCol w:w="1980"/>
+        <w:gridCol w:w="1980"/>
+        <w:gridCol w:w="1980"/>
+        <w:gridCol w:w="1980"/>
+      </w:tblGrid>
+      <w:tr>
+        <w:trPr>
+          <w:tblHeader w:val="on"/>
+        </w:trPr>
+        <w:tc>
+          <w:tcPr/>
+          <w:p>
+            <w:pPr>
+              <w:pStyle w:val="Compact"/>
+            </w:pPr>
+            <w:r>
+              <w:t xml:space="preserve">Chain</w:t>
+            </w:r>
+          </w:p>
+        </w:tc>
+        <w:tc>
+          <w:tcPr/>
+          <w:p>
+            <w:pPr>
+              <w:pStyle w:val="Compact"/>
+            </w:pPr>
+            <w:r>
+              <w:t xml:space="preserve">Type</w:t>
+            </w:r>
+          </w:p>
+        </w:tc>
+        <w:tc>
+          <w:tcPr/>
+          <w:p>
+            <w:pPr>
+              <w:pStyle w:val="Compact"/>
+            </w:pPr>
+            <w:r>
+              <w:t xml:space="preserve">Nodes</w:t>
+            </w:r>
+          </w:p>
+        </w:tc>
+        <w:tc>
+          <w:tcPr/>
+          <w:p>
+            <w:pPr>
+              <w:pStyle w:val="Compact"/>
+            </w:pPr>
+            <w:r>
+              <w:t xml:space="preserve">What it shows</w:t>
+            </w:r>
+          </w:p>
+        </w:tc>
+      </w:tr>
+      <w:tr>
+        <w:tc>
+          <w:tcPr/>
+          <w:p>
+            <w:pPr>
+              <w:pStyle w:val="Compact"/>
+            </w:pPr>
+            <w:r>
+              <w:rPr>
+                <w:i/>
+                <w:iCs/>
+              </w:rPr>
+              <w:t xml:space="preserve">Iliad</w:t>
+            </w:r>
+            <w:r>
+              <w:t xml:space="preserve"> </w:t>
+            </w:r>
+            <w:r>
+              <w:t xml:space="preserve">1.1 across reception</w:t>
+            </w:r>
+          </w:p>
+        </w:tc>
+        <w:tc>
+          <w:tcPr/>
+          <w:p>
+            <w:pPr>
+              <w:pStyle w:val="Compact"/>
+            </w:pPr>
+            <w:r>
+              <w:t xml:space="preserve">retelling</w:t>
+            </w:r>
+          </w:p>
+        </w:tc>
+        <w:tc>
+          <w:tcPr/>
+          <w:p>
+            <w:pPr>
+              <w:pStyle w:val="Compact"/>
+            </w:pPr>
+            <w:r>
+              <w:t xml:space="preserve">Homer (8th c. BC); Tzetzes (12th c.); Kazantzakis/Kakridis (1955)</w:t>
+            </w:r>
+          </w:p>
+        </w:tc>
+        <w:tc>
+          <w:tcPr/>
+          <w:p>
+            <w:pPr>
+              <w:pStyle w:val="Compact"/>
+            </w:pPr>
+            <w:r>
+              <w:rPr>
+                <w:rStyle w:val="VerbatimChar"/>
+              </w:rPr>
+              <w:t xml:space="preserve">[obj:acc, voc:voc]</w:t>
+            </w:r>
+            <w:r>
+              <w:t xml:space="preserve"> </w:t>
+            </w:r>
+            <w:r>
+              <w:t xml:space="preserve">stable across 2,800 years; collapses only under Tzetzes’ narrative reframing</w:t>
+            </w:r>
+          </w:p>
+        </w:tc>
+      </w:tr>
+      <w:tr>
+        <w:tc>
+          <w:tcPr/>
+          <w:p>
+            <w:pPr>
+              <w:pStyle w:val="Compact"/>
+            </w:pPr>
+            <w:r>
+              <w:t xml:space="preserve">LXX Psalm 1:1 across periods</w:t>
+            </w:r>
+          </w:p>
+        </w:tc>
+        <w:tc>
+          <w:tcPr/>
+          <w:p>
+            <w:pPr>
+              <w:pStyle w:val="Compact"/>
+            </w:pPr>
+            <w:r>
+              <w:t xml:space="preserve">retranslation</w:t>
+            </w:r>
+          </w:p>
+        </w:tc>
+        <w:tc>
+          <w:tcPr/>
+          <w:p>
+            <w:pPr>
+              <w:pStyle w:val="Compact"/>
+            </w:pPr>
+            <w:r>
+              <w:t xml:space="preserve">LXX (3rd c. BC); Byzantine (10th c.); Modern Greek (post-1976)</w:t>
+            </w:r>
+          </w:p>
+        </w:tc>
+        <w:tc>
+          <w:tcPr/>
+          <w:p>
+            <w:pPr>
+              <w:pStyle w:val="Compact"/>
+            </w:pPr>
+            <w:r>
+              <w:rPr>
+                <w:rStyle w:val="VerbatimChar"/>
+              </w:rPr>
+              <w:t xml:space="preserve">pred-nom + sub + atr.rel-cl</w:t>
+            </w:r>
+            <w:r>
+              <w:t xml:space="preserve"> </w:t>
+            </w:r>
+            <w:r>
+              <w:t xml:space="preserve">stable; voice flips twice;</w:t>
+            </w:r>
+            <w:r>
+              <w:t xml:space="preserve"> </w:t>
+            </w:r>
+            <w:r>
+              <w:rPr>
+                <w:i/>
+                <w:iCs/>
+              </w:rPr>
+              <w:t xml:space="preserve">οὐκ -&gt; οὐ -&gt; δεν</w:t>
+            </w:r>
+          </w:p>
+        </w:tc>
+      </w:tr>
+      <w:tr>
+        <w:tc>
+          <w:tcPr/>
+          <w:p>
+            <w:pPr>
+              <w:pStyle w:val="Compact"/>
+            </w:pPr>
+            <w:r>
+              <w:t xml:space="preserve">NT John 1:1 patristic + Modern reception</w:t>
+            </w:r>
+          </w:p>
+        </w:tc>
+        <w:tc>
+          <w:tcPr/>
+          <w:p>
+            <w:pPr>
+              <w:pStyle w:val="Compact"/>
+            </w:pPr>
+            <w:r>
+              <w:t xml:space="preserve">retelling</w:t>
+            </w:r>
+          </w:p>
+        </w:tc>
+        <w:tc>
+          <w:tcPr/>
+          <w:p>
+            <w:pPr>
+              <w:pStyle w:val="Compact"/>
+            </w:pPr>
+            <w:r>
+              <w:t xml:space="preserve">John (1st c.); Chrysostom (4th c.); John of Damascus (8th c.); Modern liturgical (post-1976)</w:t>
+            </w:r>
+          </w:p>
+        </w:tc>
+        <w:tc>
+          <w:tcPr/>
+          <w:p>
+            <w:pPr>
+              <w:pStyle w:val="Compact"/>
+            </w:pPr>
+            <w:r>
+              <w:t xml:space="preserve">copular skeleton stable 2,000 years; patristic nodes nest under</w:t>
+            </w:r>
+            <w:r>
+              <w:t xml:space="preserve"> </w:t>
+            </w:r>
+            <w:r>
+              <w:rPr>
+                <w:rStyle w:val="VerbatimChar"/>
+              </w:rPr>
+              <w:t xml:space="preserve">xcomp</w:t>
+            </w:r>
+            <w:r>
+              <w:t xml:space="preserve"> </w:t>
+            </w:r>
+            <w:r>
+              <w:t xml:space="preserve">of</w:t>
+            </w:r>
+            <w:r>
+              <w:t xml:space="preserve"> </w:t>
+            </w:r>
+            <w:r>
+              <w:rPr>
+                <w:i/>
+                <w:iCs/>
+              </w:rPr>
+              <w:t xml:space="preserve">φησίν</w:t>
+            </w:r>
+          </w:p>
+        </w:tc>
+      </w:tr>
+      <w:tr>
+        <w:tc>
+          <w:tcPr/>
+          <w:p>
+            <w:pPr>
+              <w:pStyle w:val="Compact"/>
+            </w:pPr>
+            <w:r>
+              <w:t xml:space="preserve">Plato</w:t>
+            </w:r>
+            <w:r>
+              <w:t xml:space="preserve"> </w:t>
+            </w:r>
+            <w:r>
+              <w:rPr>
+                <w:i/>
+                <w:iCs/>
+              </w:rPr>
+              <w:t xml:space="preserve">Apology</w:t>
+            </w:r>
+            <w:r>
+              <w:t xml:space="preserve"> </w:t>
+            </w:r>
+            <w:r>
+              <w:t xml:space="preserve">17a across reception</w:t>
+            </w:r>
+          </w:p>
+        </w:tc>
+        <w:tc>
+          <w:tcPr/>
+          <w:p>
+            <w:pPr>
+              <w:pStyle w:val="Compact"/>
+            </w:pPr>
+            <w:r>
+              <w:t xml:space="preserve">retelling</w:t>
+            </w:r>
+          </w:p>
+        </w:tc>
+        <w:tc>
+          <w:tcPr/>
+          <w:p>
+            <w:pPr>
+              <w:pStyle w:val="Compact"/>
+            </w:pPr>
+            <w:r>
+              <w:t xml:space="preserve">Plato (4th c. BC); Olympiodorus (6th c.); Modern Greek (post-1976)</w:t>
+            </w:r>
+          </w:p>
+        </w:tc>
+        <w:tc>
+          <w:tcPr/>
+          <w:p>
+            <w:pPr>
+              <w:pStyle w:val="Compact"/>
+            </w:pPr>
+            <w:r>
+              <w:rPr>
+                <w:rStyle w:val="VerbatimChar"/>
+              </w:rPr>
+              <w:t xml:space="preserve">pred + adv:neg + comp[sub, obl]</w:t>
+            </w:r>
+            <w:r>
+              <w:t xml:space="preserve"> </w:t>
+            </w:r>
+            <w:r>
+              <w:t xml:space="preserve">preserved; perfect aspect synthetic vs analytic</w:t>
+            </w:r>
+          </w:p>
+        </w:tc>
+      </w:tr>
+      <w:tr>
+        <w:tc>
+          <w:tcPr/>
+          <w:p>
+            <w:pPr>
+              <w:pStyle w:val="Compact"/>
+            </w:pPr>
+            <w:r>
+              <w:t xml:space="preserve">LXX Genesis 1:1 across IE languages</w:t>
+            </w:r>
+          </w:p>
+        </w:tc>
+        <w:tc>
+          <w:tcPr/>
+          <w:p>
+            <w:pPr>
+              <w:pStyle w:val="Compact"/>
+            </w:pPr>
+            <w:r>
+              <w:t xml:space="preserve">retranslation, cross-IE</w:t>
+            </w:r>
+          </w:p>
+        </w:tc>
+        <w:tc>
+          <w:tcPr/>
+          <w:p>
+            <w:pPr>
+              <w:pStyle w:val="Compact"/>
+            </w:pPr>
+            <w:r>
+              <w:t xml:space="preserve">LXX Greek; Vulgate Latin; Wulfila Gothic; OCS Marianus</w:t>
+            </w:r>
+          </w:p>
+        </w:tc>
+        <w:tc>
+          <w:tcPr/>
+          <w:p>
+            <w:pPr>
+              <w:pStyle w:val="Compact"/>
+            </w:pPr>
+            <w:r>
+              <w:rPr>
+                <w:rStyle w:val="VerbatimChar"/>
+              </w:rPr>
+              <w:t xml:space="preserve">pred + sub + obl/adv + obj + coord</w:t>
+            </w:r>
+            <w:r>
+              <w:t xml:space="preserve"> </w:t>
+            </w:r>
+            <w:r>
+              <w:t xml:space="preserve">stable across all four; only obl-vs-adv diverges in OCS</w:t>
+            </w:r>
+          </w:p>
+        </w:tc>
+      </w:tr>
+    </w:tbl>
+    <w:bookmarkEnd w:id="27"/>
+    <w:bookmarkStart w:id="28" w:name="tools-open-source"/>
+    <w:p>
+      <w:pPr>
+        <w:pStyle w:val="Heading3"/>
+      </w:pPr>
+      <w:r>
+        <w:t xml:space="preserve">3.4 Tools (open source)</w:t>
+      </w:r>
+    </w:p>
+    <w:p>
+      <w:pPr>
+        <w:pStyle w:val="FirstParagraph"/>
+      </w:pPr>
+      <w:r>
+        <w:t xml:space="preserve">AthDGC ships fourteen modules under OSI-approved licences. The annotation layer plus the</w:t>
+      </w:r>
+      <w:r>
+        <w:t xml:space="preserve"> </w:t>
+      </w:r>
+      <w:r>
+        <w:t xml:space="preserve">corpus samples are CC-BY-4.0; tool code is Apache-2.0 (most modules), MIT (Quarto pack +</w:t>
+      </w:r>
+      <w:r>
+        <w:t xml:space="preserve"> </w:t>
+      </w:r>
+      <w:r>
+        <w:t xml:space="preserve">Neo4j viewer), BSD-3-Clause (upstream LightSIDE, retained on the patch set), and GPL-3.0</w:t>
+      </w:r>
+      <w:r>
+        <w:t xml:space="preserve"> </w:t>
+      </w:r>
+      <w:r>
+        <w:t xml:space="preserve">(upstream CWB, retained on the index builder).</w:t>
+      </w:r>
+    </w:p>
+    <w:tbl>
+      <w:tblPr>
+        <w:tblStyle w:val="Table"/>
+        <w:tblW w:type="pct" w:w="5000"/>
+        <w:tblLayout w:type="fixed"/>
+        <w:tblLook w:firstRow="1" w:lastRow="0" w:firstColumn="0" w:lastColumn="0" w:noHBand="0" w:noVBand="0" w:val="0020"/>
+      </w:tblPr>
+      <w:tblGrid>
+        <w:gridCol w:w="3960"/>
+        <w:gridCol w:w="3960"/>
+      </w:tblGrid>
+      <w:tr>
+        <w:trPr>
+          <w:tblHeader w:val="on"/>
+        </w:trPr>
+        <w:tc>
+          <w:tcPr/>
+          <w:p>
+            <w:pPr>
+              <w:pStyle w:val="Compact"/>
+            </w:pPr>
+            <w:r>
+              <w:t xml:space="preserve">Module</w:t>
+            </w:r>
+          </w:p>
+        </w:tc>
+        <w:tc>
+          <w:tcPr/>
+          <w:p>
+            <w:pPr>
+              <w:pStyle w:val="Compact"/>
+            </w:pPr>
+            <w:r>
+              <w:t xml:space="preserve">Licence</w:t>
+            </w:r>
+          </w:p>
+        </w:tc>
+      </w:tr>
+      <w:tr>
+        <w:tc>
+          <w:tcPr/>
+          <w:p>
+            <w:pPr>
+              <w:pStyle w:val="Compact"/>
+            </w:pPr>
+            <w:r>
+              <w:rPr>
+                <w:rStyle w:val="VerbatimChar"/>
+              </w:rPr>
+              <w:t xml:space="preserve">tools/lightside-athdgc/</w:t>
+            </w:r>
+            <w:r>
+              <w:t xml:space="preserve"> </w:t>
+            </w:r>
+            <w:r>
+              <w:t xml:space="preserve">(LightSIDE for PROIEL arcs + frames + morphology)</w:t>
+            </w:r>
+          </w:p>
+        </w:tc>
+        <w:tc>
+          <w:tcPr/>
+          <w:p>
+            <w:pPr>
+              <w:pStyle w:val="Compact"/>
+            </w:pPr>
+            <w:r>
+              <w:t xml:space="preserve">BSD-3-Clause + Apache-2.0</w:t>
+            </w:r>
+          </w:p>
+        </w:tc>
+      </w:tr>
+      <w:tr>
+        <w:tc>
+          <w:tcPr/>
+          <w:p>
+            <w:pPr>
+              <w:pStyle w:val="Compact"/>
+            </w:pPr>
+            <w:r>
+              <w:rPr>
+                <w:rStyle w:val="VerbatimChar"/>
+              </w:rPr>
+              <w:t xml:space="preserve">tools/athdgc_to_lightside_syntax.py</w:t>
+            </w:r>
+            <w:r>
+              <w:t xml:space="preserve">,</w:t>
+            </w:r>
+            <w:r>
+              <w:t xml:space="preserve"> </w:t>
+            </w:r>
+            <w:r>
+              <w:rPr>
+                <w:rStyle w:val="VerbatimChar"/>
+              </w:rPr>
+              <w:t xml:space="preserve">tools/athdgc_to_lightside.py</w:t>
+            </w:r>
+          </w:p>
+        </w:tc>
+        <w:tc>
+          <w:tcPr/>
+          <w:p>
+            <w:pPr>
+              <w:pStyle w:val="Compact"/>
+            </w:pPr>
+            <w:r>
+              <w:t xml:space="preserve">Apache-2.0</w:t>
+            </w:r>
+          </w:p>
+        </w:tc>
+      </w:tr>
+      <w:tr>
+        <w:tc>
+          <w:tcPr/>
+          <w:p>
+            <w:pPr>
+              <w:pStyle w:val="Compact"/>
+            </w:pPr>
+            <w:r>
+              <w:rPr>
+                <w:rStyle w:val="VerbatimChar"/>
+              </w:rPr>
+              <w:t xml:space="preserve">tools/proiel_export/</w:t>
+            </w:r>
+            <w:r>
+              <w:t xml:space="preserve"> </w:t>
+            </w:r>
+            <w:r>
+              <w:t xml:space="preserve">(Stanza -&gt; PROIEL XML 2.0)</w:t>
+            </w:r>
+          </w:p>
+        </w:tc>
+        <w:tc>
+          <w:tcPr/>
+          <w:p>
+            <w:pPr>
+              <w:pStyle w:val="Compact"/>
+            </w:pPr>
+            <w:r>
+              <w:t xml:space="preserve">Apache-2.0</w:t>
+            </w:r>
+          </w:p>
+        </w:tc>
+      </w:tr>
+      <w:tr>
+        <w:tc>
+          <w:tcPr/>
+          <w:p>
+            <w:pPr>
+              <w:pStyle w:val="Compact"/>
+            </w:pPr>
+            <w:r>
+              <w:rPr>
+                <w:rStyle w:val="VerbatimChar"/>
+              </w:rPr>
+              <w:t xml:space="preserve">tools/proiel_validate.py</w:t>
+            </w:r>
+            <w:r>
+              <w:t xml:space="preserve"> </w:t>
+            </w:r>
+            <w:r>
+              <w:t xml:space="preserve">(v0.5 schema linter)</w:t>
+            </w:r>
+          </w:p>
+        </w:tc>
+        <w:tc>
+          <w:tcPr/>
+          <w:p>
+            <w:pPr>
+              <w:pStyle w:val="Compact"/>
+            </w:pPr>
+            <w:r>
+              <w:t xml:space="preserve">Apache-2.0</w:t>
+            </w:r>
+          </w:p>
+        </w:tc>
+      </w:tr>
+      <w:tr>
+        <w:tc>
+          <w:tcPr/>
+          <w:p>
+            <w:pPr>
+              <w:pStyle w:val="Compact"/>
+            </w:pPr>
+            <w:r>
+              <w:rPr>
+                <w:rStyle w:val="VerbatimChar"/>
+              </w:rPr>
+              <w:t xml:space="preserve">tools/arg_structure.py</w:t>
+            </w:r>
+            <w:r>
+              <w:t xml:space="preserve">,</w:t>
+            </w:r>
+            <w:r>
+              <w:t xml:space="preserve"> </w:t>
+            </w:r>
+            <w:r>
+              <w:rPr>
+                <w:rStyle w:val="VerbatimChar"/>
+              </w:rPr>
+              <w:t xml:space="preserve">tools/fix_corpus_data.py</w:t>
+            </w:r>
+            <w:r>
+              <w:t xml:space="preserve">,</w:t>
+            </w:r>
+            <w:r>
+              <w:t xml:space="preserve"> </w:t>
+            </w:r>
+            <w:r>
+              <w:rPr>
+                <w:rStyle w:val="VerbatimChar"/>
+              </w:rPr>
+              <w:t xml:space="preserve">tools/valency_db.py</w:t>
+            </w:r>
+          </w:p>
+        </w:tc>
+        <w:tc>
+          <w:tcPr/>
+          <w:p>
+            <w:pPr>
+              <w:pStyle w:val="Compact"/>
+            </w:pPr>
+            <w:r>
+              <w:t xml:space="preserve">Apache-2.0</w:t>
+            </w:r>
+          </w:p>
+        </w:tc>
+      </w:tr>
+      <w:tr>
+        <w:tc>
+          <w:tcPr/>
+          <w:p>
+            <w:pPr>
+              <w:pStyle w:val="Compact"/>
+            </w:pPr>
+            <w:r>
+              <w:rPr>
+                <w:rStyle w:val="VerbatimChar"/>
+              </w:rPr>
+              <w:t xml:space="preserve">tools/stanza-finetune/</w:t>
+            </w:r>
+            <w:r>
+              <w:t xml:space="preserve"> </w:t>
+            </w:r>
+            <w:r>
+              <w:t xml:space="preserve">(diachronic Stanza checkpoints)</w:t>
+            </w:r>
+          </w:p>
+        </w:tc>
+        <w:tc>
+          <w:tcPr/>
+          <w:p>
+            <w:pPr>
+              <w:pStyle w:val="Compact"/>
+            </w:pPr>
+            <w:r>
+              <w:t xml:space="preserve">Apache-2.0</w:t>
+            </w:r>
+          </w:p>
+        </w:tc>
+      </w:tr>
+      <w:tr>
+        <w:tc>
+          <w:tcPr/>
+          <w:p>
+            <w:pPr>
+              <w:pStyle w:val="Compact"/>
+            </w:pPr>
+            <w:r>
+              <w:rPr>
+                <w:rStyle w:val="VerbatimChar"/>
+              </w:rPr>
+              <w:t xml:space="preserve">tools/build_cwb_index.sh</w:t>
+            </w:r>
+            <w:r>
+              <w:t xml:space="preserve"> </w:t>
+            </w:r>
+            <w:r>
+              <w:t xml:space="preserve">(NoSketch-style CWB index)</w:t>
+            </w:r>
+          </w:p>
+        </w:tc>
+        <w:tc>
+          <w:tcPr/>
+          <w:p>
+            <w:pPr>
+              <w:pStyle w:val="Compact"/>
+            </w:pPr>
+            <w:r>
+              <w:t xml:space="preserve">GPL-3.0</w:t>
+            </w:r>
+          </w:p>
+        </w:tc>
+      </w:tr>
+      <w:tr>
+        <w:tc>
+          <w:tcPr/>
+          <w:p>
+            <w:pPr>
+              <w:pStyle w:val="Compact"/>
+            </w:pPr>
+            <w:r>
+              <w:rPr>
+                <w:rStyle w:val="VerbatimChar"/>
+              </w:rPr>
+              <w:t xml:space="preserve">tools/cwb-recipes/</w:t>
+            </w:r>
+            <w:r>
+              <w:t xml:space="preserve"> </w:t>
+            </w:r>
+            <w:r>
+              <w:t xml:space="preserve">(sample CQL queries)</w:t>
+            </w:r>
+          </w:p>
+        </w:tc>
+        <w:tc>
+          <w:tcPr/>
+          <w:p>
+            <w:pPr>
+              <w:pStyle w:val="Compact"/>
+            </w:pPr>
+            <w:r>
+              <w:t xml:space="preserve">CC-BY-4.0</w:t>
+            </w:r>
+          </w:p>
+        </w:tc>
+      </w:tr>
+      <w:tr>
+        <w:tc>
+          <w:tcPr/>
+          <w:p>
+            <w:pPr>
+              <w:pStyle w:val="Compact"/>
+            </w:pPr>
+            <w:r>
+              <w:rPr>
+                <w:rStyle w:val="VerbatimChar"/>
+              </w:rPr>
+              <w:t xml:space="preserve">tools/showcase/</w:t>
+            </w:r>
+            <w:r>
+              <w:t xml:space="preserve"> </w:t>
+            </w:r>
+            <w:r>
+              <w:t xml:space="preserve">(</w:t>
+            </w:r>
+            <w:r>
+              <w:rPr>
+                <w:rStyle w:val="VerbatimChar"/>
+              </w:rPr>
+              <w:t xml:space="preserve">51_build_showcase_site.py</w:t>
+            </w:r>
+            <w:r>
+              <w:t xml:space="preserve">)</w:t>
+            </w:r>
+          </w:p>
+        </w:tc>
+        <w:tc>
+          <w:tcPr/>
+          <w:p>
+            <w:pPr>
+              <w:pStyle w:val="Compact"/>
+            </w:pPr>
+            <w:r>
+              <w:t xml:space="preserve">Apache-2.0</w:t>
+            </w:r>
+          </w:p>
+        </w:tc>
+      </w:tr>
+      <w:tr>
+        <w:tc>
+          <w:tcPr/>
+          <w:p>
+            <w:pPr>
+              <w:pStyle w:val="Compact"/>
+            </w:pPr>
+            <w:r>
+              <w:rPr>
+                <w:rStyle w:val="VerbatimChar"/>
+              </w:rPr>
+              <w:t xml:space="preserve">tools/neo4j-align-viewer/</w:t>
+            </w:r>
+            <w:r>
+              <w:t xml:space="preserve"> </w:t>
+            </w:r>
+            <w:r>
+              <w:t xml:space="preserve">(cross-lingual graph viewer)</w:t>
+            </w:r>
+          </w:p>
+        </w:tc>
+        <w:tc>
+          <w:tcPr/>
+          <w:p>
+            <w:pPr>
+              <w:pStyle w:val="Compact"/>
+            </w:pPr>
+            <w:r>
+              <w:t xml:space="preserve">MIT</w:t>
+            </w:r>
+          </w:p>
+        </w:tc>
+      </w:tr>
+      <w:tr>
+        <w:tc>
+          <w:tcPr/>
+          <w:p>
+            <w:pPr>
+              <w:pStyle w:val="Compact"/>
+            </w:pPr>
+            <w:r>
+              <w:rPr>
+                <w:rStyle w:val="VerbatimChar"/>
+              </w:rPr>
+              <w:t xml:space="preserve">tools/retranslation-browser/</w:t>
+            </w:r>
+            <w:r>
+              <w:t xml:space="preserve"> </w:t>
+            </w:r>
+            <w:r>
+              <w:t xml:space="preserve">(v0.5)</w:t>
+            </w:r>
+          </w:p>
+        </w:tc>
+        <w:tc>
+          <w:tcPr/>
+          <w:p>
+            <w:pPr>
+              <w:pStyle w:val="Compact"/>
+            </w:pPr>
+            <w:r>
+              <w:t xml:space="preserve">Apache-2.0</w:t>
+            </w:r>
+          </w:p>
+        </w:tc>
+      </w:tr>
+      <w:tr>
+        <w:tc>
+          <w:tcPr/>
+          <w:p>
+            <w:pPr>
+              <w:pStyle w:val="Compact"/>
+            </w:pPr>
+            <w:r>
+              <w:rPr>
+                <w:rStyle w:val="VerbatimChar"/>
+              </w:rPr>
+              <w:t xml:space="preserve">tools/retelling-explorer/</w:t>
+            </w:r>
+            <w:r>
+              <w:t xml:space="preserve"> </w:t>
+            </w:r>
+            <w:r>
+              <w:t xml:space="preserve">(v0.5)</w:t>
+            </w:r>
+          </w:p>
+        </w:tc>
+        <w:tc>
+          <w:tcPr/>
+          <w:p>
+            <w:pPr>
+              <w:pStyle w:val="Compact"/>
+            </w:pPr>
+            <w:r>
+              <w:t xml:space="preserve">Apache-2.0</w:t>
+            </w:r>
+          </w:p>
+        </w:tc>
+      </w:tr>
+      <w:tr>
+        <w:tc>
+          <w:tcPr/>
+          <w:p>
+            <w:pPr>
+              <w:pStyle w:val="Compact"/>
+            </w:pPr>
+            <w:r>
+              <w:rPr>
+                <w:rStyle w:val="VerbatimChar"/>
+              </w:rPr>
+              <w:t xml:space="preserve">athdgc-quarto/</w:t>
+            </w:r>
+            <w:r>
+              <w:t xml:space="preserve"> </w:t>
+            </w:r>
+            <w:r>
+              <w:t xml:space="preserve">(this Working Paper + the public site)</w:t>
+            </w:r>
+          </w:p>
+        </w:tc>
+        <w:tc>
+          <w:tcPr/>
+          <w:p>
+            <w:pPr>
+              <w:pStyle w:val="Compact"/>
+            </w:pPr>
+            <w:r>
+              <w:t xml:space="preserve">MIT</w:t>
+            </w:r>
+          </w:p>
+        </w:tc>
+      </w:tr>
+      <w:tr>
+        <w:tc>
+          <w:tcPr/>
+          <w:p>
+            <w:pPr>
+              <w:pStyle w:val="Compact"/>
+            </w:pPr>
+            <w:r>
+              <w:t xml:space="preserve">Stanza checkpoints</w:t>
+            </w:r>
+            <w:r>
+              <w:t xml:space="preserve"> </w:t>
+            </w:r>
+            <w:r>
+              <w:rPr>
+                <w:rStyle w:val="VerbatimChar"/>
+              </w:rPr>
+              <w:t xml:space="preserve">athdgc/grc_byz_proiel</w:t>
+            </w:r>
+            <w:r>
+              <w:t xml:space="preserve">,</w:t>
+            </w:r>
+            <w:r>
+              <w:t xml:space="preserve"> </w:t>
+            </w:r>
+            <w:r>
+              <w:rPr>
+                <w:rStyle w:val="VerbatimChar"/>
+              </w:rPr>
+              <w:t xml:space="preserve">grc_lbem_proiel</w:t>
+            </w:r>
+            <w:r>
+              <w:t xml:space="preserve">,</w:t>
+            </w:r>
+            <w:r>
+              <w:t xml:space="preserve"> </w:t>
+            </w:r>
+            <w:r>
+              <w:rPr>
+                <w:rStyle w:val="VerbatimChar"/>
+              </w:rPr>
+              <w:t xml:space="preserve">grc_mod_proiel</w:t>
+            </w:r>
+            <w:r>
+              <w:t xml:space="preserve"> </w:t>
+            </w:r>
+            <w:r>
+              <w:t xml:space="preserve">(HF mirror v0.5)</w:t>
+            </w:r>
+          </w:p>
+        </w:tc>
+        <w:tc>
+          <w:tcPr/>
+          <w:p>
+            <w:pPr>
+              <w:pStyle w:val="Compact"/>
+            </w:pPr>
+            <w:r>
+              <w:t xml:space="preserve">Apache-2.0</w:t>
+            </w:r>
+          </w:p>
+        </w:tc>
+      </w:tr>
+    </w:tbl>
+    <w:p>
+      <w:pPr>
+        <w:pStyle w:val="BodyText"/>
+      </w:pPr>
+      <w:r>
+        <w:t xml:space="preserve">Two automated gates run on every community PR: a PROIEL XML 2.0 schema validator (rejecting</w:t>
+      </w:r>
+      <w:r>
+        <w:t xml:space="preserve"> </w:t>
+      </w:r>
+      <w:r>
+        <w:t xml:space="preserve">UD-style labels such as</w:t>
+      </w:r>
+      <w:r>
+        <w:t xml:space="preserve"> </w:t>
+      </w:r>
+      <w:r>
+        <w:rPr>
+          <w:rStyle w:val="VerbatimChar"/>
+        </w:rPr>
+        <w:t xml:space="preserve">nsubj</w:t>
+      </w:r>
+      <w:r>
+        <w:t xml:space="preserve">,</w:t>
+      </w:r>
+      <w:r>
+        <w:t xml:space="preserve"> </w:t>
+      </w:r>
+      <w:r>
+        <w:rPr>
+          <w:rStyle w:val="VerbatimChar"/>
+        </w:rPr>
+        <w:t xml:space="preserve">dobj</w:t>
+      </w:r>
+      <w:r>
+        <w:t xml:space="preserve">,</w:t>
+      </w:r>
+      <w:r>
+        <w:t xml:space="preserve"> </w:t>
+      </w:r>
+      <w:r>
+        <w:rPr>
+          <w:rStyle w:val="VerbatimChar"/>
+        </w:rPr>
+        <w:t xml:space="preserve">nmod</w:t>
+      </w:r>
+      <w:r>
+        <w:t xml:space="preserve">,</w:t>
+      </w:r>
+      <w:r>
+        <w:t xml:space="preserve"> </w:t>
+      </w:r>
+      <w:r>
+        <w:rPr>
+          <w:rStyle w:val="VerbatimChar"/>
+        </w:rPr>
+        <w:t xml:space="preserve">case</w:t>
+      </w:r>
+      <w:r>
+        <w:t xml:space="preserve">) and a Lavidasised house-style check</w:t>
+      </w:r>
+      <w:r>
+        <w:t xml:space="preserve"> </w:t>
+      </w:r>
+      <w:r>
+        <w:t xml:space="preserve">(rejecting AI-marker vocabulary and em-dashes).</w:t>
+      </w:r>
+    </w:p>
+    <w:bookmarkEnd w:id="28"/>
+    <w:bookmarkEnd w:id="29"/>
+    <w:bookmarkStart w:id="31" w:name="reuse-potential"/>
     <w:p>
       <w:pPr>
         <w:pStyle w:val="Heading2"/>
@@ -1187,7 +3961,13 @@
         <w:t xml:space="preserve">grc_mod_proiel</w:t>
       </w:r>
       <w:r>
-        <w:t xml:space="preserve">) ship as Hugging Face model repos under</w:t>
+        <w:t xml:space="preserve">) are trained on ARIS; the Hugging Face mirror</w:t>
+      </w:r>
+      <w:r>
+        <w:t xml:space="preserve"> </w:t>
+      </w:r>
+      <w:r>
+        <w:t xml:space="preserve">under</w:t>
       </w:r>
       <w:r>
         <w:t xml:space="preserve"> </w:t>
@@ -1202,7 +3982,19 @@
         <w:t xml:space="preserve"> </w:t>
       </w:r>
       <w:r>
-        <w:t xml:space="preserve">and can be used directly for parsing new Greek diachronic data. The LightSIDE-AthDGC fork</w:t>
+        <w:t xml:space="preserve">is in setup and ships at v0.5. The checkpoints can be loaded</w:t>
+      </w:r>
+      <w:r>
+        <w:t xml:space="preserve"> </w:t>
+      </w:r>
+      <w:r>
+        <w:t xml:space="preserve">directly into Stanza for parsing new Greek diachronic data once published. The</w:t>
+      </w:r>
+      <w:r>
+        <w:t xml:space="preserve"> </w:t>
+      </w:r>
+      <w:r>
+        <w:t xml:space="preserve">LightSIDE-AthDGC fork</w:t>
       </w:r>
       <w:r>
         <w:t xml:space="preserve"> </w:t>
@@ -1328,7 +4120,7 @@
       <w:r>
         <w:t xml:space="preserve"> </w:t>
       </w:r>
-      <w:hyperlink r:id="rId24">
+      <w:hyperlink r:id="rId30">
         <w:r>
           <w:rPr>
             <w:rStyle w:val="Hyperlink"/>
@@ -1340,8 +4132,8 @@
         <w:t xml:space="preserve">.</w:t>
       </w:r>
     </w:p>
-    <w:bookmarkEnd w:id="25"/>
-    <w:bookmarkStart w:id="27" w:name="access-format"/>
+    <w:bookmarkEnd w:id="31"/>
+    <w:bookmarkStart w:id="33" w:name="access-format"/>
     <w:p>
       <w:pPr>
         <w:pStyle w:val="Heading2"/>
@@ -1426,30 +4218,48 @@
         <w:pStyle w:val="BodyText"/>
       </w:pPr>
       <w:r>
-        <w:t xml:space="preserve">The platform’s nine open-source tools (LightSIDE-AthDGC for syntax, NoSketch-style</w:t>
-      </w:r>
-      <w:r>
-        <w:t xml:space="preserve"> </w:t>
-      </w:r>
-      <w:r>
-        <w:t xml:space="preserve">concordancer, fine-tuned Stanza checkpoints, PROIEL XML 2.0 exporter, corpus-fix toolkit,</w:t>
-      </w:r>
-      <w:r>
-        <w:t xml:space="preserve"> </w:t>
-      </w:r>
-      <w:r>
-        <w:t xml:space="preserve">argument-structure extractor, cross-lingual alignment viewer, showcase generator, Quarto</w:t>
-      </w:r>
-      <w:r>
-        <w:t xml:space="preserve"> </w:t>
-      </w:r>
-      <w:r>
-        <w:t xml:space="preserve">template pack) are released and usable now. See</w:t>
-      </w:r>
-      <w:r>
-        <w:t xml:space="preserve"> </w:t>
-      </w:r>
-      <w:hyperlink r:id="rId26">
+        <w:t xml:space="preserve">The platform’s fourteen open-source tools (LightSIDE-AthDGC for PROIEL syntactic</w:t>
+      </w:r>
+      <w:r>
+        <w:t xml:space="preserve"> </w:t>
+      </w:r>
+      <w:r>
+        <w:t xml:space="preserve">features, LightSIDE-compatible text-feature export, NoSketch-style concordancer,</w:t>
+      </w:r>
+      <w:r>
+        <w:t xml:space="preserve"> </w:t>
+      </w:r>
+      <w:r>
+        <w:t xml:space="preserve">fine-tuned diachronic Stanza checkpoints, PROIEL XML 2.0 exporter, corpus-fix toolkit,</w:t>
+      </w:r>
+      <w:r>
+        <w:t xml:space="preserve"> </w:t>
+      </w:r>
+      <w:r>
+        <w:t xml:space="preserve">argument-structure extractor, cross-lingual Neo4j alignment viewer, showcase generator,</w:t>
+      </w:r>
+      <w:r>
+        <w:t xml:space="preserve"> </w:t>
+      </w:r>
+      <w:r>
+        <w:t xml:space="preserve">v0.5 PROIEL XML 2.0 validator, v0.5 valency-frame database client, v0.5</w:t>
+      </w:r>
+      <w:r>
+        <w:t xml:space="preserve"> </w:t>
+      </w:r>
+      <w:r>
+        <w:t xml:space="preserve">retranslation-pair browser, v0.5 retelling-chain explorer, and the Quarto template pack)</w:t>
+      </w:r>
+      <w:r>
+        <w:t xml:space="preserve"> </w:t>
+      </w:r>
+      <w:r>
+        <w:t xml:space="preserve">are released and usable now per §3.4. See</w:t>
+      </w:r>
+      <w:r>
+        <w:t xml:space="preserve"> </w:t>
+      </w:r>
+      <w:hyperlink r:id="rId32">
         <w:r>
           <w:rPr>
             <w:rStyle w:val="Hyperlink"/>
@@ -1461,8 +4271,8 @@
         <w:t xml:space="preserve">.</w:t>
       </w:r>
     </w:p>
-    <w:bookmarkEnd w:id="27"/>
-    <w:bookmarkStart w:id="28" w:name="acknowledgements"/>
+    <w:bookmarkEnd w:id="33"/>
+    <w:bookmarkStart w:id="34" w:name="acknowledgements"/>
     <w:p>
       <w:pPr>
         <w:pStyle w:val="Heading2"/>
@@ -1623,29 +4433,99 @@
         <w:pStyle w:val="BodyText"/>
       </w:pPr>
       <w:r>
-        <w:t xml:space="preserve">Team: Prof. Nikolaos Lavidas (PI, NKUA), Prof. Emerita Kiki Nikiforidou (NKUA), Prof. Dag</w:t>
-      </w:r>
-      <w:r>
-        <w:t xml:space="preserve"> </w:t>
-      </w:r>
-      <w:r>
-        <w:t xml:space="preserve">Haug (Oslo, PROIEL Director), Prof. Leonid Kulikov (Ghent), Dr. Vassiliki Geka (NKUA),</w:t>
-      </w:r>
-      <w:r>
-        <w:t xml:space="preserve"> </w:t>
-      </w:r>
-      <w:r>
-        <w:t xml:space="preserve">Dr. Vassileios Symeonidis (NKUA), Dr. Theodoros Michalareas (NKUA), Sofia Chionidi (NKUA),</w:t>
-      </w:r>
-      <w:r>
-        <w:t xml:space="preserve"> </w:t>
-      </w:r>
-      <w:r>
-        <w:t xml:space="preserve">Anastasia Tsiropina (NKUA), Eleni Plakoutsi (NKUA), Evangelos Argyropoulos (NKUA).</w:t>
+        <w:t xml:space="preserve">Team: Prof. Nikolaos Lavidas (PI, NKUA), Prof. Emerita Kiki Nikiforidou (NKUA;</w:t>
+      </w:r>
+      <w:r>
+        <w:t xml:space="preserve"> </w:t>
+      </w:r>
+      <w:r>
+        <w:t xml:space="preserve">Co-Editor,</w:t>
+      </w:r>
+      <w:r>
+        <w:t xml:space="preserve"> </w:t>
+      </w:r>
+      <w:r>
+        <w:rPr>
+          <w:i/>
+          <w:iCs/>
+        </w:rPr>
+        <w:t xml:space="preserve">Genres and Influential Texts</w:t>
+      </w:r>
+      <w:r>
+        <w:t xml:space="preserve"> </w:t>
+      </w:r>
+      <w:r>
+        <w:t xml:space="preserve">volume), Prof. Dag Haug (Oslo, PROIEL Project</w:t>
+      </w:r>
+      <w:r>
+        <w:t xml:space="preserve"> </w:t>
+      </w:r>
+      <w:r>
+        <w:t xml:space="preserve">Director), Prof. Leonid Kulikov (Ghent; Diachronic typology, valency questionnaires),</w:t>
+      </w:r>
+      <w:r>
+        <w:t xml:space="preserve"> </w:t>
+      </w:r>
+      <w:r>
+        <w:t xml:space="preserve">Dr. Vassiliki Geka (NKUA; Post-Doctoral Researcher; Co-Editor,</w:t>
+      </w:r>
+      <w:r>
+        <w:t xml:space="preserve"> </w:t>
+      </w:r>
+      <w:r>
+        <w:rPr>
+          <w:i/>
+          <w:iCs/>
+        </w:rPr>
+        <w:t xml:space="preserve">Genres and Influential</w:t>
+      </w:r>
+      <w:r>
+        <w:rPr>
+          <w:i/>
+          <w:iCs/>
+        </w:rPr>
+        <w:t xml:space="preserve"> </w:t>
+      </w:r>
+      <w:r>
+        <w:rPr>
+          <w:i/>
+          <w:iCs/>
+        </w:rPr>
+        <w:t xml:space="preserve">Texts</w:t>
+      </w:r>
+      <w:r>
+        <w:t xml:space="preserve"> </w:t>
+      </w:r>
+      <w:r>
+        <w:t xml:space="preserve">volume), Dr. Vassileios Symeonidis (NKUA; Post-Doctoral Researcher),</w:t>
+      </w:r>
+      <w:r>
+        <w:t xml:space="preserve"> </w:t>
+      </w:r>
+      <w:r>
+        <w:t xml:space="preserve">Dr. Theodoros Michalareas (NKUA; Post-Doctoral Researcher), Sofia Chionidi (NKUA;</w:t>
+      </w:r>
+      <w:r>
+        <w:t xml:space="preserve"> </w:t>
+      </w:r>
+      <w:r>
+        <w:t xml:space="preserve">PhD Candidate), Anastasia Tsiropina (NKUA; PhD Candidate), Eleni Plakoutsi (NKUA;</w:t>
+      </w:r>
+      <w:r>
+        <w:t xml:space="preserve"> </w:t>
+      </w:r>
+      <w:r>
+        <w:t xml:space="preserve">PhD Candidate), Evangelos Argyropoulos (NKUA; Research Assistant); and the Athens</w:t>
+      </w:r>
+      <w:r>
+        <w:t xml:space="preserve"> </w:t>
+      </w:r>
+      <w:r>
+        <w:t xml:space="preserve">Digital Glossa Chronos Research Network as collective author.</w:t>
       </w:r>
     </w:p>
-    <w:bookmarkEnd w:id="28"/>
-    <w:bookmarkStart w:id="36" w:name="references"/>
+    <w:bookmarkEnd w:id="34"/>
+    <w:bookmarkStart w:id="42" w:name="references"/>
     <w:p>
       <w:pPr>
         <w:pStyle w:val="Heading2"/>
@@ -1654,8 +4534,8 @@
         <w:t xml:space="preserve">References</w:t>
       </w:r>
     </w:p>
-    <w:bookmarkStart w:id="35" w:name="refs"/>
-    <w:bookmarkStart w:id="29" w:name="ref-dou2021"/>
+    <w:bookmarkStart w:id="41" w:name="refs"/>
+    <w:bookmarkStart w:id="35" w:name="ref-dou2021"/>
     <w:p>
       <w:pPr>
         <w:pStyle w:val="Bibliography"/>
@@ -1683,8 +4563,8 @@
         <w:t xml:space="preserve">.</w:t>
       </w:r>
     </w:p>
-    <w:bookmarkEnd w:id="29"/>
-    <w:bookmarkStart w:id="30" w:name="ref-eckhoff2018"/>
+    <w:bookmarkEnd w:id="35"/>
+    <w:bookmarkStart w:id="36" w:name="ref-eckhoff2018"/>
     <w:p>
       <w:pPr>
         <w:pStyle w:val="Bibliography"/>
@@ -1739,8 +4619,8 @@
         <w:t xml:space="preserve">52 (1): 29–65.</w:t>
       </w:r>
     </w:p>
-    <w:bookmarkEnd w:id="30"/>
-    <w:bookmarkStart w:id="31" w:name="ref-feng2022"/>
+    <w:bookmarkEnd w:id="36"/>
+    <w:bookmarkStart w:id="37" w:name="ref-feng2022"/>
     <w:p>
       <w:pPr>
         <w:pStyle w:val="Bibliography"/>
@@ -1780,8 +4660,8 @@
         <w:t xml:space="preserve">.</w:t>
       </w:r>
     </w:p>
-    <w:bookmarkEnd w:id="31"/>
-    <w:bookmarkStart w:id="32" w:name="ref-haug2008"/>
+    <w:bookmarkEnd w:id="37"/>
+    <w:bookmarkStart w:id="38" w:name="ref-haug2008"/>
     <w:p>
       <w:pPr>
         <w:pStyle w:val="Bibliography"/>
@@ -1827,8 +4707,8 @@
         <w:t xml:space="preserve">.</w:t>
       </w:r>
     </w:p>
-    <w:bookmarkEnd w:id="32"/>
-    <w:bookmarkStart w:id="33" w:name="ref-list2014"/>
+    <w:bookmarkEnd w:id="38"/>
+    <w:bookmarkStart w:id="39" w:name="ref-list2014"/>
     <w:p>
       <w:pPr>
         <w:pStyle w:val="Bibliography"/>
@@ -1856,8 +4736,8 @@
         <w:t xml:space="preserve">sseldorf University Press.</w:t>
       </w:r>
     </w:p>
-    <w:bookmarkEnd w:id="33"/>
-    <w:bookmarkStart w:id="34" w:name="ref-qi2020"/>
+    <w:bookmarkEnd w:id="39"/>
+    <w:bookmarkStart w:id="40" w:name="ref-qi2020"/>
     <w:p>
       <w:pPr>
         <w:pStyle w:val="Bibliography"/>
@@ -1903,9 +4783,9 @@
         <w:t xml:space="preserve">.</w:t>
       </w:r>
     </w:p>
-    <w:bookmarkEnd w:id="34"/>
-    <w:bookmarkEnd w:id="35"/>
-    <w:bookmarkEnd w:id="36"/>
+    <w:bookmarkEnd w:id="40"/>
+    <w:bookmarkEnd w:id="41"/>
+    <w:bookmarkEnd w:id="42"/>
     <w:sectPr>
       <w:footnotePr>
         <w:numRestart w:val="eachSect"/>

</xml_diff>

<commit_message>
AthDGC site update 2026-06-04 18:21 --- clean Quarto render, real Zenodo DOI 10.5281/zenodo.20439182, samples-only public release
</commit_message>
<xml_diff>
--- a/data_paper.docx
+++ b/data_paper.docx
@@ -3779,7 +3779,7 @@
     </w:p>
     <w:bookmarkEnd w:id="28"/>
     <w:bookmarkEnd w:id="29"/>
-    <w:bookmarkStart w:id="31" w:name="reuse-potential"/>
+    <w:bookmarkStart w:id="33" w:name="reuse-potential"/>
     <w:p>
       <w:pPr>
         <w:pStyle w:val="Heading2"/>
@@ -3976,25 +3976,98 @@
         <w:rPr>
           <w:rStyle w:val="VerbatimChar"/>
         </w:rPr>
-        <w:t xml:space="preserve">athdgc/*</w:t>
-      </w:r>
-      <w:r>
-        <w:t xml:space="preserve"> </w:t>
-      </w:r>
-      <w:r>
-        <w:t xml:space="preserve">is in setup and ships at v0.5. The checkpoints can be loaded</w:t>
-      </w:r>
-      <w:r>
-        <w:t xml:space="preserve"> </w:t>
-      </w:r>
-      <w:r>
-        <w:t xml:space="preserve">directly into Stanza for parsing new Greek diachronic data once published. The</w:t>
-      </w:r>
-      <w:r>
-        <w:t xml:space="preserve"> </w:t>
-      </w:r>
-      <w:r>
-        <w:t xml:space="preserve">LightSIDE-AthDGC fork</w:t>
+        <w:t xml:space="preserve">AthDGC/*</w:t>
+      </w:r>
+      <w:r>
+        <w:t xml:space="preserve"> </w:t>
+      </w:r>
+      <w:r>
+        <w:t xml:space="preserve">is live at</w:t>
+      </w:r>
+      <w:r>
+        <w:t xml:space="preserve"> </w:t>
+      </w:r>
+      <w:hyperlink r:id="rId30">
+        <w:r>
+          <w:rPr>
+            <w:rStyle w:val="Hyperlink"/>
+          </w:rPr>
+          <w:t xml:space="preserve">https://huggingface.co/AthDGC</w:t>
+        </w:r>
+      </w:hyperlink>
+      <w:r>
+        <w:t xml:space="preserve"> </w:t>
+      </w:r>
+      <w:r>
+        <w:t xml:space="preserve">with placeholder READMEs,</w:t>
+      </w:r>
+      <w:r>
+        <w:t xml:space="preserve"> </w:t>
+      </w:r>
+      <w:r>
+        <w:t xml:space="preserve">and the model weights ship at v0.5. The PyPI package</w:t>
+      </w:r>
+      <w:r>
+        <w:t xml:space="preserve"> </w:t>
+      </w:r>
+      <w:r>
+        <w:rPr>
+          <w:rStyle w:val="VerbatimChar"/>
+        </w:rPr>
+        <w:t xml:space="preserve">athdgc-tools</w:t>
+      </w:r>
+      <w:r>
+        <w:t xml:space="preserve"> </w:t>
+      </w:r>
+      <w:r>
+        <w:t xml:space="preserve">reserves the name</w:t>
+      </w:r>
+      <w:r>
+        <w:t xml:space="preserve"> </w:t>
+      </w:r>
+      <w:r>
+        <w:t xml:space="preserve">at</w:t>
+      </w:r>
+      <w:r>
+        <w:t xml:space="preserve"> </w:t>
+      </w:r>
+      <w:hyperlink r:id="rId31">
+        <w:r>
+          <w:rPr>
+            <w:rStyle w:val="Hyperlink"/>
+          </w:rPr>
+          <w:t xml:space="preserve">https://pypi.org/project/athdgc-tools/</w:t>
+        </w:r>
+      </w:hyperlink>
+      <w:r>
+        <w:t xml:space="preserve"> </w:t>
+      </w:r>
+      <w:r>
+        <w:t xml:space="preserve">with stub</w:t>
+      </w:r>
+      <w:r>
+        <w:t xml:space="preserve"> </w:t>
+      </w:r>
+      <w:r>
+        <w:rPr>
+          <w:rStyle w:val="VerbatimChar"/>
+        </w:rPr>
+        <w:t xml:space="preserve">0.4.0.dev0</w:t>
+      </w:r>
+      <w:r>
+        <w:t xml:space="preserve">; the full toolkit</w:t>
+      </w:r>
+      <w:r>
+        <w:t xml:space="preserve"> </w:t>
+      </w:r>
+      <w:r>
+        <w:t xml:space="preserve">replaces the stub at v0.5. The checkpoints can be loaded directly into Stanza for</w:t>
+      </w:r>
+      <w:r>
+        <w:t xml:space="preserve"> </w:t>
+      </w:r>
+      <w:r>
+        <w:t xml:space="preserve">parsing new Greek diachronic data once the weights are published. The LightSIDE-AthDGC fork</w:t>
       </w:r>
       <w:r>
         <w:t xml:space="preserve"> </w:t>
@@ -4120,7 +4193,7 @@
       <w:r>
         <w:t xml:space="preserve"> </w:t>
       </w:r>
-      <w:hyperlink r:id="rId30">
+      <w:hyperlink r:id="rId32">
         <w:r>
           <w:rPr>
             <w:rStyle w:val="Hyperlink"/>
@@ -4132,8 +4205,8 @@
         <w:t xml:space="preserve">.</w:t>
       </w:r>
     </w:p>
-    <w:bookmarkEnd w:id="31"/>
-    <w:bookmarkStart w:id="33" w:name="access-format"/>
+    <w:bookmarkEnd w:id="33"/>
+    <w:bookmarkStart w:id="35" w:name="access-format"/>
     <w:p>
       <w:pPr>
         <w:pStyle w:val="Heading2"/>
@@ -4259,7 +4332,7 @@
       <w:r>
         <w:t xml:space="preserve"> </w:t>
       </w:r>
-      <w:hyperlink r:id="rId32">
+      <w:hyperlink r:id="rId34">
         <w:r>
           <w:rPr>
             <w:rStyle w:val="Hyperlink"/>
@@ -4271,8 +4344,8 @@
         <w:t xml:space="preserve">.</w:t>
       </w:r>
     </w:p>
-    <w:bookmarkEnd w:id="33"/>
-    <w:bookmarkStart w:id="34" w:name="acknowledgements"/>
+    <w:bookmarkEnd w:id="35"/>
+    <w:bookmarkStart w:id="36" w:name="acknowledgements"/>
     <w:p>
       <w:pPr>
         <w:pStyle w:val="Heading2"/>
@@ -4524,8 +4597,8 @@
         <w:t xml:space="preserve">Digital Glossa Chronos Research Network as collective author.</w:t>
       </w:r>
     </w:p>
-    <w:bookmarkEnd w:id="34"/>
-    <w:bookmarkStart w:id="42" w:name="references"/>
+    <w:bookmarkEnd w:id="36"/>
+    <w:bookmarkStart w:id="44" w:name="references"/>
     <w:p>
       <w:pPr>
         <w:pStyle w:val="Heading2"/>
@@ -4534,8 +4607,8 @@
         <w:t xml:space="preserve">References</w:t>
       </w:r>
     </w:p>
-    <w:bookmarkStart w:id="41" w:name="refs"/>
-    <w:bookmarkStart w:id="35" w:name="ref-dou2021"/>
+    <w:bookmarkStart w:id="43" w:name="refs"/>
+    <w:bookmarkStart w:id="37" w:name="ref-dou2021"/>
     <w:p>
       <w:pPr>
         <w:pStyle w:val="Bibliography"/>
@@ -4563,8 +4636,8 @@
         <w:t xml:space="preserve">.</w:t>
       </w:r>
     </w:p>
-    <w:bookmarkEnd w:id="35"/>
-    <w:bookmarkStart w:id="36" w:name="ref-eckhoff2018"/>
+    <w:bookmarkEnd w:id="37"/>
+    <w:bookmarkStart w:id="38" w:name="ref-eckhoff2018"/>
     <w:p>
       <w:pPr>
         <w:pStyle w:val="Bibliography"/>
@@ -4619,8 +4692,8 @@
         <w:t xml:space="preserve">52 (1): 29–65.</w:t>
       </w:r>
     </w:p>
-    <w:bookmarkEnd w:id="36"/>
-    <w:bookmarkStart w:id="37" w:name="ref-feng2022"/>
+    <w:bookmarkEnd w:id="38"/>
+    <w:bookmarkStart w:id="39" w:name="ref-feng2022"/>
     <w:p>
       <w:pPr>
         <w:pStyle w:val="Bibliography"/>
@@ -4660,8 +4733,8 @@
         <w:t xml:space="preserve">.</w:t>
       </w:r>
     </w:p>
-    <w:bookmarkEnd w:id="37"/>
-    <w:bookmarkStart w:id="38" w:name="ref-haug2008"/>
+    <w:bookmarkEnd w:id="39"/>
+    <w:bookmarkStart w:id="40" w:name="ref-haug2008"/>
     <w:p>
       <w:pPr>
         <w:pStyle w:val="Bibliography"/>
@@ -4707,8 +4780,8 @@
         <w:t xml:space="preserve">.</w:t>
       </w:r>
     </w:p>
-    <w:bookmarkEnd w:id="38"/>
-    <w:bookmarkStart w:id="39" w:name="ref-list2014"/>
+    <w:bookmarkEnd w:id="40"/>
+    <w:bookmarkStart w:id="41" w:name="ref-list2014"/>
     <w:p>
       <w:pPr>
         <w:pStyle w:val="Bibliography"/>
@@ -4736,8 +4809,8 @@
         <w:t xml:space="preserve">sseldorf University Press.</w:t>
       </w:r>
     </w:p>
-    <w:bookmarkEnd w:id="39"/>
-    <w:bookmarkStart w:id="40" w:name="ref-qi2020"/>
+    <w:bookmarkEnd w:id="41"/>
+    <w:bookmarkStart w:id="42" w:name="ref-qi2020"/>
     <w:p>
       <w:pPr>
         <w:pStyle w:val="Bibliography"/>
@@ -4783,9 +4856,9 @@
         <w:t xml:space="preserve">.</w:t>
       </w:r>
     </w:p>
-    <w:bookmarkEnd w:id="40"/>
-    <w:bookmarkEnd w:id="41"/>
     <w:bookmarkEnd w:id="42"/>
+    <w:bookmarkEnd w:id="43"/>
+    <w:bookmarkEnd w:id="44"/>
     <w:sectPr>
       <w:footnotePr>
         <w:numRestart w:val="eachSect"/>

</xml_diff>

<commit_message>
AthDGC site update 2026-06-05 01:29 --- clean Quarto render, real Zenodo DOI 10.5281/zenodo.20439182, samples-only public release
</commit_message>
<xml_diff>
--- a/data_paper.docx
+++ b/data_paper.docx
@@ -131,7 +131,7 @@
         <w:pStyle w:val="FirstParagraph"/>
       </w:pPr>
       <w:r>
-        <w:t xml:space="preserve">Greek is the longest continuously attested member of the Indo-European family. The PROIEL Treebank</w:t>
+        <w:t xml:space="preserve">Greek is the longest continuously attested member of the Indo-European family. The PROIEL (the dependency-treebank (a collection of sentences whose grammatical structure has been analysed and stored) standard for early Indo-European languages, developed at Oslo) Treebank</w:t>
       </w:r>
       <w:r>
         <w:t xml:space="preserve"> </w:t>
@@ -167,7 +167,7 @@
         <w:t xml:space="preserve"> </w:t>
       </w:r>
       <w:r>
-        <w:t xml:space="preserve">tagging, and with reproducible cross-lingual alignment to its sister IE languages. AthDGC closes</w:t>
+        <w:t xml:space="preserve">tagging, and with reproducible cross-lingual alignment (matching corresponding words or sentences between texts in different languages) to its sister IE languages. AthDGC closes</w:t>
       </w:r>
       <w:r>
         <w:t xml:space="preserve"> </w:t>
@@ -280,7 +280,7 @@
         </w:numPr>
       </w:pPr>
       <w:r>
-        <w:t xml:space="preserve">Zenodo deposition:</w:t>
+        <w:t xml:space="preserve">Zenodo (an open research-data repository hosted at CERN that mints permanent DOIs) deposition:</w:t>
       </w:r>
       <w:r>
         <w:t xml:space="preserve"> </w:t>
@@ -334,7 +334,7 @@
         <w:t xml:space="preserve"> </w:t>
       </w:r>
       <w:r>
-        <w:t xml:space="preserve">the direction of Prof. Nikolaos Lavidas. Compute is supplied by GRNET ARIS, allocation</w:t>
+        <w:t xml:space="preserve">the direction of Prof. Nikolaos Lavidas. Compute is supplied by GRNET ARIS (the Greek national high-performance computing cluster, run by GRNET), allocation</w:t>
       </w:r>
       <w:r>
         <w:t xml:space="preserve"> </w:t>
@@ -434,7 +434,7 @@
         <w:pStyle w:val="FirstParagraph"/>
       </w:pPr>
       <w:r>
-        <w:t xml:space="preserve">Surviving text is converted into the PROIEL XML 2.0 schema with sentence-level structure.</w:t>
+        <w:t xml:space="preserve">Surviving text is converted into the PROIEL XML 2.0 (the file format that stores each sentence as a tree of word-by-word grammatical relations, developed at Oslo) schema with sentence-level structure.</w:t>
       </w:r>
     </w:p>
     <w:bookmarkEnd w:id="18"/>
@@ -452,7 +452,7 @@
         <w:pStyle w:val="FirstParagraph"/>
       </w:pPr>
       <w:r>
-        <w:t xml:space="preserve">Annotation is performed sentence by sentence with the Stanford Stanza pipeline</w:t>
+        <w:t xml:space="preserve">Annotation is performed sentence by sentence with the Stanford Stanza (Stanford’s open-source Python pipeline that automatically tags, lemmatises, and parses sentences) pipeline</w:t>
       </w:r>
       <w:r>
         <w:t xml:space="preserve"> </w:t>
@@ -551,7 +551,7 @@
         <w:t xml:space="preserve"> </w:t>
       </w:r>
       <w:r>
-        <w:t xml:space="preserve">every verb token, using the PROIEL relation inventory strictly: the subject (</w:t>
+        <w:t xml:space="preserve">every verb token, using the PROIEL relation inventory (the closed set of grammatical-relation labels the schema allows, e.g. sub, obj, obl, atr) strictly: the subject (</w:t>
       </w:r>
       <w:r>
         <w:rPr>
@@ -662,7 +662,7 @@
         <w:pStyle w:val="FirstParagraph"/>
       </w:pPr>
       <w:r>
-        <w:t xml:space="preserve">Sentence-level alignment uses LaBSE embeddings</w:t>
+        <w:t xml:space="preserve">Sentence-level alignment uses LaBSE (a multilingual sentence-embedding model that maps sentences from many languages into a common vector space) embeddings (numeric vectors that represent the meaning of text)</w:t>
       </w:r>
       <w:r>
         <w:t xml:space="preserve"> </w:t>
@@ -677,7 +677,7 @@
         <w:t xml:space="preserve"> </w:t>
       </w:r>
       <w:r>
-        <w:t xml:space="preserve">multilingual-BERT attention via the AwesomeAlign procedure</w:t>
+        <w:t xml:space="preserve">multilingual-BERT (a neural language model trained on text from over 100 languages) attention via the AwesomeAlign (a word-alignment procedure that uses multilingual-BERT attention to match words across translations) procedure</w:t>
       </w:r>
       <w:r>
         <w:t xml:space="preserve"> </w:t>
@@ -796,7 +796,7 @@
               <w:pStyle w:val="Compact"/>
             </w:pPr>
             <w:r>
-              <w:t xml:space="preserve">PROIEL XML 2.0 (primary); JSONL partitions; Neo4j alignment-graph dump; Qdrant vector store</w:t>
+              <w:t xml:space="preserve">PROIEL XML 2.0 (primary); JSONL (a plain-text data format that stores one record per line) partitions; Neo4j (a graph database that stores data as nodes and connections rather than as tables) alignment-graph dump; Qdrant vector store</w:t>
             </w:r>
           </w:p>
         </w:tc>
@@ -892,7 +892,7 @@
               <w:pStyle w:val="Compact"/>
             </w:pPr>
             <w:r>
-              <w:t xml:space="preserve">Code Apache-2.0; metadata + alignments CC-BY-4.0; per-source raw text under its original licence</w:t>
+              <w:t xml:space="preserve">Code Apache-2.0 (a permissive open-source licence widely used for software); metadata + alignments CC-BY-4.0 (the Creative Commons Attribution 4.0 licence, which permits reuse with credit); per-source raw text under its original licence</w:t>
             </w:r>
           </w:p>
         </w:tc>
@@ -934,7 +934,7 @@
               <w:pStyle w:val="Compact"/>
             </w:pPr>
             <w:r>
-              <w:t xml:space="preserve">Concept DOI</w:t>
+              <w:t xml:space="preserve">Concept DOI (a Digital Object Identifier that always points to the latest version of a deposited record)</w:t>
             </w:r>
           </w:p>
         </w:tc>
@@ -3130,13 +3130,13 @@
         <w:t xml:space="preserve"> </w:t>
       </w:r>
       <w:r>
-        <w:t xml:space="preserve">corpus samples are CC-BY-4.0; tool code is Apache-2.0 (most modules), MIT (Quarto pack +</w:t>
-      </w:r>
-      <w:r>
-        <w:t xml:space="preserve"> </w:t>
-      </w:r>
-      <w:r>
-        <w:t xml:space="preserve">Neo4j viewer), BSD-3-Clause (upstream LightSIDE, retained on the patch set), and GPL-3.0</w:t>
+        <w:t xml:space="preserve">corpus samples are CC-BY-4.0; tool code is Apache-2.0 (most modules), MIT (a short permissive open-source licence) (Quarto (an open-source publishing system that builds websites, slides, papers, and posters from a single source) pack +</w:t>
+      </w:r>
+      <w:r>
+        <w:t xml:space="preserve"> </w:t>
+      </w:r>
+      <w:r>
+        <w:t xml:space="preserve">Neo4j viewer), BSD-3-Clause (upstream LightSIDE (an open-source text-mining workbench developed at Carnegie Mellon), retained on the patch set), and GPL-3.0</w:t>
       </w:r>
       <w:r>
         <w:t xml:space="preserve"> </w:t>
@@ -3389,7 +3389,7 @@
               <w:t xml:space="preserve"> </w:t>
             </w:r>
             <w:r>
-              <w:t xml:space="preserve">(diachronic Stanza checkpoints)</w:t>
+              <w:t xml:space="preserve">(diachronic Stanza checkpoints (saved snapshots of a trained model))</w:t>
             </w:r>
           </w:p>
         </w:tc>
@@ -3883,7 +3883,7 @@
         <w:t xml:space="preserve"> </w:t>
       </w:r>
       <w:r>
-        <w:t xml:space="preserve">query the Neo4j alignment graph for typological correspondences (e.g. </w:t>
+        <w:t xml:space="preserve">query the Neo4j alignment graph (a database that records which token in language A corresponds to which token in language B) for typological correspondences (e.g. </w:t>
       </w:r>
       <w:r>
         <w:rPr>
@@ -3928,7 +3928,7 @@
         <w:t xml:space="preserve"> </w:t>
       </w:r>
       <w:r>
-        <w:t xml:space="preserve">The fine-tuned Stanza checkpoints (</w:t>
+        <w:t xml:space="preserve">The fine-tuned (further trained on new data to adapt it to a particular text type) Stanza checkpoints (</w:t>
       </w:r>
       <w:r>
         <w:rPr>
@@ -3961,7 +3961,7 @@
         <w:t xml:space="preserve">grc_mod_proiel</w:t>
       </w:r>
       <w:r>
-        <w:t xml:space="preserve">) are trained on ARIS; the Hugging Face mirror</w:t>
+        <w:t xml:space="preserve">) are trained on ARIS; the Hugging Face (a public hosting platform for machine-learning models and datasets) mirror</w:t>
       </w:r>
       <w:r>
         <w:t xml:space="preserve"> </w:t>
@@ -4005,7 +4005,7 @@
         <w:t xml:space="preserve"> </w:t>
       </w:r>
       <w:r>
-        <w:t xml:space="preserve">and the model weights ship at v0.5. The PyPI package</w:t>
+        <w:t xml:space="preserve">and the model weights ship at v0.5. The PyPI (the Python Package Index, the central archive that pip downloads packages from) package</w:t>
       </w:r>
       <w:r>
         <w:t xml:space="preserve"> </w:t>
@@ -4067,13 +4067,13 @@
         <w:t xml:space="preserve"> </w:t>
       </w:r>
       <w:r>
-        <w:t xml:space="preserve">parsing new Greek diachronic data once the weights are published. The LightSIDE-AthDGC fork</w:t>
-      </w:r>
-      <w:r>
-        <w:t xml:space="preserve"> </w:t>
-      </w:r>
-      <w:r>
-        <w:t xml:space="preserve">extends LightSIDE to work on syntactic features (dependency arcs, argument-structure</w:t>
+        <w:t xml:space="preserve">parsing new Greek diachronic data once the weights are published. The LightSIDE-AthDGC (the Lavidas-extension fork of LightSIDE that operates on syntactic features rather than only text features) fork</w:t>
+      </w:r>
+      <w:r>
+        <w:t xml:space="preserve"> </w:t>
+      </w:r>
+      <w:r>
+        <w:t xml:space="preserve">extends LightSIDE to work on syntactic features (dependency arcs (the head-to-dependent links between words in a parsed sentence), argument-structure</w:t>
       </w:r>
       <w:r>
         <w:t xml:space="preserve"> </w:t>
@@ -4127,13 +4127,13 @@
         <w:t xml:space="preserve"> </w:t>
       </w:r>
       <w:r>
-        <w:t xml:space="preserve">pack generates the whole multi-output site (HTML, Reveal.js slides, .docx, .pptx,</w:t>
-      </w:r>
-      <w:r>
-        <w:t xml:space="preserve"> </w:t>
-      </w:r>
-      <w:r>
-        <w:t xml:space="preserve">Beamer, A0 poster) from a single source. Both are open-source and reusable by other</w:t>
+        <w:t xml:space="preserve">pack generates the whole multi-output site (HTML, Reveal.js (a browser-based slide framework) slides, .docx, .pptx,</w:t>
+      </w:r>
+      <w:r>
+        <w:t xml:space="preserve"> </w:t>
+      </w:r>
+      <w:r>
+        <w:t xml:space="preserve">Beamer (a LaTeX-based slide format used in academic talks), A0 poster) from a single source. Both are open-source and reusable by other</w:t>
       </w:r>
       <w:r>
         <w:t xml:space="preserve"> </w:t>
@@ -4265,7 +4265,7 @@
         <w:t xml:space="preserve"> </w:t>
       </w:r>
       <w:r>
-        <w:t xml:space="preserve">HPC under allocation</w:t>
+        <w:t xml:space="preserve">HPC (high-performance computing, i.e. a cluster of fast machines used for heavy computation) under allocation</w:t>
       </w:r>
       <w:r>
         <w:t xml:space="preserve"> </w:t>
@@ -4297,7 +4297,7 @@
         <w:t xml:space="preserve"> </w:t>
       </w:r>
       <w:r>
-        <w:t xml:space="preserve">features, LightSIDE-compatible text-feature export, NoSketch-style concordancer,</w:t>
+        <w:t xml:space="preserve">features, LightSIDE-compatible text-feature export, NoSketch-style concordancer (a search tool that shows every occurrence of a word in its surrounding context),</w:t>
       </w:r>
       <w:r>
         <w:t xml:space="preserve"> </w:t>
@@ -4315,7 +4315,7 @@
         <w:t xml:space="preserve"> </w:t>
       </w:r>
       <w:r>
-        <w:t xml:space="preserve">v0.5 PROIEL XML 2.0 validator, v0.5 valency-frame database client, v0.5</w:t>
+        <w:t xml:space="preserve">v0.5 PROIEL XML 2.0 validator, v0.5 valency (the number and type of arguments a verb takes)-frame database client, v0.5</w:t>
       </w:r>
       <w:r>
         <w:t xml:space="preserve"> </w:t>

</xml_diff>

<commit_message>
AthDGC site update 2026-06-05 20:07 --- clean Quarto render, real Zenodo DOI 10.5281/zenodo.20439182, samples-only public release
</commit_message>
<xml_diff>
--- a/data_paper.docx
+++ b/data_paper.docx
@@ -706,7 +706,7 @@
     </w:p>
     <w:bookmarkEnd w:id="21"/>
     <w:bookmarkEnd w:id="22"/>
-    <w:bookmarkStart w:id="29" w:name="dataset-description"/>
+    <w:bookmarkStart w:id="31" w:name="dataset-description"/>
     <w:p>
       <w:pPr>
         <w:pStyle w:val="Heading2"/>
@@ -3110,7 +3110,7 @@
       </w:tr>
     </w:tbl>
     <w:bookmarkEnd w:id="27"/>
-    <w:bookmarkStart w:id="28" w:name="tools-open-source"/>
+    <w:bookmarkStart w:id="30" w:name="tools-open-source"/>
     <w:p>
       <w:pPr>
         <w:pStyle w:val="Heading3"/>
@@ -3124,25 +3124,166 @@
         <w:pStyle w:val="FirstParagraph"/>
       </w:pPr>
       <w:r>
-        <w:t xml:space="preserve">AthDGC ships fourteen modules under OSI-approved licences. The annotation layer plus the</w:t>
-      </w:r>
-      <w:r>
-        <w:t xml:space="preserve"> </w:t>
-      </w:r>
-      <w:r>
-        <w:t xml:space="preserve">corpus samples are CC-BY-4.0; tool code is Apache-2.0 (most modules), MIT (a short permissive open-source licence) (Quarto (an open-source publishing system that builds websites, slides, papers, and posters from a single source) pack +</w:t>
-      </w:r>
-      <w:r>
-        <w:t xml:space="preserve"> </w:t>
-      </w:r>
-      <w:r>
-        <w:t xml:space="preserve">Neo4j viewer), BSD-3-Clause (upstream LightSIDE (an open-source text-mining workbench developed at Carnegie Mellon), retained on the patch set), and GPL-3.0</w:t>
-      </w:r>
-      <w:r>
-        <w:t xml:space="preserve"> </w:t>
-      </w:r>
-      <w:r>
-        <w:t xml:space="preserve">(upstream CWB, retained on the index builder).</w:t>
+        <w:t xml:space="preserve">The AthDGC toolkit is organised as a set of OSI-licensed modules in three</w:t>
+      </w:r>
+      <w:r>
+        <w:t xml:space="preserve"> </w:t>
+      </w:r>
+      <w:r>
+        <w:t xml:space="preserve">readiness tiers. Five modules are LIVE in the public repo and can be cloned</w:t>
+      </w:r>
+      <w:r>
+        <w:t xml:space="preserve"> </w:t>
+      </w:r>
+      <w:r>
+        <w:t xml:space="preserve">and run today (the Quarto pack, the showcase generator, the corpus-fix</w:t>
+      </w:r>
+      <w:r>
+        <w:t xml:space="preserve"> </w:t>
+      </w:r>
+      <w:r>
+        <w:t xml:space="preserve">toolkit, the PROIEL XML 2.0 exporter that runs inside the build pipeline,</w:t>
+      </w:r>
+      <w:r>
+        <w:t xml:space="preserve"> </w:t>
+      </w:r>
+      <w:r>
+        <w:t xml:space="preserve">and the Stanza annotation job script). Eight modules are IN SETUP - working</w:t>
+      </w:r>
+      <w:r>
+        <w:t xml:space="preserve"> </w:t>
+      </w:r>
+      <w:r>
+        <w:t xml:space="preserve">in the project’s internal pack and migrating to a unified public</w:t>
+      </w:r>
+      <w:r>
+        <w:t xml:space="preserve"> </w:t>
+      </w:r>
+      <w:r>
+        <w:rPr>
+          <w:rStyle w:val="VerbatimChar"/>
+        </w:rPr>
+        <w:t xml:space="preserve">tools/</w:t>
+      </w:r>
+      <w:r>
+        <w:t xml:space="preserve"> </w:t>
+      </w:r>
+      <w:r>
+        <w:t xml:space="preserve">directory at v0.5 (the PROIEL XML 2.0 schema validator, the house-style</w:t>
+      </w:r>
+      <w:r>
+        <w:t xml:space="preserve"> </w:t>
+      </w:r>
+      <w:r>
+        <w:t xml:space="preserve">check, the argument-frame extractor, the Stanza fine-tuning scripts, the</w:t>
+      </w:r>
+      <w:r>
+        <w:t xml:space="preserve"> </w:t>
+      </w:r>
+      <w:r>
+        <w:rPr>
+          <w:rStyle w:val="VerbatimChar"/>
+        </w:rPr>
+        <w:t xml:space="preserve">athdgc-tools</w:t>
+      </w:r>
+      <w:r>
+        <w:t xml:space="preserve"> </w:t>
+      </w:r>
+      <w:r>
+        <w:t xml:space="preserve">PyPI package and the three Hugging Face model repos, whose</w:t>
+      </w:r>
+      <w:r>
+        <w:t xml:space="preserve"> </w:t>
+      </w:r>
+      <w:r>
+        <w:t xml:space="preserve">weights upload at v0.5). The remaining modules - the LightSIDE-AthDGC</w:t>
+      </w:r>
+      <w:r>
+        <w:t xml:space="preserve"> </w:t>
+      </w:r>
+      <w:r>
+        <w:t xml:space="preserve">syntactic-feature fork and its export scripts, the NoSketch-style CWB</w:t>
+      </w:r>
+      <w:r>
+        <w:t xml:space="preserve"> </w:t>
+      </w:r>
+      <w:r>
+        <w:t xml:space="preserve">indexer, the Neo4j alignment viewer, the valency-frame database client,</w:t>
+      </w:r>
+      <w:r>
+        <w:t xml:space="preserve"> </w:t>
+      </w:r>
+      <w:r>
+        <w:t xml:space="preserve">the retranslation-pair browser, and the retelling-chain explorer - are</w:t>
+      </w:r>
+      <w:r>
+        <w:t xml:space="preserve"> </w:t>
+      </w:r>
+      <w:r>
+        <w:t xml:space="preserve">FORTHCOMING (v0.5): described here as designed, implementation lands at</w:t>
+      </w:r>
+      <w:r>
+        <w:t xml:space="preserve"> </w:t>
+      </w:r>
+      <w:r>
+        <w:t xml:space="preserve">v0.5. The complete tier matrix per module is on the public Tools page at</w:t>
+      </w:r>
+      <w:r>
+        <w:t xml:space="preserve"> </w:t>
+      </w:r>
+      <w:hyperlink r:id="rId28">
+        <w:r>
+          <w:rPr>
+            <w:rStyle w:val="Hyperlink"/>
+          </w:rPr>
+          <w:t xml:space="preserve">https://athdgc.github.io/tools.html</w:t>
+        </w:r>
+      </w:hyperlink>
+      <w:r>
+        <w:t xml:space="preserve"> </w:t>
+      </w:r>
+      <w:r>
+        <w:t xml:space="preserve">and on the Status page at</w:t>
+      </w:r>
+      <w:r>
+        <w:t xml:space="preserve"> </w:t>
+      </w:r>
+      <w:hyperlink r:id="rId29">
+        <w:r>
+          <w:rPr>
+            <w:rStyle w:val="Hyperlink"/>
+          </w:rPr>
+          <w:t xml:space="preserve">https://athdgc.github.io/status.html</w:t>
+        </w:r>
+      </w:hyperlink>
+      <w:r>
+        <w:t xml:space="preserve">.</w:t>
+      </w:r>
+    </w:p>
+    <w:p>
+      <w:pPr>
+        <w:pStyle w:val="BodyText"/>
+      </w:pPr>
+      <w:r>
+        <w:t xml:space="preserve">Across the toolkit, the annotation layer plus the corpus samples are</w:t>
+      </w:r>
+      <w:r>
+        <w:t xml:space="preserve"> </w:t>
+      </w:r>
+      <w:r>
+        <w:t xml:space="preserve">CC-BY-4.0; tool code is Apache-2.0 (most modules), MIT (Quarto pack +</w:t>
+      </w:r>
+      <w:r>
+        <w:t xml:space="preserve"> </w:t>
+      </w:r>
+      <w:r>
+        <w:t xml:space="preserve">Neo4j viewer), BSD-3-Clause (upstream LightSIDE, retained on the patch</w:t>
+      </w:r>
+      <w:r>
+        <w:t xml:space="preserve"> </w:t>
+      </w:r>
+      <w:r>
+        <w:t xml:space="preserve">set), and GPL-3.0 (upstream CWB, retained on the index builder).</w:t>
       </w:r>
     </w:p>
     <w:tbl>
@@ -3777,9 +3918,9 @@
         <w:t xml:space="preserve">(rejecting AI-marker vocabulary and em-dashes).</w:t>
       </w:r>
     </w:p>
-    <w:bookmarkEnd w:id="28"/>
-    <w:bookmarkEnd w:id="29"/>
-    <w:bookmarkStart w:id="33" w:name="reuse-potential"/>
+    <w:bookmarkEnd w:id="30"/>
+    <w:bookmarkEnd w:id="31"/>
+    <w:bookmarkStart w:id="35" w:name="reuse-potential"/>
     <w:p>
       <w:pPr>
         <w:pStyle w:val="Heading2"/>
@@ -3987,7 +4128,7 @@
       <w:r>
         <w:t xml:space="preserve"> </w:t>
       </w:r>
-      <w:hyperlink r:id="rId30">
+      <w:hyperlink r:id="rId32">
         <w:r>
           <w:rPr>
             <w:rStyle w:val="Hyperlink"/>
@@ -4031,7 +4172,7 @@
       <w:r>
         <w:t xml:space="preserve"> </w:t>
       </w:r>
-      <w:hyperlink r:id="rId31">
+      <w:hyperlink r:id="rId33">
         <w:r>
           <w:rPr>
             <w:rStyle w:val="Hyperlink"/>
@@ -4193,7 +4334,7 @@
       <w:r>
         <w:t xml:space="preserve"> </w:t>
       </w:r>
-      <w:hyperlink r:id="rId32">
+      <w:hyperlink r:id="rId34">
         <w:r>
           <w:rPr>
             <w:rStyle w:val="Hyperlink"/>
@@ -4205,8 +4346,8 @@
         <w:t xml:space="preserve">.</w:t>
       </w:r>
     </w:p>
-    <w:bookmarkEnd w:id="33"/>
-    <w:bookmarkStart w:id="35" w:name="access-format"/>
+    <w:bookmarkEnd w:id="35"/>
+    <w:bookmarkStart w:id="36" w:name="access-format"/>
     <w:p>
       <w:pPr>
         <w:pStyle w:val="Heading2"/>
@@ -4291,48 +4432,18 @@
         <w:pStyle w:val="BodyText"/>
       </w:pPr>
       <w:r>
-        <w:t xml:space="preserve">The platform’s fourteen open-source tools (LightSIDE-AthDGC for PROIEL syntactic</w:t>
-      </w:r>
-      <w:r>
-        <w:t xml:space="preserve"> </w:t>
-      </w:r>
-      <w:r>
-        <w:t xml:space="preserve">features, LightSIDE-compatible text-feature export, NoSketch-style concordancer (a search tool that shows every occurrence of a word in its surrounding context),</w:t>
-      </w:r>
-      <w:r>
-        <w:t xml:space="preserve"> </w:t>
-      </w:r>
-      <w:r>
-        <w:t xml:space="preserve">fine-tuned diachronic Stanza checkpoints, PROIEL XML 2.0 exporter, corpus-fix toolkit,</w:t>
-      </w:r>
-      <w:r>
-        <w:t xml:space="preserve"> </w:t>
-      </w:r>
-      <w:r>
-        <w:t xml:space="preserve">argument-structure extractor, cross-lingual Neo4j alignment viewer, showcase generator,</w:t>
-      </w:r>
-      <w:r>
-        <w:t xml:space="preserve"> </w:t>
-      </w:r>
-      <w:r>
-        <w:t xml:space="preserve">v0.5 PROIEL XML 2.0 validator, v0.5 valency (the number and type of arguments a verb takes)-frame database client, v0.5</w:t>
-      </w:r>
-      <w:r>
-        <w:t xml:space="preserve"> </w:t>
-      </w:r>
-      <w:r>
-        <w:t xml:space="preserve">retranslation-pair browser, v0.5 retelling-chain explorer, and the Quarto template pack)</w:t>
-      </w:r>
-      <w:r>
-        <w:t xml:space="preserve"> </w:t>
-      </w:r>
-      <w:r>
-        <w:t xml:space="preserve">are released and usable now per §3.4. See</w:t>
-      </w:r>
-      <w:r>
-        <w:t xml:space="preserve"> </w:t>
-      </w:r>
-      <w:hyperlink r:id="rId34">
+        <w:t xml:space="preserve">The toolkit’s readiness per module is summarised in §3.4 and on the public</w:t>
+      </w:r>
+      <w:r>
+        <w:t xml:space="preserve"> </w:t>
+      </w:r>
+      <w:r>
+        <w:t xml:space="preserve">Tools page at</w:t>
+      </w:r>
+      <w:r>
+        <w:t xml:space="preserve"> </w:t>
+      </w:r>
+      <w:hyperlink r:id="rId28">
         <w:r>
           <w:rPr>
             <w:rStyle w:val="Hyperlink"/>
@@ -4341,11 +4452,53 @@
         </w:r>
       </w:hyperlink>
       <w:r>
-        <w:t xml:space="preserve">.</w:t>
+        <w:t xml:space="preserve">. Five modules are LIVE</w:t>
+      </w:r>
+      <w:r>
+        <w:t xml:space="preserve"> </w:t>
+      </w:r>
+      <w:r>
+        <w:t xml:space="preserve">today (the Quarto template pack, the showcase generator, the corpus-fix</w:t>
+      </w:r>
+      <w:r>
+        <w:t xml:space="preserve"> </w:t>
+      </w:r>
+      <w:r>
+        <w:t xml:space="preserve">toolkit, the PROIEL XML 2.0 exporter inside the build pipeline, and the</w:t>
+      </w:r>
+      <w:r>
+        <w:t xml:space="preserve"> </w:t>
+      </w:r>
+      <w:r>
+        <w:t xml:space="preserve">Stanza annotation job script). Eight are IN SETUP and ship with the v0.5</w:t>
+      </w:r>
+      <w:r>
+        <w:t xml:space="preserve"> </w:t>
+      </w:r>
+      <w:r>
+        <w:t xml:space="preserve">release. The LightSIDE-AthDGC syntactic-feature fork, the NoSketch-style</w:t>
+      </w:r>
+      <w:r>
+        <w:t xml:space="preserve"> </w:t>
+      </w:r>
+      <w:r>
+        <w:t xml:space="preserve">concordancer, the Neo4j alignment viewer, the valency-frame database</w:t>
+      </w:r>
+      <w:r>
+        <w:t xml:space="preserve"> </w:t>
+      </w:r>
+      <w:r>
+        <w:t xml:space="preserve">client, the retranslation-pair browser, and the retelling-chain explorer</w:t>
+      </w:r>
+      <w:r>
+        <w:t xml:space="preserve"> </w:t>
+      </w:r>
+      <w:r>
+        <w:t xml:space="preserve">are FORTHCOMING (v0.5).</w:t>
       </w:r>
     </w:p>
-    <w:bookmarkEnd w:id="35"/>
-    <w:bookmarkStart w:id="36" w:name="acknowledgements"/>
+    <w:bookmarkEnd w:id="36"/>
+    <w:bookmarkStart w:id="37" w:name="acknowledgements"/>
     <w:p>
       <w:pPr>
         <w:pStyle w:val="Heading2"/>
@@ -4588,17 +4741,11 @@
         <w:t xml:space="preserve"> </w:t>
       </w:r>
       <w:r>
-        <w:t xml:space="preserve">PhD Candidate), Evangelos Argyropoulos (NKUA; Research Assistant); and the Athens</w:t>
-      </w:r>
-      <w:r>
-        <w:t xml:space="preserve"> </w:t>
-      </w:r>
-      <w:r>
-        <w:t xml:space="preserve">Digital Glossa Chronos Research Network as collective author.</w:t>
+        <w:t xml:space="preserve">PhD Candidate), Evangelos Argyropoulos (NKUA; Research Assistant).</w:t>
       </w:r>
     </w:p>
-    <w:bookmarkEnd w:id="36"/>
-    <w:bookmarkStart w:id="44" w:name="references"/>
+    <w:bookmarkEnd w:id="37"/>
+    <w:bookmarkStart w:id="45" w:name="references"/>
     <w:p>
       <w:pPr>
         <w:pStyle w:val="Heading2"/>
@@ -4607,8 +4754,8 @@
         <w:t xml:space="preserve">References</w:t>
       </w:r>
     </w:p>
-    <w:bookmarkStart w:id="43" w:name="refs"/>
-    <w:bookmarkStart w:id="37" w:name="ref-dou2021"/>
+    <w:bookmarkStart w:id="44" w:name="refs"/>
+    <w:bookmarkStart w:id="38" w:name="ref-dou2021"/>
     <w:p>
       <w:pPr>
         <w:pStyle w:val="Bibliography"/>
@@ -4636,8 +4783,8 @@
         <w:t xml:space="preserve">.</w:t>
       </w:r>
     </w:p>
-    <w:bookmarkEnd w:id="37"/>
-    <w:bookmarkStart w:id="38" w:name="ref-eckhoff2018"/>
+    <w:bookmarkEnd w:id="38"/>
+    <w:bookmarkStart w:id="39" w:name="ref-eckhoff2018"/>
     <w:p>
       <w:pPr>
         <w:pStyle w:val="Bibliography"/>
@@ -4692,8 +4839,8 @@
         <w:t xml:space="preserve">52 (1): 29–65.</w:t>
       </w:r>
     </w:p>
-    <w:bookmarkEnd w:id="38"/>
-    <w:bookmarkStart w:id="39" w:name="ref-feng2022"/>
+    <w:bookmarkEnd w:id="39"/>
+    <w:bookmarkStart w:id="40" w:name="ref-feng2022"/>
     <w:p>
       <w:pPr>
         <w:pStyle w:val="Bibliography"/>
@@ -4733,8 +4880,8 @@
         <w:t xml:space="preserve">.</w:t>
       </w:r>
     </w:p>
-    <w:bookmarkEnd w:id="39"/>
-    <w:bookmarkStart w:id="40" w:name="ref-haug2008"/>
+    <w:bookmarkEnd w:id="40"/>
+    <w:bookmarkStart w:id="41" w:name="ref-haug2008"/>
     <w:p>
       <w:pPr>
         <w:pStyle w:val="Bibliography"/>
@@ -4780,8 +4927,8 @@
         <w:t xml:space="preserve">.</w:t>
       </w:r>
     </w:p>
-    <w:bookmarkEnd w:id="40"/>
-    <w:bookmarkStart w:id="41" w:name="ref-list2014"/>
+    <w:bookmarkEnd w:id="41"/>
+    <w:bookmarkStart w:id="42" w:name="ref-list2014"/>
     <w:p>
       <w:pPr>
         <w:pStyle w:val="Bibliography"/>
@@ -4809,8 +4956,8 @@
         <w:t xml:space="preserve">sseldorf University Press.</w:t>
       </w:r>
     </w:p>
-    <w:bookmarkEnd w:id="41"/>
-    <w:bookmarkStart w:id="42" w:name="ref-qi2020"/>
+    <w:bookmarkEnd w:id="42"/>
+    <w:bookmarkStart w:id="43" w:name="ref-qi2020"/>
     <w:p>
       <w:pPr>
         <w:pStyle w:val="Bibliography"/>
@@ -4856,9 +5003,9 @@
         <w:t xml:space="preserve">.</w:t>
       </w:r>
     </w:p>
-    <w:bookmarkEnd w:id="42"/>
     <w:bookmarkEnd w:id="43"/>
     <w:bookmarkEnd w:id="44"/>
+    <w:bookmarkEnd w:id="45"/>
     <w:sectPr>
       <w:footnotePr>
         <w:numRestart w:val="eachSect"/>

</xml_diff>

<commit_message>
AthDGC site update 2026-06-05 22:22 --- clean Quarto render, real Zenodo DOI 10.5281/zenodo.20439182, samples-only public release
</commit_message>
<xml_diff>
--- a/data_paper.docx
+++ b/data_paper.docx
@@ -45,67 +45,97 @@
         <w:t xml:space="preserve">“Athens-PROIEL”</w:t>
       </w:r>
       <w:r>
-        <w:t xml:space="preserve">) is an open, end-to-end pipeline and dataset that</w:t>
-      </w:r>
-      <w:r>
-        <w:t xml:space="preserve"> </w:t>
-      </w:r>
-      <w:r>
-        <w:t xml:space="preserve">provides the first continuously updated, dependency-parsed treebank of the</w:t>
-      </w:r>
-      <w:r>
-        <w:t xml:space="preserve"> </w:t>
-      </w:r>
-      <w:r>
-        <w:t xml:space="preserve">entire Greek language - from Homeric and Archaic texts to Modern Greek -</w:t>
-      </w:r>
-      <w:r>
-        <w:t xml:space="preserve"> </w:t>
-      </w:r>
-      <w:r>
-        <w:t xml:space="preserve">with cross-lingual alignment to Latin (Vulgate), Gothic (Wulfila), Old Church</w:t>
-      </w:r>
-      <w:r>
-        <w:t xml:space="preserve"> </w:t>
-      </w:r>
-      <w:r>
-        <w:t xml:space="preserve">Slavonic (Marianus), and Classical Armenian via the verse-level</w:t>
-      </w:r>
-      <w:r>
-        <w:t xml:space="preserve"> </w:t>
-      </w:r>
-      <w:r>
-        <w:t xml:space="preserve">cross-alignment of the New Testament. AthDGC follows the PROIEL XML 2.0</w:t>
-      </w:r>
-      <w:r>
-        <w:t xml:space="preserve"> </w:t>
-      </w:r>
-      <w:r>
-        <w:t xml:space="preserve">schema, uses the Stanford Stanza PROIEL-trained pipeline for annotation, and</w:t>
-      </w:r>
-      <w:r>
-        <w:t xml:space="preserve"> </w:t>
-      </w:r>
-      <w:r>
-        <w:t xml:space="preserve">applies LaBSE sentence embeddings and multilingual-BERT attention for</w:t>
-      </w:r>
-      <w:r>
-        <w:t xml:space="preserve"> </w:t>
-      </w:r>
-      <w:r>
-        <w:t xml:space="preserve">word-level alignment. As of v0.4, the corpus contains 89.9M total rows,</w:t>
-      </w:r>
-      <w:r>
-        <w:t xml:space="preserve"> </w:t>
-      </w:r>
-      <w:r>
-        <w:t xml:space="preserve">4.08M annotated Greek rows, and 6,861 NT-aligned Greek verses cross-aligned</w:t>
-      </w:r>
-      <w:r>
-        <w:t xml:space="preserve"> </w:t>
-      </w:r>
-      <w:r>
-        <w:t xml:space="preserve">to four sister IE witnesses.</w:t>
+        <w:t xml:space="preserve">) is an open, end-to-end pipeline and dataset. It is,</w:t>
+      </w:r>
+      <w:r>
+        <w:t xml:space="preserve"> </w:t>
+      </w:r>
+      <w:r>
+        <w:t xml:space="preserve">to the best of our knowledge, the first openly licensed dependency-parsed</w:t>
+      </w:r>
+      <w:r>
+        <w:t xml:space="preserve"> </w:t>
+      </w:r>
+      <w:r>
+        <w:t xml:space="preserve">treebank of Greek that spans eight diachronic periods - Archaic, Classical,</w:t>
+      </w:r>
+      <w:r>
+        <w:t xml:space="preserve"> </w:t>
+      </w:r>
+      <w:r>
+        <w:t xml:space="preserve">Koine, Late Antique, Byzantine, Late Byzantine, Early Modern, and Modern -</w:t>
+      </w:r>
+      <w:r>
+        <w:t xml:space="preserve"> </w:t>
+      </w:r>
+      <w:r>
+        <w:t xml:space="preserve">under a single PROIEL XML 2.0 schema, with verse-level cross-alignment of the</w:t>
+      </w:r>
+      <w:r>
+        <w:t xml:space="preserve"> </w:t>
+      </w:r>
+      <w:r>
+        <w:t xml:space="preserve">New Testament to Latin (Vulgate), Gothic (Wulfila), Old Church Slavonic</w:t>
+      </w:r>
+      <w:r>
+        <w:t xml:space="preserve"> </w:t>
+      </w:r>
+      <w:r>
+        <w:t xml:space="preserve">(Marianus), and Classical Armenian. AthDGC builds on, rather than replaces,</w:t>
+      </w:r>
+      <w:r>
+        <w:t xml:space="preserve"> </w:t>
+      </w:r>
+      <w:r>
+        <w:t xml:space="preserve">the PROIEL Treebank Family (Haug &amp; Jøhndal 2008; Eckhoff et al. 2018), which</w:t>
+      </w:r>
+      <w:r>
+        <w:t xml:space="preserve"> </w:t>
+      </w:r>
+      <w:r>
+        <w:t xml:space="preserve">established the schema and the Koine-Greek anchor for the project. Annotation</w:t>
+      </w:r>
+      <w:r>
+        <w:t xml:space="preserve"> </w:t>
+      </w:r>
+      <w:r>
+        <w:t xml:space="preserve">uses the Stanford Stanza PROIEL-trained pipeline; sentence-level alignment</w:t>
+      </w:r>
+      <w:r>
+        <w:t xml:space="preserve"> </w:t>
+      </w:r>
+      <w:r>
+        <w:t xml:space="preserve">uses LaBSE; word-level alignment uses multilingual-BERT attention via</w:t>
+      </w:r>
+      <w:r>
+        <w:t xml:space="preserve"> </w:t>
+      </w:r>
+      <w:r>
+        <w:t xml:space="preserve">AwesomeAlign. The v0.4 release ships curated samples and the full open-source</w:t>
+      </w:r>
+      <w:r>
+        <w:t xml:space="preserve"> </w:t>
+      </w:r>
+      <w:r>
+        <w:t xml:space="preserve">toolkit; the full annotated corpus partitions remain under v0.5 audit on</w:t>
+      </w:r>
+      <w:r>
+        <w:t xml:space="preserve"> </w:t>
+      </w:r>
+      <w:r>
+        <w:t xml:space="preserve">GRNET ARIS. Quantitative scale, per-witness verse counts, and per-period</w:t>
+      </w:r>
+      <w:r>
+        <w:t xml:space="preserve"> </w:t>
+      </w:r>
+      <w:r>
+        <w:t xml:space="preserve">annotated-row counts are reported as the v0.5 release notes, after the audit</w:t>
+      </w:r>
+      <w:r>
+        <w:t xml:space="preserve"> </w:t>
+      </w:r>
+      <w:r>
+        <w:t xml:space="preserve">pass on ARIS completes.</w:t>
       </w:r>
     </w:p>
     <w:bookmarkStart w:id="15" w:name="overview"/>
@@ -1926,18 +1956,18 @@
               <w:pStyle w:val="Compact"/>
             </w:pPr>
             <w:r>
+              <w:t xml:space="preserve">Edition coverage</w:t>
+            </w:r>
+          </w:p>
+        </w:tc>
+        <w:tc>
+          <w:tcPr/>
+          <w:p>
+            <w:pPr>
+              <w:pStyle w:val="Compact"/>
+            </w:pPr>
+            <w:r>
               <w:t xml:space="preserve">Status</w:t>
-            </w:r>
-          </w:p>
-        </w:tc>
-        <w:tc>
-          <w:tcPr/>
-          <w:p>
-            <w:pPr>
-              <w:pStyle w:val="Compact"/>
-            </w:pPr>
-            <w:r>
-              <w:t xml:space="preserve">NT-aligned verses (v0.4)</w:t>
             </w:r>
           </w:p>
         </w:tc>
@@ -1950,7 +1980,7 @@
               <w:pStyle w:val="Compact"/>
             </w:pPr>
             <w:r>
-              <w:t xml:space="preserve">Greek (Koine)</w:t>
+              <w:t xml:space="preserve">Greek (Koine NT)</w:t>
             </w:r>
           </w:p>
         </w:tc>
@@ -1997,18 +2027,18 @@
               <w:pStyle w:val="Compact"/>
             </w:pPr>
             <w:r>
+              <w:t xml:space="preserve">SBL GNT (complete)</w:t>
+            </w:r>
+          </w:p>
+        </w:tc>
+        <w:tc>
+          <w:tcPr/>
+          <w:p>
+            <w:pPr>
+              <w:pStyle w:val="Compact"/>
+            </w:pPr>
+            <w:r>
               <w:t xml:space="preserve">annotated</w:t>
-            </w:r>
-          </w:p>
-        </w:tc>
-        <w:tc>
-          <w:tcPr/>
-          <w:p>
-            <w:pPr>
-              <w:pStyle w:val="Compact"/>
-            </w:pPr>
-            <w:r>
-              <w:t xml:space="preserve">7,956</w:t>
             </w:r>
           </w:p>
         </w:tc>
@@ -2068,18 +2098,18 @@
               <w:pStyle w:val="Compact"/>
             </w:pPr>
             <w:r>
+              <w:t xml:space="preserve">Clementine Vulgate NT (complete)</w:t>
+            </w:r>
+          </w:p>
+        </w:tc>
+        <w:tc>
+          <w:tcPr/>
+          <w:p>
+            <w:pPr>
+              <w:pStyle w:val="Compact"/>
+            </w:pPr>
+            <w:r>
               <w:t xml:space="preserve">annotated</w:t>
-            </w:r>
-          </w:p>
-        </w:tc>
-        <w:tc>
-          <w:tcPr/>
-          <w:p>
-            <w:pPr>
-              <w:pStyle w:val="Compact"/>
-            </w:pPr>
-            <w:r>
-              <w:t xml:space="preserve">7,956</w:t>
             </w:r>
           </w:p>
         </w:tc>
@@ -2139,18 +2169,18 @@
               <w:pStyle w:val="Compact"/>
             </w:pPr>
             <w:r>
+              <w:t xml:space="preserve">Wulfila Project (Gospels + Pauline corpus, partial)</w:t>
+            </w:r>
+          </w:p>
+        </w:tc>
+        <w:tc>
+          <w:tcPr/>
+          <w:p>
+            <w:pPr>
+              <w:pStyle w:val="Compact"/>
+            </w:pPr>
+            <w:r>
               <w:t xml:space="preserve">annotated</w:t>
-            </w:r>
-          </w:p>
-        </w:tc>
-        <w:tc>
-          <w:tcPr/>
-          <w:p>
-            <w:pPr>
-              <w:pStyle w:val="Compact"/>
-            </w:pPr>
-            <w:r>
-              <w:t xml:space="preserve">3,512</w:t>
             </w:r>
           </w:p>
         </w:tc>
@@ -2210,18 +2240,18 @@
               <w:pStyle w:val="Compact"/>
             </w:pPr>
             <w:r>
+              <w:t xml:space="preserve">Codex Marianus (four Gospels)</w:t>
+            </w:r>
+          </w:p>
+        </w:tc>
+        <w:tc>
+          <w:tcPr/>
+          <w:p>
+            <w:pPr>
+              <w:pStyle w:val="Compact"/>
+            </w:pPr>
+            <w:r>
               <w:t xml:space="preserve">sampled</w:t>
-            </w:r>
-          </w:p>
-        </w:tc>
-        <w:tc>
-          <w:tcPr/>
-          <w:p>
-            <w:pPr>
-              <w:pStyle w:val="Compact"/>
-            </w:pPr>
-            <w:r>
-              <w:t xml:space="preserve">6,861</w:t>
             </w:r>
           </w:p>
         </w:tc>
@@ -2287,18 +2317,18 @@
               <w:pStyle w:val="Compact"/>
             </w:pPr>
             <w:r>
-              <w:t xml:space="preserve">ingestion</w:t>
-            </w:r>
-          </w:p>
-        </w:tc>
-        <w:tc>
-          <w:tcPr/>
-          <w:p>
-            <w:pPr>
-              <w:pStyle w:val="Compact"/>
-            </w:pPr>
-            <w:r>
-              <w:t xml:space="preserve">0 (v0.5)</w:t>
+              <w:t xml:space="preserve">TITUS Armenian NT</w:t>
+            </w:r>
+          </w:p>
+        </w:tc>
+        <w:tc>
+          <w:tcPr/>
+          <w:p>
+            <w:pPr>
+              <w:pStyle w:val="Compact"/>
+            </w:pPr>
+            <w:r>
+              <w:t xml:space="preserve">ingestion (v0.5)</w:t>
             </w:r>
           </w:p>
         </w:tc>
@@ -2364,18 +2394,18 @@
               <w:pStyle w:val="Compact"/>
             </w:pPr>
             <w:r>
+              <w:t xml:space="preserve">GRETIL / SARIT</w:t>
+            </w:r>
+          </w:p>
+        </w:tc>
+        <w:tc>
+          <w:tcPr/>
+          <w:p>
+            <w:pPr>
+              <w:pStyle w:val="Compact"/>
+            </w:pPr>
+            <w:r>
               <w:t xml:space="preserve">queued (v0.7)</w:t>
-            </w:r>
-          </w:p>
-        </w:tc>
-        <w:tc>
-          <w:tcPr/>
-          <w:p>
-            <w:pPr>
-              <w:pStyle w:val="Compact"/>
-            </w:pPr>
-            <w:r>
-              <w:t xml:space="preserve">0</w:t>
             </w:r>
           </w:p>
         </w:tc>
@@ -2441,18 +2471,18 @@
               <w:pStyle w:val="Compact"/>
             </w:pPr>
             <w:r>
+              <w:t xml:space="preserve">TEAMS Wessex Gospels</w:t>
+            </w:r>
+          </w:p>
+        </w:tc>
+        <w:tc>
+          <w:tcPr/>
+          <w:p>
+            <w:pPr>
+              <w:pStyle w:val="Compact"/>
+            </w:pPr>
+            <w:r>
               <w:t xml:space="preserve">queued (v0.7)</w:t>
-            </w:r>
-          </w:p>
-        </w:tc>
-        <w:tc>
-          <w:tcPr/>
-          <w:p>
-            <w:pPr>
-              <w:pStyle w:val="Compact"/>
-            </w:pPr>
-            <w:r>
-              <w:t xml:space="preserve">0</w:t>
             </w:r>
           </w:p>
         </w:tc>
@@ -2518,18 +2548,18 @@
               <w:pStyle w:val="Compact"/>
             </w:pPr>
             <w:r>
+              <w:t xml:space="preserve">TITUS Yasna + Yashts</w:t>
+            </w:r>
+          </w:p>
+        </w:tc>
+        <w:tc>
+          <w:tcPr/>
+          <w:p>
+            <w:pPr>
+              <w:pStyle w:val="Compact"/>
+            </w:pPr>
+            <w:r>
               <w:t xml:space="preserve">queued (v0.7)</w:t>
-            </w:r>
-          </w:p>
-        </w:tc>
-        <w:tc>
-          <w:tcPr/>
-          <w:p>
-            <w:pPr>
-              <w:pStyle w:val="Compact"/>
-            </w:pPr>
-            <w:r>
-              <w:t xml:space="preserve">0</w:t>
             </w:r>
           </w:p>
         </w:tc>
@@ -2595,18 +2625,18 @@
               <w:pStyle w:val="Compact"/>
             </w:pPr>
             <w:r>
+              <w:t xml:space="preserve">TITUS Behistun</w:t>
+            </w:r>
+          </w:p>
+        </w:tc>
+        <w:tc>
+          <w:tcPr/>
+          <w:p>
+            <w:pPr>
+              <w:pStyle w:val="Compact"/>
+            </w:pPr>
+            <w:r>
               <w:t xml:space="preserve">queued (v0.7)</w:t>
-            </w:r>
-          </w:p>
-        </w:tc>
-        <w:tc>
-          <w:tcPr/>
-          <w:p>
-            <w:pPr>
-              <w:pStyle w:val="Compact"/>
-            </w:pPr>
-            <w:r>
-              <w:t xml:space="preserve">0</w:t>
             </w:r>
           </w:p>
         </w:tc>
@@ -2672,23 +2702,43 @@
               <w:pStyle w:val="Compact"/>
             </w:pPr>
             <w:r>
+              <w:t xml:space="preserve">Ostroh 1581 + Ohienko 1962</w:t>
+            </w:r>
+          </w:p>
+        </w:tc>
+        <w:tc>
+          <w:tcPr/>
+          <w:p>
+            <w:pPr>
+              <w:pStyle w:val="Compact"/>
+            </w:pPr>
+            <w:r>
               <w:t xml:space="preserve">queued (v0.7)</w:t>
-            </w:r>
-          </w:p>
-        </w:tc>
-        <w:tc>
-          <w:tcPr/>
-          <w:p>
-            <w:pPr>
-              <w:pStyle w:val="Compact"/>
-            </w:pPr>
-            <w:r>
-              <w:t xml:space="preserve">0</w:t>
             </w:r>
           </w:p>
         </w:tc>
       </w:tr>
     </w:tbl>
+    <w:p>
+      <w:pPr>
+        <w:pStyle w:val="BodyText"/>
+      </w:pPr>
+      <w:r>
+        <w:t xml:space="preserve">Verified per-witness aligned-verse counts ship in the v0.5 release notes once</w:t>
+      </w:r>
+      <w:r>
+        <w:t xml:space="preserve"> </w:t>
+      </w:r>
+      <w:r>
+        <w:t xml:space="preserve">the ARIS audit pass closes. The v0.4 release ships the curated samples on the</w:t>
+      </w:r>
+      <w:r>
+        <w:t xml:space="preserve"> </w:t>
+      </w:r>
+      <w:r>
+        <w:t xml:space="preserve">Samples page rather than full per-witness counts.</w:t>
+      </w:r>
+    </w:p>
     <w:bookmarkEnd w:id="26"/>
     <w:bookmarkStart w:id="27" w:name="retelling-and-retranslation-chains"/>
     <w:p>

</xml_diff>

<commit_message>
AthDGC site update 2026-06-05 22:32 --- clean Quarto render, real Zenodo DOI 10.5281/zenodo.20439182, samples-only public release
</commit_message>
<xml_diff>
--- a/data_paper.docx
+++ b/data_paper.docx
@@ -81,19 +81,19 @@
         <w:t xml:space="preserve"> </w:t>
       </w:r>
       <w:r>
-        <w:t xml:space="preserve">(Marianus), and Classical Armenian. AthDGC builds on, rather than replaces,</w:t>
-      </w:r>
-      <w:r>
-        <w:t xml:space="preserve"> </w:t>
-      </w:r>
-      <w:r>
-        <w:t xml:space="preserve">the PROIEL Treebank Family (Haug &amp; Jøhndal 2008; Eckhoff et al. 2018), which</w:t>
-      </w:r>
-      <w:r>
-        <w:t xml:space="preserve"> </w:t>
-      </w:r>
-      <w:r>
-        <w:t xml:space="preserve">established the schema and the Koine-Greek anchor for the project. Annotation</w:t>
+        <w:t xml:space="preserve">(Marianus), and Classical Armenian. AthDGC builds on the PROIEL Treebank</w:t>
+      </w:r>
+      <w:r>
+        <w:t xml:space="preserve"> </w:t>
+      </w:r>
+      <w:r>
+        <w:t xml:space="preserve">Family (Haug &amp; Jøhndal 2008; Eckhoff et al. 2018), which established the</w:t>
+      </w:r>
+      <w:r>
+        <w:t xml:space="preserve"> </w:t>
+      </w:r>
+      <w:r>
+        <w:t xml:space="preserve">schema and the Koine-Greek anchor for the project. Annotation</w:t>
       </w:r>
       <w:r>
         <w:t xml:space="preserve"> </w:t>

</xml_diff>

<commit_message>
AthDGC site update 2026-06-05 23:15 --- clean Quarto render, real Zenodo DOI 10.5281/zenodo.20439182, samples-only public release
</commit_message>
<xml_diff>
--- a/data_paper.docx
+++ b/data_paper.docx
@@ -138,7 +138,7 @@
         <w:t xml:space="preserve">pass on ARIS completes.</w:t>
       </w:r>
     </w:p>
-    <w:bookmarkStart w:id="15" w:name="overview"/>
+    <w:bookmarkStart w:id="14" w:name="overview"/>
     <w:p>
       <w:pPr>
         <w:pStyle w:val="Heading2"/>
@@ -246,7 +246,7 @@
       </w:r>
     </w:p>
     <w:bookmarkEnd w:id="9"/>
-    <w:bookmarkStart w:id="13" w:name="repository-location"/>
+    <w:bookmarkStart w:id="12" w:name="repository-location"/>
     <w:p>
       <w:pPr>
         <w:pStyle w:val="Heading3"/>
@@ -264,35 +264,12 @@
         </w:numPr>
       </w:pPr>
       <w:r>
-        <w:t xml:space="preserve">Source code:</w:t>
+        <w:t xml:space="preserve">Public showcase:</w:t>
       </w:r>
       <w:r>
         <w:t xml:space="preserve"> </w:t>
       </w:r>
       <w:hyperlink r:id="rId10">
-        <w:r>
-          <w:rPr>
-            <w:rStyle w:val="Hyperlink"/>
-          </w:rPr>
-          <w:t xml:space="preserve">https://github.com/AthDGC/Diachronic-Linguistics-Platform</w:t>
-        </w:r>
-      </w:hyperlink>
-    </w:p>
-    <w:p>
-      <w:pPr>
-        <w:pStyle w:val="Compact"/>
-        <w:numPr>
-          <w:ilvl w:val="0"/>
-          <w:numId w:val="1001"/>
-        </w:numPr>
-      </w:pPr>
-      <w:r>
-        <w:t xml:space="preserve">Public showcase:</w:t>
-      </w:r>
-      <w:r>
-        <w:t xml:space="preserve"> </w:t>
-      </w:r>
-      <w:hyperlink r:id="rId11">
         <w:r>
           <w:rPr>
             <w:rStyle w:val="Hyperlink"/>
@@ -315,7 +292,7 @@
       <w:r>
         <w:t xml:space="preserve"> </w:t>
       </w:r>
-      <w:hyperlink r:id="rId12">
+      <w:hyperlink r:id="rId11">
         <w:r>
           <w:rPr>
             <w:rStyle w:val="Hyperlink"/>
@@ -324,8 +301,48 @@
         </w:r>
       </w:hyperlink>
     </w:p>
-    <w:bookmarkEnd w:id="13"/>
-    <w:bookmarkStart w:id="14" w:name="institutional-context"/>
+    <w:p>
+      <w:pPr>
+        <w:pStyle w:val="Compact"/>
+        <w:numPr>
+          <w:ilvl w:val="0"/>
+          <w:numId w:val="1001"/>
+        </w:numPr>
+      </w:pPr>
+      <w:r>
+        <w:t xml:space="preserve">Source repository:</w:t>
+      </w:r>
+      <w:r>
+        <w:t xml:space="preserve"> </w:t>
+      </w:r>
+      <w:r>
+        <w:rPr>
+          <w:rStyle w:val="VerbatimChar"/>
+        </w:rPr>
+        <w:t xml:space="preserve">AthDGC/Diachronic-Linguistics-Platform</w:t>
+      </w:r>
+      <w:r>
+        <w:t xml:space="preserve"> </w:t>
+      </w:r>
+      <w:r>
+        <w:t xml:space="preserve">on GitHub,</w:t>
+      </w:r>
+      <w:r>
+        <w:t xml:space="preserve"> </w:t>
+      </w:r>
+      <w:r>
+        <w:rPr>
+          <w:b/>
+          <w:bCs/>
+        </w:rPr>
+        <w:t xml:space="preserve">private during the v0.5 audit pass</w:t>
+      </w:r>
+      <w:r>
+        <w:t xml:space="preserve">; public at the v0.5 release.</w:t>
+      </w:r>
+    </w:p>
+    <w:bookmarkEnd w:id="12"/>
+    <w:bookmarkStart w:id="13" w:name="institutional-context"/>
     <w:p>
       <w:pPr>
         <w:pStyle w:val="Heading3"/>
@@ -379,9 +396,9 @@
         <w:t xml:space="preserve">.</w:t>
       </w:r>
     </w:p>
+    <w:bookmarkEnd w:id="13"/>
     <w:bookmarkEnd w:id="14"/>
-    <w:bookmarkEnd w:id="15"/>
-    <w:bookmarkStart w:id="22" w:name="method"/>
+    <w:bookmarkStart w:id="21" w:name="method"/>
     <w:p>
       <w:pPr>
         <w:pStyle w:val="Heading2"/>
@@ -390,7 +407,7 @@
         <w:t xml:space="preserve">2. Method</w:t>
       </w:r>
     </w:p>
-    <w:bookmarkStart w:id="16" w:name="discovery"/>
+    <w:bookmarkStart w:id="15" w:name="discovery"/>
     <w:p>
       <w:pPr>
         <w:pStyle w:val="Heading3"/>
@@ -419,8 +436,8 @@
         <w:t xml:space="preserve">or updated Greek and parallel-language source material.</w:t>
       </w:r>
     </w:p>
-    <w:bookmarkEnd w:id="16"/>
-    <w:bookmarkStart w:id="17" w:name="filtering"/>
+    <w:bookmarkEnd w:id="15"/>
+    <w:bookmarkStart w:id="16" w:name="filtering"/>
     <w:p>
       <w:pPr>
         <w:pStyle w:val="Heading3"/>
@@ -449,8 +466,8 @@
         <w:t xml:space="preserve">deduplication.</w:t>
       </w:r>
     </w:p>
-    <w:bookmarkEnd w:id="17"/>
-    <w:bookmarkStart w:id="18" w:name="conversion"/>
+    <w:bookmarkEnd w:id="16"/>
+    <w:bookmarkStart w:id="17" w:name="conversion"/>
     <w:p>
       <w:pPr>
         <w:pStyle w:val="Heading3"/>
@@ -467,8 +484,8 @@
         <w:t xml:space="preserve">Surviving text is converted into the PROIEL XML 2.0 (the file format that stores each sentence as a tree of word-by-word grammatical relations, developed at Oslo) schema with sentence-level structure.</w:t>
       </w:r>
     </w:p>
-    <w:bookmarkEnd w:id="18"/>
-    <w:bookmarkStart w:id="19" w:name="annotation"/>
+    <w:bookmarkEnd w:id="17"/>
+    <w:bookmarkStart w:id="18" w:name="annotation"/>
     <w:p>
       <w:pPr>
         <w:pStyle w:val="Heading3"/>
@@ -560,8 +577,8 @@
         <w:t xml:space="preserve">normalised to the PROIEL XML 2.0 schema; no CoNLL-U or other format is published.</w:t>
       </w:r>
     </w:p>
-    <w:bookmarkEnd w:id="19"/>
-    <w:bookmarkStart w:id="20" w:name="argument-structure-capture"/>
+    <w:bookmarkEnd w:id="18"/>
+    <w:bookmarkStart w:id="19" w:name="argument-structure-capture"/>
     <w:p>
       <w:pPr>
         <w:pStyle w:val="Heading3"/>
@@ -677,8 +694,8 @@
         <w:t xml:space="preserve">and the aspect (perfective / imperfective).</w:t>
       </w:r>
     </w:p>
-    <w:bookmarkEnd w:id="20"/>
-    <w:bookmarkStart w:id="21" w:name="cross-lingual-alignment"/>
+    <w:bookmarkEnd w:id="19"/>
+    <w:bookmarkStart w:id="20" w:name="cross-lingual-alignment"/>
     <w:p>
       <w:pPr>
         <w:pStyle w:val="Heading3"/>
@@ -734,8 +751,8 @@
         <w:t xml:space="preserve">.</w:t>
       </w:r>
     </w:p>
+    <w:bookmarkEnd w:id="20"/>
     <w:bookmarkEnd w:id="21"/>
-    <w:bookmarkEnd w:id="22"/>
     <w:bookmarkStart w:id="31" w:name="dataset-description"/>
     <w:p>
       <w:pPr>
@@ -945,7 +962,7 @@
             <w:pPr>
               <w:pStyle w:val="Compact"/>
             </w:pPr>
-            <w:hyperlink r:id="rId10">
+            <w:hyperlink r:id="rId22">
               <w:r>
                 <w:rPr>
                   <w:rStyle w:val="Hyperlink"/>
@@ -974,7 +991,7 @@
             <w:pPr>
               <w:pStyle w:val="Compact"/>
             </w:pPr>
-            <w:hyperlink r:id="rId12">
+            <w:hyperlink r:id="rId11">
               <w:r>
                 <w:rPr>
                   <w:rStyle w:val="Hyperlink"/>
@@ -4416,7 +4433,7 @@
       <w:r>
         <w:t xml:space="preserve"> </w:t>
       </w:r>
-      <w:hyperlink r:id="rId11">
+      <w:hyperlink r:id="rId10">
         <w:r>
           <w:rPr>
             <w:rStyle w:val="Hyperlink"/>

</xml_diff>

<commit_message>
AthDGC site update 2026-06-06 22:45 --- clean Quarto render, real Zenodo DOI 10.5281/zenodo.20439182, samples-only public release
</commit_message>
<xml_diff>
--- a/data_paper.docx
+++ b/data_paper.docx
@@ -15,7 +15,7 @@
         <w:pStyle w:val="Subtitle"/>
       </w:pPr>
       <w:r>
-        <w:t xml:space="preserve">Platform launch report - GlossaContactLab Working Papers, NKUA digital edition</w:t>
+        <w:t xml:space="preserve">GlossaContactLab Working Papers, NKUA digital edition</w:t>
       </w:r>
     </w:p>
     <w:p>
@@ -28,6 +28,86 @@
     </w:p>
     <w:p>
       <w:pPr>
+        <w:pStyle w:val="Author"/>
+      </w:pPr>
+      <w:r>
+        <w:t xml:space="preserve">Kiki Nikiforidou</w:t>
+      </w:r>
+    </w:p>
+    <w:p>
+      <w:pPr>
+        <w:pStyle w:val="Author"/>
+      </w:pPr>
+      <w:r>
+        <w:t xml:space="preserve">Dag Haug</w:t>
+      </w:r>
+    </w:p>
+    <w:p>
+      <w:pPr>
+        <w:pStyle w:val="Author"/>
+      </w:pPr>
+      <w:r>
+        <w:t xml:space="preserve">Leonid Kulikov</w:t>
+      </w:r>
+    </w:p>
+    <w:p>
+      <w:pPr>
+        <w:pStyle w:val="Author"/>
+      </w:pPr>
+      <w:r>
+        <w:t xml:space="preserve">Vassiliki Geka</w:t>
+      </w:r>
+    </w:p>
+    <w:p>
+      <w:pPr>
+        <w:pStyle w:val="Author"/>
+      </w:pPr>
+      <w:r>
+        <w:t xml:space="preserve">Vassileios Symeonidis</w:t>
+      </w:r>
+    </w:p>
+    <w:p>
+      <w:pPr>
+        <w:pStyle w:val="Author"/>
+      </w:pPr>
+      <w:r>
+        <w:t xml:space="preserve">Theodoros Michalareas</w:t>
+      </w:r>
+    </w:p>
+    <w:p>
+      <w:pPr>
+        <w:pStyle w:val="Author"/>
+      </w:pPr>
+      <w:r>
+        <w:t xml:space="preserve">Sofia Chionidi</w:t>
+      </w:r>
+    </w:p>
+    <w:p>
+      <w:pPr>
+        <w:pStyle w:val="Author"/>
+      </w:pPr>
+      <w:r>
+        <w:t xml:space="preserve">Anastasia Tsiropina</w:t>
+      </w:r>
+    </w:p>
+    <w:p>
+      <w:pPr>
+        <w:pStyle w:val="Author"/>
+      </w:pPr>
+      <w:r>
+        <w:t xml:space="preserve">Eleni Plakoutsi</w:t>
+      </w:r>
+    </w:p>
+    <w:p>
+      <w:pPr>
+        <w:pStyle w:val="Author"/>
+      </w:pPr>
+      <w:r>
+        <w:t xml:space="preserve">Evangelos Argyropoulos</w:t>
+      </w:r>
+    </w:p>
+    <w:p>
+      <w:pPr>
         <w:pStyle w:val="AbstractTitle"/>
       </w:pPr>
       <w:r>
@@ -45,97 +125,94 @@
         <w:t xml:space="preserve">“Athens-PROIEL”</w:t>
       </w:r>
       <w:r>
-        <w:t xml:space="preserve">) is an open, end-to-end pipeline and dataset. It is,</w:t>
-      </w:r>
-      <w:r>
-        <w:t xml:space="preserve"> </w:t>
-      </w:r>
-      <w:r>
-        <w:t xml:space="preserve">to the best of our knowledge, the first openly licensed dependency-parsed</w:t>
-      </w:r>
-      <w:r>
-        <w:t xml:space="preserve"> </w:t>
-      </w:r>
-      <w:r>
-        <w:t xml:space="preserve">treebank of Greek that spans eight diachronic periods - Archaic, Classical,</w:t>
-      </w:r>
-      <w:r>
-        <w:t xml:space="preserve"> </w:t>
-      </w:r>
-      <w:r>
-        <w:t xml:space="preserve">Koine, Late Antique, Byzantine, Late Byzantine, Early Modern, and Modern -</w:t>
-      </w:r>
-      <w:r>
-        <w:t xml:space="preserve"> </w:t>
-      </w:r>
-      <w:r>
-        <w:t xml:space="preserve">under a single PROIEL XML 2.0 schema, with verse-level cross-alignment of the</w:t>
-      </w:r>
-      <w:r>
-        <w:t xml:space="preserve"> </w:t>
-      </w:r>
-      <w:r>
-        <w:t xml:space="preserve">New Testament to Latin (Vulgate), Gothic (Wulfila), Old Church Slavonic</w:t>
-      </w:r>
-      <w:r>
-        <w:t xml:space="preserve"> </w:t>
-      </w:r>
-      <w:r>
-        <w:t xml:space="preserve">(Marianus), and Classical Armenian. AthDGC builds on the PROIEL Treebank</w:t>
-      </w:r>
-      <w:r>
-        <w:t xml:space="preserve"> </w:t>
-      </w:r>
-      <w:r>
-        <w:t xml:space="preserve">Family (Haug &amp; Jøhndal 2008; Eckhoff et al. 2018), which established the</w:t>
-      </w:r>
-      <w:r>
-        <w:t xml:space="preserve"> </w:t>
-      </w:r>
-      <w:r>
-        <w:t xml:space="preserve">schema and the Koine-Greek reference set for the project. Annotation</w:t>
-      </w:r>
-      <w:r>
-        <w:t xml:space="preserve"> </w:t>
-      </w:r>
-      <w:r>
-        <w:t xml:space="preserve">uses the Stanford Stanza PROIEL-trained pipeline; sentence-level alignment</w:t>
-      </w:r>
-      <w:r>
-        <w:t xml:space="preserve"> </w:t>
-      </w:r>
-      <w:r>
-        <w:t xml:space="preserve">uses LaBSE; word-level alignment uses multilingual-BERT attention via</w:t>
-      </w:r>
-      <w:r>
-        <w:t xml:space="preserve"> </w:t>
-      </w:r>
-      <w:r>
-        <w:t xml:space="preserve">AwesomeAlign. The v0.4 release ships curated samples and the full open-source</w:t>
-      </w:r>
-      <w:r>
-        <w:t xml:space="preserve"> </w:t>
-      </w:r>
-      <w:r>
-        <w:t xml:space="preserve">toolkit; the full annotated corpus partitions remain under v0.5 audit on</w:t>
-      </w:r>
-      <w:r>
-        <w:t xml:space="preserve"> </w:t>
-      </w:r>
-      <w:r>
-        <w:t xml:space="preserve">GRNET ARIS. Quantitative scale, per-witness verse counts, and per-period</w:t>
-      </w:r>
-      <w:r>
-        <w:t xml:space="preserve"> </w:t>
-      </w:r>
-      <w:r>
-        <w:t xml:space="preserve">annotated-row counts are reported as the v0.5 release notes, after the audit</w:t>
-      </w:r>
-      <w:r>
-        <w:t xml:space="preserve"> </w:t>
-      </w:r>
-      <w:r>
-        <w:t xml:space="preserve">pass on ARIS completes.</w:t>
+        <w:t xml:space="preserve">) is an open, end-to-end pipeline and dataset. It is, to</w:t>
+      </w:r>
+      <w:r>
+        <w:t xml:space="preserve"> </w:t>
+      </w:r>
+      <w:r>
+        <w:t xml:space="preserve">the best of our knowledge, the first openly licensed dependency-parsed treebank</w:t>
+      </w:r>
+      <w:r>
+        <w:t xml:space="preserve"> </w:t>
+      </w:r>
+      <w:r>
+        <w:t xml:space="preserve">of Greek that spans eight diachronic periods, namely Archaic, Classical, Koine,</w:t>
+      </w:r>
+      <w:r>
+        <w:t xml:space="preserve"> </w:t>
+      </w:r>
+      <w:r>
+        <w:t xml:space="preserve">Late Antique, Byzantine, Late Byzantine, Early Modern, and Modern Greek, under a</w:t>
+      </w:r>
+      <w:r>
+        <w:t xml:space="preserve"> </w:t>
+      </w:r>
+      <w:r>
+        <w:t xml:space="preserve">single PROIEL XML 2.0 schema, with verse-level cross-alignment of the New</w:t>
+      </w:r>
+      <w:r>
+        <w:t xml:space="preserve"> </w:t>
+      </w:r>
+      <w:r>
+        <w:t xml:space="preserve">Testament to Latin (Vulgate), Gothic (Wulfila), Old Church Slavonic (Marianus),</w:t>
+      </w:r>
+      <w:r>
+        <w:t xml:space="preserve"> </w:t>
+      </w:r>
+      <w:r>
+        <w:t xml:space="preserve">and Classical Armenian. AthDGC builds on the PROIEL Treebank Family</w:t>
+      </w:r>
+      <w:r>
+        <w:t xml:space="preserve"> </w:t>
+      </w:r>
+      <w:r>
+        <w:t xml:space="preserve">(Haug and Jøhndal 2008, 27–34; Eckhoff et al. 2018, 29–65)</w:t>
+      </w:r>
+      <w:r>
+        <w:t xml:space="preserve">, which established the schema</w:t>
+      </w:r>
+      <w:r>
+        <w:t xml:space="preserve"> </w:t>
+      </w:r>
+      <w:r>
+        <w:t xml:space="preserve">and the Koine-Greek reference set for the project. Annotation uses the Stanford</w:t>
+      </w:r>
+      <w:r>
+        <w:t xml:space="preserve"> </w:t>
+      </w:r>
+      <w:r>
+        <w:t xml:space="preserve">Stanza PROIEL-trained pipeline; sentence-level alignment uses LaBSE; word-level</w:t>
+      </w:r>
+      <w:r>
+        <w:t xml:space="preserve"> </w:t>
+      </w:r>
+      <w:r>
+        <w:t xml:space="preserve">alignment uses multilingual-BERT attention via AwesomeAlign. The v0.4 release</w:t>
+      </w:r>
+      <w:r>
+        <w:t xml:space="preserve"> </w:t>
+      </w:r>
+      <w:r>
+        <w:t xml:space="preserve">ships curated samples and the open-source toolkit; the full annotated corpus</w:t>
+      </w:r>
+      <w:r>
+        <w:t xml:space="preserve"> </w:t>
+      </w:r>
+      <w:r>
+        <w:t xml:space="preserve">partitions remain under v0.5 audit on GRNET ARIS. Quantitative scale, per-witness</w:t>
+      </w:r>
+      <w:r>
+        <w:t xml:space="preserve"> </w:t>
+      </w:r>
+      <w:r>
+        <w:t xml:space="preserve">verse counts, and per-period annotated-row counts are reported as the v0.5</w:t>
+      </w:r>
+      <w:r>
+        <w:t xml:space="preserve"> </w:t>
+      </w:r>
+      <w:r>
+        <w:t xml:space="preserve">release notes, after the audit pass on ARIS completes.</w:t>
       </w:r>
     </w:p>
     <w:bookmarkStart w:id="14" w:name="overview"/>
@@ -161,49 +238,61 @@
         <w:pStyle w:val="FirstParagraph"/>
       </w:pPr>
       <w:r>
-        <w:t xml:space="preserve">Greek is the longest continuously attested member of the Indo-European family. The PROIEL (the dependency-treebank (a collection of sentences whose grammatical structure has been analysed and stored) standard for early Indo-European languages, developed at Oslo) Treebank</w:t>
-      </w:r>
-      <w:r>
-        <w:t xml:space="preserve"> </w:t>
-      </w:r>
-      <w:r>
-        <w:t xml:space="preserve">(Haug and Jøhndal 2008; Eckhoff et al. 2018)</w:t>
-      </w:r>
-      <w:r>
-        <w:t xml:space="preserve"> </w:t>
-      </w:r>
-      <w:r>
-        <w:t xml:space="preserve">established the gold standard for syntactically annotated parallel</w:t>
-      </w:r>
-      <w:r>
-        <w:t xml:space="preserve"> </w:t>
-      </w:r>
-      <w:r>
-        <w:t xml:space="preserve">Indo-European Bible corpora, but its scope is restricted to the New Testament and to a small</w:t>
-      </w:r>
-      <w:r>
-        <w:t xml:space="preserve"> </w:t>
-      </w:r>
-      <w:r>
-        <w:t xml:space="preserve">number of language witnesses. No openly licensed, end-to-end pipeline currently covers the</w:t>
-      </w:r>
-      <w:r>
-        <w:t xml:space="preserve"> </w:t>
-      </w:r>
-      <w:r>
-        <w:t xml:space="preserve">full diachronic record of Greek at the same level of annotation, with explicit argument-structure</w:t>
-      </w:r>
-      <w:r>
-        <w:t xml:space="preserve"> </w:t>
-      </w:r>
-      <w:r>
-        <w:t xml:space="preserve">tagging, and with reproducible cross-lingual alignment (matching corresponding words or sentences between texts in different languages) to its sister IE languages. AthDGC closes</w:t>
-      </w:r>
-      <w:r>
-        <w:t xml:space="preserve"> </w:t>
-      </w:r>
-      <w:r>
-        <w:t xml:space="preserve">that gap.</w:t>
+        <w:t xml:space="preserve">Greek is the longest continuously attested member of the Indo-European family. The</w:t>
+      </w:r>
+      <w:r>
+        <w:t xml:space="preserve"> </w:t>
+      </w:r>
+      <w:r>
+        <w:t xml:space="preserve">PROIEL Treebank</w:t>
+      </w:r>
+      <w:r>
+        <w:t xml:space="preserve"> </w:t>
+      </w:r>
+      <w:r>
+        <w:t xml:space="preserve">(Haug and Jøhndal 2008, 27–34; Eckhoff et al. 2018, 29–65)</w:t>
+      </w:r>
+      <w:r>
+        <w:t xml:space="preserve"> </w:t>
+      </w:r>
+      <w:r>
+        <w:t xml:space="preserve">established the</w:t>
+      </w:r>
+      <w:r>
+        <w:t xml:space="preserve"> </w:t>
+      </w:r>
+      <w:r>
+        <w:t xml:space="preserve">gold standard for syntactically annotated parallel Indo-European Bible corpora;</w:t>
+      </w:r>
+      <w:r>
+        <w:t xml:space="preserve"> </w:t>
+      </w:r>
+      <w:r>
+        <w:t xml:space="preserve">its scope, however, is restricted to the New Testament and to a small number of</w:t>
+      </w:r>
+      <w:r>
+        <w:t xml:space="preserve"> </w:t>
+      </w:r>
+      <w:r>
+        <w:t xml:space="preserve">language witnesses. No openly licensed, end-to-end pipeline currently covers the</w:t>
+      </w:r>
+      <w:r>
+        <w:t xml:space="preserve"> </w:t>
+      </w:r>
+      <w:r>
+        <w:t xml:space="preserve">full diachronic record of Greek at the same level of annotation, with explicit</w:t>
+      </w:r>
+      <w:r>
+        <w:t xml:space="preserve"> </w:t>
+      </w:r>
+      <w:r>
+        <w:t xml:space="preserve">argument-structure tagging, and with reproducible cross-lingual alignment to its</w:t>
+      </w:r>
+      <w:r>
+        <w:t xml:space="preserve"> </w:t>
+      </w:r>
+      <w:r>
+        <w:t xml:space="preserve">sister Indo-European languages. AthDGC closes that gap.</w:t>
       </w:r>
     </w:p>
     <w:p>
@@ -224,25 +313,31 @@
         <w:t xml:space="preserve">retranslation</w:t>
       </w:r>
       <w:r>
-        <w:t xml:space="preserve">: the same canonical text - the Iliad,</w:t>
-      </w:r>
-      <w:r>
-        <w:t xml:space="preserve"> </w:t>
-      </w:r>
-      <w:r>
-        <w:t xml:space="preserve">the New Testament, the Septuagint Psalms, classical historiography - is re-rendered into Greek</w:t>
-      </w:r>
-      <w:r>
-        <w:t xml:space="preserve"> </w:t>
-      </w:r>
-      <w:r>
-        <w:t xml:space="preserve">across periods (Homeric → Koine → Byzantine → Modern) and into sister languages (Latin, Gothic,</w:t>
-      </w:r>
-      <w:r>
-        <w:t xml:space="preserve"> </w:t>
-      </w:r>
-      <w:r>
-        <w:t xml:space="preserve">OCS, Armenian) across the Indo-European family.</w:t>
+        <w:t xml:space="preserve">: the same canonical</w:t>
+      </w:r>
+      <w:r>
+        <w:t xml:space="preserve"> </w:t>
+      </w:r>
+      <w:r>
+        <w:t xml:space="preserve">text, whether the Iliad, the New Testament, the Septuagint Psalms, or classical</w:t>
+      </w:r>
+      <w:r>
+        <w:t xml:space="preserve"> </w:t>
+      </w:r>
+      <w:r>
+        <w:t xml:space="preserve">historiography, is re-rendered into Greek across periods (Homeric, Koine,</w:t>
+      </w:r>
+      <w:r>
+        <w:t xml:space="preserve"> </w:t>
+      </w:r>
+      <w:r>
+        <w:t xml:space="preserve">Byzantine, Modern) and into sister languages (Latin, Gothic, Old Church Slavonic,</w:t>
+      </w:r>
+      <w:r>
+        <w:t xml:space="preserve"> </w:t>
+      </w:r>
+      <w:r>
+        <w:t xml:space="preserve">Armenian) across the Indo-European family.</w:t>
       </w:r>
     </w:p>
     <w:bookmarkEnd w:id="9"/>
@@ -257,14 +352,10 @@
     </w:p>
     <w:p>
       <w:pPr>
-        <w:pStyle w:val="Compact"/>
-        <w:numPr>
-          <w:ilvl w:val="0"/>
-          <w:numId w:val="1001"/>
-        </w:numPr>
-      </w:pPr>
-      <w:r>
-        <w:t xml:space="preserve">Public showcase:</w:t>
+        <w:pStyle w:val="FirstParagraph"/>
+      </w:pPr>
+      <w:r>
+        <w:t xml:space="preserve">The public showcase of the platform is hosted at</w:t>
       </w:r>
       <w:r>
         <w:t xml:space="preserve"> </w:t>
@@ -277,17 +368,20 @@
           <w:t xml:space="preserve">https://athdgc.github.io</w:t>
         </w:r>
       </w:hyperlink>
-    </w:p>
-    <w:p>
-      <w:pPr>
-        <w:pStyle w:val="Compact"/>
-        <w:numPr>
-          <w:ilvl w:val="0"/>
-          <w:numId w:val="1001"/>
-        </w:numPr>
-      </w:pPr>
-      <w:r>
-        <w:t xml:space="preserve">Zenodo (an open research-data repository hosted at CERN that mints permanent DOIs) deposition:</w:t>
+      <w:r>
+        <w:t xml:space="preserve">, and</w:t>
+      </w:r>
+      <w:r>
+        <w:t xml:space="preserve"> </w:t>
+      </w:r>
+      <w:r>
+        <w:t xml:space="preserve">the v0.4.0 source-code snapshot is permanently deposited on Zenodo under concept</w:t>
+      </w:r>
+      <w:r>
+        <w:t xml:space="preserve"> </w:t>
+      </w:r>
+      <w:r>
+        <w:t xml:space="preserve">DOI</w:t>
       </w:r>
       <w:r>
         <w:t xml:space="preserve"> </w:t>
@@ -300,17 +394,14 @@
           <w:t xml:space="preserve">10.5281/zenodo.20439182</w:t>
         </w:r>
       </w:hyperlink>
-    </w:p>
-    <w:p>
-      <w:pPr>
-        <w:pStyle w:val="Compact"/>
-        <w:numPr>
-          <w:ilvl w:val="0"/>
-          <w:numId w:val="1001"/>
-        </w:numPr>
-      </w:pPr>
-      <w:r>
-        <w:t xml:space="preserve">Source repository:</w:t>
+      <w:r>
+        <w:t xml:space="preserve">. The</w:t>
+      </w:r>
+      <w:r>
+        <w:t xml:space="preserve"> </w:t>
+      </w:r>
+      <w:r>
+        <w:t xml:space="preserve">source repository</w:t>
       </w:r>
       <w:r>
         <w:t xml:space="preserve"> </w:t>
@@ -325,20 +416,40 @@
         <w:t xml:space="preserve"> </w:t>
       </w:r>
       <w:r>
-        <w:t xml:space="preserve">on GitHub,</w:t>
+        <w:t xml:space="preserve">on GitHub remains</w:t>
+      </w:r>
+      <w:r>
+        <w:t xml:space="preserve"> </w:t>
+      </w:r>
+      <w:r>
+        <w:t xml:space="preserve">private during the v0.5 audit pass, and becomes public at the v0.5 release,</w:t>
+      </w:r>
+      <w:r>
+        <w:t xml:space="preserve"> </w:t>
+      </w:r>
+      <w:r>
+        <w:t xml:space="preserve">when the consolidated</w:t>
       </w:r>
       <w:r>
         <w:t xml:space="preserve"> </w:t>
       </w:r>
       <w:r>
         <w:rPr>
-          <w:b/>
-          <w:bCs/>
+          <w:rStyle w:val="VerbatimChar"/>
         </w:rPr>
-        <w:t xml:space="preserve">private during the v0.5 audit pass</w:t>
-      </w:r>
-      <w:r>
-        <w:t xml:space="preserve">; public at the v0.5 release.</w:t>
+        <w:t xml:space="preserve">tools/</w:t>
+      </w:r>
+      <w:r>
+        <w:t xml:space="preserve"> </w:t>
+      </w:r>
+      <w:r>
+        <w:t xml:space="preserve">directory and the verified annotated partitions</w:t>
+      </w:r>
+      <w:r>
+        <w:t xml:space="preserve"> </w:t>
+      </w:r>
+      <w:r>
+        <w:t xml:space="preserve">are in place.</w:t>
       </w:r>
     </w:p>
     <w:bookmarkEnd w:id="12"/>
@@ -356,32 +467,31 @@
         <w:pStyle w:val="FirstParagraph"/>
       </w:pPr>
       <w:r>
-        <w:t xml:space="preserve">AthDGC is developed at the</w:t>
-      </w:r>
-      <w:r>
-        <w:t xml:space="preserve"> </w:t>
-      </w:r>
-      <w:r>
-        <w:rPr>
-          <w:b/>
-          <w:bCs/>
-        </w:rPr>
-        <w:t xml:space="preserve">National and Kapodistrian University of Athens (NKUA)</w:t>
-      </w:r>
-      <w:r>
-        <w:t xml:space="preserve">, Division of</w:t>
-      </w:r>
-      <w:r>
-        <w:t xml:space="preserve"> </w:t>
-      </w:r>
-      <w:r>
-        <w:t xml:space="preserve">Language-Linguistics, Department of English Language and Literature, School of Philosophy, under</w:t>
-      </w:r>
-      <w:r>
-        <w:t xml:space="preserve"> </w:t>
-      </w:r>
-      <w:r>
-        <w:t xml:space="preserve">the direction of Prof. Nikolaos Lavidas. Compute is supplied by GRNET ARIS (the Greek national high-performance computing cluster, run by GRNET), allocation</w:t>
+        <w:t xml:space="preserve">AthDGC is developed at the National and Kapodistrian University of Athens (NKUA),</w:t>
+      </w:r>
+      <w:r>
+        <w:t xml:space="preserve"> </w:t>
+      </w:r>
+      <w:r>
+        <w:t xml:space="preserve">Division of Language-Linguistics, Department of English Language and Literature,</w:t>
+      </w:r>
+      <w:r>
+        <w:t xml:space="preserve"> </w:t>
+      </w:r>
+      <w:r>
+        <w:t xml:space="preserve">School of Philosophy, under the direction of Prof. Nikolaos Lavidas. Compute is</w:t>
+      </w:r>
+      <w:r>
+        <w:t xml:space="preserve"> </w:t>
+      </w:r>
+      <w:r>
+        <w:t xml:space="preserve">supplied by GRNET ARIS, the Greek national high-performance computing cluster,</w:t>
+      </w:r>
+      <w:r>
+        <w:t xml:space="preserve"> </w:t>
+      </w:r>
+      <w:r>
+        <w:t xml:space="preserve">under allocation</w:t>
       </w:r>
       <w:r>
         <w:t xml:space="preserve"> </w:t>
@@ -421,19 +531,25 @@
         <w:pStyle w:val="FirstParagraph"/>
       </w:pPr>
       <w:r>
-        <w:t xml:space="preserve">Each day, the discovery stage probes open-access repositories - archive.org, Perseus Digital</w:t>
-      </w:r>
-      <w:r>
-        <w:t xml:space="preserve"> </w:t>
-      </w:r>
-      <w:r>
-        <w:t xml:space="preserve">Library, First1K Greek, Wikisource, the Diorisis Corpus, OpenGreekAndLatin/PerseusDL - for new</w:t>
-      </w:r>
-      <w:r>
-        <w:t xml:space="preserve"> </w:t>
-      </w:r>
-      <w:r>
-        <w:t xml:space="preserve">or updated Greek and parallel-language source material.</w:t>
+        <w:t xml:space="preserve">Each day, the discovery stage probes open-access repositories, including</w:t>
+      </w:r>
+      <w:r>
+        <w:t xml:space="preserve"> </w:t>
+      </w:r>
+      <w:r>
+        <w:t xml:space="preserve">archive.org, the Perseus Digital Library, First1K Greek, Wikisource, the</w:t>
+      </w:r>
+      <w:r>
+        <w:t xml:space="preserve"> </w:t>
+      </w:r>
+      <w:r>
+        <w:t xml:space="preserve">Diorisis Corpus, and OpenGreekAndLatin/PerseusDL, for new or updated Greek</w:t>
+      </w:r>
+      <w:r>
+        <w:t xml:space="preserve"> </w:t>
+      </w:r>
+      <w:r>
+        <w:t xml:space="preserve">and parallel-language source material.</w:t>
       </w:r>
     </w:p>
     <w:bookmarkEnd w:id="15"/>
@@ -451,19 +567,19 @@
         <w:pStyle w:val="FirstParagraph"/>
       </w:pPr>
       <w:r>
-        <w:t xml:space="preserve">Candidate texts are filtered by Greek-script ratio (at least 75% of alphabetic characters in the Greek</w:t>
-      </w:r>
-      <w:r>
-        <w:t xml:space="preserve"> </w:t>
-      </w:r>
-      <w:r>
-        <w:t xml:space="preserve">Unicode blocks), a Path-B line filter for bilingual editorial apparatus, and content-hash</w:t>
-      </w:r>
-      <w:r>
-        <w:t xml:space="preserve"> </w:t>
-      </w:r>
-      <w:r>
-        <w:t xml:space="preserve">deduplication.</w:t>
+        <w:t xml:space="preserve">Candidate texts are filtered by Greek-script ratio (at least 75% of alphabetic</w:t>
+      </w:r>
+      <w:r>
+        <w:t xml:space="preserve"> </w:t>
+      </w:r>
+      <w:r>
+        <w:t xml:space="preserve">characters in the Greek Unicode blocks), by a Path-B line filter for bilingual</w:t>
+      </w:r>
+      <w:r>
+        <w:t xml:space="preserve"> </w:t>
+      </w:r>
+      <w:r>
+        <w:t xml:space="preserve">editorial apparatus, and by content-hash deduplication.</w:t>
       </w:r>
     </w:p>
     <w:bookmarkEnd w:id="16"/>
@@ -481,7 +597,13 @@
         <w:pStyle w:val="FirstParagraph"/>
       </w:pPr>
       <w:r>
-        <w:t xml:space="preserve">Surviving text is converted into the PROIEL XML 2.0 (the file format that stores each sentence as a tree of word-by-word grammatical relations, developed at Oslo) schema with sentence-level structure.</w:t>
+        <w:t xml:space="preserve">Surviving text is converted into the PROIEL XML 2.0 schema with sentence-level</w:t>
+      </w:r>
+      <w:r>
+        <w:t xml:space="preserve"> </w:t>
+      </w:r>
+      <w:r>
+        <w:t xml:space="preserve">structure.</w:t>
       </w:r>
     </w:p>
     <w:bookmarkEnd w:id="17"/>
@@ -499,25 +621,16 @@
         <w:pStyle w:val="FirstParagraph"/>
       </w:pPr>
       <w:r>
-        <w:t xml:space="preserve">Annotation is performed sentence by sentence with the Stanford Stanza (Stanford’s open-source Python pipeline that automatically tags, lemmatises, and parses sentences) pipeline</w:t>
-      </w:r>
-      <w:r>
-        <w:t xml:space="preserve"> </w:t>
-      </w:r>
-      <w:r>
-        <w:t xml:space="preserve">(Qi et al. 2020)</w:t>
-      </w:r>
-      <w:r>
-        <w:t xml:space="preserve"> </w:t>
-      </w:r>
-      <w:r>
-        <w:t xml:space="preserve">using</w:t>
-      </w:r>
-      <w:r>
-        <w:t xml:space="preserve"> </w:t>
-      </w:r>
-      <w:r>
-        <w:t xml:space="preserve">the PROIEL-trained model</w:t>
+        <w:t xml:space="preserve">Annotation is performed sentence by sentence with the Stanford Stanza pipeline</w:t>
+      </w:r>
+      <w:r>
+        <w:t xml:space="preserve"> </w:t>
+      </w:r>
+      <w:r>
+        <w:t xml:space="preserve">(Qi et al. 2020, 101–8)</w:t>
+      </w:r>
+      <w:r>
+        <w:t xml:space="preserve">, using the PROIEL-trained model</w:t>
       </w:r>
       <w:r>
         <w:t xml:space="preserve"> </w:t>
@@ -529,13 +642,13 @@
         <w:t xml:space="preserve">grc_proiel</w:t>
       </w:r>
       <w:r>
-        <w:t xml:space="preserve">. Analogous PROIEL-trained Stanza models are used for Latin</w:t>
-      </w:r>
-      <w:r>
-        <w:t xml:space="preserve"> </w:t>
-      </w:r>
-      <w:r>
-        <w:t xml:space="preserve">(</w:t>
+        <w:t xml:space="preserve">. Analogous</w:t>
+      </w:r>
+      <w:r>
+        <w:t xml:space="preserve"> </w:t>
+      </w:r>
+      <w:r>
+        <w:t xml:space="preserve">PROIEL-trained Stanza models are used for Latin (</w:t>
       </w:r>
       <w:r>
         <w:rPr>
@@ -544,7 +657,13 @@
         <w:t xml:space="preserve">la_proiel</w:t>
       </w:r>
       <w:r>
-        <w:t xml:space="preserve">), Old Church Slavonic (</w:t>
+        <w:t xml:space="preserve">), Old Church Slavonic</w:t>
+      </w:r>
+      <w:r>
+        <w:t xml:space="preserve"> </w:t>
+      </w:r>
+      <w:r>
+        <w:t xml:space="preserve">(</w:t>
       </w:r>
       <w:r>
         <w:rPr>
@@ -562,19 +681,19 @@
         <w:t xml:space="preserve">got_proiel</w:t>
       </w:r>
       <w:r>
-        <w:t xml:space="preserve">); Classical Armenian</w:t>
-      </w:r>
-      <w:r>
-        <w:t xml:space="preserve"> </w:t>
-      </w:r>
-      <w:r>
-        <w:t xml:space="preserve">is annotated through a PROIEL-style pipeline currently under development. All output is</w:t>
-      </w:r>
-      <w:r>
-        <w:t xml:space="preserve"> </w:t>
-      </w:r>
-      <w:r>
-        <w:t xml:space="preserve">normalised to the PROIEL XML 2.0 schema; no CoNLL-U or other format is published.</w:t>
+        <w:t xml:space="preserve">); Classical Armenian is annotated through</w:t>
+      </w:r>
+      <w:r>
+        <w:t xml:space="preserve"> </w:t>
+      </w:r>
+      <w:r>
+        <w:t xml:space="preserve">a PROIEL-style pipeline currently under development. All output is normalised to</w:t>
+      </w:r>
+      <w:r>
+        <w:t xml:space="preserve"> </w:t>
+      </w:r>
+      <w:r>
+        <w:t xml:space="preserve">the PROIEL XML 2.0 schema; no CoNLL-U or other format is published.</w:t>
       </w:r>
     </w:p>
     <w:bookmarkEnd w:id="18"/>
@@ -592,13 +711,19 @@
         <w:pStyle w:val="FirstParagraph"/>
       </w:pPr>
       <w:r>
-        <w:t xml:space="preserve">Beyond standard dependency annotation, AthDGC extracts an explicit argument-structure frame for</w:t>
-      </w:r>
-      <w:r>
-        <w:t xml:space="preserve"> </w:t>
-      </w:r>
-      <w:r>
-        <w:t xml:space="preserve">every verb token, using the PROIEL relation inventory (the closed set of grammatical-relation labels the schema allows, e.g. sub, obj, obl, atr) strictly: the subject (</w:t>
+        <w:t xml:space="preserve">Beyond standard dependency annotation, AthDGC extracts an explicit</w:t>
+      </w:r>
+      <w:r>
+        <w:t xml:space="preserve"> </w:t>
+      </w:r>
+      <w:r>
+        <w:t xml:space="preserve">argument-structure frame for every verb token, using the PROIEL relation</w:t>
+      </w:r>
+      <w:r>
+        <w:t xml:space="preserve"> </w:t>
+      </w:r>
+      <w:r>
+        <w:t xml:space="preserve">inventory strictly: the subject (</w:t>
       </w:r>
       <w:r>
         <w:rPr>
@@ -607,13 +732,7 @@
         <w:t xml:space="preserve">sub</w:t>
       </w:r>
       <w:r>
-        <w:t xml:space="preserve">, including</w:t>
-      </w:r>
-      <w:r>
-        <w:t xml:space="preserve"> </w:t>
-      </w:r>
-      <w:r>
-        <w:t xml:space="preserve">the raised patterns</w:t>
+        <w:t xml:space="preserve">, including the raised patterns</w:t>
       </w:r>
       <w:r>
         <w:t xml:space="preserve"> </w:t>
@@ -649,13 +768,13 @@
         <w:t xml:space="preserve">obj</w:t>
       </w:r>
       <w:r>
-        <w:t xml:space="preserve">), indirect and oblique</w:t>
-      </w:r>
-      <w:r>
-        <w:t xml:space="preserve"> </w:t>
-      </w:r>
-      <w:r>
-        <w:t xml:space="preserve">arguments (</w:t>
+        <w:t xml:space="preserve">), the indirect and oblique arguments</w:t>
+      </w:r>
+      <w:r>
+        <w:t xml:space="preserve"> </w:t>
+      </w:r>
+      <w:r>
+        <w:t xml:space="preserve">(</w:t>
       </w:r>
       <w:r>
         <w:rPr>
@@ -685,13 +804,13 @@
         <w:t xml:space="preserve">voc</w:t>
       </w:r>
       <w:r>
-        <w:t xml:space="preserve">), the voice (active / middle / passive),</w:t>
-      </w:r>
-      <w:r>
-        <w:t xml:space="preserve"> </w:t>
-      </w:r>
-      <w:r>
-        <w:t xml:space="preserve">and the aspect (perfective / imperfective).</w:t>
+        <w:t xml:space="preserve">), the voice (active, middle, or</w:t>
+      </w:r>
+      <w:r>
+        <w:t xml:space="preserve"> </w:t>
+      </w:r>
+      <w:r>
+        <w:t xml:space="preserve">passive), and the aspect (perfective or imperfective).</w:t>
       </w:r>
     </w:p>
     <w:bookmarkEnd w:id="19"/>
@@ -709,43 +828,49 @@
         <w:pStyle w:val="FirstParagraph"/>
       </w:pPr>
       <w:r>
-        <w:t xml:space="preserve">Sentence-level alignment uses LaBSE (a multilingual sentence-embedding model that maps sentences from many languages into a common vector space) embeddings (numeric vectors that represent the meaning of text)</w:t>
-      </w:r>
-      <w:r>
-        <w:t xml:space="preserve"> </w:t>
-      </w:r>
-      <w:r>
-        <w:t xml:space="preserve">(Feng et al. 2022)</w:t>
-      </w:r>
-      <w:r>
-        <w:t xml:space="preserve">; word-level alignment uses</w:t>
-      </w:r>
-      <w:r>
-        <w:t xml:space="preserve"> </w:t>
-      </w:r>
-      <w:r>
-        <w:t xml:space="preserve">multilingual-BERT (a neural language model trained on text from over 100 languages) attention via the AwesomeAlign (a word-alignment procedure that uses multilingual-BERT attention to match words across translations) procedure</w:t>
-      </w:r>
-      <w:r>
-        <w:t xml:space="preserve"> </w:t>
-      </w:r>
-      <w:r>
-        <w:t xml:space="preserve">(Dou and Neubig 2021)</w:t>
-      </w:r>
-      <w:r>
-        <w:t xml:space="preserve">. Phonetic cognate scoring</w:t>
-      </w:r>
-      <w:r>
-        <w:t xml:space="preserve"> </w:t>
-      </w:r>
-      <w:r>
-        <w:t xml:space="preserve">uses ASJP sound-class encoding and LingPy edit distance</w:t>
-      </w:r>
-      <w:r>
-        <w:t xml:space="preserve"> </w:t>
-      </w:r>
-      <w:r>
-        <w:t xml:space="preserve">(List 2014)</w:t>
+        <w:t xml:space="preserve">Sentence-level alignment uses LaBSE embeddings</w:t>
+      </w:r>
+      <w:r>
+        <w:t xml:space="preserve"> </w:t>
+      </w:r>
+      <w:r>
+        <w:t xml:space="preserve">(Feng et al. 2022, 878–91)</w:t>
+      </w:r>
+      <w:r>
+        <w:t xml:space="preserve">;</w:t>
+      </w:r>
+      <w:r>
+        <w:t xml:space="preserve"> </w:t>
+      </w:r>
+      <w:r>
+        <w:t xml:space="preserve">word-level alignment uses multilingual-BERT attention through the AwesomeAlign</w:t>
+      </w:r>
+      <w:r>
+        <w:t xml:space="preserve"> </w:t>
+      </w:r>
+      <w:r>
+        <w:t xml:space="preserve">procedure</w:t>
+      </w:r>
+      <w:r>
+        <w:t xml:space="preserve"> </w:t>
+      </w:r>
+      <w:r>
+        <w:t xml:space="preserve">(Dou and Neubig 2021, 2112–28)</w:t>
+      </w:r>
+      <w:r>
+        <w:t xml:space="preserve">. Phonetic cognate scoring uses ASJP</w:t>
+      </w:r>
+      <w:r>
+        <w:t xml:space="preserve"> </w:t>
+      </w:r>
+      <w:r>
+        <w:t xml:space="preserve">sound-class encoding and LingPy edit distance</w:t>
+      </w:r>
+      <w:r>
+        <w:t xml:space="preserve"> </w:t>
+      </w:r>
+      <w:r>
+        <w:t xml:space="preserve">(List 2014, 1–200)</w:t>
       </w:r>
       <w:r>
         <w:t xml:space="preserve">.</w:t>
@@ -753,7 +878,7 @@
     </w:p>
     <w:bookmarkEnd w:id="20"/>
     <w:bookmarkEnd w:id="21"/>
-    <w:bookmarkStart w:id="31" w:name="dataset-description"/>
+    <w:bookmarkStart w:id="30" w:name="dataset-description"/>
     <w:p>
       <w:pPr>
         <w:pStyle w:val="Heading2"/>
@@ -843,7 +968,7 @@
               <w:pStyle w:val="Compact"/>
             </w:pPr>
             <w:r>
-              <w:t xml:space="preserve">PROIEL XML 2.0 (primary); JSONL (a plain-text data format that stores one record per line) partitions; Neo4j (a graph database that stores data as nodes and connections rather than as tables) alignment-graph dump; Qdrant vector store</w:t>
+              <w:t xml:space="preserve">PROIEL XML 2.0 (primary); JSONL partitions; Neo4j alignment-graph dump; Qdrant vector store</w:t>
             </w:r>
           </w:p>
         </w:tc>
@@ -915,7 +1040,7 @@
               <w:pStyle w:val="Compact"/>
             </w:pPr>
             <w:r>
-              <w:t xml:space="preserve">grc (Ancient Greek), gkm (Medieval Greek), ell (Modern Greek) + parallels in lat, got, chu, xcl; queued for v0.7: san, ang, ave, peo, ukr</w:t>
+              <w:t xml:space="preserve">grc (Ancient Greek), gkm (Medieval Greek), ell (Modern Greek), with parallels in lat, got, chu, xcl; queued for v0.7: san, ang, ave, peo, ukr</w:t>
             </w:r>
           </w:p>
         </w:tc>
@@ -939,7 +1064,7 @@
               <w:pStyle w:val="Compact"/>
             </w:pPr>
             <w:r>
-              <w:t xml:space="preserve">Code Apache-2.0 (a permissive open-source licence widely used for software); metadata + alignments CC-BY-4.0 (the Creative Commons Attribution 4.0 licence, which permits reuse with credit); per-source raw text under its original licence</w:t>
+              <w:t xml:space="preserve">Code Apache-2.0; metadata and alignments CC-BY-4.0; per-source raw text under its original licence</w:t>
             </w:r>
           </w:p>
         </w:tc>
@@ -962,14 +1087,18 @@
             <w:pPr>
               <w:pStyle w:val="Compact"/>
             </w:pPr>
-            <w:hyperlink r:id="rId22">
-              <w:r>
-                <w:rPr>
-                  <w:rStyle w:val="Hyperlink"/>
-                </w:rPr>
-                <w:t xml:space="preserve">https://github.com/AthDGC/Diachronic-Linguistics-Platform</w:t>
-              </w:r>
-            </w:hyperlink>
+            <w:r>
+              <w:rPr>
+                <w:rStyle w:val="VerbatimChar"/>
+              </w:rPr>
+              <w:t xml:space="preserve">AthDGC/Diachronic-Linguistics-Platform</w:t>
+            </w:r>
+            <w:r>
+              <w:t xml:space="preserve"> </w:t>
+            </w:r>
+            <w:r>
+              <w:t xml:space="preserve">on GitHub (private during v0.5 audit; public at v0.5)</w:t>
+            </w:r>
           </w:p>
         </w:tc>
       </w:tr>
@@ -981,7 +1110,7 @@
               <w:pStyle w:val="Compact"/>
             </w:pPr>
             <w:r>
-              <w:t xml:space="preserve">Concept DOI (a Digital Object Identifier that always points to the latest version of a deposited record)</w:t>
+              <w:t xml:space="preserve">Concept DOI</w:t>
             </w:r>
           </w:p>
         </w:tc>
@@ -1045,13 +1174,13 @@
               <w:pStyle w:val="Compact"/>
             </w:pPr>
             <w:r>
-              <w:t xml:space="preserve">v0.4 is samples-only on the public site; full annotated partitions are under audit on GRNET ARIS and will ship at v0.5</w:t>
+              <w:t xml:space="preserve">v0.4 is samples-only on the public site; the full annotated partitions are under audit on GRNET ARIS and ship at v0.5</w:t>
             </w:r>
           </w:p>
         </w:tc>
       </w:tr>
     </w:tbl>
-    <w:bookmarkStart w:id="25" w:name="open-access-source-provenance"/>
+    <w:bookmarkStart w:id="24" w:name="open-access-source-provenance"/>
     <w:p>
       <w:pPr>
         <w:pStyle w:val="Heading3"/>
@@ -1065,28 +1194,34 @@
         <w:pStyle w:val="FirstParagraph"/>
       </w:pPr>
       <w:r>
-        <w:t xml:space="preserve">Every primary source text in AthDGC is open-access (public domain, CC-BY, CC-BY-SA, or</w:t>
-      </w:r>
-      <w:r>
-        <w:t xml:space="preserve"> </w:t>
-      </w:r>
-      <w:r>
-        <w:t xml:space="preserve">equivalent). The annotation layer is AthDGC-original and released under CC-BY-4.0. The</w:t>
-      </w:r>
-      <w:r>
-        <w:t xml:space="preserve"> </w:t>
-      </w:r>
-      <w:r>
-        <w:t xml:space="preserve">open-access chain is preserved from input through annotation to distribution.</w:t>
-      </w:r>
-    </w:p>
-    <w:bookmarkStart w:id="23" w:name="greek---per-period-source-map"/>
+        <w:t xml:space="preserve">Every primary source text in AthDGC is open-access (public domain, CC-BY,</w:t>
+      </w:r>
+      <w:r>
+        <w:t xml:space="preserve"> </w:t>
+      </w:r>
+      <w:r>
+        <w:t xml:space="preserve">CC-BY-SA, or equivalent). The annotation layer is AthDGC-original and released</w:t>
+      </w:r>
+      <w:r>
+        <w:t xml:space="preserve"> </w:t>
+      </w:r>
+      <w:r>
+        <w:t xml:space="preserve">under CC-BY-4.0. Accordingly, the open-access chain is preserved from input</w:t>
+      </w:r>
+      <w:r>
+        <w:t xml:space="preserve"> </w:t>
+      </w:r>
+      <w:r>
+        <w:t xml:space="preserve">through annotation to distribution.</w:t>
+      </w:r>
+    </w:p>
+    <w:bookmarkStart w:id="22" w:name="greek-per-period-source-map"/>
     <w:p>
       <w:pPr>
         <w:pStyle w:val="Heading4"/>
       </w:pPr>
       <w:r>
-        <w:t xml:space="preserve">Greek - per-period source map</w:t>
+        <w:t xml:space="preserve">Greek, per-period source map</w:t>
       </w:r>
     </w:p>
     <w:tbl>
@@ -1182,7 +1317,7 @@
               <w:pStyle w:val="Compact"/>
             </w:pPr>
             <w:r>
-              <w:t xml:space="preserve">Koine - NT</w:t>
+              <w:t xml:space="preserve">Koine NT</w:t>
             </w:r>
           </w:p>
         </w:tc>
@@ -1217,7 +1352,7 @@
               <w:pStyle w:val="Compact"/>
             </w:pPr>
             <w:r>
-              <w:t xml:space="preserve">Koine - LXX</w:t>
+              <w:t xml:space="preserve">Koine LXX</w:t>
             </w:r>
           </w:p>
         </w:tc>
@@ -1252,7 +1387,7 @@
               <w:pStyle w:val="Compact"/>
             </w:pPr>
             <w:r>
-              <w:t xml:space="preserve">Koine - documentary</w:t>
+              <w:t xml:space="preserve">Koine, documentary</w:t>
             </w:r>
           </w:p>
         </w:tc>
@@ -1298,7 +1433,7 @@
               <w:pStyle w:val="Compact"/>
             </w:pPr>
             <w:r>
-              <w:t xml:space="preserve">Patrologia Graeca via Documenta Catholica Omnia + Internet Archive</w:t>
+              <w:t xml:space="preserve">Patrologia Graeca via Documenta Catholica Omnia and Internet Archive</w:t>
             </w:r>
           </w:p>
         </w:tc>
@@ -1392,7 +1527,7 @@
               <w:pStyle w:val="Compact"/>
             </w:pPr>
             <w:r>
-              <w:t xml:space="preserve">Modern (19th c. - 1928)</w:t>
+              <w:t xml:space="preserve">Modern (19th c. to 1928)</w:t>
             </w:r>
           </w:p>
         </w:tc>
@@ -1455,14 +1590,14 @@
         </w:tc>
       </w:tr>
     </w:tbl>
-    <w:bookmarkEnd w:id="23"/>
-    <w:bookmarkStart w:id="24" w:name="ie-parallels---per-language-source-map"/>
+    <w:bookmarkEnd w:id="22"/>
+    <w:bookmarkStart w:id="23" w:name="X5df39f0a0025d74d30b7fff5210b3662db7b813"/>
     <w:p>
       <w:pPr>
         <w:pStyle w:val="Heading4"/>
       </w:pPr>
       <w:r>
-        <w:t xml:space="preserve">IE parallels - per-language source map</w:t>
+        <w:t xml:space="preserve">Indo-European parallels, per-language source map</w:t>
       </w:r>
     </w:p>
     <w:tbl>
@@ -1593,7 +1728,7 @@
               <w:pStyle w:val="Compact"/>
             </w:pPr>
             <w:r>
-              <w:t xml:space="preserve">OCS (Marianus)</w:t>
+              <w:t xml:space="preserve">Old Church Slavonic (Marianus)</w:t>
             </w:r>
           </w:p>
         </w:tc>
@@ -1720,7 +1855,7 @@
               <w:pStyle w:val="Compact"/>
             </w:pPr>
             <w:r>
-              <w:t xml:space="preserve">public domain + CC-BY-SA</w:t>
+              <w:t xml:space="preserve">public domain; CC-BY-SA</w:t>
             </w:r>
           </w:p>
         </w:tc>
@@ -1755,7 +1890,7 @@
               <w:pStyle w:val="Compact"/>
             </w:pPr>
             <w:r>
-              <w:t xml:space="preserve">public domain + open access</w:t>
+              <w:t xml:space="preserve">public domain; open access</w:t>
             </w:r>
           </w:p>
         </w:tc>
@@ -1838,7 +1973,7 @@
               <w:pStyle w:val="Compact"/>
             </w:pPr>
             <w:r>
-              <w:t xml:space="preserve">Ukrainian (20th-c. rev.)</w:t>
+              <w:t xml:space="preserve">Ukrainian (20th-c. revision)</w:t>
             </w:r>
           </w:p>
         </w:tc>
@@ -1871,36 +2006,36 @@
         <w:pStyle w:val="BodyText"/>
       </w:pPr>
       <w:r>
-        <w:t xml:space="preserve">In-copyright editions are never republished verbatim. AthDGC uses an open-access antecedent</w:t>
-      </w:r>
-      <w:r>
-        <w:t xml:space="preserve"> </w:t>
-      </w:r>
-      <w:r>
-        <w:t xml:space="preserve">(e.g. pre-1928 Teubner; SBL GNT instead of Nestle-Aland) or, where unavoidable, short</w:t>
-      </w:r>
-      <w:r>
-        <w:t xml:space="preserve"> </w:t>
-      </w:r>
-      <w:r>
-        <w:t xml:space="preserve">quotation samples under fair use with full attribution. The annotation layer is always</w:t>
-      </w:r>
-      <w:r>
-        <w:t xml:space="preserve"> </w:t>
-      </w:r>
-      <w:r>
-        <w:t xml:space="preserve">AthDGC-original.</w:t>
-      </w:r>
-    </w:p>
+        <w:t xml:space="preserve">In-copyright editions are never republished verbatim. Accordingly, AthDGC uses</w:t>
+      </w:r>
+      <w:r>
+        <w:t xml:space="preserve"> </w:t>
+      </w:r>
+      <w:r>
+        <w:t xml:space="preserve">an open-access antecedent (for example, pre-1928 Teubner, or the SBL GNT instead</w:t>
+      </w:r>
+      <w:r>
+        <w:t xml:space="preserve"> </w:t>
+      </w:r>
+      <w:r>
+        <w:t xml:space="preserve">of Nestle-Aland) or, where this is unavoidable, short quotation samples under</w:t>
+      </w:r>
+      <w:r>
+        <w:t xml:space="preserve"> </w:t>
+      </w:r>
+      <w:r>
+        <w:t xml:space="preserve">fair use with full attribution. The annotation layer is always AthDGC-original.</w:t>
+      </w:r>
+    </w:p>
+    <w:bookmarkEnd w:id="23"/>
     <w:bookmarkEnd w:id="24"/>
-    <w:bookmarkEnd w:id="25"/>
-    <w:bookmarkStart w:id="26" w:name="ie-parallels-covered"/>
+    <w:bookmarkStart w:id="25" w:name="indo-european-parallels-covered"/>
     <w:p>
       <w:pPr>
         <w:pStyle w:val="Heading3"/>
       </w:pPr>
       <w:r>
-        <w:t xml:space="preserve">3.2 IE parallels covered</w:t>
+        <w:t xml:space="preserve">3.2 Indo-European parallels covered</w:t>
       </w:r>
     </w:p>
     <w:tbl>
@@ -2186,7 +2321,7 @@
               <w:pStyle w:val="Compact"/>
             </w:pPr>
             <w:r>
-              <w:t xml:space="preserve">Wulfila Project (Gospels + Pauline corpus, partial)</w:t>
+              <w:t xml:space="preserve">Wulfila Project (Gospels and Pauline corpus, partial)</w:t>
             </w:r>
           </w:p>
         </w:tc>
@@ -2565,7 +2700,7 @@
               <w:pStyle w:val="Compact"/>
             </w:pPr>
             <w:r>
-              <w:t xml:space="preserve">TITUS Yasna + Yashts</w:t>
+              <w:t xml:space="preserve">TITUS Yasna and Yashts</w:t>
             </w:r>
           </w:p>
         </w:tc>
@@ -2666,7 +2801,7 @@
               <w:pStyle w:val="Compact"/>
             </w:pPr>
             <w:r>
-              <w:t xml:space="preserve">Ukrainian (Ostroh + 20th-c. rev.)</w:t>
+              <w:t xml:space="preserve">Ukrainian (Ostroh and 20th-c. revision)</w:t>
             </w:r>
           </w:p>
         </w:tc>
@@ -2688,7 +2823,7 @@
               <w:pStyle w:val="Compact"/>
             </w:pPr>
             <w:r>
-              <w:t xml:space="preserve">1581 + 1962</w:t>
+              <w:t xml:space="preserve">1581 and 1962</w:t>
             </w:r>
           </w:p>
         </w:tc>
@@ -2719,7 +2854,7 @@
               <w:pStyle w:val="Compact"/>
             </w:pPr>
             <w:r>
-              <w:t xml:space="preserve">Ostroh 1581 + Ohienko 1962</w:t>
+              <w:t xml:space="preserve">Ostroh 1581 and Ohienko 1962</w:t>
             </w:r>
           </w:p>
         </w:tc>
@@ -2741,23 +2876,23 @@
         <w:pStyle w:val="BodyText"/>
       </w:pPr>
       <w:r>
-        <w:t xml:space="preserve">Verified per-witness aligned-verse counts ship in the v0.5 release notes once</w:t>
-      </w:r>
-      <w:r>
-        <w:t xml:space="preserve"> </w:t>
-      </w:r>
-      <w:r>
-        <w:t xml:space="preserve">the ARIS audit pass closes. The v0.4 release ships the curated samples on the</w:t>
-      </w:r>
-      <w:r>
-        <w:t xml:space="preserve"> </w:t>
-      </w:r>
-      <w:r>
-        <w:t xml:space="preserve">Samples page rather than full per-witness counts.</w:t>
-      </w:r>
-    </w:p>
-    <w:bookmarkEnd w:id="26"/>
-    <w:bookmarkStart w:id="27" w:name="retelling-and-retranslation-chains"/>
+        <w:t xml:space="preserve">Verified per-witness aligned-verse counts ship in the v0.5 release notes once the</w:t>
+      </w:r>
+      <w:r>
+        <w:t xml:space="preserve"> </w:t>
+      </w:r>
+      <w:r>
+        <w:t xml:space="preserve">ARIS audit pass closes. Accordingly, the v0.4 release ships the curated samples</w:t>
+      </w:r>
+      <w:r>
+        <w:t xml:space="preserve"> </w:t>
+      </w:r>
+      <w:r>
+        <w:t xml:space="preserve">on the Samples page rather than full per-witness counts.</w:t>
+      </w:r>
+    </w:p>
+    <w:bookmarkEnd w:id="25"/>
+    <w:bookmarkStart w:id="26" w:name="retelling-and-retranslation-chains"/>
     <w:p>
       <w:pPr>
         <w:pStyle w:val="Heading3"/>
@@ -2771,19 +2906,25 @@
         <w:pStyle w:val="FirstParagraph"/>
       </w:pPr>
       <w:r>
-        <w:t xml:space="preserve">Five chains are public on the Samples page. Each renders the same canonical passage across</w:t>
-      </w:r>
-      <w:r>
-        <w:t xml:space="preserve"> </w:t>
-      </w:r>
-      <w:r>
-        <w:t xml:space="preserve">periods (retelling, retranslation within Greek) or across languages (cross-IE retranslation),</w:t>
-      </w:r>
-      <w:r>
-        <w:t xml:space="preserve"> </w:t>
-      </w:r>
-      <w:r>
-        <w:t xml:space="preserve">with one PROIEL tree per node and a frame-stability gloss.</w:t>
+        <w:t xml:space="preserve">Five chains are public on the Samples page. Each renders the same canonical</w:t>
+      </w:r>
+      <w:r>
+        <w:t xml:space="preserve"> </w:t>
+      </w:r>
+      <w:r>
+        <w:t xml:space="preserve">passage across periods (retelling, or retranslation within Greek) or across</w:t>
+      </w:r>
+      <w:r>
+        <w:t xml:space="preserve"> </w:t>
+      </w:r>
+      <w:r>
+        <w:t xml:space="preserve">languages (cross-IE retranslation), with one PROIEL tree per node and a</w:t>
+      </w:r>
+      <w:r>
+        <w:t xml:space="preserve"> </w:t>
+      </w:r>
+      <w:r>
+        <w:t xml:space="preserve">frame-stability gloss.</w:t>
       </w:r>
     </w:p>
     <w:tbl>
@@ -2973,7 +3114,13 @@
                 <w:i/>
                 <w:iCs/>
               </w:rPr>
-              <w:t xml:space="preserve">οὐκ -&gt; οὐ -&gt; δεν</w:t>
+              <w:t xml:space="preserve">οὐκ, οὐ, δεν</w:t>
+            </w:r>
+            <w:r>
+              <w:t xml:space="preserve"> </w:t>
+            </w:r>
+            <w:r>
+              <w:t xml:space="preserve">across the three nodes</w:t>
             </w:r>
           </w:p>
         </w:tc>
@@ -2986,7 +3133,7 @@
               <w:pStyle w:val="Compact"/>
             </w:pPr>
             <w:r>
-              <w:t xml:space="preserve">NT John 1:1 patristic + Modern reception</w:t>
+              <w:t xml:space="preserve">NT John 1:1 patristic and Modern reception</w:t>
             </w:r>
           </w:p>
         </w:tc>
@@ -3115,7 +3262,7 @@
               <w:t xml:space="preserve"> </w:t>
             </w:r>
             <w:r>
-              <w:t xml:space="preserve">preserved; perfect aspect synthetic vs analytic</w:t>
+              <w:t xml:space="preserve">preserved; perfect aspect synthetic vs. analytic</w:t>
             </w:r>
           </w:p>
         </w:tc>
@@ -3170,14 +3317,14 @@
               <w:t xml:space="preserve"> </w:t>
             </w:r>
             <w:r>
-              <w:t xml:space="preserve">stable across all four; only obl-vs-adv diverges in OCS</w:t>
+              <w:t xml:space="preserve">stable across all four; only obl-vs.-adv diverges in OCS</w:t>
             </w:r>
           </w:p>
         </w:tc>
       </w:tr>
     </w:tbl>
-    <w:bookmarkEnd w:id="27"/>
-    <w:bookmarkStart w:id="30" w:name="tools-open-source"/>
+    <w:bookmarkEnd w:id="26"/>
+    <w:bookmarkStart w:id="29" w:name="tools-open-source"/>
     <w:p>
       <w:pPr>
         <w:pStyle w:val="Heading3"/>
@@ -3197,31 +3344,31 @@
         <w:t xml:space="preserve"> </w:t>
       </w:r>
       <w:r>
-        <w:t xml:space="preserve">readiness tiers. Five modules are LIVE in the public repo and can be cloned</w:t>
-      </w:r>
-      <w:r>
-        <w:t xml:space="preserve"> </w:t>
-      </w:r>
-      <w:r>
-        <w:t xml:space="preserve">and run today (the Quarto pack, the showcase generator, the corpus-fix</w:t>
-      </w:r>
-      <w:r>
-        <w:t xml:space="preserve"> </w:t>
-      </w:r>
-      <w:r>
-        <w:t xml:space="preserve">toolkit, the PROIEL XML 2.0 exporter that runs inside the build pipeline,</w:t>
-      </w:r>
-      <w:r>
-        <w:t xml:space="preserve"> </w:t>
-      </w:r>
-      <w:r>
-        <w:t xml:space="preserve">and the Stanza annotation job script). Eight modules are IN SETUP - working</w:t>
-      </w:r>
-      <w:r>
-        <w:t xml:space="preserve"> </w:t>
-      </w:r>
-      <w:r>
-        <w:t xml:space="preserve">in the project’s internal pack and migrating to a unified public</w:t>
+        <w:t xml:space="preserve">readiness tiers. Five modules are LIVE in the public repository and can be cloned</w:t>
+      </w:r>
+      <w:r>
+        <w:t xml:space="preserve"> </w:t>
+      </w:r>
+      <w:r>
+        <w:t xml:space="preserve">and run today: the Quarto pack, the showcase generator, the corpus-fix toolkit,</w:t>
+      </w:r>
+      <w:r>
+        <w:t xml:space="preserve"> </w:t>
+      </w:r>
+      <w:r>
+        <w:t xml:space="preserve">the PROIEL XML 2.0 exporter that runs inside the build pipeline, and the Stanza</w:t>
+      </w:r>
+      <w:r>
+        <w:t xml:space="preserve"> </w:t>
+      </w:r>
+      <w:r>
+        <w:t xml:space="preserve">annotation job script. Eight modules are IN SETUP, working in the project’s</w:t>
+      </w:r>
+      <w:r>
+        <w:t xml:space="preserve"> </w:t>
+      </w:r>
+      <w:r>
+        <w:t xml:space="preserve">internal pack and migrating to a unified public</w:t>
       </w:r>
       <w:r>
         <w:t xml:space="preserve"> </w:t>
@@ -3236,13 +3383,19 @@
         <w:t xml:space="preserve"> </w:t>
       </w:r>
       <w:r>
-        <w:t xml:space="preserve">directory at v0.5 (the PROIEL XML 2.0 schema validator, the house-style</w:t>
-      </w:r>
-      <w:r>
-        <w:t xml:space="preserve"> </w:t>
-      </w:r>
-      <w:r>
-        <w:t xml:space="preserve">check, the argument-frame extractor, the Stanza fine-tuning scripts, the</w:t>
+        <w:t xml:space="preserve">directory at v0.5,</w:t>
+      </w:r>
+      <w:r>
+        <w:t xml:space="preserve"> </w:t>
+      </w:r>
+      <w:r>
+        <w:t xml:space="preserve">namely the PROIEL XML 2.0 schema validator, the house-style check, the</w:t>
+      </w:r>
+      <w:r>
+        <w:t xml:space="preserve"> </w:t>
+      </w:r>
+      <w:r>
+        <w:t xml:space="preserve">argument-frame extractor, the Stanza fine-tuning scripts, the</w:t>
       </w:r>
       <w:r>
         <w:t xml:space="preserve"> </w:t>
@@ -3257,48 +3410,42 @@
         <w:t xml:space="preserve"> </w:t>
       </w:r>
       <w:r>
-        <w:t xml:space="preserve">PyPI package and the three Hugging Face model repos, whose</w:t>
-      </w:r>
-      <w:r>
-        <w:t xml:space="preserve"> </w:t>
-      </w:r>
-      <w:r>
-        <w:t xml:space="preserve">weights upload at v0.5). The remaining modules - the LightSIDE-AthDGC</w:t>
-      </w:r>
-      <w:r>
-        <w:t xml:space="preserve"> </w:t>
-      </w:r>
-      <w:r>
-        <w:t xml:space="preserve">syntactic-feature fork and its export scripts, the NoSketch-style CWB</w:t>
-      </w:r>
-      <w:r>
-        <w:t xml:space="preserve"> </w:t>
-      </w:r>
-      <w:r>
-        <w:t xml:space="preserve">indexer, the Neo4j alignment viewer, the valency-frame database client,</w:t>
-      </w:r>
-      <w:r>
-        <w:t xml:space="preserve"> </w:t>
-      </w:r>
-      <w:r>
-        <w:t xml:space="preserve">the retranslation-pair browser, and the retelling-chain explorer - are</w:t>
-      </w:r>
-      <w:r>
-        <w:t xml:space="preserve"> </w:t>
-      </w:r>
-      <w:r>
-        <w:t xml:space="preserve">FORTHCOMING (v0.5): described here as designed, implementation lands at</w:t>
-      </w:r>
-      <w:r>
-        <w:t xml:space="preserve"> </w:t>
-      </w:r>
-      <w:r>
-        <w:t xml:space="preserve">v0.5. The complete tier matrix per module is on the public Tools page at</w:t>
-      </w:r>
-      <w:r>
-        <w:t xml:space="preserve"> </w:t>
-      </w:r>
-      <w:hyperlink r:id="rId28">
+        <w:t xml:space="preserve">PyPI package, and the three Hugging Face model repositories whose weights upload</w:t>
+      </w:r>
+      <w:r>
+        <w:t xml:space="preserve"> </w:t>
+      </w:r>
+      <w:r>
+        <w:t xml:space="preserve">at v0.5. The remaining modules are FORTHCOMING at v0.5: the LightSIDE-AthDGC</w:t>
+      </w:r>
+      <w:r>
+        <w:t xml:space="preserve"> </w:t>
+      </w:r>
+      <w:r>
+        <w:t xml:space="preserve">syntactic-feature fork and its export scripts, the NoSketch-style CWB indexer,</w:t>
+      </w:r>
+      <w:r>
+        <w:t xml:space="preserve"> </w:t>
+      </w:r>
+      <w:r>
+        <w:t xml:space="preserve">the Neo4j alignment viewer, the valency-frame database client, the</w:t>
+      </w:r>
+      <w:r>
+        <w:t xml:space="preserve"> </w:t>
+      </w:r>
+      <w:r>
+        <w:t xml:space="preserve">retranslation-pair browser, and the retelling-chain explorer. The complete tier</w:t>
+      </w:r>
+      <w:r>
+        <w:t xml:space="preserve"> </w:t>
+      </w:r>
+      <w:r>
+        <w:t xml:space="preserve">matrix per module is on the public Tools page at</w:t>
+      </w:r>
+      <w:r>
+        <w:t xml:space="preserve"> </w:t>
+      </w:r>
+      <w:hyperlink r:id="rId27">
         <w:r>
           <w:rPr>
             <w:rStyle w:val="Hyperlink"/>
@@ -3315,7 +3462,7 @@
       <w:r>
         <w:t xml:space="preserve"> </w:t>
       </w:r>
-      <w:hyperlink r:id="rId29">
+      <w:hyperlink r:id="rId28">
         <w:r>
           <w:rPr>
             <w:rStyle w:val="Hyperlink"/>
@@ -3332,25 +3479,25 @@
         <w:pStyle w:val="BodyText"/>
       </w:pPr>
       <w:r>
-        <w:t xml:space="preserve">Across the toolkit, the annotation layer plus the corpus samples are</w:t>
-      </w:r>
-      <w:r>
-        <w:t xml:space="preserve"> </w:t>
-      </w:r>
-      <w:r>
-        <w:t xml:space="preserve">CC-BY-4.0; tool code is Apache-2.0 (most modules), MIT (Quarto pack +</w:t>
-      </w:r>
-      <w:r>
-        <w:t xml:space="preserve"> </w:t>
-      </w:r>
-      <w:r>
-        <w:t xml:space="preserve">Neo4j viewer), BSD-3-Clause (upstream LightSIDE, retained on the patch</w:t>
-      </w:r>
-      <w:r>
-        <w:t xml:space="preserve"> </w:t>
-      </w:r>
-      <w:r>
-        <w:t xml:space="preserve">set), and GPL-3.0 (upstream CWB, retained on the index builder).</w:t>
+        <w:t xml:space="preserve">Across the toolkit, the annotation layer and the corpus samples are CC-BY-4.0;</w:t>
+      </w:r>
+      <w:r>
+        <w:t xml:space="preserve"> </w:t>
+      </w:r>
+      <w:r>
+        <w:t xml:space="preserve">the tool code is Apache-2.0 (most modules), MIT (Quarto pack and Neo4j viewer),</w:t>
+      </w:r>
+      <w:r>
+        <w:t xml:space="preserve"> </w:t>
+      </w:r>
+      <w:r>
+        <w:t xml:space="preserve">BSD-3-Clause (upstream LightSIDE, retained on the patch set), and GPL-3.0</w:t>
+      </w:r>
+      <w:r>
+        <w:t xml:space="preserve"> </w:t>
+      </w:r>
+      <w:r>
+        <w:t xml:space="preserve">(upstream CWB, retained on the index builder).</w:t>
       </w:r>
     </w:p>
     <w:tbl>
@@ -3408,18 +3555,18 @@
               <w:t xml:space="preserve"> </w:t>
             </w:r>
             <w:r>
-              <w:t xml:space="preserve">(LightSIDE for PROIEL arcs + frames + morphology)</w:t>
-            </w:r>
-          </w:p>
-        </w:tc>
-        <w:tc>
-          <w:tcPr/>
-          <w:p>
-            <w:pPr>
-              <w:pStyle w:val="Compact"/>
-            </w:pPr>
-            <w:r>
-              <w:t xml:space="preserve">BSD-3-Clause + Apache-2.0</w:t>
+              <w:t xml:space="preserve">(LightSIDE for PROIEL arcs, frames, and morphology)</w:t>
+            </w:r>
+          </w:p>
+        </w:tc>
+        <w:tc>
+          <w:tcPr/>
+          <w:p>
+            <w:pPr>
+              <w:pStyle w:val="Compact"/>
+            </w:pPr>
+            <w:r>
+              <w:t xml:space="preserve">BSD-3-Clause and Apache-2.0</w:t>
             </w:r>
           </w:p>
         </w:tc>
@@ -3480,7 +3627,7 @@
               <w:t xml:space="preserve"> </w:t>
             </w:r>
             <w:r>
-              <w:t xml:space="preserve">(Stanza -&gt; PROIEL XML 2.0)</w:t>
+              <w:t xml:space="preserve">(Stanza output to PROIEL XML 2.0)</w:t>
             </w:r>
           </w:p>
         </w:tc>
@@ -3597,7 +3744,7 @@
               <w:t xml:space="preserve"> </w:t>
             </w:r>
             <w:r>
-              <w:t xml:space="preserve">(diachronic Stanza checkpoints (saved snapshots of a trained model))</w:t>
+              <w:t xml:space="preserve">(diachronic Stanza checkpoints)</w:t>
             </w:r>
           </w:p>
         </w:tc>
@@ -3837,7 +3984,7 @@
               <w:t xml:space="preserve"> </w:t>
             </w:r>
             <w:r>
-              <w:t xml:space="preserve">(this Working Paper + the public site)</w:t>
+              <w:t xml:space="preserve">(this Working Paper and the public site)</w:t>
             </w:r>
           </w:p>
         </w:tc>
@@ -3900,7 +4047,7 @@
               <w:t xml:space="preserve"> </w:t>
             </w:r>
             <w:r>
-              <w:t xml:space="preserve">(HF mirror v0.5)</w:t>
+              <w:t xml:space="preserve">(Hugging Face mirror, v0.5)</w:t>
             </w:r>
           </w:p>
         </w:tc>
@@ -3922,13 +4069,13 @@
         <w:pStyle w:val="BodyText"/>
       </w:pPr>
       <w:r>
-        <w:t xml:space="preserve">Two automated gates run on every community PR: a PROIEL XML 2.0 schema validator (rejecting</w:t>
-      </w:r>
-      <w:r>
-        <w:t xml:space="preserve"> </w:t>
-      </w:r>
-      <w:r>
-        <w:t xml:space="preserve">UD-style labels such as</w:t>
+        <w:t xml:space="preserve">Two automated gates run on every community pull request, namely a PROIEL XML 2.0</w:t>
+      </w:r>
+      <w:r>
+        <w:t xml:space="preserve"> </w:t>
+      </w:r>
+      <w:r>
+        <w:t xml:space="preserve">schema validator (which rejects UD-style labels such as</w:t>
       </w:r>
       <w:r>
         <w:t xml:space="preserve"> </w:t>
@@ -3976,18 +4123,12 @@
         <w:t xml:space="preserve">case</w:t>
       </w:r>
       <w:r>
-        <w:t xml:space="preserve">) and a house-style check</w:t>
-      </w:r>
-      <w:r>
-        <w:t xml:space="preserve"> </w:t>
-      </w:r>
-      <w:r>
-        <w:t xml:space="preserve">(rejecting AI-marker vocabulary and em-dashes).</w:t>
-      </w:r>
-    </w:p>
+        <w:t xml:space="preserve">) and a house-style check that enforces the project style guide.</w:t>
+      </w:r>
+    </w:p>
+    <w:bookmarkEnd w:id="29"/>
     <w:bookmarkEnd w:id="30"/>
-    <w:bookmarkEnd w:id="31"/>
-    <w:bookmarkStart w:id="35" w:name="reuse-potential"/>
+    <w:bookmarkStart w:id="32" w:name="reuse-potential"/>
     <w:p>
       <w:pPr>
         <w:pStyle w:val="Heading2"/>
@@ -4001,110 +4142,125 @@
         <w:pStyle w:val="FirstParagraph"/>
       </w:pPr>
       <w:r>
-        <w:t xml:space="preserve">AthDGC supports four primary reuse classes:</w:t>
-      </w:r>
-    </w:p>
-    <w:p>
-      <w:pPr>
-        <w:numPr>
-          <w:ilvl w:val="0"/>
-          <w:numId w:val="1002"/>
-        </w:numPr>
-      </w:pPr>
-      <w:r>
-        <w:rPr>
-          <w:b/>
-          <w:bCs/>
-        </w:rPr>
-        <w:t xml:space="preserve">Historical syntactic research.</w:t>
-      </w:r>
-      <w:r>
-        <w:t xml:space="preserve"> </w:t>
-      </w:r>
-      <w:r>
-        <w:t xml:space="preserve">Per-period dependency parses allow analysts to track</w:t>
-      </w:r>
-      <w:r>
-        <w:t xml:space="preserve"> </w:t>
-      </w:r>
-      <w:r>
-        <w:t xml:space="preserve">argument-structure changes across three millennia of Greek (active-to-mediopassive shifts,</w:t>
-      </w:r>
-      <w:r>
-        <w:t xml:space="preserve"> </w:t>
-      </w:r>
-      <w:r>
-        <w:t xml:space="preserve">loss of optative, rise of periphrastic perfect, accusative-to-genitive variation under</w:t>
-      </w:r>
-      <w:r>
-        <w:t xml:space="preserve"> </w:t>
-      </w:r>
-      <w:r>
-        <w:t xml:space="preserve">verbs of perception, etc.). The colour-coded compact dependency overview on each sample is</w:t>
-      </w:r>
-      <w:r>
-        <w:t xml:space="preserve"> </w:t>
-      </w:r>
-      <w:r>
-        <w:t xml:space="preserve">designed for fast scanning of these patterns.</w:t>
-      </w:r>
-    </w:p>
-    <w:p>
-      <w:pPr>
-        <w:numPr>
-          <w:ilvl w:val="0"/>
-          <w:numId w:val="1002"/>
-        </w:numPr>
-      </w:pPr>
-      <w:r>
-        <w:rPr>
-          <w:b/>
-          <w:bCs/>
-        </w:rPr>
-        <w:t xml:space="preserve">Indo-European comparative syntax.</w:t>
-      </w:r>
-      <w:r>
-        <w:t xml:space="preserve"> </w:t>
-      </w:r>
-      <w:r>
-        <w:t xml:space="preserve">The verse-level cross-lingual alignment of the New</w:t>
-      </w:r>
-      <w:r>
-        <w:t xml:space="preserve"> </w:t>
-      </w:r>
-      <w:r>
-        <w:t xml:space="preserve">Testament to Latin (Vulgate), Gothic (Wulfila), Old Church Slavonic (Marianus), and</w:t>
-      </w:r>
-      <w:r>
-        <w:t xml:space="preserve"> </w:t>
-      </w:r>
-      <w:r>
-        <w:t xml:space="preserve">Classical Armenian provides aligned PROIEL parses across four sister IE languages, with</w:t>
-      </w:r>
-      <w:r>
-        <w:t xml:space="preserve"> </w:t>
-      </w:r>
-      <w:r>
-        <w:t xml:space="preserve">Sanskrit, Old English, Avestan, Old Persian, and Ukrainian queued at v0.7. Users can</w:t>
-      </w:r>
-      <w:r>
-        <w:t xml:space="preserve"> </w:t>
-      </w:r>
-      <w:r>
-        <w:t xml:space="preserve">query the Neo4j alignment graph (a database that records which token in language A corresponds to which token in language B) for typological correspondences (e.g. </w:t>
+        <w:t xml:space="preserve">AthDGC supports four primary reuse classes.</w:t>
+      </w:r>
+    </w:p>
+    <w:p>
+      <w:pPr>
+        <w:pStyle w:val="BodyText"/>
+      </w:pPr>
+      <w:r>
+        <w:t xml:space="preserve">In the first place,</w:t>
+      </w:r>
+      <w:r>
+        <w:t xml:space="preserve"> </w:t>
       </w:r>
       <w:r>
         <w:rPr>
           <w:i/>
           <w:iCs/>
         </w:rPr>
-        <w:t xml:space="preserve">every Greek aorist</w:t>
+        <w:t xml:space="preserve">historical syntactic research</w:t>
+      </w:r>
+      <w:r>
+        <w:t xml:space="preserve">. Per-period dependency parses</w:t>
+      </w:r>
+      <w:r>
+        <w:t xml:space="preserve"> </w:t>
+      </w:r>
+      <w:r>
+        <w:t xml:space="preserve">allow analysts to track argument-structure changes across three millennia of</w:t>
+      </w:r>
+      <w:r>
+        <w:t xml:space="preserve"> </w:t>
+      </w:r>
+      <w:r>
+        <w:t xml:space="preserve">Greek (active-to-mediopassive shifts, loss of the optative, the rise of the</w:t>
+      </w:r>
+      <w:r>
+        <w:t xml:space="preserve"> </w:t>
+      </w:r>
+      <w:r>
+        <w:t xml:space="preserve">periphrastic perfect, accusative-to-genitive variation under verbs of perception,</w:t>
+      </w:r>
+      <w:r>
+        <w:t xml:space="preserve"> </w:t>
+      </w:r>
+      <w:r>
+        <w:t xml:space="preserve">among others). Accordingly, the colour-coded compact dependency overview on each</w:t>
+      </w:r>
+      <w:r>
+        <w:t xml:space="preserve"> </w:t>
+      </w:r>
+      <w:r>
+        <w:t xml:space="preserve">sample is designed for fast scanning of these patterns.</w:t>
+      </w:r>
+    </w:p>
+    <w:p>
+      <w:pPr>
+        <w:pStyle w:val="BodyText"/>
+      </w:pPr>
+      <w:r>
+        <w:t xml:space="preserve">Secondly,</w:t>
+      </w:r>
+      <w:r>
+        <w:t xml:space="preserve"> </w:t>
       </w:r>
       <w:r>
         <w:rPr>
           <w:i/>
           <w:iCs/>
         </w:rPr>
+        <w:t xml:space="preserve">Indo-European comparative syntax</w:t>
+      </w:r>
+      <w:r>
+        <w:t xml:space="preserve">. The verse-level cross-lingual</w:t>
+      </w:r>
+      <w:r>
+        <w:t xml:space="preserve"> </w:t>
+      </w:r>
+      <w:r>
+        <w:t xml:space="preserve">alignment of the New Testament to Latin (Vulgate), Gothic (Wulfila), Old Church</w:t>
+      </w:r>
+      <w:r>
+        <w:t xml:space="preserve"> </w:t>
+      </w:r>
+      <w:r>
+        <w:t xml:space="preserve">Slavonic (Marianus), and Classical Armenian provides aligned PROIEL parses across</w:t>
+      </w:r>
+      <w:r>
+        <w:t xml:space="preserve"> </w:t>
+      </w:r>
+      <w:r>
+        <w:t xml:space="preserve">four sister Indo-European languages, with Sanskrit, Old English, Avestan, Old</w:t>
+      </w:r>
+      <w:r>
+        <w:t xml:space="preserve"> </w:t>
+      </w:r>
+      <w:r>
+        <w:t xml:space="preserve">Persian, and Ukrainian queued at v0.7. In this respect, users can query the Neo4j</w:t>
+      </w:r>
+      <w:r>
+        <w:t xml:space="preserve"> </w:t>
+      </w:r>
+      <w:r>
+        <w:t xml:space="preserve">alignment graph for typological correspondences, for example every Greek aorist</w:t>
+      </w:r>
+      <w:r>
+        <w:t xml:space="preserve"> </w:t>
+      </w:r>
+      <w:r>
+        <w:t xml:space="preserve">active verb whose Latin Vulgate counterpart is passive.</w:t>
+      </w:r>
+    </w:p>
+    <w:p>
+      <w:pPr>
+        <w:pStyle w:val="BodyText"/>
+      </w:pPr>
+      <w:r>
+        <w:t xml:space="preserve">Thirdly,</w:t>
+      </w:r>
+      <w:r>
         <w:t xml:space="preserve"> </w:t>
       </w:r>
       <w:r>
@@ -4112,31 +4268,16 @@
           <w:i/>
           <w:iCs/>
         </w:rPr>
-        <w:t xml:space="preserve">active verb whose Latin Vulgate counterpart is passive</w:t>
-      </w:r>
-      <w:r>
-        <w:t xml:space="preserve">).</w:t>
-      </w:r>
-    </w:p>
-    <w:p>
-      <w:pPr>
-        <w:numPr>
-          <w:ilvl w:val="0"/>
-          <w:numId w:val="1002"/>
-        </w:numPr>
-      </w:pPr>
-      <w:r>
-        <w:rPr>
-          <w:b/>
-          <w:bCs/>
-        </w:rPr>
-        <w:t xml:space="preserve">Computational diachronic NLP.</w:t>
-      </w:r>
-      <w:r>
-        <w:t xml:space="preserve"> </w:t>
-      </w:r>
-      <w:r>
-        <w:t xml:space="preserve">The fine-tuned (further trained on new data to adapt it to a particular text type) Stanza checkpoints (</w:t>
+        <w:t xml:space="preserve">computational diachronic NLP</w:t>
+      </w:r>
+      <w:r>
+        <w:t xml:space="preserve">. The fine-tuned Stanza checkpoints</w:t>
+      </w:r>
+      <w:r>
+        <w:t xml:space="preserve"> </w:t>
+      </w:r>
+      <w:r>
+        <w:t xml:space="preserve">(</w:t>
       </w:r>
       <w:r>
         <w:rPr>
@@ -4169,13 +4310,13 @@
         <w:t xml:space="preserve">grc_mod_proiel</w:t>
       </w:r>
       <w:r>
-        <w:t xml:space="preserve">) are trained on ARIS; the Hugging Face (a public hosting platform for machine-learning models and datasets) mirror</w:t>
-      </w:r>
-      <w:r>
-        <w:t xml:space="preserve"> </w:t>
-      </w:r>
-      <w:r>
-        <w:t xml:space="preserve">under</w:t>
+        <w:t xml:space="preserve">) are trained on ARIS;</w:t>
+      </w:r>
+      <w:r>
+        <w:t xml:space="preserve"> </w:t>
+      </w:r>
+      <w:r>
+        <w:t xml:space="preserve">the Hugging Face model repositories under</w:t>
       </w:r>
       <w:r>
         <w:t xml:space="preserve"> </w:t>
@@ -4190,30 +4331,19 @@
         <w:t xml:space="preserve"> </w:t>
       </w:r>
       <w:r>
-        <w:t xml:space="preserve">is live at</w:t>
-      </w:r>
-      <w:r>
-        <w:t xml:space="preserve"> </w:t>
-      </w:r>
-      <w:hyperlink r:id="rId32">
-        <w:r>
-          <w:rPr>
-            <w:rStyle w:val="Hyperlink"/>
-          </w:rPr>
-          <w:t xml:space="preserve">https://huggingface.co/AthDGC</w:t>
-        </w:r>
-      </w:hyperlink>
-      <w:r>
-        <w:t xml:space="preserve"> </w:t>
-      </w:r>
-      <w:r>
-        <w:t xml:space="preserve">with placeholder READMEs,</w:t>
-      </w:r>
-      <w:r>
-        <w:t xml:space="preserve"> </w:t>
-      </w:r>
-      <w:r>
-        <w:t xml:space="preserve">and the model weights ship at v0.5. The PyPI (the Python Package Index, the central archive that pip downloads packages from) package</w:t>
+        <w:t xml:space="preserve">exist now as private</w:t>
+      </w:r>
+      <w:r>
+        <w:t xml:space="preserve"> </w:t>
+      </w:r>
+      <w:r>
+        <w:t xml:space="preserve">during the v0.5 audit pass and become public at v0.5 with the weight payloads</w:t>
+      </w:r>
+      <w:r>
+        <w:t xml:space="preserve"> </w:t>
+      </w:r>
+      <w:r>
+        <w:t xml:space="preserve">uploaded. In broad terms, the PyPI package</w:t>
       </w:r>
       <w:r>
         <w:t xml:space="preserve"> </w:t>
@@ -4228,30 +4358,13 @@
         <w:t xml:space="preserve"> </w:t>
       </w:r>
       <w:r>
-        <w:t xml:space="preserve">reserves the name</w:t>
-      </w:r>
-      <w:r>
-        <w:t xml:space="preserve"> </w:t>
-      </w:r>
-      <w:r>
-        <w:t xml:space="preserve">at</w:t>
-      </w:r>
-      <w:r>
-        <w:t xml:space="preserve"> </w:t>
-      </w:r>
-      <w:hyperlink r:id="rId33">
-        <w:r>
-          <w:rPr>
-            <w:rStyle w:val="Hyperlink"/>
-          </w:rPr>
-          <w:t xml:space="preserve">https://pypi.org/project/athdgc-tools/</w:t>
-        </w:r>
-      </w:hyperlink>
-      <w:r>
-        <w:t xml:space="preserve"> </w:t>
-      </w:r>
-      <w:r>
-        <w:t xml:space="preserve">with stub</w:t>
+        <w:t xml:space="preserve">reserves the name with</w:t>
+      </w:r>
+      <w:r>
+        <w:t xml:space="preserve"> </w:t>
+      </w:r>
+      <w:r>
+        <w:t xml:space="preserve">the stub</w:t>
       </w:r>
       <w:r>
         <w:t xml:space="preserve"> </w:t>
@@ -4263,58 +4376,64 @@
         <w:t xml:space="preserve">0.4.0.dev0</w:t>
       </w:r>
       <w:r>
-        <w:t xml:space="preserve">; the full toolkit</w:t>
-      </w:r>
-      <w:r>
-        <w:t xml:space="preserve"> </w:t>
-      </w:r>
-      <w:r>
-        <w:t xml:space="preserve">replaces the stub at v0.5. The checkpoints can be loaded directly into Stanza for</w:t>
-      </w:r>
-      <w:r>
-        <w:t xml:space="preserve"> </w:t>
-      </w:r>
-      <w:r>
-        <w:t xml:space="preserve">parsing new Greek diachronic data once the weights are published. The LightSIDE-AthDGC (the Lavidas-extension fork of LightSIDE that operates on syntactic features rather than only text features) fork</w:t>
-      </w:r>
-      <w:r>
-        <w:t xml:space="preserve"> </w:t>
-      </w:r>
-      <w:r>
-        <w:t xml:space="preserve">extends LightSIDE to work on syntactic features (dependency arcs (the head-to-dependent links between words in a parsed sentence), argument-structure</w:t>
-      </w:r>
-      <w:r>
-        <w:t xml:space="preserve"> </w:t>
-      </w:r>
-      <w:r>
-        <w:t xml:space="preserve">frames, morphology bundles), opening a new feature space for classification of</w:t>
-      </w:r>
-      <w:r>
-        <w:t xml:space="preserve"> </w:t>
-      </w:r>
-      <w:r>
-        <w:t xml:space="preserve">diachronic stages.</w:t>
-      </w:r>
-    </w:p>
-    <w:p>
-      <w:pPr>
-        <w:numPr>
-          <w:ilvl w:val="0"/>
-          <w:numId w:val="1002"/>
-        </w:numPr>
-      </w:pPr>
+        <w:t xml:space="preserve">, and the full toolkit replaces the stub at v0.5; the</w:t>
+      </w:r>
+      <w:r>
+        <w:t xml:space="preserve"> </w:t>
+      </w:r>
+      <w:r>
+        <w:t xml:space="preserve">checkpoints can be loaded directly into Stanza for parsing new Greek diachronic</w:t>
+      </w:r>
+      <w:r>
+        <w:t xml:space="preserve"> </w:t>
+      </w:r>
+      <w:r>
+        <w:t xml:space="preserve">data once the weights are published. Thereby the LightSIDE-AthDGC fork extends</w:t>
+      </w:r>
+      <w:r>
+        <w:t xml:space="preserve"> </w:t>
+      </w:r>
+      <w:r>
+        <w:t xml:space="preserve">LightSIDE to operate on syntactic features, namely dependency arcs,</w:t>
+      </w:r>
+      <w:r>
+        <w:t xml:space="preserve"> </w:t>
+      </w:r>
+      <w:r>
+        <w:t xml:space="preserve">argument-structure frames, and morphology bundles, opening a new feature space</w:t>
+      </w:r>
+      <w:r>
+        <w:t xml:space="preserve"> </w:t>
+      </w:r>
+      <w:r>
+        <w:t xml:space="preserve">for the classification of diachronic stages.</w:t>
+      </w:r>
+    </w:p>
+    <w:p>
+      <w:pPr>
+        <w:pStyle w:val="BodyText"/>
+      </w:pPr>
+      <w:r>
+        <w:t xml:space="preserve">Fourthly,</w:t>
+      </w:r>
+      <w:r>
+        <w:t xml:space="preserve"> </w:t>
+      </w:r>
       <w:r>
         <w:rPr>
-          <w:b/>
-          <w:bCs/>
+          <w:i/>
+          <w:iCs/>
         </w:rPr>
-        <w:t xml:space="preserve">Digital editions + pedagogy.</w:t>
-      </w:r>
-      <w:r>
-        <w:t xml:space="preserve"> </w:t>
-      </w:r>
-      <w:r>
-        <w:t xml:space="preserve">The showcase generator (</w:t>
+        <w:t xml:space="preserve">digital editions and pedagogy</w:t>
+      </w:r>
+      <w:r>
+        <w:t xml:space="preserve">. The showcase generator</w:t>
+      </w:r>
+      <w:r>
+        <w:t xml:space="preserve"> </w:t>
+      </w:r>
+      <w:r>
+        <w:t xml:space="preserve">(</w:t>
       </w:r>
       <w:r>
         <w:rPr>
@@ -4323,39 +4442,33 @@
         <w:t xml:space="preserve">51_build_showcase_site.py</w:t>
       </w:r>
       <w:r>
-        <w:t xml:space="preserve">)</w:t>
-      </w:r>
-      <w:r>
-        <w:t xml:space="preserve"> </w:t>
-      </w:r>
-      <w:r>
-        <w:t xml:space="preserve">produces browsable per-sample PROIEL trees from any JSONL corpus; the Quarto template</w:t>
-      </w:r>
-      <w:r>
-        <w:t xml:space="preserve"> </w:t>
-      </w:r>
-      <w:r>
-        <w:t xml:space="preserve">pack generates the whole multi-output site (HTML, Reveal.js (a browser-based slide framework) slides, .docx, .pptx,</w:t>
-      </w:r>
-      <w:r>
-        <w:t xml:space="preserve"> </w:t>
-      </w:r>
-      <w:r>
-        <w:t xml:space="preserve">Beamer (a LaTeX-based slide format used in academic talks), A0 poster) from a single source. Both are open-source and reusable by other</w:t>
-      </w:r>
-      <w:r>
-        <w:t xml:space="preserve"> </w:t>
-      </w:r>
-      <w:r>
-        <w:t xml:space="preserve">historical-treebank projects.</w:t>
-      </w:r>
-    </w:p>
-    <w:p>
-      <w:pPr>
-        <w:pStyle w:val="FirstParagraph"/>
-      </w:pPr>
-      <w:r>
-        <w:t xml:space="preserve">The platform is taught as a KEDIVIM continuing-education course at NKUA:</w:t>
+        <w:t xml:space="preserve">) produces browsable per-sample PROIEL trees from any</w:t>
+      </w:r>
+      <w:r>
+        <w:t xml:space="preserve"> </w:t>
+      </w:r>
+      <w:r>
+        <w:t xml:space="preserve">JSONL corpus; the Quarto template pack generates the whole multi-output site</w:t>
+      </w:r>
+      <w:r>
+        <w:t xml:space="preserve"> </w:t>
+      </w:r>
+      <w:r>
+        <w:t xml:space="preserve">(HTML, Reveal.js slides, .docx, .pptx, Beamer, A0 poster) from a single source.</w:t>
+      </w:r>
+      <w:r>
+        <w:t xml:space="preserve"> </w:t>
+      </w:r>
+      <w:r>
+        <w:t xml:space="preserve">Both are open-source and reusable by other historical-treebank projects.</w:t>
+      </w:r>
+    </w:p>
+    <w:p>
+      <w:pPr>
+        <w:pStyle w:val="BodyText"/>
+      </w:pPr>
+      <w:r>
+        <w:t xml:space="preserve">The platform is taught as a KEDIVIM continuing-education course at NKUA,</w:t>
       </w:r>
       <w:r>
         <w:t xml:space="preserve"> </w:t>
@@ -4365,7 +4478,7 @@
           <w:i/>
           <w:iCs/>
         </w:rPr>
-        <w:t xml:space="preserve">Ψηφιακά Εργαλεία</w:t>
+        <w:t xml:space="preserve">Ψηφιακά Εργαλεία για τη Διαχρονική Ανάλυση της Γλώσσας / Digital Tools for the</w:t>
       </w:r>
       <w:r>
         <w:rPr>
@@ -4379,29 +4492,15 @@
           <w:i/>
           <w:iCs/>
         </w:rPr>
-        <w:t xml:space="preserve">για τη Διαχρονική Ανάλυση της Γλώσσας / Digital Tools for the Diachronic Analysis of</w:t>
-      </w:r>
-      <w:r>
-        <w:rPr>
-          <w:i/>
-          <w:iCs/>
-        </w:rPr>
-        <w:t xml:space="preserve"> </w:t>
-      </w:r>
-      <w:r>
-        <w:rPr>
-          <w:i/>
-          <w:iCs/>
-        </w:rPr>
-        <w:t xml:space="preserve">Language</w:t>
-      </w:r>
-      <w:r>
-        <w:t xml:space="preserve">, autumn 2026. See</w:t>
-      </w:r>
-      <w:r>
-        <w:t xml:space="preserve"> </w:t>
-      </w:r>
-      <w:hyperlink r:id="rId34">
+        <w:t xml:space="preserve">Diachronic Analysis of Language</w:t>
+      </w:r>
+      <w:r>
+        <w:t xml:space="preserve">, autumn 2026; see</w:t>
+      </w:r>
+      <w:r>
+        <w:t xml:space="preserve"> </w:t>
+      </w:r>
+      <w:hyperlink r:id="rId31">
         <w:r>
           <w:rPr>
             <w:rStyle w:val="Hyperlink"/>
@@ -4413,14 +4512,14 @@
         <w:t xml:space="preserve">.</w:t>
       </w:r>
     </w:p>
-    <w:bookmarkEnd w:id="35"/>
-    <w:bookmarkStart w:id="36" w:name="access-format"/>
+    <w:bookmarkEnd w:id="32"/>
+    <w:bookmarkStart w:id="33" w:name="access-and-format"/>
     <w:p>
       <w:pPr>
         <w:pStyle w:val="Heading2"/>
       </w:pPr>
       <w:r>
-        <w:t xml:space="preserve">5. Access + format</w:t>
+        <w:t xml:space="preserve">5. Access and format</w:t>
       </w:r>
     </w:p>
     <w:p>
@@ -4452,8 +4551,8 @@
       </w:r>
       <w:r>
         <w:rPr>
-          <w:b/>
-          <w:bCs/>
+          <w:i/>
+          <w:iCs/>
         </w:rPr>
         <w:t xml:space="preserve">curated samples only</w:t>
       </w:r>
@@ -4461,19 +4560,19 @@
         <w:t xml:space="preserve"> </w:t>
       </w:r>
       <w:r>
-        <w:t xml:space="preserve">for the v0.4</w:t>
-      </w:r>
-      <w:r>
-        <w:t xml:space="preserve"> </w:t>
-      </w:r>
-      <w:r>
-        <w:t xml:space="preserve">release. The full annotated corpus partitions remain under audit on the GRNET ARIS national</w:t>
-      </w:r>
-      <w:r>
-        <w:t xml:space="preserve"> </w:t>
-      </w:r>
-      <w:r>
-        <w:t xml:space="preserve">HPC (high-performance computing, i.e. a cluster of fast machines used for heavy computation) under allocation</w:t>
+        <w:t xml:space="preserve">for</w:t>
+      </w:r>
+      <w:r>
+        <w:t xml:space="preserve"> </w:t>
+      </w:r>
+      <w:r>
+        <w:t xml:space="preserve">the v0.4 release. The full annotated corpus partitions remain under audit on the</w:t>
+      </w:r>
+      <w:r>
+        <w:t xml:space="preserve"> </w:t>
+      </w:r>
+      <w:r>
+        <w:t xml:space="preserve">GRNET ARIS national HPC under allocation</w:t>
       </w:r>
       <w:r>
         <w:t xml:space="preserve"> </w:t>
@@ -4485,13 +4584,19 @@
         <w:t xml:space="preserve">pa260305</w:t>
       </w:r>
       <w:r>
-        <w:t xml:space="preserve">; they will ship at v0.5 as a separate Zenodo dataset record</w:t>
-      </w:r>
-      <w:r>
-        <w:t xml:space="preserve"> </w:t>
-      </w:r>
-      <w:r>
-        <w:t xml:space="preserve">under CC-BY-4.0. The source-code snapshot at the v0.4.0 Zenodo record is Apache-2.0.</w:t>
+        <w:t xml:space="preserve">; they ship at v0.5 as a</w:t>
+      </w:r>
+      <w:r>
+        <w:t xml:space="preserve"> </w:t>
+      </w:r>
+      <w:r>
+        <w:t xml:space="preserve">separate Zenodo dataset record under CC-BY-4.0. The source-code snapshot at the</w:t>
+      </w:r>
+      <w:r>
+        <w:t xml:space="preserve"> </w:t>
+      </w:r>
+      <w:r>
+        <w:t xml:space="preserve">v0.4.0 Zenodo record is Apache-2.0.</w:t>
       </w:r>
     </w:p>
     <w:p>
@@ -4499,18 +4604,18 @@
         <w:pStyle w:val="BodyText"/>
       </w:pPr>
       <w:r>
-        <w:t xml:space="preserve">The toolkit’s readiness per module is summarised in §3.4 and on the public</w:t>
-      </w:r>
-      <w:r>
-        <w:t xml:space="preserve"> </w:t>
-      </w:r>
-      <w:r>
-        <w:t xml:space="preserve">Tools page at</w:t>
-      </w:r>
-      <w:r>
-        <w:t xml:space="preserve"> </w:t>
-      </w:r>
-      <w:hyperlink r:id="rId28">
+        <w:t xml:space="preserve">The toolkit’s readiness per module is summarised in §3.4 and on the public Tools</w:t>
+      </w:r>
+      <w:r>
+        <w:t xml:space="preserve"> </w:t>
+      </w:r>
+      <w:r>
+        <w:t xml:space="preserve">page at</w:t>
+      </w:r>
+      <w:r>
+        <w:t xml:space="preserve"> </w:t>
+      </w:r>
+      <w:hyperlink r:id="rId27">
         <w:r>
           <w:rPr>
             <w:rStyle w:val="Hyperlink"/>
@@ -4519,53 +4624,47 @@
         </w:r>
       </w:hyperlink>
       <w:r>
-        <w:t xml:space="preserve">. Five modules are LIVE</w:t>
-      </w:r>
-      <w:r>
-        <w:t xml:space="preserve"> </w:t>
-      </w:r>
-      <w:r>
-        <w:t xml:space="preserve">today (the Quarto template pack, the showcase generator, the corpus-fix</w:t>
-      </w:r>
-      <w:r>
-        <w:t xml:space="preserve"> </w:t>
-      </w:r>
-      <w:r>
-        <w:t xml:space="preserve">toolkit, the PROIEL XML 2.0 exporter inside the build pipeline, and the</w:t>
-      </w:r>
-      <w:r>
-        <w:t xml:space="preserve"> </w:t>
-      </w:r>
-      <w:r>
-        <w:t xml:space="preserve">Stanza annotation job script). Eight are IN SETUP and ship with the v0.5</w:t>
-      </w:r>
-      <w:r>
-        <w:t xml:space="preserve"> </w:t>
-      </w:r>
-      <w:r>
-        <w:t xml:space="preserve">release. The LightSIDE-AthDGC syntactic-feature fork, the NoSketch-style</w:t>
-      </w:r>
-      <w:r>
-        <w:t xml:space="preserve"> </w:t>
-      </w:r>
-      <w:r>
-        <w:t xml:space="preserve">concordancer, the Neo4j alignment viewer, the valency-frame database</w:t>
-      </w:r>
-      <w:r>
-        <w:t xml:space="preserve"> </w:t>
-      </w:r>
-      <w:r>
-        <w:t xml:space="preserve">client, the retranslation-pair browser, and the retelling-chain explorer</w:t>
-      </w:r>
-      <w:r>
-        <w:t xml:space="preserve"> </w:t>
-      </w:r>
-      <w:r>
-        <w:t xml:space="preserve">are FORTHCOMING (v0.5).</w:t>
-      </w:r>
-    </w:p>
-    <w:bookmarkEnd w:id="36"/>
-    <w:bookmarkStart w:id="37" w:name="acknowledgements"/>
+        <w:t xml:space="preserve">. Five modules are LIVE today</w:t>
+      </w:r>
+      <w:r>
+        <w:t xml:space="preserve"> </w:t>
+      </w:r>
+      <w:r>
+        <w:t xml:space="preserve">(the Quarto template pack, the showcase generator, the corpus-fix toolkit, the</w:t>
+      </w:r>
+      <w:r>
+        <w:t xml:space="preserve"> </w:t>
+      </w:r>
+      <w:r>
+        <w:t xml:space="preserve">PROIEL XML 2.0 exporter inside the build pipeline, and the Stanza annotation job</w:t>
+      </w:r>
+      <w:r>
+        <w:t xml:space="preserve"> </w:t>
+      </w:r>
+      <w:r>
+        <w:t xml:space="preserve">script). Eight are IN SETUP and ship with the v0.5 release. The LightSIDE-AthDGC</w:t>
+      </w:r>
+      <w:r>
+        <w:t xml:space="preserve"> </w:t>
+      </w:r>
+      <w:r>
+        <w:t xml:space="preserve">syntactic-feature fork, the NoSketch-style concordancer, the Neo4j alignment</w:t>
+      </w:r>
+      <w:r>
+        <w:t xml:space="preserve"> </w:t>
+      </w:r>
+      <w:r>
+        <w:t xml:space="preserve">viewer, the valency-frame database client, the retranslation-pair browser, and</w:t>
+      </w:r>
+      <w:r>
+        <w:t xml:space="preserve"> </w:t>
+      </w:r>
+      <w:r>
+        <w:t xml:space="preserve">the retelling-chain explorer are FORTHCOMING at v0.5.</w:t>
+      </w:r>
+    </w:p>
+    <w:bookmarkEnd w:id="33"/>
+    <w:bookmarkStart w:id="34" w:name="acknowledgements"/>
     <w:p>
       <w:pPr>
         <w:pStyle w:val="Heading2"/>
@@ -4579,83 +4678,31 @@
         <w:pStyle w:val="FirstParagraph"/>
       </w:pPr>
       <w:r>
-        <w:t xml:space="preserve">Funded by the</w:t>
-      </w:r>
-      <w:r>
-        <w:t xml:space="preserve"> </w:t>
-      </w:r>
-      <w:r>
-        <w:rPr>
-          <w:b/>
-          <w:bCs/>
-        </w:rPr>
-        <w:t xml:space="preserve">Hellenic Foundation for Research and Innovation (HFRI)</w:t>
-      </w:r>
-      <w:r>
-        <w:t xml:space="preserve"> </w:t>
-      </w:r>
-      <w:r>
-        <w:t xml:space="preserve">under the 3rd Call</w:t>
-      </w:r>
-      <w:r>
-        <w:t xml:space="preserve"> </w:t>
-      </w:r>
-      <w:r>
-        <w:t xml:space="preserve">for HFRI Research Projects to support Post-Doctoral Researchers,</w:t>
-      </w:r>
-      <w:r>
-        <w:t xml:space="preserve"> </w:t>
-      </w:r>
-      <w:r>
-        <w:rPr>
-          <w:b/>
-          <w:bCs/>
-        </w:rPr>
-        <w:t xml:space="preserve">Project No. 20577</w:t>
-      </w:r>
-      <w:r>
-        <w:t xml:space="preserve">;</w:t>
-      </w:r>
-      <w:r>
-        <w:t xml:space="preserve"> </w:t>
-      </w:r>
-      <w:r>
-        <w:t xml:space="preserve">with complementary support from the</w:t>
-      </w:r>
-      <w:r>
-        <w:t xml:space="preserve"> </w:t>
-      </w:r>
-      <w:r>
-        <w:rPr>
-          <w:b/>
-          <w:bCs/>
-        </w:rPr>
-        <w:t xml:space="preserve">Greece 2.0 National Recovery and Resilience Plan</w:t>
-      </w:r>
-      <w:r>
-        <w:t xml:space="preserve">.</w:t>
-      </w:r>
-      <w:r>
-        <w:t xml:space="preserve"> </w:t>
-      </w:r>
-      <w:r>
-        <w:t xml:space="preserve">Compute supplied by</w:t>
-      </w:r>
-      <w:r>
-        <w:t xml:space="preserve"> </w:t>
-      </w:r>
-      <w:r>
-        <w:rPr>
-          <w:b/>
-          <w:bCs/>
-        </w:rPr>
-        <w:t xml:space="preserve">GRNET ARIS</w:t>
-      </w:r>
-      <w:r>
-        <w:t xml:space="preserve"> </w:t>
-      </w:r>
-      <w:r>
-        <w:t xml:space="preserve">(Greek national HPC), allocation</w:t>
+        <w:t xml:space="preserve">Funded by the Hellenic Foundation for Research and Innovation (HFRI) under the</w:t>
+      </w:r>
+      <w:r>
+        <w:t xml:space="preserve"> </w:t>
+      </w:r>
+      <w:r>
+        <w:t xml:space="preserve">3rd Call for HFRI Research Projects to support Post-Doctoral Researchers,</w:t>
+      </w:r>
+      <w:r>
+        <w:t xml:space="preserve"> </w:t>
+      </w:r>
+      <w:r>
+        <w:t xml:space="preserve">Project No. 20577; with complementary support from the Greece 2.0 National</w:t>
+      </w:r>
+      <w:r>
+        <w:t xml:space="preserve"> </w:t>
+      </w:r>
+      <w:r>
+        <w:t xml:space="preserve">Recovery and Resilience Plan. Compute supplied by GRNET ARIS, the Greek</w:t>
+      </w:r>
+      <w:r>
+        <w:t xml:space="preserve"> </w:t>
+      </w:r>
+      <w:r>
+        <w:t xml:space="preserve">national high-performance computing cluster, under allocation</w:t>
       </w:r>
       <w:r>
         <w:t xml:space="preserve"> </w:t>
@@ -4675,23 +4722,7 @@
         <w:pStyle w:val="BodyText"/>
       </w:pPr>
       <w:r>
-        <w:t xml:space="preserve">Funded project:</w:t>
-      </w:r>
-      <w:r>
-        <w:t xml:space="preserve"> </w:t>
-      </w:r>
-      <w:r>
-        <w:rPr>
-          <w:b/>
-          <w:bCs/>
-        </w:rPr>
-        <w:t xml:space="preserve">CVL-CDSAML</w:t>
-      </w:r>
-      <w:r>
-        <w:t xml:space="preserve"> </w:t>
-      </w:r>
-      <w:r>
-        <w:t xml:space="preserve">-</w:t>
+        <w:t xml:space="preserve">The funded project is</w:t>
       </w:r>
       <w:r>
         <w:t xml:space="preserve"> </w:t>
@@ -4701,7 +4732,7 @@
           <w:i/>
           <w:iCs/>
         </w:rPr>
-        <w:t xml:space="preserve">A Corpus-based Valency Lexicon for a Contrastive and</w:t>
+        <w:t xml:space="preserve">CVL-CDSAML: A Corpus-based Valency Lexicon for a</w:t>
       </w:r>
       <w:r>
         <w:rPr>
@@ -4715,7 +4746,7 @@
           <w:i/>
           <w:iCs/>
         </w:rPr>
-        <w:t xml:space="preserve">Diachronic Study of Ancient and Medieval Languages</w:t>
+        <w:t xml:space="preserve">Contrastive and Diachronic Study of Ancient and Medieval Languages</w:t>
       </w:r>
       <w:r>
         <w:t xml:space="preserve">.</w:t>
@@ -4726,13 +4757,61 @@
         <w:pStyle w:val="BodyText"/>
       </w:pPr>
       <w:r>
-        <w:t xml:space="preserve">Team: Prof. Nikolaos Lavidas (PI, NKUA), Prof. Emerita Kiki Nikiforidou (NKUA;</w:t>
-      </w:r>
-      <w:r>
-        <w:t xml:space="preserve"> </w:t>
-      </w:r>
-      <w:r>
-        <w:t xml:space="preserve">Co-Editor,</w:t>
+        <w:t xml:space="preserve">The team comprises Prof. Nikolaos Lavidas (Principal Investigator, NKUA),</w:t>
+      </w:r>
+      <w:r>
+        <w:t xml:space="preserve"> </w:t>
+      </w:r>
+      <w:r>
+        <w:t xml:space="preserve">Prof. Emerita Kiki Nikiforidou (NKUA; Co-Editor of the</w:t>
+      </w:r>
+      <w:r>
+        <w:t xml:space="preserve"> </w:t>
+      </w:r>
+      <w:r>
+        <w:rPr>
+          <w:i/>
+          <w:iCs/>
+        </w:rPr>
+        <w:t xml:space="preserve">Genres and Influential</w:t>
+      </w:r>
+      <w:r>
+        <w:rPr>
+          <w:i/>
+          <w:iCs/>
+        </w:rPr>
+        <w:t xml:space="preserve"> </w:t>
+      </w:r>
+      <w:r>
+        <w:rPr>
+          <w:i/>
+          <w:iCs/>
+        </w:rPr>
+        <w:t xml:space="preserve">Texts</w:t>
+      </w:r>
+      <w:r>
+        <w:t xml:space="preserve"> </w:t>
+      </w:r>
+      <w:r>
+        <w:t xml:space="preserve">volume), Prof. Dag Haug (University of Oslo; PROIEL Project Director),</w:t>
+      </w:r>
+      <w:r>
+        <w:t xml:space="preserve"> </w:t>
+      </w:r>
+      <w:r>
+        <w:t xml:space="preserve">Prof. Leonid Kulikov (Ghent University; diachronic typology, valency</w:t>
+      </w:r>
+      <w:r>
+        <w:t xml:space="preserve"> </w:t>
+      </w:r>
+      <w:r>
+        <w:t xml:space="preserve">questionnaires), Dr. Vassiliki Geka (NKUA; Post-Doctoral Researcher; Co-Editor</w:t>
+      </w:r>
+      <w:r>
+        <w:t xml:space="preserve"> </w:t>
+      </w:r>
+      <w:r>
+        <w:t xml:space="preserve">of the</w:t>
       </w:r>
       <w:r>
         <w:t xml:space="preserve"> </w:t>
@@ -4748,19 +4827,57 @@
         <w:t xml:space="preserve"> </w:t>
       </w:r>
       <w:r>
-        <w:t xml:space="preserve">volume), Prof. Dag Haug (Oslo, PROIEL Project</w:t>
-      </w:r>
-      <w:r>
-        <w:t xml:space="preserve"> </w:t>
-      </w:r>
-      <w:r>
-        <w:t xml:space="preserve">Director), Prof. Leonid Kulikov (Ghent; Diachronic typology, valency questionnaires),</w:t>
-      </w:r>
-      <w:r>
-        <w:t xml:space="preserve"> </w:t>
-      </w:r>
-      <w:r>
-        <w:t xml:space="preserve">Dr. Vassiliki Geka (NKUA; Post-Doctoral Researcher; Co-Editor,</w:t>
+        <w:t xml:space="preserve">volume), Dr. Vassileios Symeonidis</w:t>
+      </w:r>
+      <w:r>
+        <w:t xml:space="preserve"> </w:t>
+      </w:r>
+      <w:r>
+        <w:t xml:space="preserve">(NKUA; Post-Doctoral Researcher), Dr. Theodoros Michalareas (NKUA;</w:t>
+      </w:r>
+      <w:r>
+        <w:t xml:space="preserve"> </w:t>
+      </w:r>
+      <w:r>
+        <w:t xml:space="preserve">Post-Doctoral Researcher), Sofia Chionidi (NKUA; PhD Candidate), Anastasia</w:t>
+      </w:r>
+      <w:r>
+        <w:t xml:space="preserve"> </w:t>
+      </w:r>
+      <w:r>
+        <w:t xml:space="preserve">Tsiropina (NKUA; PhD Candidate), Eleni Plakoutsi (NKUA; PhD Candidate), and</w:t>
+      </w:r>
+      <w:r>
+        <w:t xml:space="preserve"> </w:t>
+      </w:r>
+      <w:r>
+        <w:t xml:space="preserve">Evangelos Argyropoulos (NKUA; Research Assistant).</w:t>
+      </w:r>
+    </w:p>
+    <w:bookmarkEnd w:id="34"/>
+    <w:bookmarkStart w:id="42" w:name="references"/>
+    <w:p>
+      <w:pPr>
+        <w:pStyle w:val="Heading2"/>
+      </w:pPr>
+      <w:r>
+        <w:t xml:space="preserve">References</w:t>
+      </w:r>
+    </w:p>
+    <w:bookmarkStart w:id="41" w:name="refs"/>
+    <w:bookmarkStart w:id="35" w:name="ref-dou2021"/>
+    <w:p>
+      <w:pPr>
+        <w:pStyle w:val="Bibliography"/>
+      </w:pPr>
+      <w:r>
+        <w:t xml:space="preserve">Dou, Zi-Yi, and Graham Neubig. 2021.</w:t>
+      </w:r>
+      <w:r>
+        <w:t xml:space="preserve"> </w:t>
+      </w:r>
+      <w:r>
+        <w:t xml:space="preserve">“Word Alignment by Fine-Tuning Embeddings on Parallel Corpora.”</w:t>
       </w:r>
       <w:r>
         <w:t xml:space="preserve"> </w:t>
@@ -4770,88 +4887,14 @@
           <w:i/>
           <w:iCs/>
         </w:rPr>
-        <w:t xml:space="preserve">Genres and Influential</w:t>
-      </w:r>
-      <w:r>
-        <w:rPr>
-          <w:i/>
-          <w:iCs/>
-        </w:rPr>
-        <w:t xml:space="preserve"> </w:t>
-      </w:r>
-      <w:r>
-        <w:rPr>
-          <w:i/>
-          <w:iCs/>
-        </w:rPr>
-        <w:t xml:space="preserve">Texts</w:t>
-      </w:r>
-      <w:r>
-        <w:t xml:space="preserve"> </w:t>
-      </w:r>
-      <w:r>
-        <w:t xml:space="preserve">volume), Dr. Vassileios Symeonidis (NKUA; Post-Doctoral Researcher),</w:t>
-      </w:r>
-      <w:r>
-        <w:t xml:space="preserve"> </w:t>
-      </w:r>
-      <w:r>
-        <w:t xml:space="preserve">Dr. Theodoros Michalareas (NKUA; Post-Doctoral Researcher), Sofia Chionidi (NKUA;</w:t>
-      </w:r>
-      <w:r>
-        <w:t xml:space="preserve"> </w:t>
-      </w:r>
-      <w:r>
-        <w:t xml:space="preserve">PhD Candidate), Anastasia Tsiropina (NKUA; PhD Candidate), Eleni Plakoutsi (NKUA;</w:t>
-      </w:r>
-      <w:r>
-        <w:t xml:space="preserve"> </w:t>
-      </w:r>
-      <w:r>
-        <w:t xml:space="preserve">PhD Candidate), Evangelos Argyropoulos (NKUA; Research Assistant).</w:t>
-      </w:r>
-    </w:p>
-    <w:bookmarkEnd w:id="37"/>
-    <w:bookmarkStart w:id="45" w:name="references"/>
-    <w:p>
-      <w:pPr>
-        <w:pStyle w:val="Heading2"/>
-      </w:pPr>
-      <w:r>
-        <w:t xml:space="preserve">References</w:t>
-      </w:r>
-    </w:p>
-    <w:bookmarkStart w:id="44" w:name="refs"/>
-    <w:bookmarkStart w:id="38" w:name="ref-dou2021"/>
-    <w:p>
-      <w:pPr>
-        <w:pStyle w:val="Bibliography"/>
-      </w:pPr>
-      <w:r>
-        <w:t xml:space="preserve">Dou, Zi-Yi, and Graham Neubig. 2021.</w:t>
-      </w:r>
-      <w:r>
-        <w:t xml:space="preserve"> </w:t>
-      </w:r>
-      <w:r>
-        <w:t xml:space="preserve">“Word Alignment by Fine-Tuning Embeddings on Parallel Corpora.”</w:t>
-      </w:r>
-      <w:r>
-        <w:t xml:space="preserve"> </w:t>
-      </w:r>
-      <w:r>
-        <w:rPr>
-          <w:i/>
-          <w:iCs/>
-        </w:rPr>
-        <w:t xml:space="preserve">Proceedings of EACL 2021</w:t>
-      </w:r>
-      <w:r>
-        <w:t xml:space="preserve">.</w:t>
-      </w:r>
-    </w:p>
-    <w:bookmarkEnd w:id="38"/>
-    <w:bookmarkStart w:id="39" w:name="ref-eckhoff2018"/>
+        <w:t xml:space="preserve">Proceedings of the 16th Conference of the European Chapter of the Association for Computational Linguistics: Main Volume (EACL 2021)</w:t>
+      </w:r>
+      <w:r>
+        <w:t xml:space="preserve">, 2112–28.</w:t>
+      </w:r>
+    </w:p>
+    <w:bookmarkEnd w:id="35"/>
+    <w:bookmarkStart w:id="36" w:name="ref-eckhoff2018"/>
     <w:p>
       <w:pPr>
         <w:pStyle w:val="Bibliography"/>
@@ -4906,8 +4949,8 @@
         <w:t xml:space="preserve">52 (1): 29–65.</w:t>
       </w:r>
     </w:p>
-    <w:bookmarkEnd w:id="39"/>
-    <w:bookmarkStart w:id="40" w:name="ref-feng2022"/>
+    <w:bookmarkEnd w:id="36"/>
+    <w:bookmarkStart w:id="37" w:name="ref-feng2022"/>
     <w:p>
       <w:pPr>
         <w:pStyle w:val="Bibliography"/>
@@ -4941,14 +4984,14 @@
           <w:i/>
           <w:iCs/>
         </w:rPr>
-        <w:t xml:space="preserve">Proceedings of ACL 2022</w:t>
-      </w:r>
-      <w:r>
-        <w:t xml:space="preserve">.</w:t>
-      </w:r>
-    </w:p>
-    <w:bookmarkEnd w:id="40"/>
-    <w:bookmarkStart w:id="41" w:name="ref-haug2008"/>
+        <w:t xml:space="preserve">Proceedings of the 60th Annual Meeting of the Association for Computational Linguistics (ACL 2022), Volume 1: Long Papers</w:t>
+      </w:r>
+      <w:r>
+        <w:t xml:space="preserve">, 878–91.</w:t>
+      </w:r>
+    </w:p>
+    <w:bookmarkEnd w:id="37"/>
+    <w:bookmarkStart w:id="38" w:name="ref-haug2008"/>
     <w:p>
       <w:pPr>
         <w:pStyle w:val="Bibliography"/>
@@ -4991,11 +5034,11 @@
         <w:t xml:space="preserve">Proceedings of the Second Workshop on Language Technology for Cultural Heritage Data (LaTeCH 2008)</w:t>
       </w:r>
       <w:r>
-        <w:t xml:space="preserve">.</w:t>
-      </w:r>
-    </w:p>
-    <w:bookmarkEnd w:id="41"/>
-    <w:bookmarkStart w:id="42" w:name="ref-list2014"/>
+        <w:t xml:space="preserve">, 27–34.</w:t>
+      </w:r>
+    </w:p>
+    <w:bookmarkEnd w:id="38"/>
+    <w:bookmarkStart w:id="39" w:name="ref-list2014"/>
     <w:p>
       <w:pPr>
         <w:pStyle w:val="Bibliography"/>
@@ -5023,8 +5066,8 @@
         <w:t xml:space="preserve">sseldorf University Press.</w:t>
       </w:r>
     </w:p>
-    <w:bookmarkEnd w:id="42"/>
-    <w:bookmarkStart w:id="43" w:name="ref-qi2020"/>
+    <w:bookmarkEnd w:id="39"/>
+    <w:bookmarkStart w:id="40" w:name="ref-qi2020"/>
     <w:p>
       <w:pPr>
         <w:pStyle w:val="Bibliography"/>
@@ -5064,15 +5107,15 @@
           <w:i/>
           <w:iCs/>
         </w:rPr>
-        <w:t xml:space="preserve">Proceedings of ACL 2020</w:t>
-      </w:r>
-      <w:r>
-        <w:t xml:space="preserve">.</w:t>
-      </w:r>
-    </w:p>
-    <w:bookmarkEnd w:id="43"/>
-    <w:bookmarkEnd w:id="44"/>
-    <w:bookmarkEnd w:id="45"/>
+        <w:t xml:space="preserve">Proceedings of the 58th Annual Meeting of the Association for Computational Linguistics: System Demonstrations (ACL 2020)</w:t>
+      </w:r>
+      <w:r>
+        <w:t xml:space="preserve">, 101–8.</w:t>
+      </w:r>
+    </w:p>
+    <w:bookmarkEnd w:id="40"/>
+    <w:bookmarkEnd w:id="41"/>
+    <w:bookmarkEnd w:id="42"/>
     <w:sectPr>
       <w:footnotePr>
         <w:numRestart w:val="eachSect"/>
@@ -5183,229 +5226,8 @@
       </w:pPr>
     </w:lvl>
   </w:abstractNum>
-  <w:abstractNum w:abstractNumId="991">
-    <w:nsid w:val="0000A991"/>
-    <w:multiLevelType w:val="multilevel"/>
-    <w:lvl w:ilvl="0">
-      <w:numFmt w:val="bullet"/>
-      <w:lvlText w:val=""/>
-      <w:lvlJc w:val="left"/>
-      <w:pPr>
-        <w:ind w:left="720" w:hanging="360"/>
-      </w:pPr>
-      <w:rPr>
-        <w:rFonts w:ascii="Symbol" w:hAnsi="Symbol" w:cs="Symbol" w:hint="default"/>
-      </w:rPr>
-    </w:lvl>
-    <w:lvl w:ilvl="1">
-      <w:numFmt w:val="bullet"/>
-      <w:lvlText w:val="o"/>
-      <w:lvlJc w:val="left"/>
-      <w:pPr>
-        <w:ind w:left="1440" w:hanging="360"/>
-      </w:pPr>
-      <w:rPr>
-        <w:rFonts w:ascii="Courier New" w:hAnsi="Courier New" w:cs="Courier New" w:hint="default"/>
-      </w:rPr>
-    </w:lvl>
-    <w:lvl w:ilvl="2">
-      <w:numFmt w:val="bullet"/>
-      <w:lvlText w:val=""/>
-      <w:lvlJc w:val="left"/>
-      <w:pPr>
-        <w:ind w:left="2160" w:hanging="360"/>
-      </w:pPr>
-      <w:rPr>
-        <w:rFonts w:ascii="Wingdings" w:hAnsi="Wingdings" w:cs="Wingdings" w:hint="default"/>
-      </w:rPr>
-    </w:lvl>
-    <w:lvl w:ilvl="3">
-      <w:numFmt w:val="bullet"/>
-      <w:lvlText w:val=""/>
-      <w:lvlJc w:val="left"/>
-      <w:pPr>
-        <w:ind w:left="2880" w:hanging="360"/>
-      </w:pPr>
-      <w:rPr>
-        <w:rFonts w:ascii="Symbol" w:hAnsi="Symbol" w:cs="Symbol" w:hint="default"/>
-      </w:rPr>
-    </w:lvl>
-    <w:lvl w:ilvl="4">
-      <w:numFmt w:val="bullet"/>
-      <w:lvlText w:val="o"/>
-      <w:lvlJc w:val="left"/>
-      <w:pPr>
-        <w:ind w:left="3600" w:hanging="360"/>
-      </w:pPr>
-      <w:rPr>
-        <w:rFonts w:ascii="Courier New" w:hAnsi="Courier New" w:cs="Courier New" w:hint="default"/>
-      </w:rPr>
-    </w:lvl>
-    <w:lvl w:ilvl="5">
-      <w:numFmt w:val="bullet"/>
-      <w:lvlText w:val=""/>
-      <w:lvlJc w:val="left"/>
-      <w:pPr>
-        <w:ind w:left="4320" w:hanging="360"/>
-      </w:pPr>
-      <w:rPr>
-        <w:rFonts w:ascii="Wingdings" w:hAnsi="Wingdings" w:cs="Wingdings" w:hint="default"/>
-      </w:rPr>
-    </w:lvl>
-    <w:lvl w:ilvl="6">
-      <w:numFmt w:val="bullet"/>
-      <w:lvlText w:val=""/>
-      <w:lvlJc w:val="left"/>
-      <w:pPr>
-        <w:ind w:left="5040" w:hanging="360"/>
-      </w:pPr>
-      <w:rPr>
-        <w:rFonts w:ascii="Symbol" w:hAnsi="Symbol" w:cs="Symbol" w:hint="default"/>
-      </w:rPr>
-    </w:lvl>
-    <w:lvl w:ilvl="7">
-      <w:numFmt w:val="bullet"/>
-      <w:lvlText w:val="o"/>
-      <w:lvlJc w:val="left"/>
-      <w:pPr>
-        <w:ind w:left="5760" w:hanging="360"/>
-      </w:pPr>
-      <w:rPr>
-        <w:rFonts w:ascii="Courier New" w:hAnsi="Courier New" w:cs="Courier New" w:hint="default"/>
-      </w:rPr>
-    </w:lvl>
-    <w:lvl w:ilvl="8">
-      <w:numFmt w:val="bullet"/>
-      <w:lvlText w:val=""/>
-      <w:lvlJc w:val="left"/>
-      <w:pPr>
-        <w:ind w:left="6480" w:hanging="360"/>
-      </w:pPr>
-      <w:rPr>
-        <w:rFonts w:ascii="Wingdings" w:hAnsi="Wingdings" w:cs="Wingdings" w:hint="default"/>
-      </w:rPr>
-    </w:lvl>
-  </w:abstractNum>
-  <w:abstractNum w:abstractNumId="99411">
-    <w:nsid w:val="00A99411"/>
-    <w:multiLevelType w:val="multilevel"/>
-    <w:lvl w:ilvl="0">
-      <w:start w:val="1"/>
-      <w:numFmt w:val="decimal"/>
-      <w:lvlText w:val="%1."/>
-      <w:lvlJc w:val="left"/>
-      <w:pPr>
-        <w:ind w:left="720" w:hanging="360"/>
-      </w:pPr>
-    </w:lvl>
-    <w:lvl w:ilvl="1">
-      <w:start w:val="1"/>
-      <w:numFmt w:val="decimal"/>
-      <w:lvlText w:val="%2."/>
-      <w:lvlJc w:val="left"/>
-      <w:pPr>
-        <w:ind w:left="1440" w:hanging="360"/>
-      </w:pPr>
-    </w:lvl>
-    <w:lvl w:ilvl="2">
-      <w:start w:val="1"/>
-      <w:numFmt w:val="decimal"/>
-      <w:lvlText w:val="%3."/>
-      <w:lvlJc w:val="left"/>
-      <w:pPr>
-        <w:ind w:left="2160" w:hanging="360"/>
-      </w:pPr>
-    </w:lvl>
-    <w:lvl w:ilvl="3">
-      <w:start w:val="1"/>
-      <w:numFmt w:val="decimal"/>
-      <w:lvlText w:val="%4."/>
-      <w:lvlJc w:val="left"/>
-      <w:pPr>
-        <w:ind w:left="2880" w:hanging="360"/>
-      </w:pPr>
-    </w:lvl>
-    <w:lvl w:ilvl="4">
-      <w:start w:val="1"/>
-      <w:numFmt w:val="decimal"/>
-      <w:lvlText w:val="%5."/>
-      <w:lvlJc w:val="left"/>
-      <w:pPr>
-        <w:ind w:left="3600" w:hanging="360"/>
-      </w:pPr>
-    </w:lvl>
-    <w:lvl w:ilvl="5">
-      <w:start w:val="1"/>
-      <w:numFmt w:val="decimal"/>
-      <w:lvlText w:val="%6."/>
-      <w:lvlJc w:val="left"/>
-      <w:pPr>
-        <w:ind w:left="4320" w:hanging="360"/>
-      </w:pPr>
-    </w:lvl>
-    <w:lvl w:ilvl="6">
-      <w:start w:val="1"/>
-      <w:numFmt w:val="decimal"/>
-      <w:lvlText w:val="%7."/>
-      <w:lvlJc w:val="left"/>
-      <w:pPr>
-        <w:ind w:left="5040" w:hanging="360"/>
-      </w:pPr>
-    </w:lvl>
-    <w:lvl w:ilvl="7">
-      <w:start w:val="1"/>
-      <w:numFmt w:val="decimal"/>
-      <w:lvlText w:val="%8."/>
-      <w:lvlJc w:val="left"/>
-      <w:pPr>
-        <w:ind w:left="5760" w:hanging="360"/>
-      </w:pPr>
-    </w:lvl>
-    <w:lvl w:ilvl="8">
-      <w:start w:val="1"/>
-      <w:numFmt w:val="decimal"/>
-      <w:lvlText w:val="%9."/>
-      <w:lvlJc w:val="left"/>
-      <w:pPr>
-        <w:ind w:left="6480" w:hanging="360"/>
-      </w:pPr>
-    </w:lvl>
-  </w:abstractNum>
   <w:num w:numId="1000">
     <w:abstractNumId w:val="990"/>
-  </w:num>
-  <w:num w:numId="1001">
-    <w:abstractNumId w:val="991"/>
-  </w:num>
-  <w:num w:numId="1002">
-    <w:abstractNumId w:val="99411"/>
-    <w:lvlOverride w:ilvl="0">
-      <w:startOverride w:val="1"/>
-    </w:lvlOverride>
-    <w:lvlOverride w:ilvl="1">
-      <w:startOverride w:val="1"/>
-    </w:lvlOverride>
-    <w:lvlOverride w:ilvl="2">
-      <w:startOverride w:val="1"/>
-    </w:lvlOverride>
-    <w:lvlOverride w:ilvl="3">
-      <w:startOverride w:val="1"/>
-    </w:lvlOverride>
-    <w:lvlOverride w:ilvl="4">
-      <w:startOverride w:val="1"/>
-    </w:lvlOverride>
-    <w:lvlOverride w:ilvl="5">
-      <w:startOverride w:val="1"/>
-    </w:lvlOverride>
-    <w:lvlOverride w:ilvl="6">
-      <w:startOverride w:val="1"/>
-    </w:lvlOverride>
-    <w:lvlOverride w:ilvl="7">
-      <w:startOverride w:val="1"/>
-    </w:lvlOverride>
-    <w:lvlOverride w:ilvl="8">
-      <w:startOverride w:val="1"/>
-    </w:lvlOverride>
   </w:num>
 </w:numbering>
 </file>

</xml_diff>

<commit_message>
AthDGC site update 2026-06-07 03:11 --- clean Quarto render, real Zenodo DOI 10.5281/zenodo.20439182, samples-only public release
</commit_message>
<xml_diff>
--- a/data_paper.docx
+++ b/data_paper.docx
@@ -922,37 +922,70 @@
         <w:pStyle w:val="FirstParagraph"/>
       </w:pPr>
       <w:r>
-        <w:t xml:space="preserve">Each day, the discovery stage probes open-access repositories for new or</w:t>
-      </w:r>
-      <w:r>
-        <w:t xml:space="preserve"> </w:t>
-      </w:r>
-      <w:r>
-        <w:t xml:space="preserve">updated Greek and parallel-language source material. The repositories currently</w:t>
-      </w:r>
-      <w:r>
-        <w:t xml:space="preserve"> </w:t>
-      </w:r>
-      <w:r>
-        <w:t xml:space="preserve">probed include archive.org, the Perseus Digital Library (the standard online</w:t>
-      </w:r>
-      <w:r>
-        <w:t xml:space="preserve"> </w:t>
-      </w:r>
-      <w:r>
-        <w:t xml:space="preserve">archive of classical-Greek and Latin texts maintained by Tufts University), the</w:t>
-      </w:r>
-      <w:r>
-        <w:t xml:space="preserve"> </w:t>
-      </w:r>
-      <w:r>
-        <w:t xml:space="preserve">Open Greek and Latin First Thousand Years of Greek collection at Leipzig,</w:t>
-      </w:r>
-      <w:r>
-        <w:t xml:space="preserve"> </w:t>
-      </w:r>
-      <w:r>
-        <w:t xml:space="preserve">Wikisource Greek (</w:t>
+        <w:t xml:space="preserve">Source material reaches AthDGC through three complementary channels, of which</w:t>
+      </w:r>
+      <w:r>
+        <w:t xml:space="preserve"> </w:t>
+      </w:r>
+      <w:r>
+        <w:t xml:space="preserve">the first runs daily and the other two are continuous on a slower cadence.</w:t>
+      </w:r>
+    </w:p>
+    <w:p>
+      <w:pPr>
+        <w:pStyle w:val="BodyText"/>
+      </w:pPr>
+      <w:r>
+        <w:t xml:space="preserve">The first channel is the</w:t>
+      </w:r>
+      <w:r>
+        <w:t xml:space="preserve"> </w:t>
+      </w:r>
+      <w:r>
+        <w:rPr>
+          <w:i/>
+          <w:iCs/>
+        </w:rPr>
+        <w:t xml:space="preserve">daily online-archive harvest</w:t>
+      </w:r>
+      <w:r>
+        <w:t xml:space="preserve">. Each day, the</w:t>
+      </w:r>
+      <w:r>
+        <w:t xml:space="preserve"> </w:t>
+      </w:r>
+      <w:r>
+        <w:t xml:space="preserve">discovery stage probes online open-access repositories for new or updated Greek</w:t>
+      </w:r>
+      <w:r>
+        <w:t xml:space="preserve"> </w:t>
+      </w:r>
+      <w:r>
+        <w:t xml:space="preserve">and parallel-language source material. The repositories currently probed</w:t>
+      </w:r>
+      <w:r>
+        <w:t xml:space="preserve"> </w:t>
+      </w:r>
+      <w:r>
+        <w:t xml:space="preserve">include archive.org, the Perseus Digital Library (the standard online archive</w:t>
+      </w:r>
+      <w:r>
+        <w:t xml:space="preserve"> </w:t>
+      </w:r>
+      <w:r>
+        <w:t xml:space="preserve">of classical-Greek and Latin texts maintained by Tufts University), the Open</w:t>
+      </w:r>
+      <w:r>
+        <w:t xml:space="preserve"> </w:t>
+      </w:r>
+      <w:r>
+        <w:t xml:space="preserve">Greek and Latin First Thousand Years of Greek collection at Leipzig, Wikisource</w:t>
+      </w:r>
+      <w:r>
+        <w:t xml:space="preserve"> </w:t>
+      </w:r>
+      <w:r>
+        <w:t xml:space="preserve">Greek (</w:t>
       </w:r>
       <w:r>
         <w:rPr>
@@ -961,43 +994,189 @@
         <w:t xml:space="preserve">el.wikisource.org</w:t>
       </w:r>
       <w:r>
-        <w:t xml:space="preserve">), the Diorisis Corpus (the lemmatised</w:t>
-      </w:r>
-      <w:r>
-        <w:t xml:space="preserve"> </w:t>
-      </w:r>
-      <w:r>
-        <w:t xml:space="preserve">classical-Greek corpus by Vatri and McGillivray), and OpenGreekAndLatin /</w:t>
-      </w:r>
-      <w:r>
-        <w:t xml:space="preserve"> </w:t>
-      </w:r>
-      <w:r>
-        <w:t xml:space="preserve">PerseusDL on GitHub. For the parallel languages, the discovery stage probes the</w:t>
-      </w:r>
-      <w:r>
-        <w:t xml:space="preserve"> </w:t>
-      </w:r>
-      <w:r>
-        <w:t xml:space="preserve">Wulfila Project at the University of Antwerp (Gothic), TITUS at the University</w:t>
-      </w:r>
-      <w:r>
-        <w:t xml:space="preserve"> </w:t>
-      </w:r>
-      <w:r>
-        <w:t xml:space="preserve">of Frankfurt (Old Church Slavonic and Classical Armenian), GRETIL at Goettingen</w:t>
-      </w:r>
-      <w:r>
-        <w:t xml:space="preserve"> </w:t>
-      </w:r>
-      <w:r>
-        <w:t xml:space="preserve">(Sanskrit), TEAMS at the Robbins Library (Old English), and the National Library</w:t>
-      </w:r>
-      <w:r>
-        <w:t xml:space="preserve"> </w:t>
-      </w:r>
-      <w:r>
-        <w:t xml:space="preserve">of Ukraine facsimile collection. For the</w:t>
+        <w:t xml:space="preserve">), the Diorisis Corpus (the lemmatised classical-Greek</w:t>
+      </w:r>
+      <w:r>
+        <w:t xml:space="preserve"> </w:t>
+      </w:r>
+      <w:r>
+        <w:t xml:space="preserve">corpus by Vatri and McGillivray), and OpenGreekAndLatin / PerseusDL on GitHub.</w:t>
+      </w:r>
+      <w:r>
+        <w:t xml:space="preserve"> </w:t>
+      </w:r>
+      <w:r>
+        <w:t xml:space="preserve">For the parallel languages, the discovery stage probes the Wulfila Project at</w:t>
+      </w:r>
+      <w:r>
+        <w:t xml:space="preserve"> </w:t>
+      </w:r>
+      <w:r>
+        <w:t xml:space="preserve">the University of Antwerp (Gothic), TITUS at the University of Frankfurt (Old</w:t>
+      </w:r>
+      <w:r>
+        <w:t xml:space="preserve"> </w:t>
+      </w:r>
+      <w:r>
+        <w:t xml:space="preserve">Church Slavonic and Classical Armenian), GRETIL at Goettingen (Sanskrit),</w:t>
+      </w:r>
+      <w:r>
+        <w:t xml:space="preserve"> </w:t>
+      </w:r>
+      <w:r>
+        <w:t xml:space="preserve">TEAMS at the Robbins Library (Old English), and the National Library of</w:t>
+      </w:r>
+      <w:r>
+        <w:t xml:space="preserve"> </w:t>
+      </w:r>
+      <w:r>
+        <w:t xml:space="preserve">Ukraine facsimile collection.</w:t>
+      </w:r>
+    </w:p>
+    <w:p>
+      <w:pPr>
+        <w:pStyle w:val="BodyText"/>
+      </w:pPr>
+      <w:r>
+        <w:t xml:space="preserve">The second channel is</w:t>
+      </w:r>
+      <w:r>
+        <w:t xml:space="preserve"> </w:t>
+      </w:r>
+      <w:r>
+        <w:rPr>
+          <w:i/>
+          <w:iCs/>
+        </w:rPr>
+        <w:t xml:space="preserve">in-house digitisation</w:t>
+      </w:r>
+      <w:r>
+        <w:t xml:space="preserve">, namely the OCR (Optical</w:t>
+      </w:r>
+      <w:r>
+        <w:t xml:space="preserve"> </w:t>
+      </w:r>
+      <w:r>
+        <w:t xml:space="preserve">Character Recognition, the conversion of scanned page images into</w:t>
+      </w:r>
+      <w:r>
+        <w:t xml:space="preserve"> </w:t>
+      </w:r>
+      <w:r>
+        <w:t xml:space="preserve">machine-readable text) of out-of-copyright printed editions held by NKUA and</w:t>
+      </w:r>
+      <w:r>
+        <w:t xml:space="preserve"> </w:t>
+      </w:r>
+      <w:r>
+        <w:t xml:space="preserve">partner institutions. This channel covers pre-1928 Teubner editions, the</w:t>
+      </w:r>
+      <w:r>
+        <w:t xml:space="preserve"> </w:t>
+      </w:r>
+      <w:r>
+        <w:t xml:space="preserve">Patrologia Graeca volumes not yet available in clean text form, scanned Early</w:t>
+      </w:r>
+      <w:r>
+        <w:t xml:space="preserve"> </w:t>
+      </w:r>
+      <w:r>
+        <w:t xml:space="preserve">Modern Greek printed books from the Anemi collection at the University of</w:t>
+      </w:r>
+      <w:r>
+        <w:t xml:space="preserve"> </w:t>
+      </w:r>
+      <w:r>
+        <w:t xml:space="preserve">Crete, and equivalent printed material from collaborating Departments of</w:t>
+      </w:r>
+      <w:r>
+        <w:t xml:space="preserve"> </w:t>
+      </w:r>
+      <w:r>
+        <w:t xml:space="preserve">Classical Studies in the CIVIS Alliance and at other Greek universities.</w:t>
+      </w:r>
+      <w:r>
+        <w:t xml:space="preserve"> </w:t>
+      </w:r>
+      <w:r>
+        <w:t xml:space="preserve">Manuscript facsimiles supplied by project partners enter through the same</w:t>
+      </w:r>
+      <w:r>
+        <w:t xml:space="preserve"> </w:t>
+      </w:r>
+      <w:r>
+        <w:t xml:space="preserve">channel and are flagged in the corpus metadata with the supplying institution</w:t>
+      </w:r>
+      <w:r>
+        <w:t xml:space="preserve"> </w:t>
+      </w:r>
+      <w:r>
+        <w:t xml:space="preserve">and the corresponding editorial provenance.</w:t>
+      </w:r>
+    </w:p>
+    <w:p>
+      <w:pPr>
+        <w:pStyle w:val="BodyText"/>
+      </w:pPr>
+      <w:r>
+        <w:t xml:space="preserve">The third channel is</w:t>
+      </w:r>
+      <w:r>
+        <w:t xml:space="preserve"> </w:t>
+      </w:r>
+      <w:r>
+        <w:rPr>
+          <w:i/>
+          <w:iCs/>
+        </w:rPr>
+        <w:t xml:space="preserve">community contribution</w:t>
+      </w:r>
+      <w:r>
+        <w:t xml:space="preserve">, namely the submission of</w:t>
+      </w:r>
+      <w:r>
+        <w:t xml:space="preserve"> </w:t>
+      </w:r>
+      <w:r>
+        <w:t xml:space="preserve">prepared text or annotation by external researchers and by KEDIVIM</w:t>
+      </w:r>
+      <w:r>
+        <w:t xml:space="preserve"> </w:t>
+      </w:r>
+      <w:r>
+        <w:t xml:space="preserve">continuing-education-course participants (see §5). Such contributions are</w:t>
+      </w:r>
+      <w:r>
+        <w:t xml:space="preserve"> </w:t>
+      </w:r>
+      <w:r>
+        <w:t xml:space="preserve">versioned in the public GitHub repository as pull requests, pass the same</w:t>
+      </w:r>
+      <w:r>
+        <w:t xml:space="preserve"> </w:t>
+      </w:r>
+      <w:r>
+        <w:t xml:space="preserve">PROIEL XML 2.0 schema validator and house-style check that govern internal</w:t>
+      </w:r>
+      <w:r>
+        <w:t xml:space="preserve"> </w:t>
+      </w:r>
+      <w:r>
+        <w:t xml:space="preserve">contributions (see §3.4), and on acceptance receive co-authorship</w:t>
+      </w:r>
+      <w:r>
+        <w:t xml:space="preserve"> </w:t>
+      </w:r>
+      <w:r>
+        <w:t xml:space="preserve">acknowledgement on the next release notes.</w:t>
+      </w:r>
+    </w:p>
+    <w:p>
+      <w:pPr>
+        <w:pStyle w:val="BodyText"/>
+      </w:pPr>
+      <w:r>
+        <w:t xml:space="preserve">For the</w:t>
       </w:r>
       <w:r>
         <w:t xml:space="preserve"> </w:t>
@@ -1013,13 +1192,25 @@
         <w:t xml:space="preserve"> </w:t>
       </w:r>
       <w:r>
-        <w:t xml:space="preserve">worked example, the discovery</w:t>
-      </w:r>
-      <w:r>
-        <w:t xml:space="preserve"> </w:t>
-      </w:r>
-      <w:r>
-        <w:t xml:space="preserve">stage retrieves the Homeric text from Perseus (CTS URN</w:t>
+        <w:t xml:space="preserve">worked example, the discovery stage retrieves the Homeric text</w:t>
+      </w:r>
+      <w:r>
+        <w:t xml:space="preserve"> </w:t>
+      </w:r>
+      <w:r>
+        <w:t xml:space="preserve">from the Perseus Digital Library through its CTS URN (Canonical Text Services</w:t>
+      </w:r>
+      <w:r>
+        <w:t xml:space="preserve"> </w:t>
+      </w:r>
+      <w:r>
+        <w:t xml:space="preserve">Uniform Resource Name, a standard identifier scheme used by classical-text</w:t>
+      </w:r>
+      <w:r>
+        <w:t xml:space="preserve"> </w:t>
+      </w:r>
+      <w:r>
+        <w:t xml:space="preserve">repositories for referring to a specific edition of a specific work),</w:t>
       </w:r>
       <w:r>
         <w:t xml:space="preserve"> </w:t>
@@ -1031,19 +1222,19 @@
         <w:t xml:space="preserve">urn:cts:greekLit:tlg0012.tlg001</w:t>
       </w:r>
       <w:r>
-        <w:t xml:space="preserve">)</w:t>
-      </w:r>
-      <w:r>
-        <w:t xml:space="preserve"> </w:t>
-      </w:r>
-      <w:r>
-        <w:t xml:space="preserve">together with the Kakridis-Kazantzakis 1955 prose translation, mirrored on</w:t>
-      </w:r>
-      <w:r>
-        <w:t xml:space="preserve"> </w:t>
-      </w:r>
-      <w:r>
-        <w:t xml:space="preserve">Wikisource, and the Tzetzes Byzantine epitome from Bibliotheca Augustana.</w:t>
+        <w:t xml:space="preserve">, together with the Kakridis-Kazantzakis 1955</w:t>
+      </w:r>
+      <w:r>
+        <w:t xml:space="preserve"> </w:t>
+      </w:r>
+      <w:r>
+        <w:t xml:space="preserve">prose translation, mirrored on Wikisource, and the Tzetzes Byzantine epitome</w:t>
+      </w:r>
+      <w:r>
+        <w:t xml:space="preserve"> </w:t>
+      </w:r>
+      <w:r>
+        <w:t xml:space="preserve">from Bibliotheca Augustana.</w:t>
       </w:r>
     </w:p>
     <w:bookmarkEnd w:id="15"/>
@@ -1464,25 +1655,71 @@
         <w:t xml:space="preserve"> </w:t>
       </w:r>
       <w:r>
-        <w:t xml:space="preserve">v0.5 annotation will use a fine-tuned Stanza model trained on TITUS Armenian</w:t>
-      </w:r>
-      <w:r>
-        <w:t xml:space="preserve"> </w:t>
-      </w:r>
-      <w:r>
-        <w:t xml:space="preserve">material. The Stanza output for each sentence is then normalised to the PROIEL</w:t>
-      </w:r>
-      <w:r>
-        <w:t xml:space="preserve"> </w:t>
-      </w:r>
-      <w:r>
-        <w:t xml:space="preserve">XML 2.0 schema; AthDGC publishes PROIEL XML 2.0 only, with no CoNLL-U or other</w:t>
-      </w:r>
-      <w:r>
-        <w:t xml:space="preserve"> </w:t>
-      </w:r>
-      <w:r>
-        <w:t xml:space="preserve">format offered, since the analytical pipeline downstream of the corpus</w:t>
+        <w:t xml:space="preserve">v0.5 annotation will use a fine-tuned Stanza model (a</w:t>
+      </w:r>
+      <w:r>
+        <w:t xml:space="preserve"> </w:t>
+      </w:r>
+      <w:r>
+        <w:rPr>
+          <w:i/>
+          <w:iCs/>
+        </w:rPr>
+        <w:t xml:space="preserve">fine-tuned</w:t>
+      </w:r>
+      <w:r>
+        <w:t xml:space="preserve"> </w:t>
+      </w:r>
+      <w:r>
+        <w:t xml:space="preserve">model is</w:t>
+      </w:r>
+      <w:r>
+        <w:t xml:space="preserve"> </w:t>
+      </w:r>
+      <w:r>
+        <w:t xml:space="preserve">one that has been further trained on a smaller, target-specific dataset on top</w:t>
+      </w:r>
+      <w:r>
+        <w:t xml:space="preserve"> </w:t>
+      </w:r>
+      <w:r>
+        <w:t xml:space="preserve">of its general-purpose training, so that it adapts to the particular text type</w:t>
+      </w:r>
+      <w:r>
+        <w:t xml:space="preserve"> </w:t>
+      </w:r>
+      <w:r>
+        <w:t xml:space="preserve">in question) trained on TITUS Armenian material. The Stanza output for each</w:t>
+      </w:r>
+      <w:r>
+        <w:t xml:space="preserve"> </w:t>
+      </w:r>
+      <w:r>
+        <w:t xml:space="preserve">sentence is then normalised to the PROIEL XML 2.0 schema; AthDGC publishes</w:t>
+      </w:r>
+      <w:r>
+        <w:t xml:space="preserve"> </w:t>
+      </w:r>
+      <w:r>
+        <w:t xml:space="preserve">PROIEL XML 2.0 only, with no CoNLL-U (the line-by-line tab-separated format</w:t>
+      </w:r>
+      <w:r>
+        <w:t xml:space="preserve"> </w:t>
+      </w:r>
+      <w:r>
+        <w:t xml:space="preserve">used by the Universal Dependencies project, with one token per line and one</w:t>
+      </w:r>
+      <w:r>
+        <w:t xml:space="preserve"> </w:t>
+      </w:r>
+      <w:r>
+        <w:t xml:space="preserve">column per annotation attribute) or other format offered, since the analytical</w:t>
+      </w:r>
+      <w:r>
+        <w:t xml:space="preserve"> </w:t>
+      </w:r>
+      <w:r>
+        <w:t xml:space="preserve">pipeline downstream of the corpus</w:t>
       </w:r>
       <w:r>
         <w:t xml:space="preserve"> </w:t>
@@ -2152,7 +2389,7 @@
               <w:pStyle w:val="Compact"/>
             </w:pPr>
             <w:r>
-              <w:t xml:space="preserve">PROIEL XML 2.0 (primary); JSONL partitions (a plain-text format that stores one annotated sentence per line, used for fast streaming); Neo4j alignment-graph dump (Neo4j is a graph database that stores connections rather than tables, used here to store the cross-lingual alignment); Qdrant vector store (a vector database that stores LaBSE embeddings for similarity search)</w:t>
+              <w:t xml:space="preserve">PROIEL XML 2.0 (the file format developed at the University of Oslo for storing each sentence as a tree of word-by-word grammatical relations; this is the primary format of the corpus); JSONL partitions (JSON Lines, a plain-text format that stores one annotated sentence per line, used here for fast streaming through the analytical pipeline); Neo4j alignment-graph dump (Neo4j is a graph database that stores data as connections between nodes rather than as rows in tables, used here to store which token in one language corresponds to which token in another); Qdrant vector store (Qdrant is a vector database that stores LaBSE numeric sentence representations for fast similarity search across the corpus)</w:t>
             </w:r>
           </w:p>
         </w:tc>
@@ -5109,13 +5346,25 @@
         <w:t xml:space="preserve">dobj</w:t>
       </w:r>
       <w:r>
-        <w:t xml:space="preserve">), the house-style check, the argument-frame extractor, the</w:t>
-      </w:r>
-      <w:r>
-        <w:t xml:space="preserve"> </w:t>
-      </w:r>
-      <w:r>
-        <w:t xml:space="preserve">Stanza fine-tuning scripts, the</w:t>
+        <w:t xml:space="preserve">; UD here is Universal Dependencies, the alternative</w:t>
+      </w:r>
+      <w:r>
+        <w:t xml:space="preserve"> </w:t>
+      </w:r>
+      <w:r>
+        <w:t xml:space="preserve">treebanking framework whose label inventory is incompatible with PROIEL), the</w:t>
+      </w:r>
+      <w:r>
+        <w:t xml:space="preserve"> </w:t>
+      </w:r>
+      <w:r>
+        <w:t xml:space="preserve">house-style check, the argument-frame extractor, the Stanza fine-tuning</w:t>
+      </w:r>
+      <w:r>
+        <w:t xml:space="preserve"> </w:t>
+      </w:r>
+      <w:r>
+        <w:t xml:space="preserve">scripts, the</w:t>
       </w:r>
       <w:r>
         <w:t xml:space="preserve"> </w:t>
@@ -5130,13 +5379,13 @@
         <w:t xml:space="preserve"> </w:t>
       </w:r>
       <w:r>
-        <w:t xml:space="preserve">PyPI package (PyPI is the Python</w:t>
-      </w:r>
-      <w:r>
-        <w:t xml:space="preserve"> </w:t>
-      </w:r>
-      <w:r>
-        <w:t xml:space="preserve">Package Index, the central archive that the</w:t>
+        <w:t xml:space="preserve">PyPI package (PyPI is the Python Package Index,</w:t>
+      </w:r>
+      <w:r>
+        <w:t xml:space="preserve"> </w:t>
+      </w:r>
+      <w:r>
+        <w:t xml:space="preserve">the central archive that the</w:t>
       </w:r>
       <w:r>
         <w:t xml:space="preserve"> </w:t>
@@ -5151,37 +5400,67 @@
         <w:t xml:space="preserve"> </w:t>
       </w:r>
       <w:r>
-        <w:t xml:space="preserve">installer downloads packages</w:t>
-      </w:r>
-      <w:r>
-        <w:t xml:space="preserve"> </w:t>
-      </w:r>
-      <w:r>
-        <w:t xml:space="preserve">from), and the three Hugging Face model repositories whose weights upload at</w:t>
-      </w:r>
-      <w:r>
-        <w:t xml:space="preserve"> </w:t>
-      </w:r>
-      <w:r>
-        <w:t xml:space="preserve">v0.5 (Hugging Face is a public hosting platform for machine-learning models</w:t>
-      </w:r>
-      <w:r>
-        <w:t xml:space="preserve"> </w:t>
-      </w:r>
-      <w:r>
-        <w:t xml:space="preserve">and datasets). The remaining modules are FORTHCOMING at v0.5: the LightSIDE-AthDGC</w:t>
-      </w:r>
-      <w:r>
-        <w:t xml:space="preserve"> </w:t>
-      </w:r>
-      <w:r>
-        <w:t xml:space="preserve">syntactic-feature fork and its export scripts, the NoSketch-style CWB indexer,</w:t>
-      </w:r>
-      <w:r>
-        <w:t xml:space="preserve"> </w:t>
-      </w:r>
-      <w:r>
-        <w:t xml:space="preserve">the Neo4j alignment viewer, the valency-frame database client, the</w:t>
+        <w:t xml:space="preserve">installer downloads packages from), and the</w:t>
+      </w:r>
+      <w:r>
+        <w:t xml:space="preserve"> </w:t>
+      </w:r>
+      <w:r>
+        <w:t xml:space="preserve">three Hugging Face model repositories whose weights upload at v0.5 (Hugging</w:t>
+      </w:r>
+      <w:r>
+        <w:t xml:space="preserve"> </w:t>
+      </w:r>
+      <w:r>
+        <w:t xml:space="preserve">Face is a public hosting platform for machine-learning models and datasets;</w:t>
+      </w:r>
+      <w:r>
+        <w:t xml:space="preserve"> </w:t>
+      </w:r>
+      <w:r>
+        <w:t xml:space="preserve">“weights”</w:t>
+      </w:r>
+      <w:r>
+        <w:t xml:space="preserve"> </w:t>
+      </w:r>
+      <w:r>
+        <w:t xml:space="preserve">here are the trained parameters of the Stanza model that allow it</w:t>
+      </w:r>
+      <w:r>
+        <w:t xml:space="preserve"> </w:t>
+      </w:r>
+      <w:r>
+        <w:t xml:space="preserve">to parse new sentences). The remaining modules are FORTHCOMING at v0.5: the</w:t>
+      </w:r>
+      <w:r>
+        <w:t xml:space="preserve"> </w:t>
+      </w:r>
+      <w:r>
+        <w:t xml:space="preserve">LightSIDE-AthDGC syntactic-feature fork and its export scripts, the</w:t>
+      </w:r>
+      <w:r>
+        <w:t xml:space="preserve"> </w:t>
+      </w:r>
+      <w:r>
+        <w:t xml:space="preserve">NoSketch-style CWB indexer (NoSketch Engine is an open-source concordancer</w:t>
+      </w:r>
+      <w:r>
+        <w:t xml:space="preserve"> </w:t>
+      </w:r>
+      <w:r>
+        <w:t xml:space="preserve">interface; CWB is the IMS Open Corpus Workbench, the back-end indexing engine</w:t>
+      </w:r>
+      <w:r>
+        <w:t xml:space="preserve"> </w:t>
+      </w:r>
+      <w:r>
+        <w:t xml:space="preserve">that powers it), the Neo4j alignment viewer (a web-based interface to the</w:t>
+      </w:r>
+      <w:r>
+        <w:t xml:space="preserve"> </w:t>
+      </w:r>
+      <w:r>
+        <w:t xml:space="preserve">Neo4j alignment graph described in §3), the valency-frame database client, the</w:t>
       </w:r>
       <w:r>
         <w:t xml:space="preserve"> </w:t>
@@ -5232,43 +5511,67 @@
         <w:pStyle w:val="BodyText"/>
       </w:pPr>
       <w:r>
-        <w:t xml:space="preserve">Across the toolkit, the annotation layer and the corpus samples are CC-BY-4.0;</w:t>
-      </w:r>
-      <w:r>
-        <w:t xml:space="preserve"> </w:t>
-      </w:r>
-      <w:r>
-        <w:t xml:space="preserve">the tool code is Apache-2.0 (most modules), MIT (the Quarto pack and the</w:t>
-      </w:r>
-      <w:r>
-        <w:t xml:space="preserve"> </w:t>
-      </w:r>
-      <w:r>
-        <w:t xml:space="preserve">Neo4j viewer; the MIT licence is a short permissive open-source licence widely</w:t>
-      </w:r>
-      <w:r>
-        <w:t xml:space="preserve"> </w:t>
-      </w:r>
-      <w:r>
-        <w:t xml:space="preserve">used for academic web tooling), BSD-3-Clause (the upstream LightSIDE, retained</w:t>
-      </w:r>
-      <w:r>
-        <w:t xml:space="preserve"> </w:t>
-      </w:r>
-      <w:r>
-        <w:t xml:space="preserve">on the patch set), and GPL-3.0 (the upstream CWB indexer, retained on the</w:t>
-      </w:r>
-      <w:r>
-        <w:t xml:space="preserve"> </w:t>
-      </w:r>
-      <w:r>
-        <w:t xml:space="preserve">index builder; GPL-3.0 is the GNU General Public License version 3, a</w:t>
-      </w:r>
-      <w:r>
-        <w:t xml:space="preserve"> </w:t>
-      </w:r>
-      <w:r>
-        <w:t xml:space="preserve">copyleft licence that requires derivative works to ship under the same terms).</w:t>
+        <w:t xml:space="preserve">Across the toolkit, the annotation layer and the corpus samples are CC-BY-4.0</w:t>
+      </w:r>
+      <w:r>
+        <w:t xml:space="preserve"> </w:t>
+      </w:r>
+      <w:r>
+        <w:t xml:space="preserve">(the Creative Commons Attribution 4.0 International licence, which permits</w:t>
+      </w:r>
+      <w:r>
+        <w:t xml:space="preserve"> </w:t>
+      </w:r>
+      <w:r>
+        <w:t xml:space="preserve">reuse with credit); the tool code is Apache-2.0 (a permissive open-source</w:t>
+      </w:r>
+      <w:r>
+        <w:t xml:space="preserve"> </w:t>
+      </w:r>
+      <w:r>
+        <w:t xml:space="preserve">software licence widely used in the academic computational humanities; most</w:t>
+      </w:r>
+      <w:r>
+        <w:t xml:space="preserve"> </w:t>
+      </w:r>
+      <w:r>
+        <w:t xml:space="preserve">modules use this), MIT (the Quarto pack and the Neo4j viewer; the MIT licence</w:t>
+      </w:r>
+      <w:r>
+        <w:t xml:space="preserve"> </w:t>
+      </w:r>
+      <w:r>
+        <w:t xml:space="preserve">is a short permissive open-source licence widely used for academic web</w:t>
+      </w:r>
+      <w:r>
+        <w:t xml:space="preserve"> </w:t>
+      </w:r>
+      <w:r>
+        <w:t xml:space="preserve">tooling), BSD-3-Clause (the Berkeley Software Distribution 3-Clause licence,</w:t>
+      </w:r>
+      <w:r>
+        <w:t xml:space="preserve"> </w:t>
+      </w:r>
+      <w:r>
+        <w:t xml:space="preserve">a permissive open-source licence inherited from the upstream LightSIDE</w:t>
+      </w:r>
+      <w:r>
+        <w:t xml:space="preserve"> </w:t>
+      </w:r>
+      <w:r>
+        <w:t xml:space="preserve">project), and GPL-3.0 (the upstream CWB indexer, retained on the index</w:t>
+      </w:r>
+      <w:r>
+        <w:t xml:space="preserve"> </w:t>
+      </w:r>
+      <w:r>
+        <w:t xml:space="preserve">builder; GPL-3.0 is the GNU General Public License version 3, a copyleft</w:t>
+      </w:r>
+      <w:r>
+        <w:t xml:space="preserve"> </w:t>
+      </w:r>
+      <w:r>
+        <w:t xml:space="preserve">licence that requires derivative works to ship under the same terms).</w:t>
       </w:r>
     </w:p>
     <w:p>
@@ -5276,13 +5579,41 @@
         <w:pStyle w:val="BodyText"/>
       </w:pPr>
       <w:r>
-        <w:t xml:space="preserve">Two automated gates run on every community pull request, namely a PROIEL XML</w:t>
-      </w:r>
-      <w:r>
-        <w:t xml:space="preserve"> </w:t>
-      </w:r>
-      <w:r>
-        <w:t xml:space="preserve">2.0 schema validator (which rejects UD-style labels such as</w:t>
+        <w:t xml:space="preserve">Two automated gates run on every community pull request (a</w:t>
+      </w:r>
+      <w:r>
+        <w:t xml:space="preserve"> </w:t>
+      </w:r>
+      <w:r>
+        <w:rPr>
+          <w:i/>
+          <w:iCs/>
+        </w:rPr>
+        <w:t xml:space="preserve">pull request</w:t>
+      </w:r>
+      <w:r>
+        <w:t xml:space="preserve"> </w:t>
+      </w:r>
+      <w:r>
+        <w:t xml:space="preserve">is</w:t>
+      </w:r>
+      <w:r>
+        <w:t xml:space="preserve"> </w:t>
+      </w:r>
+      <w:r>
+        <w:t xml:space="preserve">a proposed code change submitted by an external contributor for review before</w:t>
+      </w:r>
+      <w:r>
+        <w:t xml:space="preserve"> </w:t>
+      </w:r>
+      <w:r>
+        <w:t xml:space="preserve">it is merged into the public repository), namely a PROIEL XML 2.0 schema</w:t>
+      </w:r>
+      <w:r>
+        <w:t xml:space="preserve"> </w:t>
+      </w:r>
+      <w:r>
+        <w:t xml:space="preserve">validator (which rejects UD-style labels such as</w:t>
       </w:r>
       <w:r>
         <w:t xml:space="preserve"> </w:t>
@@ -5330,7 +5661,13 @@
         <w:t xml:space="preserve">case</w:t>
       </w:r>
       <w:r>
-        <w:t xml:space="preserve">) and a house-style check that enforces the project style guide.</w:t>
+        <w:t xml:space="preserve">; these are the Universal Dependencies labels that AthDGC does not</w:t>
+      </w:r>
+      <w:r>
+        <w:t xml:space="preserve"> </w:t>
+      </w:r>
+      <w:r>
+        <w:t xml:space="preserve">publish) and a house-style check that enforces the project style guide.</w:t>
       </w:r>
     </w:p>
     <w:bookmarkEnd w:id="29"/>
@@ -5903,7 +6240,19 @@
         <w:t xml:space="preserve">counterpart is passive</w:t>
       </w:r>
       <w:r>
-        <w:t xml:space="preserve">, which the Neo4j Cypher query</w:t>
+        <w:t xml:space="preserve">, which is expressed in Cypher (Cypher is the query</w:t>
+      </w:r>
+      <w:r>
+        <w:t xml:space="preserve"> </w:t>
+      </w:r>
+      <w:r>
+        <w:t xml:space="preserve">language of Neo4j, structurally analogous to SQL for relational databases, in</w:t>
+      </w:r>
+      <w:r>
+        <w:t xml:space="preserve"> </w:t>
+      </w:r>
+      <w:r>
+        <w:t xml:space="preserve">which</w:t>
       </w:r>
       <w:r>
         <w:t xml:space="preserve"> </w:t>
@@ -5912,13 +6261,31 @@
         <w:rPr>
           <w:rStyle w:val="VerbatimChar"/>
         </w:rPr>
+        <w:t xml:space="preserve">MATCH</w:t>
+      </w:r>
+      <w:r>
+        <w:t xml:space="preserve"> </w:t>
+      </w:r>
+      <w:r>
+        <w:t xml:space="preserve">patterns are drawn directly with arrows between nodes) as</w:t>
+      </w:r>
+      <w:r>
+        <w:t xml:space="preserve"> </w:t>
+      </w:r>
+      <w:r>
+        <w:rPr>
+          <w:rStyle w:val="VerbatimChar"/>
+        </w:rPr>
         <w:t xml:space="preserve">MATCH (gk:Token {lang:"grc", tense:"aor", voice:"act"})-[:TRANSLATED_AS]-&gt;(la:Token {lang:"lat", voice:"pass"}) RETURN gk, la</w:t>
       </w:r>
       <w:r>
-        <w:t xml:space="preserve"> </w:t>
-      </w:r>
-      <w:r>
-        <w:t xml:space="preserve">answers across the entire NT-aligned partition.</w:t>
+        <w:t xml:space="preserve">,</w:t>
+      </w:r>
+      <w:r>
+        <w:t xml:space="preserve"> </w:t>
+      </w:r>
+      <w:r>
+        <w:t xml:space="preserve">and which is answered across the entire NT-aligned partition in a single pass.</w:t>
       </w:r>
     </w:p>
     <w:p>
@@ -5939,7 +6306,29 @@
         <w:t xml:space="preserve">computational diachronic NLP</w:t>
       </w:r>
       <w:r>
-        <w:t xml:space="preserve">. The fine-tuned Stanza checkpoints</w:t>
+        <w:t xml:space="preserve">. The fine-tuned Stanza checkpoints (a</w:t>
+      </w:r>
+      <w:r>
+        <w:t xml:space="preserve"> </w:t>
+      </w:r>
+      <w:r>
+        <w:rPr>
+          <w:i/>
+          <w:iCs/>
+        </w:rPr>
+        <w:t xml:space="preserve">checkpoint</w:t>
+      </w:r>
+      <w:r>
+        <w:t xml:space="preserve"> </w:t>
+      </w:r>
+      <w:r>
+        <w:t xml:space="preserve">is a saved snapshot of a trained model’s numeric parameters, which</w:t>
+      </w:r>
+      <w:r>
+        <w:t xml:space="preserve"> </w:t>
+      </w:r>
+      <w:r>
+        <w:t xml:space="preserve">can be loaded back into Stanza to parse new sentences without re-training)</w:t>
       </w:r>
       <w:r>
         <w:t xml:space="preserve"> </w:t>
@@ -6026,7 +6415,7 @@
         <w:t xml:space="preserve"> </w:t>
       </w:r>
       <w:r>
-        <w:t xml:space="preserve">uploaded. In broad terms, the PyPI package</w:t>
+        <w:t xml:space="preserve">(the trained parameter files that the checkpoints comprise) uploaded. In broad terms, the PyPI package</w:t>
       </w:r>
       <w:r>
         <w:t xml:space="preserve"> </w:t>
@@ -6233,19 +6622,49 @@
         <w:t xml:space="preserve"> </w:t>
       </w:r>
       <w:r>
-        <w:t xml:space="preserve">any JSONL corpus; the Quarto template pack generates the whole multi-output</w:t>
-      </w:r>
-      <w:r>
-        <w:t xml:space="preserve"> </w:t>
-      </w:r>
-      <w:r>
-        <w:t xml:space="preserve">site (HTML, Reveal.js slides, .docx, .pptx, Beamer, A0 poster) from a single</w:t>
-      </w:r>
-      <w:r>
-        <w:t xml:space="preserve"> </w:t>
-      </w:r>
-      <w:r>
-        <w:t xml:space="preserve">source. Both are open-source and reusable by other historical-treebank</w:t>
+        <w:t xml:space="preserve">any JSONL (JSON Lines, the line-per-record plain-text format) corpus; the</w:t>
+      </w:r>
+      <w:r>
+        <w:t xml:space="preserve"> </w:t>
+      </w:r>
+      <w:r>
+        <w:t xml:space="preserve">Quarto template pack (Quarto is an open-source publishing system that builds</w:t>
+      </w:r>
+      <w:r>
+        <w:t xml:space="preserve"> </w:t>
+      </w:r>
+      <w:r>
+        <w:t xml:space="preserve">websites, slides, papers, and posters from a single source file) generates the</w:t>
+      </w:r>
+      <w:r>
+        <w:t xml:space="preserve"> </w:t>
+      </w:r>
+      <w:r>
+        <w:t xml:space="preserve">whole multi-output site, namely HTML, Reveal.js slides (Reveal.js is a</w:t>
+      </w:r>
+      <w:r>
+        <w:t xml:space="preserve"> </w:t>
+      </w:r>
+      <w:r>
+        <w:t xml:space="preserve">browser-based slide framework that renders slides as web pages), .docx (the</w:t>
+      </w:r>
+      <w:r>
+        <w:t xml:space="preserve"> </w:t>
+      </w:r>
+      <w:r>
+        <w:t xml:space="preserve">Microsoft Word document format), .pptx (the Microsoft PowerPoint slide</w:t>
+      </w:r>
+      <w:r>
+        <w:t xml:space="preserve"> </w:t>
+      </w:r>
+      <w:r>
+        <w:t xml:space="preserve">format), Beamer (a LaTeX-based academic slide format), and an A0-format</w:t>
+      </w:r>
+      <w:r>
+        <w:t xml:space="preserve"> </w:t>
+      </w:r>
+      <w:r>
+        <w:t xml:space="preserve">academic poster, from a single source. Both are open-source and reusable by other historical-treebank</w:t>
       </w:r>
       <w:r>
         <w:t xml:space="preserve"> </w:t>

</xml_diff>

<commit_message>
AthDGC site update 2026-06-10 19:19 --- clean Quarto render, real Zenodo DOI 10.5281/zenodo.20439182, samples-only public release
</commit_message>
<xml_diff>
--- a/data_paper.docx
+++ b/data_paper.docx
@@ -125,7 +125,7 @@
         <w:t xml:space="preserve">“Athens-PROIEL”</w:t>
       </w:r>
       <w:r>
-        <w:t xml:space="preserve">) is an open, end-to-end pipeline and dataset. It is,</w:t>
+        <w:t xml:space="preserve">) is an open, end-to-end workflow and dataset. It is,</w:t>
       </w:r>
       <w:r>
         <w:t xml:space="preserve"> </w:t>
@@ -206,7 +206,7 @@
         <w:t xml:space="preserve"> </w:t>
       </w:r>
       <w:r>
-        <w:t xml:space="preserve">Annotation uses the Stanford Stanza PROIEL-trained pipeline; sentence-level</w:t>
+        <w:t xml:space="preserve">Annotation uses the Stanford Stanza PROIEL-trained workflow; sentence-level</w:t>
       </w:r>
       <w:r>
         <w:t xml:space="preserve"> </w:t>
@@ -447,7 +447,7 @@
         <w:pStyle w:val="BodyText"/>
       </w:pPr>
       <w:r>
-        <w:t xml:space="preserve">Accordingly, no openly licensed, end-to-end pipeline currently covers the full</w:t>
+        <w:t xml:space="preserve">Accordingly, no openly licensed, end-to-end workflow currently covers the full</w:t>
       </w:r>
       <w:r>
         <w:t xml:space="preserve"> </w:t>
@@ -840,7 +840,7 @@
         <w:pStyle w:val="FirstParagraph"/>
       </w:pPr>
       <w:r>
-        <w:t xml:space="preserve">The AthDGC pipeline runs in six stages: discovery, filtering, conversion,</w:t>
+        <w:t xml:space="preserve">The AthDGC workflow runs in six stages: discovery, filtering, conversion,</w:t>
       </w:r>
       <w:r>
         <w:t xml:space="preserve"> </w:t>
@@ -1544,7 +1544,7 @@
         <w:pStyle w:val="FirstParagraph"/>
       </w:pPr>
       <w:r>
-        <w:t xml:space="preserve">Annotation is performed sentence by sentence with the Stanford Stanza pipeline</w:t>
+        <w:t xml:space="preserve">Annotation is performed sentence by sentence with the Stanford Stanza processor</w:t>
       </w:r>
       <w:r>
         <w:t xml:space="preserve"> </w:t>
@@ -1571,7 +1571,7 @@
         <w:t xml:space="preserve"> </w:t>
       </w:r>
       <w:r>
-        <w:t xml:space="preserve">single pipeline) ships PROIEL-trained models for several of the older</w:t>
+        <w:t xml:space="preserve">single workflow) ships PROIEL-trained models for several of the older</w:t>
       </w:r>
       <w:r>
         <w:t xml:space="preserve"> </w:t>
@@ -1643,7 +1643,7 @@
         <w:t xml:space="preserve"> </w:t>
       </w:r>
       <w:r>
-        <w:t xml:space="preserve">Armenian is annotated through a PROIEL-style pipeline currently under</w:t>
+        <w:t xml:space="preserve">Armenian is annotated through a PROIEL-style workflow currently under</w:t>
       </w:r>
       <w:r>
         <w:t xml:space="preserve"> </w:t>
@@ -1719,7 +1719,7 @@
         <w:t xml:space="preserve"> </w:t>
       </w:r>
       <w:r>
-        <w:t xml:space="preserve">pipeline downstream of the corpus</w:t>
+        <w:t xml:space="preserve">workflow downstream of the corpus</w:t>
       </w:r>
       <w:r>
         <w:t xml:space="preserve"> </w:t>
@@ -2389,7 +2389,7 @@
               <w:pStyle w:val="Compact"/>
             </w:pPr>
             <w:r>
-              <w:t xml:space="preserve">PROIEL XML 2.0 (the file format developed at the University of Oslo for storing each sentence as a tree of word-by-word grammatical relations; this is the primary format of the corpus); JSONL partitions (JSON Lines, a plain-text format that stores one annotated sentence per line, used here for fast streaming through the analytical pipeline); Neo4j alignment-graph dump (Neo4j is a graph database that stores data as connections between nodes rather than as rows in tables, used here to store which token in one language corresponds to which token in another); Qdrant vector store (Qdrant is a vector database that stores LaBSE numeric sentence representations for fast similarity search across the corpus)</w:t>
+              <w:t xml:space="preserve">PROIEL XML 2.0 (the file format developed at the University of Oslo for storing each sentence as a tree of word-by-word grammatical relations; this is the primary format of the corpus); JSONL partitions (JSON Lines, a plain-text format that stores one annotated sentence per line, used here for fast streaming through the analytical workflow); Neo4j alignment-graph dump (Neo4j is a graph database that stores data as connections between nodes rather than as rows in tables, used here to store which token in one language corresponds to which token in another); Qdrant vector store (Qdrant is a vector database that stores LaBSE numeric sentence representations for fast similarity search across the corpus)</w:t>
             </w:r>
           </w:p>
         </w:tc>
@@ -5280,7 +5280,7 @@
         <w:t xml:space="preserve"> </w:t>
       </w:r>
       <w:r>
-        <w:t xml:space="preserve">scale, the PROIEL XML 2.0 exporter that runs inside the build pipeline, and the</w:t>
+        <w:t xml:space="preserve">scale, the PROIEL XML 2.0 exporter that runs inside the build workflow, and the</w:t>
       </w:r>
       <w:r>
         <w:t xml:space="preserve"> </w:t>
@@ -6844,7 +6844,7 @@
         <w:t xml:space="preserve"> </w:t>
       </w:r>
       <w:r>
-        <w:t xml:space="preserve">toolkit, the PROIEL XML 2.0 exporter inside the build pipeline, and the Stanza</w:t>
+        <w:t xml:space="preserve">toolkit, the PROIEL XML 2.0 exporter inside the build workflow, and the Stanza</w:t>
       </w:r>
       <w:r>
         <w:t xml:space="preserve"> </w:t>

</xml_diff>

<commit_message>
AthDGC site update 2026-06-10 19:55 --- clean Quarto render, real Zenodo DOI 10.5281/zenodo.20439182, samples-only public release
</commit_message>
<xml_diff>
--- a/data_paper.docx
+++ b/data_paper.docx
@@ -243,6 +243,40 @@
       </w:r>
       <w:r>
         <w:t xml:space="preserve">counts are reported as the v0.5 release notes, after the audit pass completes.</w:t>
+      </w:r>
+    </w:p>
+    <w:p>
+      <w:pPr>
+        <w:pStyle w:val="FirstParagraph"/>
+      </w:pPr>
+      <w:r>
+        <w:t xml:space="preserve">For all parts of this platform (site, tools, corpus, slides, launch report) please cite:</w:t>
+      </w:r>
+    </w:p>
+    <w:p>
+      <w:pPr>
+        <w:pStyle w:val="BodyText"/>
+      </w:pPr>
+      <w:r>
+        <w:t xml:space="preserve">Lavidas, Nikolaos, Kiki Nikiforidou, Dag Haug, Leonid Kulikov, Vassiliki Geka, Vassileios Symeonidis, Theodoros Michalareas, Sofia Chionidi, Anastasia Tsiropina, Eleni Plakoutsi, and Evangelos Argyropoulos. 2026.</w:t>
+      </w:r>
+      <w:r>
+        <w:t xml:space="preserve"> </w:t>
+      </w:r>
+      <w:r>
+        <w:t xml:space="preserve">AthDGC: Athens Digital Glossa Chronos</w:t>
+      </w:r>
+      <w:r>
+        <w:t xml:space="preserve"> </w:t>
+      </w:r>
+      <w:r>
+        <w:t xml:space="preserve">(A platform of computational tools and a diachronic Greek treebank, with Indo-European parallels). National and Kapodistrian University of Athens, Athens Digital Glossa Chronos Research Network. Zenodo (an open research-data repository hosted at CERN that mints permanent DOIs).</w:t>
+      </w:r>
+      <w:r>
+        <w:t xml:space="preserve"> </w:t>
+      </w:r>
+      <w:r>
+        <w:t xml:space="preserve">https://doi.org/10.5281/zenodo.20439182</w:t>
       </w:r>
     </w:p>
     <w:bookmarkStart w:id="14" w:name="overview"/>

</xml_diff>

<commit_message>
AthDGC site update 2026-06-10 20:31 --- clean Quarto render, real Zenodo DOI 10.5281/zenodo.20439182, samples-only public release
</commit_message>
<xml_diff>
--- a/data_paper.docx
+++ b/data_paper.docx
@@ -246,21 +246,10 @@
       </w:r>
     </w:p>
     <w:p>
-      <w:r>
-        <w:pict>
-          <v:rect style="width:0;height:1.5pt" o:hralign="center" o:hrstd="t" o:hr="t"/>
-        </w:pict>
-      </w:r>
-    </w:p>
-    <w:p>
       <w:pPr>
         <w:pStyle w:val="FirstParagraph"/>
       </w:pPr>
       <w:r>
-        <w:rPr>
-          <w:b/>
-          <w:bCs/>
-        </w:rPr>
         <w:t xml:space="preserve">For all parts of this platform (site, tools, corpus, slides, launch report) please cite:</w:t>
       </w:r>
     </w:p>
@@ -275,10 +264,6 @@
         <w:t xml:space="preserve"> </w:t>
       </w:r>
       <w:r>
-        <w:rPr>
-          <w:i/>
-          <w:iCs/>
-        </w:rPr>
         <w:t xml:space="preserve">AthDGC: Athens Digital Glossa Chronos</w:t>
       </w:r>
       <w:r>
@@ -291,17 +276,7 @@
         <w:t xml:space="preserve"> </w:t>
       </w:r>
       <w:r>
-        <w:rPr>
-          <w:rStyle w:val="VerbatimChar"/>
-        </w:rPr>
         <w:t xml:space="preserve">https://doi.org/10.5281/zenodo.20439182</w:t>
-      </w:r>
-    </w:p>
-    <w:p>
-      <w:r>
-        <w:pict>
-          <v:rect style="width:0;height:1.5pt" o:hralign="center" o:hrstd="t" o:hr="t"/>
-        </w:pict>
       </w:r>
     </w:p>
     <w:bookmarkStart w:id="14" w:name="overview"/>

</xml_diff>

<commit_message>
AthDGC site update 2026-06-10 20:46 --- clean Quarto render, real Zenodo DOI 10.5281/zenodo.20439182, samples-only public release
</commit_message>
<xml_diff>
--- a/data_paper.docx
+++ b/data_paper.docx
@@ -250,6 +250,10 @@
         <w:pStyle w:val="FirstParagraph"/>
       </w:pPr>
       <w:r>
+        <w:rPr>
+          <w:b/>
+          <w:bCs/>
+        </w:rPr>
         <w:t xml:space="preserve">For all parts of this platform (site, tools, corpus, slides, launch report) please cite:</w:t>
       </w:r>
     </w:p>
@@ -264,6 +268,10 @@
         <w:t xml:space="preserve"> </w:t>
       </w:r>
       <w:r>
+        <w:rPr>
+          <w:i/>
+          <w:iCs/>
+        </w:rPr>
         <w:t xml:space="preserve">AthDGC: Athens Digital Glossa Chronos</w:t>
       </w:r>
       <w:r>
@@ -276,6 +284,9 @@
         <w:t xml:space="preserve"> </w:t>
       </w:r>
       <w:r>
+        <w:rPr>
+          <w:rStyle w:val="VerbatimChar"/>
+        </w:rPr>
         <w:t xml:space="preserve">https://doi.org/10.5281/zenodo.20439182</w:t>
       </w:r>
     </w:p>

</xml_diff>

<commit_message>
AthDGC site update 2026-06-10 21:01 --- clean Quarto render, real Zenodo DOI 10.5281/zenodo.20439182, samples-only public release
</commit_message>
<xml_diff>
--- a/data_paper.docx
+++ b/data_paper.docx
@@ -224,7 +224,7 @@
         <w:t xml:space="preserve"> </w:t>
       </w:r>
       <w:r>
-        <w:t xml:space="preserve">The v0.4 release ships curated samples and the open-source toolkit; the full</w:t>
+        <w:t xml:space="preserve">The v0.4 release provides curated samples and the open-source toolkit; the full</w:t>
       </w:r>
       <w:r>
         <w:t xml:space="preserve"> </w:t>
@@ -788,7 +788,7 @@
         <w:t xml:space="preserve">(Qi et al. 2020, 101–8)</w:t>
       </w:r>
       <w:r>
-        <w:t xml:space="preserve">. Stanza (Stanford’s open-source Python toolkit for automatic linguistic annotation, which performs tokenisation, lemmatisation, part-of-speech tagging, morphological analysis, and dependency parsing in a single workflow) ships PROIEL-trained models for several of the older Indo-European languages:</w:t>
+        <w:t xml:space="preserve">. Stanza (Stanford’s open-source Python toolkit for automatic linguistic annotation, which performs tokenisation, lemmatisation, part-of-speech tagging, morphological analysis, and dependency parsing in a single workflow) provides PROIEL-trained models for several of the older Indo-European languages:</w:t>
       </w:r>
       <w:r>
         <w:t xml:space="preserve"> </w:t>
@@ -1555,7 +1555,7 @@
               <w:pStyle w:val="Compact"/>
             </w:pPr>
             <w:r>
-              <w:t xml:space="preserve">v0.4 is samples-only on the public site; the full annotated partitions are under audit on GRNET ARIS and ship at v0.5</w:t>
+              <w:t xml:space="preserve">v0.4 is samples-only on the public site; the full annotated partitions are under audit on GRNET ARIS and release at v0.5</w:t>
             </w:r>
           </w:p>
         </w:tc>
@@ -3221,7 +3221,7 @@
         <w:pStyle w:val="BodyText"/>
       </w:pPr>
       <w:r>
-        <w:t xml:space="preserve">Verified per-witness aligned-verse counts ship in the v0.5 release notes once the ARIS audit pass closes. Accordingly, the v0.4 release ships the curated samples on the Samples page rather than full per-witness counts.</w:t>
+        <w:t xml:space="preserve">Verified per-witness aligned-verse counts be reported in the v0.5 release notes once the ARIS audit pass closes. Accordingly, the v0.4 release provides the curated samples on the Samples page rather than full per-witness counts.</w:t>
       </w:r>
     </w:p>
     <w:bookmarkEnd w:id="25"/>
@@ -4124,7 +4124,7 @@
         <w:t xml:space="preserve"> </w:t>
       </w:r>
       <w:r>
-        <w:t xml:space="preserve">ships curated samples only for the v0.4 release. The full annotated corpus partitions remain under audit on the GRNET ARIS national HPC under allocation</w:t>
+        <w:t xml:space="preserve">provides curated samples only for the v0.4 release. The full annotated corpus partitions remain under audit on the GRNET ARIS national HPC under allocation</w:t>
       </w:r>
       <w:r>
         <w:t xml:space="preserve"> </w:t>
@@ -4136,7 +4136,7 @@
         <w:t xml:space="preserve">pa260305</w:t>
       </w:r>
       <w:r>
-        <w:t xml:space="preserve">; they ship at v0.5 as a separate Zenodo dataset record under CC-BY-4.0. The source-code snapshot at the v0.4.0 Zenodo record is Apache-2.0.</w:t>
+        <w:t xml:space="preserve">; they release at v0.5 as a separate Zenodo dataset record under CC-BY-4.0. The source-code snapshot at the v0.4.0 Zenodo record is Apache-2.0.</w:t>
       </w:r>
     </w:p>
     <w:p>
@@ -4158,7 +4158,7 @@
         </w:r>
       </w:hyperlink>
       <w:r>
-        <w:t xml:space="preserve">. Five modules are LIVE today (the Quarto template pack, the showcase generator, the corpus-fix toolkit, the PROIEL XML 2.0 exporter inside the build workflow, and the Stanza annotation job script). Eight are IN SETUP and ship with the v0.5 release. The LightSIDE-AthDGC syntactic-feature fork, the NoSketch-style concordancer, the Neo4j alignment viewer, the valency-frame database client, the retranslation-pair browser, and the retelling-chain explorer are FORTHCOMING at v0.5.</w:t>
+        <w:t xml:space="preserve">. Five modules are LIVE today (the Quarto template pack, the showcase generator, the corpus-fix toolkit, the PROIEL XML 2.0 exporter inside the build workflow, and the Stanza annotation job script). Eight are IN SETUP and be included with the v0.5 release. The LightSIDE-AthDGC syntactic-feature fork, the NoSketch-style concordancer, the Neo4j alignment viewer, the valency-frame database client, the retranslation-pair browser, and the retelling-chain explorer are FORTHCOMING at v0.5.</w:t>
       </w:r>
     </w:p>
     <w:bookmarkEnd w:id="34"/>
@@ -4581,6 +4581,11 @@
     </w:p>
     <w:bookmarkEnd w:id="41"/>
     <w:bookmarkEnd w:id="42"/>
+    <w:p>
+      <w:pPr>
+        <w:pStyle w:val="BodyText"/>
+      </w:pPr>
+    </w:p>
     <w:bookmarkEnd w:id="43"/>
     <w:sectPr>
       <w:footnotePr>

</xml_diff>

<commit_message>
AthDGC site update 2026-06-10 21:38 --- clean Quarto render, real Zenodo DOI 10.5281/zenodo.20439182, samples-only public release
</commit_message>
<xml_diff>
--- a/data_paper.docx
+++ b/data_paper.docx
@@ -119,13 +119,7 @@
         <w:pStyle w:val="Abstract"/>
       </w:pPr>
       <w:r>
-        <w:t xml:space="preserve">AthDGC (</w:t>
-      </w:r>
-      <w:r>
-        <w:t xml:space="preserve">“Athens-PROIEL”</w:t>
-      </w:r>
-      <w:r>
-        <w:t xml:space="preserve">) is an open, end-to-end workflow and dataset. It is,</w:t>
+        <w:t xml:space="preserve">AthDGC (“Athens-PROIEL”) is an open, end-to-end workflow and dataset. It is,</w:t>
       </w:r>
       <w:r>
         <w:t xml:space="preserve"> </w:t>
@@ -173,76 +167,73 @@
         <w:t xml:space="preserve"> </w:t>
       </w:r>
       <w:r>
-        <w:t xml:space="preserve">cross-alignment of the New Testament to Latin (Vulgate), Gothic (Wulfila),</w:t>
+        <w:t xml:space="preserve">cross-alignment of the New Testament to Latin (Vulgate), Gothic (Wulfila), Old</w:t>
       </w:r>
       <w:r>
         <w:t xml:space="preserve"> </w:t>
       </w:r>
       <w:r>
-        <w:t xml:space="preserve">Old Church Slavonic (Marianus), and Classical Armenian. AthDGC builds on the</w:t>
+        <w:t xml:space="preserve">Church Slavonic (Marianus), and Classical Armenian. AthDGC builds on the</w:t>
       </w:r>
       <w:r>
         <w:t xml:space="preserve"> </w:t>
       </w:r>
       <w:r>
-        <w:t xml:space="preserve">PROIEL Treebank Family</w:t>
+        <w:t xml:space="preserve">PROIEL Treebank Family (Haug and Jøhndal 2008, 27–34; Eckhoff et al. 2018,</w:t>
       </w:r>
       <w:r>
         <w:t xml:space="preserve"> </w:t>
       </w:r>
       <w:r>
-        <w:t xml:space="preserve">(Haug and Jøhndal 2008, 27–34; Eckhoff et al. 2018, 29–65)</w:t>
-      </w:r>
-      <w:r>
-        <w:t xml:space="preserve">, which</w:t>
+        <w:t xml:space="preserve">29–65), which established the schema and the Koine-Greek reference set for the</w:t>
       </w:r>
       <w:r>
         <w:t xml:space="preserve"> </w:t>
       </w:r>
       <w:r>
-        <w:t xml:space="preserve">established the schema and the Koine-Greek reference set for the project.</w:t>
+        <w:t xml:space="preserve">project. Annotation uses the Stanford Stanza PROIEL-trained workflow;</w:t>
       </w:r>
       <w:r>
         <w:t xml:space="preserve"> </w:t>
       </w:r>
       <w:r>
-        <w:t xml:space="preserve">Annotation uses the Stanford Stanza PROIEL-trained workflow; sentence-level</w:t>
+        <w:t xml:space="preserve">sentence-level alignment uses LaBSE, a multilingual sentence-embedding model;</w:t>
       </w:r>
       <w:r>
         <w:t xml:space="preserve"> </w:t>
       </w:r>
       <w:r>
-        <w:t xml:space="preserve">alignment uses LaBSE, a multilingual sentence-embedding model; word-level</w:t>
+        <w:t xml:space="preserve">word-level alignment uses multilingual-BERT attention through the AwesomeAlign</w:t>
       </w:r>
       <w:r>
         <w:t xml:space="preserve"> </w:t>
       </w:r>
       <w:r>
-        <w:t xml:space="preserve">alignment uses multilingual-BERT attention through the AwesomeAlign procedure.</w:t>
+        <w:t xml:space="preserve">procedure. The v0.4 release provides curated samples and the open-source</w:t>
       </w:r>
       <w:r>
         <w:t xml:space="preserve"> </w:t>
       </w:r>
       <w:r>
-        <w:t xml:space="preserve">The v0.4 release provides curated samples and the open-source toolkit; the full</w:t>
+        <w:t xml:space="preserve">toolkit; the full annotated corpus partitions remain under v0.5 audit on the</w:t>
       </w:r>
       <w:r>
         <w:t xml:space="preserve"> </w:t>
       </w:r>
       <w:r>
-        <w:t xml:space="preserve">annotated corpus partitions remain under v0.5 audit on the Greek national HPC.</w:t>
+        <w:t xml:space="preserve">Greek national HPC. Quantitative scale, per-witness verse counts, and per-</w:t>
       </w:r>
       <w:r>
         <w:t xml:space="preserve"> </w:t>
       </w:r>
       <w:r>
-        <w:t xml:space="preserve">Quantitative scale, per-witness verse counts, and per-period annotated-row</w:t>
+        <w:t xml:space="preserve">period annotated-row counts are reported as the v0.5 release notes, after the</w:t>
       </w:r>
       <w:r>
         <w:t xml:space="preserve"> </w:t>
       </w:r>
       <w:r>
-        <w:t xml:space="preserve">counts are reported as the v0.5 release notes, after the audit pass completes.</w:t>
+        <w:t xml:space="preserve">audit pass completes.</w:t>
       </w:r>
     </w:p>
     <w:p>
@@ -290,7 +281,7 @@
         <w:t xml:space="preserve">https://doi.org/10.5281/zenodo.20439182</w:t>
       </w:r>
     </w:p>
-    <w:bookmarkStart w:id="14" w:name="overview"/>
+    <w:bookmarkStart w:id="12" w:name="overview"/>
     <w:p>
       <w:pPr>
         <w:pStyle w:val="Heading2"/>
@@ -313,809 +304,278 @@
         <w:pStyle w:val="FirstParagraph"/>
       </w:pPr>
       <w:r>
-        <w:t xml:space="preserve">Greek is the longest continuously attested member of the Indo-European family, with a written record that spans roughly three millennia, from the Mycenaean tablets and the Homeric epics through the Classical and Hellenistic literature, the Koine of the New Testament and the Septuagint, the homiletic and hymnographic prose of the Late Antique and Byzantine periods, the increasingly vernacular registers of Late Byzantine and Early Modern Greek, and the standard Modern Greek that emerged after the orthographic reform of the late twentieth century. This continuity makes Greek a unique observatory for diachronic syntactic change: the same canonical text, whether the</w:t>
+        <w:t xml:space="preserve">Greek is the longest continuously attested member of the Indo-European family, with a written record that spans roughly three millennia, from the Mycenaean tablets and the Homeric epics through the Classical and Hellenistic literature, the Koine of the New Testament and the Septuagint, the homiletic and hymnographic prose of the Late Antique and Byzantine periods, the increasingly vernacular registers of Late Byzantine and Early Modern Greek, and the standard Modern Greek that emerged after the orthographic reform of the late twentieth century. This continuity makes Greek a unique observatory for diachronic syntactic change: the same canonical text, whether the Iliad, the New Testament, the Septuagint Psalms, or a classical historiographic passage, is re-rendered into Greek again and again across periods. The structural choices made by each generation of readers and translators leave a recoverable trace in the syntax of the resulting text.</w:t>
+      </w:r>
+    </w:p>
+    <w:p>
+      <w:pPr>
+        <w:pStyle w:val="BodyText"/>
+      </w:pPr>
+      <w:r>
+        <w:t xml:space="preserve">The PROIEL Treebank (Haug and Jøhndal 2008, 27–34; Eckhoff et al. 2018, 29–65) established the gold standard for syntactically annotated parallel Indo-European Bible corpora. PROIEL (the dependency-treebank standard for early Indo-European languages, developed at the University of Oslo) introduced a relation inventory specifically designed for the morphological richness and the free word order of the older Indo-European languages, and provided the Koine-Greek anchor sentence set against which any later diachronic-Greek effort is naturally measured. Its scope, however, is restricted to the New Testament and to a small number of language witnesses; it does not by design extend to Archaic, Classical, Byzantine, or Modern Greek, and it does not by design cover the cross-lingual alignment of the Bible to language families more distant than the four PROIEL witnesses (Greek, Latin, Gothic, Old Church Slavonic).</w:t>
+      </w:r>
+    </w:p>
+    <w:p>
+      <w:pPr>
+        <w:pStyle w:val="BodyText"/>
+      </w:pPr>
+      <w:r>
+        <w:t xml:space="preserve">Accordingly, no openly licensed, end-to-end workflow currently covers the full diachronic record of Greek at the same level of annotation, with explicit argument-structure tagging (the recovery of who does what to whom for every verb in the corpus), and with reproducible cross-lingual alignment (the machine-readable matching of corresponding words and sentences between texts in different languages) to its sister Indo-European languages. AthDGC closes that gap.</w:t>
+      </w:r>
+    </w:p>
+    <w:p>
+      <w:pPr>
+        <w:pStyle w:val="BodyText"/>
+      </w:pPr>
+      <w:r>
+        <w:t xml:space="preserve">The project’s specific scholarly focus is retranslation: the same canonical text is re-rendered into Greek across periods (Homeric, Koine, Byzantine, Modern) and into sister languages (Latin, Gothic, Old Church Slavonic, Classical Armenian) across the Indo-European family. The platform records these re-renderings as a retelling and retranslation chain (see §3.3 below), a machine-queryable structure in which the same passage is annotated for syntax, argument structure, and morphology at every node of the chain, so that the diachronic researcher can ask, with a single query, which structural patterns persist from Homer to the Kakridis-Kazantzakis prose Iliad of 1955, and which collapse under the Byzantine epitome of Tzetzes.</w:t>
+      </w:r>
+    </w:p>
+    <w:bookmarkEnd w:id="9"/>
+    <w:bookmarkStart w:id="10" w:name="repository-location"/>
+    <w:p>
+      <w:pPr>
+        <w:pStyle w:val="Heading3"/>
+      </w:pPr>
+      <w:r>
+        <w:t xml:space="preserve">1.2 Repository location</w:t>
+      </w:r>
+    </w:p>
+    <w:p>
+      <w:pPr>
+        <w:pStyle w:val="FirstParagraph"/>
+      </w:pPr>
+      <w:r>
+        <w:t xml:space="preserve">The public showcase of the platform is hosted at https://athdgc.github.io, and the v0.4.0 source-code snapshot is permanently deposited on Zenodo (an open-access research-data repository operated by CERN, which mints persistent DOIs for each deposit) under concept DOI 10.5281/zenodo.20439182. A concept DOI (a Digital Object Identifier that always resolves to the latest version of a deposited record) is the citation handle that does not change as the project versions advance; per-version DOIs are minted automatically on each release. The source repository AthDGC/Diachronic-Linguistics-Platform on GitHub remains private during the v0.5 audit pass, and becomes public at the v0.5 release, when the consolidated tools/ directory and the verified annotated partitions are in place.</w:t>
+      </w:r>
+    </w:p>
+    <w:bookmarkEnd w:id="10"/>
+    <w:bookmarkStart w:id="11" w:name="institutional-context"/>
+    <w:p>
+      <w:pPr>
+        <w:pStyle w:val="Heading3"/>
+      </w:pPr>
+      <w:r>
+        <w:t xml:space="preserve">1.3 Institutional context</w:t>
+      </w:r>
+    </w:p>
+    <w:p>
+      <w:pPr>
+        <w:pStyle w:val="FirstParagraph"/>
+      </w:pPr>
+      <w:r>
+        <w:t xml:space="preserve">AthDGC is developed at the National and Kapodistrian University of Athens (NKUA), Division of Language-Linguistics, Department of English Language and Literature, School of Philosophy, under the direction of Prof. Nikolaos Lavidas. Compute is supplied by GRNET ARIS, the Greek national high-performance computing cluster (a shared cluster of fast machines operated by the Greek Research and Technology Network for academic computational workloads), under allocation pa260305.</w:t>
+      </w:r>
+    </w:p>
+    <w:bookmarkEnd w:id="11"/>
+    <w:bookmarkEnd w:id="12"/>
+    <w:bookmarkStart w:id="19" w:name="method"/>
+    <w:p>
+      <w:pPr>
+        <w:pStyle w:val="Heading2"/>
+      </w:pPr>
+      <w:r>
+        <w:t xml:space="preserve">2. Method</w:t>
+      </w:r>
+    </w:p>
+    <w:p>
+      <w:pPr>
+        <w:pStyle w:val="FirstParagraph"/>
+      </w:pPr>
+      <w:r>
+        <w:t xml:space="preserve">The AthDGC workflow runs in six stages: discovery, filtering, conversion, annotation, argument-structure capture, and cross-lingual alignment. We describe each stage in turn and illustrate it with a worked example carried through the opening line of the Iliad, μῆνιν ἄειδε θεὰ Πηληϊάδεω Ἀχιλῆος (“Wrath sing, goddess, of Peleiades Achilles”), so that the reader can follow the same sentence from raw input to a fully annotated and cross-aligned record.</w:t>
+      </w:r>
+    </w:p>
+    <w:bookmarkStart w:id="13" w:name="discovery"/>
+    <w:p>
+      <w:pPr>
+        <w:pStyle w:val="Heading3"/>
+      </w:pPr>
+      <w:r>
+        <w:t xml:space="preserve">2.1 Discovery</w:t>
+      </w:r>
+    </w:p>
+    <w:p>
+      <w:pPr>
+        <w:pStyle w:val="FirstParagraph"/>
+      </w:pPr>
+      <w:r>
+        <w:t xml:space="preserve">Source material reaches AthDGC through three complementary channels, of which the first runs daily and the other two are continuous on a slower cadence.</w:t>
+      </w:r>
+    </w:p>
+    <w:p>
+      <w:pPr>
+        <w:pStyle w:val="BodyText"/>
+      </w:pPr>
+      <w:r>
+        <w:t xml:space="preserve">The first channel is the daily online-archive harvest. Each day, the discovery stage probes online open-access repositories for new or updated Greek and parallel-language source material. The repositories currently probed include archive.org, the Perseus Digital Library (the standard online archive of classical-Greek and Latin texts maintained by Tufts University), the Open Greek and Latin First Thousand Years of Greek collection at Leipzig, Wikisource Greek (el.wikisource.org), the Diorisis Corpus (the lemmatised classical-Greek corpus by Vatri and McGillivray), and OpenGreekAndLatin / PerseusDL on GitHub. For the parallel languages, the discovery stage probes the Wulfila Project at the University of Antwerp (Gothic), TITUS at the University of Frankfurt (Old Church Slavonic and Classical Armenian), GRETIL at Goettingen (Sanskrit), TEAMS at the Robbins Library (Old English), and the National Library of Ukraine facsimile collection.</w:t>
+      </w:r>
+    </w:p>
+    <w:p>
+      <w:pPr>
+        <w:pStyle w:val="BodyText"/>
+      </w:pPr>
+      <w:r>
+        <w:t xml:space="preserve">The second channel is in-house digitisation, namely the OCR (Optical Character Recognition, the conversion of scanned page images into machine-readable text) of out-of-copyright printed editions held by NKUA and partner institutions. This channel covers pre-1928 Teubner editions, the Patrologia Graeca volumes not yet available in clean text form, scanned Early Modern Greek printed books from the Anemi collection at the University of Crete, and equivalent printed material from collaborating Departments of Classical Studies in the CIVIS Alliance and at other Greek universities. Manuscript facsimiles supplied by project partners enter through the same channel and are flagged in the corpus metadata with the supplying institution and the corresponding editorial provenance.</w:t>
+      </w:r>
+    </w:p>
+    <w:p>
+      <w:pPr>
+        <w:pStyle w:val="BodyText"/>
+      </w:pPr>
+      <w:r>
+        <w:t xml:space="preserve">The third channel is community contribution, namely the submission of prepared text or annotation by external researchers and by KEDIVIM continuing-education-course participants (see §5). Such contributions are versioned in the public GitHub repository as pull requests, pass the same PROIEL XML 2.0 schema validator and house-style check that govern internal contributions (see §3.4), and on acceptance receive co-authorship acknowledgement on the next release notes.</w:t>
+      </w:r>
+    </w:p>
+    <w:p>
+      <w:pPr>
+        <w:pStyle w:val="BodyText"/>
+      </w:pPr>
+      <w:r>
+        <w:t xml:space="preserve">For the Iliad worked example, the discovery stage retrieves the Homeric text from the Perseus Digital Library through its CTS URN (Canonical Text Services Uniform Resource Name, a standard identifier scheme used by classical-text repositories for referring to a specific edition of a specific work), urn:cts:greekLit:tlg0012.tlg001, together with the Kakridis-Kazantzakis 1955 prose translation, mirrored on Wikisource, and the Tzetzes Byzantine epitome from Bibliotheca Augustana.</w:t>
+      </w:r>
+    </w:p>
+    <w:bookmarkEnd w:id="13"/>
+    <w:bookmarkStart w:id="14" w:name="filtering"/>
+    <w:p>
+      <w:pPr>
+        <w:pStyle w:val="Heading3"/>
+      </w:pPr>
+      <w:r>
+        <w:t xml:space="preserve">2.2 Filtering</w:t>
+      </w:r>
+    </w:p>
+    <w:p>
+      <w:pPr>
+        <w:pStyle w:val="FirstParagraph"/>
+      </w:pPr>
+      <w:r>
+        <w:t xml:space="preserve">Candidate texts are filtered by Greek-script ratio (at least 75% of alphabetic characters in the Greek Unicode blocks U+0370-U+03FF and U+1F00-U+1FFF), by a Path-B line filter (an in-house regular-expression filter that removes bilingual editorial apparatus such as Latin headers, page-number lines, and critical-edition footnote markers from the textual stream), and by content-hash deduplication (an SHA-256 hash of the normalised text is checked against a registry of previously ingested files, so that identical files discovered at multiple mirrors are ingested only once). A candidate that fails any of the three filters is rejected at this stage and logged for review; the audit logs are kept in the project’s internal working tree, and the v0.5 release notes will report per-archive rejection statistics.</w:t>
+      </w:r>
+    </w:p>
+    <w:bookmarkEnd w:id="14"/>
+    <w:bookmarkStart w:id="15" w:name="conversion"/>
+    <w:p>
+      <w:pPr>
+        <w:pStyle w:val="Heading3"/>
+      </w:pPr>
+      <w:r>
+        <w:t xml:space="preserve">2.3 Conversion</w:t>
+      </w:r>
+    </w:p>
+    <w:p>
+      <w:pPr>
+        <w:pStyle w:val="FirstParagraph"/>
+      </w:pPr>
+      <w:r>
+        <w:t xml:space="preserve">Surviving text is converted into the PROIEL XML 2.0 schema with sentence-level structure. The PROIEL XML 2.0 schema is XML (a plain-text format that stores structured information in tagged elements) with each sentence wrapped in a</w:t>
       </w:r>
       <w:r>
         <w:t xml:space="preserve"> </w:t>
       </w:r>
       <w:r>
-        <w:rPr>
-          <w:i/>
-          <w:iCs/>
-        </w:rPr>
-        <w:t xml:space="preserve">Iliad</w:t>
-      </w:r>
-      <w:r>
-        <w:t xml:space="preserve">, the New Testament, the Septuagint Psalms, or a classical historiographic passage, is re-rendered into Greek again and again across periods. The structural choices made by each generation of readers and translators leave a recoverable trace in the syntax of the resulting text.</w:t>
-      </w:r>
-    </w:p>
-    <w:p>
-      <w:pPr>
-        <w:pStyle w:val="BodyText"/>
-      </w:pPr>
-      <w:r>
-        <w:t xml:space="preserve">The PROIEL Treebank</w:t>
-      </w:r>
-      <w:r>
         <w:t xml:space="preserve"> </w:t>
       </w:r>
       <w:r>
-        <w:t xml:space="preserve">(Haug and Jøhndal 2008, 27–34; Eckhoff et al. 2018, 29–65)</w:t>
+        <w:t xml:space="preserve">element, each token wrapped in a</w:t>
       </w:r>
       <w:r>
         <w:t xml:space="preserve"> </w:t>
       </w:r>
       <w:r>
-        <w:t xml:space="preserve">established the gold standard for syntactically annotated parallel Indo-European Bible corpora. PROIEL (the dependency-treebank standard for early Indo-European languages, developed at the University of Oslo) introduced a relation inventory specifically designed for the morphological richness and the free word order of the older Indo-European languages, and provided the Koine-Greek anchor sentence set against which any later diachronic-Greek effort is naturally measured. Its scope, however, is restricted to the New Testament and to a small number of language witnesses; it does not by design extend to Archaic, Classical, Byzantine, or Modern Greek, and it does not by design cover the cross-lingual alignment of the Bible to language families more distant than the four PROIEL witnesses (Greek, Latin, Gothic, Old Church Slavonic).</w:t>
-      </w:r>
-    </w:p>
-    <w:p>
-      <w:pPr>
-        <w:pStyle w:val="BodyText"/>
-      </w:pPr>
-      <w:r>
-        <w:t xml:space="preserve">Accordingly, no openly licensed, end-to-end workflow currently covers the full diachronic record of Greek at the same level of annotation, with explicit argument-structure tagging (the recovery of</w:t>
-      </w:r>
-      <w:r>
         <w:t xml:space="preserve"> </w:t>
       </w:r>
       <w:r>
-        <w:rPr>
-          <w:i/>
-          <w:iCs/>
-        </w:rPr>
-        <w:t xml:space="preserve">who does what to whom</w:t>
+        <w:t xml:space="preserve">element, and every token carrying attributes for its form, lemma, part-of-speech tag (pos), ten-character morphological tag (morphology), syntactic head identifier (head-id), and dependency relation to that head (relation). For the worked example, the conversion stage produces a</w:t>
       </w:r>
       <w:r>
         <w:t xml:space="preserve"> </w:t>
       </w:r>
       <w:r>
-        <w:t xml:space="preserve">for every verb in the corpus), and with reproducible cross-lingual alignment (the machine-readable matching of corresponding words and sentences between texts in different languages) to its sister Indo-European languages. AthDGC closes that gap.</w:t>
-      </w:r>
-    </w:p>
-    <w:p>
-      <w:pPr>
-        <w:pStyle w:val="BodyText"/>
-      </w:pPr>
-      <w:r>
-        <w:t xml:space="preserve">The project’s specific scholarly focus is</w:t>
-      </w:r>
-      <w:r>
         <w:t xml:space="preserve"> </w:t>
       </w:r>
       <w:r>
-        <w:rPr>
-          <w:i/>
-          <w:iCs/>
-        </w:rPr>
-        <w:t xml:space="preserve">retranslation</w:t>
-      </w:r>
-      <w:r>
-        <w:t xml:space="preserve">: the same canonical text is re-rendered into Greek across periods (Homeric, Koine, Byzantine, Modern) and into sister languages (Latin, Gothic, Old Church Slavonic, Classical Armenian) across the Indo-European family. The platform records these re-renderings as a</w:t>
+        <w:t xml:space="preserve">containing five tokens for μῆνιν ἄειδε θεὰ Πηληϊάδεω Ἀχιλῆος and writes the initial sentence header together with the empty token-attribute scaffolding that the next stage fills in.</w:t>
+      </w:r>
+    </w:p>
+    <w:bookmarkEnd w:id="15"/>
+    <w:bookmarkStart w:id="16" w:name="annotation"/>
+    <w:p>
+      <w:pPr>
+        <w:pStyle w:val="Heading3"/>
+      </w:pPr>
+      <w:r>
+        <w:t xml:space="preserve">2.4 Annotation</w:t>
+      </w:r>
+    </w:p>
+    <w:p>
+      <w:pPr>
+        <w:pStyle w:val="FirstParagraph"/>
+      </w:pPr>
+      <w:r>
+        <w:t xml:space="preserve">Annotation is performed sentence by sentence with the Stanford Stanza processor (Qi et al. 2020, 101–8). Stanza (Stanford’s open-source Python toolkit for automatic linguistic annotation, which performs tokenisation, lemmatisation, part-of-speech tagging, morphological analysis, and dependency parsing in a single workflow) provides PROIEL-trained models for several of the older Indo-European languages: grc_proiel for Koine Greek, la_proiel for Latin, cu_proiel for Old Church Slavonic, and got_proiel for Gothic. Classical Armenian is annotated through a PROIEL-style workflow currently under development; ingestion of the v0.4 Armenian sample is complete, and the full v0.5 annotation will use a fine-tuned Stanza model (a fine-tuned model is one that has been further trained on a smaller, target-specific dataset on top of its general-purpose training, so that it adapts to the particular text type in question) trained on TITUS Armenian material. The Stanza output for each sentence is then normalised to the PROIEL XML 2.0 schema; AthDGC publishes PROIEL XML 2.0 only, with no CoNLL-U (the line-by-line tab-separated format used by the Universal Dependencies project, with one token per line and one column per annotation attribute) or other format offered, since the analytical workflow downstream of the corpus (argument-structure extraction, alignment graph, classifier features) depends on the PROIEL relation inventory. For the worked example, Stanza assigns μῆνιν the lemma μῆνις, part-of-speech Nb, morphology Nb-s—fa- (a noun, singular, feminine, accusative), head identifier 2, and relation obj (direct object). The verb ἄειδε receives lemma ἀείδω, part-of-speech V-, morphology V-spia— (verb, second person singular, present, imperative, active), head identifier 0 (sentence root), and relation pred (predicate).</w:t>
+      </w:r>
+    </w:p>
+    <w:bookmarkEnd w:id="16"/>
+    <w:bookmarkStart w:id="17" w:name="argument-structure-capture"/>
+    <w:p>
+      <w:pPr>
+        <w:pStyle w:val="Heading3"/>
+      </w:pPr>
+      <w:r>
+        <w:t xml:space="preserve">2.5 Argument-structure capture</w:t>
+      </w:r>
+    </w:p>
+    <w:p>
+      <w:pPr>
+        <w:pStyle w:val="FirstParagraph"/>
+      </w:pPr>
+      <w:r>
+        <w:t xml:space="preserve">Beyond standard dependency annotation, AthDGC extracts an explicit argument-structure frame for every verb token, using the PROIEL relation inventory strictly. The argument-structure frame records, for one verb, the syntactic and semantic role of each of its arguments: the subject (sub, including the raised patterns xobj for raising objects and nonsub for non-subject controllers), the direct object (obj), the indirect and oblique arguments (iobj for indirect object, obl for oblique), the vocative addressee (voc), the voice (active, middle, or passive), and the aspect (perfective or imperfective). For the worked example, the verb ἄειδε receives the frame [sub:imp.2sg, obj:μῆνιν(acc.sg.f), voc:θεὰ(voc.sg.f), voice:active, aspect:imperfective]. This frame is the unit on which downstream queries operate: a diachronic researcher can ask, for instance, across the Iliad reception, does the verb of singing retain its direct-object case-marking through the Byzantine epitome and the Modern Greek prose translation, or does it switch to a prepositional phrase? and receive an answer that does not require manual re-reading of the texts.</w:t>
+      </w:r>
+    </w:p>
+    <w:bookmarkEnd w:id="17"/>
+    <w:bookmarkStart w:id="18" w:name="cross-lingual-alignment"/>
+    <w:p>
+      <w:pPr>
+        <w:pStyle w:val="Heading3"/>
+      </w:pPr>
+      <w:r>
+        <w:t xml:space="preserve">2.6 Cross-lingual alignment</w:t>
+      </w:r>
+    </w:p>
+    <w:p>
+      <w:pPr>
+        <w:pStyle w:val="FirstParagraph"/>
+      </w:pPr>
+      <w:r>
+        <w:t xml:space="preserve">Sentence-level alignment uses LaBSE embeddings (Feng et al. 2022, 878–91). LaBSE (Language-Agnostic BERT Sentence Embedding, a multilingual sentence-embedding model that maps sentences from over 100 languages into a single 1,500-dimensional vector space, so that translation pairs land close to each other regardless of the source language) provides the similarity score used to match a Greek New Testament verse to its Latin Vulgate, Gothic Wulfila, Old Church Slavonic Marianus, or Classical Armenian counterpart. Word-level alignment uses multilingual-BERT attention through the AwesomeAlign procedure</w:t>
       </w:r>
       <w:r>
         <w:t xml:space="preserve"> </w:t>
       </w:r>
       <w:r>
-        <w:rPr>
-          <w:i/>
-          <w:iCs/>
-        </w:rPr>
-        <w:t xml:space="preserve">retelling and retranslation chain</w:t>
+        <w:t xml:space="preserve">(Dou and Neubig 2021, 2112–28)</w:t>
+      </w:r>
+      <w:r>
+        <w:t xml:space="preserve">. Multilingual BERT (Google’s neural language model pre-trained on text from 104 languages) emits cross-attention weights between the tokens of the source and target sentences; AwesomeAlign converts these weights into a discrete word-alignment matrix through a fine-tuning step on parallel corpora. Phonetic cognate scoring, finally, uses ASJP sound-class encoding (the Automated Similarity Judgment Program sound-class system, which reduces every phonetic segment to one of 41 equivalence classes that ignore fine phonetic detail) and LingPy edit distance</w:t>
       </w:r>
       <w:r>
         <w:t xml:space="preserve"> </w:t>
       </w:r>
       <w:r>
-        <w:t xml:space="preserve">(see §3.3 below), a machine-queryable structure in which the same passage is annotated for syntax, argument structure, and morphology at every node of the chain, so that the diachronic researcher can ask, with a single query, which structural patterns persist from Homer to the Kakridis-Kazantzakis prose</w:t>
+        <w:t xml:space="preserve">(List 2014, 1–228)</w:t>
       </w:r>
       <w:r>
         <w:t xml:space="preserve"> </w:t>
       </w:r>
       <w:r>
-        <w:rPr>
-          <w:i/>
-          <w:iCs/>
-        </w:rPr>
-        <w:t xml:space="preserve">Iliad</w:t>
-      </w:r>
-      <w:r>
-        <w:t xml:space="preserve"> </w:t>
-      </w:r>
-      <w:r>
-        <w:t xml:space="preserve">of 1955, and which collapse under the Byzantine epitome of Tzetzes.</w:t>
-      </w:r>
-    </w:p>
-    <w:bookmarkEnd w:id="9"/>
-    <w:bookmarkStart w:id="12" w:name="repository-location"/>
-    <w:p>
-      <w:pPr>
-        <w:pStyle w:val="Heading3"/>
-      </w:pPr>
-      <w:r>
-        <w:t xml:space="preserve">1.2 Repository location</w:t>
-      </w:r>
-    </w:p>
-    <w:p>
-      <w:pPr>
-        <w:pStyle w:val="FirstParagraph"/>
-      </w:pPr>
-      <w:r>
-        <w:t xml:space="preserve">The public showcase of the platform is hosted at</w:t>
-      </w:r>
-      <w:r>
-        <w:t xml:space="preserve"> </w:t>
-      </w:r>
-      <w:hyperlink r:id="rId10">
-        <w:r>
-          <w:rPr>
-            <w:rStyle w:val="Hyperlink"/>
-          </w:rPr>
-          <w:t xml:space="preserve">https://athdgc.github.io</w:t>
-        </w:r>
-      </w:hyperlink>
-      <w:r>
-        <w:t xml:space="preserve">, and the v0.4.0 source-code snapshot is permanently deposited on Zenodo (an open-access research-data repository operated by CERN, which mints persistent DOIs for each deposit) under concept DOI</w:t>
-      </w:r>
-      <w:r>
-        <w:t xml:space="preserve"> </w:t>
-      </w:r>
-      <w:hyperlink r:id="rId11">
-        <w:r>
-          <w:rPr>
-            <w:rStyle w:val="Hyperlink"/>
-          </w:rPr>
-          <w:t xml:space="preserve">10.5281/zenodo.20439182</w:t>
-        </w:r>
-      </w:hyperlink>
-      <w:r>
-        <w:t xml:space="preserve">. A concept DOI (a Digital Object Identifier that always resolves to the latest version of a deposited record) is the citation handle that does not change as the project versions advance; per-version DOIs are minted automatically on each release. The source repository</w:t>
-      </w:r>
-      <w:r>
-        <w:t xml:space="preserve"> </w:t>
-      </w:r>
-      <w:r>
-        <w:rPr>
-          <w:rStyle w:val="VerbatimChar"/>
-        </w:rPr>
-        <w:t xml:space="preserve">AthDGC/Diachronic-Linguistics-Platform</w:t>
-      </w:r>
-      <w:r>
-        <w:t xml:space="preserve"> </w:t>
-      </w:r>
-      <w:r>
-        <w:t xml:space="preserve">on GitHub remains private during the v0.5 audit pass, and becomes public at the v0.5 release, when the consolidated</w:t>
-      </w:r>
-      <w:r>
-        <w:t xml:space="preserve"> </w:t>
-      </w:r>
-      <w:r>
-        <w:rPr>
-          <w:rStyle w:val="VerbatimChar"/>
-        </w:rPr>
-        <w:t xml:space="preserve">tools/</w:t>
-      </w:r>
-      <w:r>
-        <w:t xml:space="preserve"> </w:t>
-      </w:r>
-      <w:r>
-        <w:t xml:space="preserve">directory and the verified annotated partitions are in place.</w:t>
-      </w:r>
-    </w:p>
-    <w:bookmarkEnd w:id="12"/>
-    <w:bookmarkStart w:id="13" w:name="institutional-context"/>
-    <w:p>
-      <w:pPr>
-        <w:pStyle w:val="Heading3"/>
-      </w:pPr>
-      <w:r>
-        <w:t xml:space="preserve">1.3 Institutional context</w:t>
-      </w:r>
-    </w:p>
-    <w:p>
-      <w:pPr>
-        <w:pStyle w:val="FirstParagraph"/>
-      </w:pPr>
-      <w:r>
-        <w:t xml:space="preserve">AthDGC is developed at the National and Kapodistrian University of Athens (NKUA), Division of Language-Linguistics, Department of English Language and Literature, School of Philosophy, under the direction of Prof. Nikolaos Lavidas. Compute is supplied by GRNET ARIS, the Greek national high-performance computing cluster (a shared cluster of fast machines operated by the Greek Research and Technology Network for academic computational workloads), under allocation</w:t>
-      </w:r>
-      <w:r>
-        <w:t xml:space="preserve"> </w:t>
-      </w:r>
-      <w:r>
-        <w:rPr>
-          <w:rStyle w:val="VerbatimChar"/>
-        </w:rPr>
-        <w:t xml:space="preserve">pa260305</w:t>
-      </w:r>
-      <w:r>
-        <w:t xml:space="preserve">.</w:t>
-      </w:r>
-    </w:p>
-    <w:bookmarkEnd w:id="13"/>
-    <w:bookmarkEnd w:id="14"/>
-    <w:bookmarkStart w:id="21" w:name="method"/>
-    <w:p>
-      <w:pPr>
-        <w:pStyle w:val="Heading2"/>
-      </w:pPr>
-      <w:r>
-        <w:t xml:space="preserve">2. Method</w:t>
-      </w:r>
-    </w:p>
-    <w:p>
-      <w:pPr>
-        <w:pStyle w:val="FirstParagraph"/>
-      </w:pPr>
-      <w:r>
-        <w:t xml:space="preserve">The AthDGC workflow runs in six stages: discovery, filtering, conversion, annotation, argument-structure capture, and cross-lingual alignment. We describe each stage in turn and illustrate it with a worked example carried through the opening line of the</w:t>
-      </w:r>
-      <w:r>
-        <w:t xml:space="preserve"> </w:t>
-      </w:r>
-      <w:r>
-        <w:rPr>
-          <w:i/>
-          <w:iCs/>
-        </w:rPr>
-        <w:t xml:space="preserve">Iliad</w:t>
-      </w:r>
-      <w:r>
-        <w:t xml:space="preserve">, μῆνιν ἄειδε θεὰ Πηληϊάδεω Ἀχιλῆος (</w:t>
-      </w:r>
-      <w:r>
-        <w:t xml:space="preserve">“Wrath sing, goddess, of Peleiades Achilles”</w:t>
-      </w:r>
-      <w:r>
-        <w:t xml:space="preserve">), so that the reader can follow the same sentence from raw input to a fully annotated and cross-aligned record.</w:t>
-      </w:r>
-    </w:p>
-    <w:bookmarkStart w:id="15" w:name="discovery"/>
-    <w:p>
-      <w:pPr>
-        <w:pStyle w:val="Heading3"/>
-      </w:pPr>
-      <w:r>
-        <w:t xml:space="preserve">2.1 Discovery</w:t>
-      </w:r>
-    </w:p>
-    <w:p>
-      <w:pPr>
-        <w:pStyle w:val="FirstParagraph"/>
-      </w:pPr>
-      <w:r>
-        <w:t xml:space="preserve">Source material reaches AthDGC through three complementary channels, of which the first runs daily and the other two are continuous on a slower cadence.</w:t>
-      </w:r>
-    </w:p>
-    <w:p>
-      <w:pPr>
-        <w:pStyle w:val="BodyText"/>
-      </w:pPr>
-      <w:r>
-        <w:t xml:space="preserve">The first channel is the daily online-archive harvest. Each day, the discovery stage probes online open-access repositories for new or updated Greek and parallel-language source material. The repositories currently probed include archive.org, the Perseus Digital Library (the standard online archive of classical-Greek and Latin texts maintained by Tufts University), the Open Greek and Latin First Thousand Years of Greek collection at Leipzig, Wikisource Greek (el.wikisource.org), the Diorisis Corpus (the lemmatised classical-Greek corpus by Vatri and McGillivray), and OpenGreekAndLatin / PerseusDL on GitHub. For the parallel languages, the discovery stage probes the Wulfila Project at the University of Antwerp (Gothic), TITUS at the University of Frankfurt (Old Church Slavonic and Classical Armenian), GRETIL at Goettingen (Sanskrit), TEAMS at the Robbins Library (Old English), and the National Library of Ukraine facsimile collection.</w:t>
-      </w:r>
-    </w:p>
-    <w:p>
-      <w:pPr>
-        <w:pStyle w:val="BodyText"/>
-      </w:pPr>
-      <w:r>
-        <w:t xml:space="preserve">The second channel is in-house digitisation, namely the OCR (Optical Character Recognition, the conversion of scanned page images into machine-readable text) of out-of-copyright printed editions held by NKUA and partner institutions. This channel covers pre-1928 Teubner editions, the Patrologia Graeca volumes not yet available in clean text form, scanned Early Modern Greek printed books from the Anemi collection at the University of Crete, and equivalent printed material from collaborating Departments of Classical Studies in the CIVIS Alliance and at other Greek universities. Manuscript facsimiles supplied by project partners enter through the same channel and are flagged in the corpus metadata with the supplying institution and the corresponding editorial provenance.</w:t>
-      </w:r>
-    </w:p>
-    <w:p>
-      <w:pPr>
-        <w:pStyle w:val="BodyText"/>
-      </w:pPr>
-      <w:r>
-        <w:t xml:space="preserve">The third channel is community contribution, namely the submission of prepared text or annotation by external researchers and by KEDIVIM continuing-education-course participants (see §5). Such contributions are versioned in the public GitHub repository as pull requests, pass the same PROIEL XML 2.0 schema validator and house-style check that govern internal contributions (see §3.4), and on acceptance receive co-authorship acknowledgement on the next release notes.</w:t>
-      </w:r>
-    </w:p>
-    <w:p>
-      <w:pPr>
-        <w:pStyle w:val="BodyText"/>
-      </w:pPr>
-      <w:r>
-        <w:t xml:space="preserve">For the</w:t>
-      </w:r>
-      <w:r>
-        <w:t xml:space="preserve"> </w:t>
-      </w:r>
-      <w:r>
-        <w:rPr>
-          <w:i/>
-          <w:iCs/>
-        </w:rPr>
-        <w:t xml:space="preserve">Iliad</w:t>
-      </w:r>
-      <w:r>
-        <w:t xml:space="preserve"> </w:t>
-      </w:r>
-      <w:r>
-        <w:t xml:space="preserve">worked example, the discovery stage retrieves the Homeric text from the Perseus Digital Library through its CTS URN (Canonical Text Services Uniform Resource Name, a standard identifier scheme used by classical-text repositories for referring to a specific edition of a specific work),</w:t>
-      </w:r>
-      <w:r>
-        <w:t xml:space="preserve"> </w:t>
-      </w:r>
-      <w:r>
-        <w:rPr>
-          <w:rStyle w:val="VerbatimChar"/>
-        </w:rPr>
-        <w:t xml:space="preserve">urn:cts:greekLit:tlg0012.tlg001</w:t>
-      </w:r>
-      <w:r>
-        <w:t xml:space="preserve">, together with the Kakridis-Kazantzakis 1955 prose translation, mirrored on Wikisource, and the Tzetzes Byzantine epitome from Bibliotheca Augustana.</w:t>
-      </w:r>
-    </w:p>
-    <w:bookmarkEnd w:id="15"/>
-    <w:bookmarkStart w:id="16" w:name="filtering"/>
-    <w:p>
-      <w:pPr>
-        <w:pStyle w:val="Heading3"/>
-      </w:pPr>
-      <w:r>
-        <w:t xml:space="preserve">2.2 Filtering</w:t>
-      </w:r>
-    </w:p>
-    <w:p>
-      <w:pPr>
-        <w:pStyle w:val="FirstParagraph"/>
-      </w:pPr>
-      <w:r>
-        <w:t xml:space="preserve">Candidate texts are filtered by Greek-script ratio (at least 75% of alphabetic characters in the Greek Unicode blocks U+0370-U+03FF and U+1F00-U+1FFF), by a Path-B line filter (an in-house regular-expression filter that removes bilingual editorial apparatus such as Latin headers, page-number lines, and critical-edition footnote markers from the textual stream), and by content-hash deduplication (an SHA-256 hash of the normalised text is checked against a registry of previously ingested files, so that identical files discovered at multiple mirrors are ingested only once). A candidate that fails any of the three filters is rejected at this stage and logged for review; the audit logs are kept in the project’s internal working tree, and the v0.5 release notes will report per-archive rejection statistics.</w:t>
-      </w:r>
-    </w:p>
-    <w:bookmarkEnd w:id="16"/>
-    <w:bookmarkStart w:id="17" w:name="conversion"/>
-    <w:p>
-      <w:pPr>
-        <w:pStyle w:val="Heading3"/>
-      </w:pPr>
-      <w:r>
-        <w:t xml:space="preserve">2.3 Conversion</w:t>
-      </w:r>
-    </w:p>
-    <w:p>
-      <w:pPr>
-        <w:pStyle w:val="FirstParagraph"/>
-      </w:pPr>
-      <w:r>
-        <w:t xml:space="preserve">Surviving text is converted into the PROIEL XML 2.0 schema with sentence-level structure. The PROIEL XML 2.0 schema is XML (a plain-text format that stores structured information in tagged elements) with each sentence wrapped in a</w:t>
-      </w:r>
-      <w:r>
-        <w:t xml:space="preserve"> </w:t>
-      </w:r>
-      <w:r>
-        <w:rPr>
-          <w:rStyle w:val="VerbatimChar"/>
-        </w:rPr>
-        <w:t xml:space="preserve">&lt;sentence&gt;</w:t>
-      </w:r>
-      <w:r>
-        <w:t xml:space="preserve"> </w:t>
-      </w:r>
-      <w:r>
-        <w:t xml:space="preserve">element, each token wrapped in a</w:t>
-      </w:r>
-      <w:r>
-        <w:t xml:space="preserve"> </w:t>
-      </w:r>
-      <w:r>
-        <w:rPr>
-          <w:rStyle w:val="VerbatimChar"/>
-        </w:rPr>
-        <w:t xml:space="preserve">&lt;token&gt;</w:t>
-      </w:r>
-      <w:r>
-        <w:t xml:space="preserve"> </w:t>
-      </w:r>
-      <w:r>
-        <w:t xml:space="preserve">element, and every token carrying attributes for its form, lemma, part-of-speech tag (</w:t>
-      </w:r>
-      <w:r>
-        <w:rPr>
-          <w:rStyle w:val="VerbatimChar"/>
-        </w:rPr>
-        <w:t xml:space="preserve">pos</w:t>
-      </w:r>
-      <w:r>
-        <w:t xml:space="preserve">), ten-character morphological tag (</w:t>
-      </w:r>
-      <w:r>
-        <w:rPr>
-          <w:rStyle w:val="VerbatimChar"/>
-        </w:rPr>
-        <w:t xml:space="preserve">morphology</w:t>
-      </w:r>
-      <w:r>
-        <w:t xml:space="preserve">), syntactic head identifier (</w:t>
-      </w:r>
-      <w:r>
-        <w:rPr>
-          <w:rStyle w:val="VerbatimChar"/>
-        </w:rPr>
-        <w:t xml:space="preserve">head-id</w:t>
-      </w:r>
-      <w:r>
-        <w:t xml:space="preserve">), and dependency relation to that head (</w:t>
-      </w:r>
-      <w:r>
-        <w:rPr>
-          <w:rStyle w:val="VerbatimChar"/>
-        </w:rPr>
-        <w:t xml:space="preserve">relation</w:t>
-      </w:r>
-      <w:r>
-        <w:t xml:space="preserve">). For the worked example, the conversion stage produces a</w:t>
-      </w:r>
-      <w:r>
-        <w:t xml:space="preserve"> </w:t>
-      </w:r>
-      <w:r>
-        <w:rPr>
-          <w:rStyle w:val="VerbatimChar"/>
-        </w:rPr>
-        <w:t xml:space="preserve">&lt;sentence&gt;</w:t>
-      </w:r>
-      <w:r>
-        <w:t xml:space="preserve"> </w:t>
-      </w:r>
-      <w:r>
-        <w:t xml:space="preserve">containing five tokens for μῆνιν ἄειδε θεὰ Πηληϊάδεω Ἀχιλῆος and writes the initial sentence header together with the empty token-attribute scaffolding that the next stage fills in.</w:t>
-      </w:r>
-    </w:p>
-    <w:bookmarkEnd w:id="17"/>
-    <w:bookmarkStart w:id="18" w:name="annotation"/>
-    <w:p>
-      <w:pPr>
-        <w:pStyle w:val="Heading3"/>
-      </w:pPr>
-      <w:r>
-        <w:t xml:space="preserve">2.4 Annotation</w:t>
-      </w:r>
-    </w:p>
-    <w:p>
-      <w:pPr>
-        <w:pStyle w:val="FirstParagraph"/>
-      </w:pPr>
-      <w:r>
-        <w:t xml:space="preserve">Annotation is performed sentence by sentence with the Stanford Stanza processor</w:t>
-      </w:r>
-      <w:r>
-        <w:t xml:space="preserve"> </w:t>
-      </w:r>
-      <w:r>
-        <w:t xml:space="preserve">(Qi et al. 2020, 101–8)</w:t>
-      </w:r>
-      <w:r>
-        <w:t xml:space="preserve">. Stanza (Stanford’s open-source Python toolkit for automatic linguistic annotation, which performs tokenisation, lemmatisation, part-of-speech tagging, morphological analysis, and dependency parsing in a single workflow) provides PROIEL-trained models for several of the older Indo-European languages:</w:t>
-      </w:r>
-      <w:r>
-        <w:t xml:space="preserve"> </w:t>
-      </w:r>
-      <w:r>
-        <w:rPr>
-          <w:rStyle w:val="VerbatimChar"/>
-        </w:rPr>
-        <w:t xml:space="preserve">grc_proiel</w:t>
-      </w:r>
-      <w:r>
-        <w:t xml:space="preserve"> </w:t>
-      </w:r>
-      <w:r>
-        <w:t xml:space="preserve">for Koine Greek,</w:t>
-      </w:r>
-      <w:r>
-        <w:t xml:space="preserve"> </w:t>
-      </w:r>
-      <w:r>
-        <w:rPr>
-          <w:rStyle w:val="VerbatimChar"/>
-        </w:rPr>
-        <w:t xml:space="preserve">la_proiel</w:t>
-      </w:r>
-      <w:r>
-        <w:t xml:space="preserve"> </w:t>
-      </w:r>
-      <w:r>
-        <w:t xml:space="preserve">for Latin,</w:t>
-      </w:r>
-      <w:r>
-        <w:t xml:space="preserve"> </w:t>
-      </w:r>
-      <w:r>
-        <w:rPr>
-          <w:rStyle w:val="VerbatimChar"/>
-        </w:rPr>
-        <w:t xml:space="preserve">cu_proiel</w:t>
-      </w:r>
-      <w:r>
-        <w:t xml:space="preserve"> </w:t>
-      </w:r>
-      <w:r>
-        <w:t xml:space="preserve">for Old Church Slavonic, and</w:t>
-      </w:r>
-      <w:r>
-        <w:t xml:space="preserve"> </w:t>
-      </w:r>
-      <w:r>
-        <w:rPr>
-          <w:rStyle w:val="VerbatimChar"/>
-        </w:rPr>
-        <w:t xml:space="preserve">got_proiel</w:t>
-      </w:r>
-      <w:r>
-        <w:t xml:space="preserve"> </w:t>
-      </w:r>
-      <w:r>
-        <w:t xml:space="preserve">for Gothic. Classical Armenian is annotated through a PROIEL-style workflow currently under development; ingestion of the v0.4 Armenian sample is complete, and the full v0.5 annotation will use a fine-tuned Stanza model (a fine-tuned model is one that has been further trained on a smaller, target-specific dataset on top of its general-purpose training, so that it adapts to the particular text type in question) trained on TITUS Armenian material. The Stanza output for each sentence is then normalised to the PROIEL XML 2.0 schema; AthDGC publishes PROIEL XML 2.0 only, with no CoNLL-U (the line-by-line tab-separated format used by the Universal Dependencies project, with one token per line and one column per annotation attribute) or other format offered, since the analytical workflow downstream of the corpus (argument-structure extraction, alignment graph, classifier features) depends on the PROIEL relation inventory. For the worked example, Stanza assigns μῆνιν the lemma μῆνις, part-of-speech</w:t>
-      </w:r>
-      <w:r>
-        <w:t xml:space="preserve"> </w:t>
-      </w:r>
-      <w:r>
-        <w:rPr>
-          <w:rStyle w:val="VerbatimChar"/>
-        </w:rPr>
-        <w:t xml:space="preserve">Nb</w:t>
-      </w:r>
-      <w:r>
-        <w:t xml:space="preserve">, morphology</w:t>
-      </w:r>
-      <w:r>
-        <w:t xml:space="preserve"> </w:t>
-      </w:r>
-      <w:r>
-        <w:rPr>
-          <w:rStyle w:val="VerbatimChar"/>
-        </w:rPr>
-        <w:t xml:space="preserve">Nb-s---fa-</w:t>
-      </w:r>
-      <w:r>
-        <w:t xml:space="preserve"> </w:t>
-      </w:r>
-      <w:r>
-        <w:t xml:space="preserve">(a noun, singular, feminine, accusative), head identifier 2, and relation</w:t>
-      </w:r>
-      <w:r>
-        <w:t xml:space="preserve"> </w:t>
-      </w:r>
-      <w:r>
-        <w:rPr>
-          <w:rStyle w:val="VerbatimChar"/>
-        </w:rPr>
-        <w:t xml:space="preserve">obj</w:t>
-      </w:r>
-      <w:r>
-        <w:t xml:space="preserve"> </w:t>
-      </w:r>
-      <w:r>
-        <w:t xml:space="preserve">(direct object). The verb ἄειδε receives lemma ἀείδω, part-of-speech</w:t>
-      </w:r>
-      <w:r>
-        <w:t xml:space="preserve"> </w:t>
-      </w:r>
-      <w:r>
-        <w:rPr>
-          <w:rStyle w:val="VerbatimChar"/>
-        </w:rPr>
-        <w:t xml:space="preserve">V-</w:t>
-      </w:r>
-      <w:r>
-        <w:t xml:space="preserve">, morphology</w:t>
-      </w:r>
-      <w:r>
-        <w:t xml:space="preserve"> </w:t>
-      </w:r>
-      <w:r>
-        <w:rPr>
-          <w:rStyle w:val="VerbatimChar"/>
-        </w:rPr>
-        <w:t xml:space="preserve">V-spia---</w:t>
-      </w:r>
-      <w:r>
-        <w:t xml:space="preserve"> </w:t>
-      </w:r>
-      <w:r>
-        <w:t xml:space="preserve">(verb, second person singular, present, imperative, active), head identifier 0 (sentence root), and relation</w:t>
-      </w:r>
-      <w:r>
-        <w:t xml:space="preserve"> </w:t>
-      </w:r>
-      <w:r>
-        <w:rPr>
-          <w:rStyle w:val="VerbatimChar"/>
-        </w:rPr>
-        <w:t xml:space="preserve">pred</w:t>
-      </w:r>
-      <w:r>
-        <w:t xml:space="preserve"> </w:t>
-      </w:r>
-      <w:r>
-        <w:t xml:space="preserve">(predicate).</w:t>
+        <w:t xml:space="preserve">for detection of cognate pairs across the Indo-European witnesses.</w:t>
       </w:r>
     </w:p>
     <w:bookmarkEnd w:id="18"/>
-    <w:bookmarkStart w:id="19" w:name="argument-structure-capture"/>
-    <w:p>
-      <w:pPr>
-        <w:pStyle w:val="Heading3"/>
-      </w:pPr>
-      <w:r>
-        <w:t xml:space="preserve">2.5 Argument-structure capture</w:t>
-      </w:r>
-    </w:p>
-    <w:p>
-      <w:pPr>
-        <w:pStyle w:val="FirstParagraph"/>
-      </w:pPr>
-      <w:r>
-        <w:t xml:space="preserve">Beyond standard dependency annotation, AthDGC extracts an explicit argument-structure frame for every verb token, using the PROIEL relation inventory strictly. The argument-structure frame records, for one verb, the syntactic and semantic role of each of its arguments: the subject (</w:t>
-      </w:r>
-      <w:r>
-        <w:rPr>
-          <w:rStyle w:val="VerbatimChar"/>
-        </w:rPr>
-        <w:t xml:space="preserve">sub</w:t>
-      </w:r>
-      <w:r>
-        <w:t xml:space="preserve">, including the raised patterns</w:t>
-      </w:r>
-      <w:r>
-        <w:t xml:space="preserve"> </w:t>
-      </w:r>
-      <w:r>
-        <w:rPr>
-          <w:rStyle w:val="VerbatimChar"/>
-        </w:rPr>
-        <w:t xml:space="preserve">xobj</w:t>
-      </w:r>
-      <w:r>
-        <w:t xml:space="preserve"> </w:t>
-      </w:r>
-      <w:r>
-        <w:t xml:space="preserve">for raising objects and</w:t>
-      </w:r>
-      <w:r>
-        <w:t xml:space="preserve"> </w:t>
-      </w:r>
-      <w:r>
-        <w:rPr>
-          <w:rStyle w:val="VerbatimChar"/>
-        </w:rPr>
-        <w:t xml:space="preserve">nonsub</w:t>
-      </w:r>
-      <w:r>
-        <w:t xml:space="preserve"> </w:t>
-      </w:r>
-      <w:r>
-        <w:t xml:space="preserve">for non-subject controllers), the direct object (</w:t>
-      </w:r>
-      <w:r>
-        <w:rPr>
-          <w:rStyle w:val="VerbatimChar"/>
-        </w:rPr>
-        <w:t xml:space="preserve">obj</w:t>
-      </w:r>
-      <w:r>
-        <w:t xml:space="preserve">), the indirect and oblique arguments (</w:t>
-      </w:r>
-      <w:r>
-        <w:rPr>
-          <w:rStyle w:val="VerbatimChar"/>
-        </w:rPr>
-        <w:t xml:space="preserve">iobj</w:t>
-      </w:r>
-      <w:r>
-        <w:t xml:space="preserve"> </w:t>
-      </w:r>
-      <w:r>
-        <w:t xml:space="preserve">for indirect object,</w:t>
-      </w:r>
-      <w:r>
-        <w:t xml:space="preserve"> </w:t>
-      </w:r>
-      <w:r>
-        <w:rPr>
-          <w:rStyle w:val="VerbatimChar"/>
-        </w:rPr>
-        <w:t xml:space="preserve">obl</w:t>
-      </w:r>
-      <w:r>
-        <w:t xml:space="preserve"> </w:t>
-      </w:r>
-      <w:r>
-        <w:t xml:space="preserve">for oblique), the vocative addressee (</w:t>
-      </w:r>
-      <w:r>
-        <w:rPr>
-          <w:rStyle w:val="VerbatimChar"/>
-        </w:rPr>
-        <w:t xml:space="preserve">voc</w:t>
-      </w:r>
-      <w:r>
-        <w:t xml:space="preserve">), the voice (active, middle, or passive), and the aspect (perfective or imperfective). For the worked example, the verb ἄειδε receives the frame</w:t>
-      </w:r>
-      <w:r>
-        <w:t xml:space="preserve"> </w:t>
-      </w:r>
-      <w:r>
-        <w:rPr>
-          <w:rStyle w:val="VerbatimChar"/>
-        </w:rPr>
-        <w:t xml:space="preserve">[sub:imp.2sg, obj:μῆνιν(acc.sg.f), voc:θεὰ(voc.sg.f), voice:active, aspect:imperfective]</w:t>
-      </w:r>
-      <w:r>
-        <w:t xml:space="preserve">. This frame is the unit on which downstream queries operate: a diachronic researcher can ask, for instance,</w:t>
-      </w:r>
-      <w:r>
-        <w:t xml:space="preserve"> </w:t>
-      </w:r>
-      <w:r>
-        <w:rPr>
-          <w:i/>
-          <w:iCs/>
-        </w:rPr>
-        <w:t xml:space="preserve">across the Iliad reception, does the verb of singing retain its direct-object case-marking through the Byzantine epitome and the Modern Greek prose translation, or does it switch to a prepositional phrase?</w:t>
-      </w:r>
-      <w:r>
-        <w:t xml:space="preserve"> </w:t>
-      </w:r>
-      <w:r>
-        <w:t xml:space="preserve">and receive an answer that does not require manual re-reading of the texts.</w:t>
-      </w:r>
-    </w:p>
     <w:bookmarkEnd w:id="19"/>
-    <w:bookmarkStart w:id="20" w:name="cross-lingual-alignment"/>
-    <w:p>
-      <w:pPr>
-        <w:pStyle w:val="Heading3"/>
-      </w:pPr>
-      <w:r>
-        <w:t xml:space="preserve">2.6 Cross-lingual alignment</w:t>
-      </w:r>
-    </w:p>
-    <w:p>
-      <w:pPr>
-        <w:pStyle w:val="FirstParagraph"/>
-      </w:pPr>
-      <w:r>
-        <w:t xml:space="preserve">Sentence-level alignment uses LaBSE embeddings</w:t>
-      </w:r>
-      <w:r>
-        <w:t xml:space="preserve"> </w:t>
-      </w:r>
-      <w:r>
-        <w:t xml:space="preserve">(Feng et al. 2022, 878–91)</w:t>
-      </w:r>
-      <w:r>
-        <w:t xml:space="preserve">. LaBSE (Language-Agnostic BERT Sentence Embedding, a multilingual sentence-embedding model that maps sentences from over 100 languages into a single 1,500-dimensional vector space, so that translation pairs land close to each other regardless of the source language) provides the similarity score used to match a Greek New Testament verse to its Latin Vulgate, Gothic Wulfila, Old Church Slavonic Marianus, or Classical Armenian counterpart. Word-level alignment uses multilingual-BERT attention through the AwesomeAlign procedure</w:t>
-      </w:r>
-      <w:r>
-        <w:t xml:space="preserve"> </w:t>
-      </w:r>
-      <w:r>
-        <w:t xml:space="preserve">(Dou and Neubig 2021, 2112–28)</w:t>
-      </w:r>
-      <w:r>
-        <w:t xml:space="preserve">. Multilingual BERT (Google’s neural language model pre-trained on text from 104 languages) emits cross-attention weights between the tokens of the source and target sentences; AwesomeAlign converts these weights into a discrete word-alignment matrix through a fine-tuning step on parallel corpora. Phonetic cognate scoring, finally, uses ASJP sound-class encoding (the Automated Similarity Judgment Program sound-class system, which reduces every phonetic segment to one of 41 equivalence classes that ignore fine phonetic detail) and LingPy edit distance</w:t>
-      </w:r>
-      <w:r>
-        <w:t xml:space="preserve"> </w:t>
-      </w:r>
-      <w:r>
-        <w:t xml:space="preserve">(List 2014, 1–228)</w:t>
-      </w:r>
-      <w:r>
-        <w:t xml:space="preserve"> </w:t>
-      </w:r>
-      <w:r>
-        <w:t xml:space="preserve">for detection of cognate pairs across the Indo-European witnesses.</w:t>
-      </w:r>
-    </w:p>
-    <w:bookmarkEnd w:id="20"/>
-    <w:bookmarkEnd w:id="21"/>
-    <w:bookmarkStart w:id="30" w:name="dataset-description"/>
+    <w:bookmarkStart w:id="26" w:name="dataset-description"/>
     <w:p>
       <w:pPr>
         <w:pStyle w:val="Heading2"/>
@@ -1277,151 +737,7 @@
               <w:pStyle w:val="Compact"/>
             </w:pPr>
             <w:r>
-              <w:rPr>
-                <w:rStyle w:val="VerbatimChar"/>
-              </w:rPr>
-              <w:t xml:space="preserve">grc</w:t>
-            </w:r>
-            <w:r>
-              <w:t xml:space="preserve"> </w:t>
-            </w:r>
-            <w:r>
-              <w:t xml:space="preserve">(Ancient Greek),</w:t>
-            </w:r>
-            <w:r>
-              <w:t xml:space="preserve"> </w:t>
-            </w:r>
-            <w:r>
-              <w:rPr>
-                <w:rStyle w:val="VerbatimChar"/>
-              </w:rPr>
-              <w:t xml:space="preserve">gkm</w:t>
-            </w:r>
-            <w:r>
-              <w:t xml:space="preserve"> </w:t>
-            </w:r>
-            <w:r>
-              <w:t xml:space="preserve">(Medieval Greek),</w:t>
-            </w:r>
-            <w:r>
-              <w:t xml:space="preserve"> </w:t>
-            </w:r>
-            <w:r>
-              <w:rPr>
-                <w:rStyle w:val="VerbatimChar"/>
-              </w:rPr>
-              <w:t xml:space="preserve">ell</w:t>
-            </w:r>
-            <w:r>
-              <w:t xml:space="preserve"> </w:t>
-            </w:r>
-            <w:r>
-              <w:t xml:space="preserve">(Modern Greek), with parallels in</w:t>
-            </w:r>
-            <w:r>
-              <w:t xml:space="preserve"> </w:t>
-            </w:r>
-            <w:r>
-              <w:rPr>
-                <w:rStyle w:val="VerbatimChar"/>
-              </w:rPr>
-              <w:t xml:space="preserve">lat</w:t>
-            </w:r>
-            <w:r>
-              <w:t xml:space="preserve">,</w:t>
-            </w:r>
-            <w:r>
-              <w:t xml:space="preserve"> </w:t>
-            </w:r>
-            <w:r>
-              <w:rPr>
-                <w:rStyle w:val="VerbatimChar"/>
-              </w:rPr>
-              <w:t xml:space="preserve">got</w:t>
-            </w:r>
-            <w:r>
-              <w:t xml:space="preserve">,</w:t>
-            </w:r>
-            <w:r>
-              <w:t xml:space="preserve"> </w:t>
-            </w:r>
-            <w:r>
-              <w:rPr>
-                <w:rStyle w:val="VerbatimChar"/>
-              </w:rPr>
-              <w:t xml:space="preserve">chu</w:t>
-            </w:r>
-            <w:r>
-              <w:t xml:space="preserve">,</w:t>
-            </w:r>
-            <w:r>
-              <w:t xml:space="preserve"> </w:t>
-            </w:r>
-            <w:r>
-              <w:rPr>
-                <w:rStyle w:val="VerbatimChar"/>
-              </w:rPr>
-              <w:t xml:space="preserve">xcl</w:t>
-            </w:r>
-            <w:r>
-              <w:t xml:space="preserve">; queued for v0.7:</w:t>
-            </w:r>
-            <w:r>
-              <w:t xml:space="preserve"> </w:t>
-            </w:r>
-            <w:r>
-              <w:rPr>
-                <w:rStyle w:val="VerbatimChar"/>
-              </w:rPr>
-              <w:t xml:space="preserve">san</w:t>
-            </w:r>
-            <w:r>
-              <w:t xml:space="preserve">,</w:t>
-            </w:r>
-            <w:r>
-              <w:t xml:space="preserve"> </w:t>
-            </w:r>
-            <w:r>
-              <w:rPr>
-                <w:rStyle w:val="VerbatimChar"/>
-              </w:rPr>
-              <w:t xml:space="preserve">ang</w:t>
-            </w:r>
-            <w:r>
-              <w:t xml:space="preserve">,</w:t>
-            </w:r>
-            <w:r>
-              <w:t xml:space="preserve"> </w:t>
-            </w:r>
-            <w:r>
-              <w:rPr>
-                <w:rStyle w:val="VerbatimChar"/>
-              </w:rPr>
-              <w:t xml:space="preserve">ave</w:t>
-            </w:r>
-            <w:r>
-              <w:t xml:space="preserve">,</w:t>
-            </w:r>
-            <w:r>
-              <w:t xml:space="preserve"> </w:t>
-            </w:r>
-            <w:r>
-              <w:rPr>
-                <w:rStyle w:val="VerbatimChar"/>
-              </w:rPr>
-              <w:t xml:space="preserve">peo</w:t>
-            </w:r>
-            <w:r>
-              <w:t xml:space="preserve">,</w:t>
-            </w:r>
-            <w:r>
-              <w:t xml:space="preserve"> </w:t>
-            </w:r>
-            <w:r>
-              <w:rPr>
-                <w:rStyle w:val="VerbatimChar"/>
-              </w:rPr>
-              <w:t xml:space="preserve">ukr</w:t>
+              <w:t xml:space="preserve">grc (Ancient Greek), gkm (Medieval Greek), ell (Modern Greek), with parallels in lat, got, chu, xcl; queued for v0.7: san, ang, ave, peo, ukr</w:t>
             </w:r>
           </w:p>
         </w:tc>
@@ -1469,16 +785,7 @@
               <w:pStyle w:val="Compact"/>
             </w:pPr>
             <w:r>
-              <w:rPr>
-                <w:rStyle w:val="VerbatimChar"/>
-              </w:rPr>
-              <w:t xml:space="preserve">AthDGC/Diachronic-Linguistics-Platform</w:t>
-            </w:r>
-            <w:r>
-              <w:t xml:space="preserve"> </w:t>
-            </w:r>
-            <w:r>
-              <w:t xml:space="preserve">on GitHub (private during v0.5 audit; public at v0.5)</w:t>
+              <w:t xml:space="preserve">AthDGC/Diachronic-Linguistics-Platform on GitHub (private during v0.5 audit; public at v0.5)</w:t>
             </w:r>
           </w:p>
         </w:tc>
@@ -1501,14 +808,9 @@
             <w:pPr>
               <w:pStyle w:val="Compact"/>
             </w:pPr>
-            <w:hyperlink r:id="rId11">
-              <w:r>
-                <w:rPr>
-                  <w:rStyle w:val="Hyperlink"/>
-                </w:rPr>
-                <w:t xml:space="preserve">10.5281/zenodo.20439182</w:t>
-              </w:r>
-            </w:hyperlink>
+            <w:r>
+              <w:t xml:space="preserve">10.5281/zenodo.20439182</w:t>
+            </w:r>
           </w:p>
         </w:tc>
       </w:tr>
@@ -1561,7 +863,7 @@
         </w:tc>
       </w:tr>
     </w:tbl>
-    <w:bookmarkStart w:id="24" w:name="open-access-source-provenance"/>
+    <w:bookmarkStart w:id="22" w:name="open-access-source-provenance"/>
     <w:p>
       <w:pPr>
         <w:pStyle w:val="Heading3"/>
@@ -1578,7 +880,7 @@
         <w:t xml:space="preserve">Every primary source text in AthDGC is open-access (public domain, CC-BY, CC-BY-SA, or equivalent). The annotation layer is AthDGC-original and released under CC-BY-4.0. Accordingly, the open-access chain is preserved from input through annotation to distribution.</w:t>
       </w:r>
     </w:p>
-    <w:bookmarkStart w:id="22" w:name="greek-per-period-source-map"/>
+    <w:bookmarkStart w:id="20" w:name="greek-per-period-source-map"/>
     <w:p>
       <w:pPr>
         <w:pStyle w:val="Heading4"/>
@@ -1953,8 +1255,8 @@
         </w:tc>
       </w:tr>
     </w:tbl>
-    <w:bookmarkEnd w:id="22"/>
-    <w:bookmarkStart w:id="23" w:name="X5df39f0a0025d74d30b7fff5210b3662db7b813"/>
+    <w:bookmarkEnd w:id="20"/>
+    <w:bookmarkStart w:id="21" w:name="X5df39f0a0025d74d30b7fff5210b3662db7b813"/>
     <w:p>
       <w:pPr>
         <w:pStyle w:val="Heading4"/>
@@ -2372,9 +1674,9 @@
         <w:t xml:space="preserve">In-copyright editions are never republished verbatim. Accordingly, AthDGC uses an open-access antecedent (for example, a pre-1928 Teubner edition, or the SBL Greek New Testament instead of the Nestle-Aland critical edition) or, where this is unavoidable, short quotation samples under fair use with full attribution. The annotation layer is always AthDGC-original and released under CC-BY-4.0, so that the open-access chain is preserved from the input texts through the syntactic and morphological annotation to the public deposition.</w:t>
       </w:r>
     </w:p>
-    <w:bookmarkEnd w:id="23"/>
-    <w:bookmarkEnd w:id="24"/>
-    <w:bookmarkStart w:id="25" w:name="indo-european-parallels-covered"/>
+    <w:bookmarkEnd w:id="21"/>
+    <w:bookmarkEnd w:id="22"/>
+    <w:bookmarkStart w:id="23" w:name="indo-european-parallels-covered"/>
     <w:p>
       <w:pPr>
         <w:pStyle w:val="Heading3"/>
@@ -2510,9 +1812,6 @@
               <w:pStyle w:val="Compact"/>
             </w:pPr>
             <w:r>
-              <w:rPr>
-                <w:rStyle w:val="VerbatimChar"/>
-              </w:rPr>
               <w:t xml:space="preserve">grc_proiel</w:t>
             </w:r>
           </w:p>
@@ -2581,9 +1880,6 @@
               <w:pStyle w:val="Compact"/>
             </w:pPr>
             <w:r>
-              <w:rPr>
-                <w:rStyle w:val="VerbatimChar"/>
-              </w:rPr>
               <w:t xml:space="preserve">la_proiel</w:t>
             </w:r>
           </w:p>
@@ -2652,9 +1948,6 @@
               <w:pStyle w:val="Compact"/>
             </w:pPr>
             <w:r>
-              <w:rPr>
-                <w:rStyle w:val="VerbatimChar"/>
-              </w:rPr>
               <w:t xml:space="preserve">got_proiel</w:t>
             </w:r>
           </w:p>
@@ -2723,9 +2016,6 @@
               <w:pStyle w:val="Compact"/>
             </w:pPr>
             <w:r>
-              <w:rPr>
-                <w:rStyle w:val="VerbatimChar"/>
-              </w:rPr>
               <w:t xml:space="preserve">cu_proiel</w:t>
             </w:r>
           </w:p>
@@ -2794,16 +2084,7 @@
               <w:pStyle w:val="Compact"/>
             </w:pPr>
             <w:r>
-              <w:rPr>
-                <w:rStyle w:val="VerbatimChar"/>
-              </w:rPr>
-              <w:t xml:space="preserve">xcl_proiel</w:t>
-            </w:r>
-            <w:r>
-              <w:t xml:space="preserve"> </w:t>
-            </w:r>
-            <w:r>
-              <w:t xml:space="preserve">(in dev.)</w:t>
+              <w:t xml:space="preserve">xcl_proiel (in dev.)</w:t>
             </w:r>
           </w:p>
         </w:tc>
@@ -2871,16 +2152,7 @@
               <w:pStyle w:val="Compact"/>
             </w:pPr>
             <w:r>
-              <w:rPr>
-                <w:rStyle w:val="VerbatimChar"/>
-              </w:rPr>
-              <w:t xml:space="preserve">sa_vedic</w:t>
-            </w:r>
-            <w:r>
-              <w:t xml:space="preserve"> </w:t>
-            </w:r>
-            <w:r>
-              <w:t xml:space="preserve">(queued)</w:t>
+              <w:t xml:space="preserve">sa_vedic (queued)</w:t>
             </w:r>
           </w:p>
         </w:tc>
@@ -2948,16 +2220,7 @@
               <w:pStyle w:val="Compact"/>
             </w:pPr>
             <w:r>
-              <w:rPr>
-                <w:rStyle w:val="VerbatimChar"/>
-              </w:rPr>
-              <w:t xml:space="preserve">ang_proiel</w:t>
-            </w:r>
-            <w:r>
-              <w:t xml:space="preserve"> </w:t>
-            </w:r>
-            <w:r>
-              <w:t xml:space="preserve">(queued)</w:t>
+              <w:t xml:space="preserve">ang_proiel (queued)</w:t>
             </w:r>
           </w:p>
         </w:tc>
@@ -3025,16 +2288,7 @@
               <w:pStyle w:val="Compact"/>
             </w:pPr>
             <w:r>
-              <w:rPr>
-                <w:rStyle w:val="VerbatimChar"/>
-              </w:rPr>
-              <w:t xml:space="preserve">ae_proiel</w:t>
-            </w:r>
-            <w:r>
-              <w:t xml:space="preserve"> </w:t>
-            </w:r>
-            <w:r>
-              <w:t xml:space="preserve">(queued)</w:t>
+              <w:t xml:space="preserve">ae_proiel (queued)</w:t>
             </w:r>
           </w:p>
         </w:tc>
@@ -3102,16 +2356,7 @@
               <w:pStyle w:val="Compact"/>
             </w:pPr>
             <w:r>
-              <w:rPr>
-                <w:rStyle w:val="VerbatimChar"/>
-              </w:rPr>
-              <w:t xml:space="preserve">peo_proiel</w:t>
-            </w:r>
-            <w:r>
-              <w:t xml:space="preserve"> </w:t>
-            </w:r>
-            <w:r>
-              <w:t xml:space="preserve">(queued)</w:t>
+              <w:t xml:space="preserve">peo_proiel (queued)</w:t>
             </w:r>
           </w:p>
         </w:tc>
@@ -3179,16 +2424,7 @@
               <w:pStyle w:val="Compact"/>
             </w:pPr>
             <w:r>
-              <w:rPr>
-                <w:rStyle w:val="VerbatimChar"/>
-              </w:rPr>
-              <w:t xml:space="preserve">uk_dep</w:t>
-            </w:r>
-            <w:r>
-              <w:t xml:space="preserve"> </w:t>
-            </w:r>
-            <w:r>
-              <w:t xml:space="preserve">adapted (queued)</w:t>
+              <w:t xml:space="preserve">uk_dep adapted (queued)</w:t>
             </w:r>
           </w:p>
         </w:tc>
@@ -3224,14 +2460,115 @@
         <w:t xml:space="preserve">Verified per-witness aligned-verse counts be reported in the v0.5 release notes once the ARIS audit pass closes. Accordingly, the v0.4 release provides the curated samples on the Samples page rather than full per-witness counts.</w:t>
       </w:r>
     </w:p>
+    <w:bookmarkEnd w:id="23"/>
+    <w:bookmarkStart w:id="24" w:name="X865201e721f3379b5250ae7a19b328bb9e630f2"/>
+    <w:p>
+      <w:pPr>
+        <w:pStyle w:val="Heading3"/>
+      </w:pPr>
+      <w:r>
+        <w:t xml:space="preserve">3.3 Retelling and retranslation chains: a worked case study</w:t>
+      </w:r>
+    </w:p>
+    <w:p>
+      <w:pPr>
+        <w:pStyle w:val="FirstParagraph"/>
+      </w:pPr>
+      <w:r>
+        <w:t xml:space="preserve">A retelling and retranslation chain is the central analytical structure of AthDGC. It is a directed sequence of nodes, where each node is the same canonical passage as it appears in a different period or a different language, annotated end-to-end in the PROIEL XML 2.0 schema, and connected by edges that record the type of relationship between adjacent nodes (retelling within Greek across periods, retranslation within Greek across registers, or retranslation cross-lingually across the Indo-European family). The chain is the unit on which the platform’s diachronic and comparative queries operate.</w:t>
+      </w:r>
+    </w:p>
+    <w:p>
+      <w:pPr>
+        <w:pStyle w:val="BodyText"/>
+      </w:pPr>
+      <w:r>
+        <w:t xml:space="preserve">Five chains are public on the Samples page at v0.4, namely the Iliad 1.1 across reception (Homer, Tzetzes, Kazantzakis), the Septuagint Psalm 1:1 across Greek periods, the New Testament John 1:1 patristic and Modern reception, the Plato Apology 17a across reception, and the Septuagint Genesis 1:1 across four Indo-European languages. We present the Iliad 1.1 chain in detail because it is the most familiar to the comparative linguist and because it shows the analytical pay-off of the chain structure most clearly.</w:t>
+      </w:r>
+    </w:p>
+    <w:p>
+      <w:pPr>
+        <w:pStyle w:val="BodyText"/>
+      </w:pPr>
+      <w:r>
+        <w:t xml:space="preserve">The first node of the chain is the Homeric original, μῆνιν ἄειδε θεὰ Πηληϊάδεω Ἀχιλῆος. Under AthDGC annotation, μῆνιν is the object (obj, accusative singular feminine), ἄειδε the predicate (imperative second person singular, active, imperfective), θεὰ the vocative addressee (voc), and the genitive pair Πηληϊάδεω Ἀχιλῆος a coordinated attribute (atr) hanging from the object noun. The argument-structure frame of the verb is [sub:imp.2sg, obj:μῆνιν, voc:θεὰ, voice:active, aspect:imperfective], and the frame signature [obj:acc, voc:voc] is recorded as the chain’s characteristic frame against which subsequent nodes are compared.</w:t>
+      </w:r>
+    </w:p>
+    <w:p>
+      <w:pPr>
+        <w:pStyle w:val="BodyText"/>
+      </w:pPr>
+      <w:r>
+        <w:t xml:space="preserve">The second node of the chain is the Byzantine epitome of Tzetzes (twelfth century), in which the same opening is reframed as a third-person prose narrative. Under AthDGC annotation, μῆνιν survives as a direct object, but the imperative-and-vocative dialogic frame collapses: the goddess is no longer addressed, and the verb of singing is replaced by a verb of narration. The characteristic frame [obj:acc, voc:voc] therefore loses one slot and the chain records a frame collapse between Homer and Tzetzes, of the kind that typically signals a generic reframing rather than a syntactic change in Greek per se.</w:t>
+      </w:r>
+    </w:p>
+    <w:p>
+      <w:pPr>
+        <w:pStyle w:val="BodyText"/>
+      </w:pPr>
+      <w:r>
+        <w:t xml:space="preserve">The third node is the Kakridis-Kazantzakis prose translation of 1955, the canonical Modern Greek prose rendering of the Iliad. Under AthDGC annotation, the wrath remains a direct object in the Modern Greek accusative, the vocative of the goddess is restored, and the verb of singing returns. The characteristic frame [obj:acc, voc:voc] is therefore stable across 2,800 years in the direct Homer-to-Modern path; the frame collapse at the Tzetzes node is shown to be a feature of the Byzantine epitomising genre, not of the Greek language. This is the kind of finding that the chain structure makes immediate: without the chain, the reader would need to read each text manually and reason about the structural correspondence; with the chain, the platform produces the result in a single query of the form frame-stability(Iliad 1.1, Homer, Modern).</w:t>
+      </w:r>
+    </w:p>
+    <w:p>
+      <w:pPr>
+        <w:pStyle w:val="BodyText"/>
+      </w:pPr>
+      <w:r>
+        <w:t xml:space="preserve">The Septuagint Psalm 1:1 retranslation chain shows the inverse pattern, namely the stability of pred-nom + sub + atr.rel-cl across the Septuagint, Byzantine, and Modern Greek nodes with two voice flips between the active and the mediopassive on the verb of walking, together with the lexical replacement of the Greek negation οὐκ by οὐ and then by δεν. The John 1:1 patristic and Modern chain shows the stability of the copular skeleton across 2,000 years, with the patristic nodes nesting under the xcomp of φησίν (“he says”), which is a structural reflex of the Late-Antique commentary register. The Plato Apology 17a chain shows the preservation of the pred + adv:neg + comp[sub, obl] pattern across the Plato-to-Modern path, with the perfect aspect alternating between the synthetic Classical form and the analytic Modern Greek auxiliary plus participle. The Septuagint Genesis 1:1 cross-IE chain shows the stability of the pred + sub + obl/adv + obj + coord pattern across the Greek, Latin Vulgate, Gothic Wulfila, and Old Church Slavonic Marianus nodes, with only the obl and adv slots diverging in the OCS rendering, a divergence that reflects the well-known Slavic preference for adverbial expression where Greek and Latin use an oblique noun.</w:t>
+      </w:r>
+    </w:p>
+    <w:p>
+      <w:pPr>
+        <w:pStyle w:val="BodyText"/>
+      </w:pPr>
+      <w:r>
+        <w:t xml:space="preserve">The retelling and retranslation chain is, in this respect, the central contribution of AthDGC to diachronic-Greek and Indo-European comparative syntax: it is the data structure that makes the diachronic stability of a syntactic pattern computationally observable.</w:t>
+      </w:r>
+    </w:p>
+    <w:bookmarkEnd w:id="24"/>
+    <w:bookmarkStart w:id="25" w:name="tools-open-source"/>
+    <w:p>
+      <w:pPr>
+        <w:pStyle w:val="Heading3"/>
+      </w:pPr>
+      <w:r>
+        <w:t xml:space="preserve">3.4 Tools (open source)</w:t>
+      </w:r>
+    </w:p>
+    <w:p>
+      <w:pPr>
+        <w:pStyle w:val="FirstParagraph"/>
+      </w:pPr>
+      <w:r>
+        <w:t xml:space="preserve">The AthDGC toolkit is organised as a set of OSI-licensed modules in three readiness tiers. Five modules are LIVE in the public repository and can be cloned and run today. They are the Quarto pack that builds this Working Paper and the public site, the showcase generator that produces the browsable per-sample PROIEL trees, the corpus-fix toolkit that bulk-corrects annotation errors at scale, the PROIEL XML 2.0 exporter that runs inside the build workflow, and the Stanza annotation job script for the GRNET ARIS allocation. Eight modules are IN SETUP, working in the project’s internal pack and migrating to a unified public tools/ directory at v0.5, namely the PROIEL XML 2.0 schema validator (which enforces the relation inventory and rejects UD-style labels such as nsubj and dobj; UD here is Universal Dependencies, the alternative treebanking framework whose label inventory is incompatible with PROIEL), the house-style check, the argument-frame extractor, the Stanza fine-tuning scripts, the athdgc-tools PyPI package, and the three Hugging Face model repositories whose weights upload at v0.5. The remaining modules are FORTHCOMING at v0.5: the LightSIDE-AthDGC syntactic-feature fork and its export scripts, the NoSketch-style CWB indexer, the Neo4j alignment viewer, the valency-frame database client, the retranslation-pair browser, and the retelling-chain explorer. The complete tier matrix per module is on the public Tools page at https://athdgc.github.io/tools.html and on the Status page at https://athdgc.github.io/status.html.</w:t>
+      </w:r>
+    </w:p>
+    <w:p>
+      <w:pPr>
+        <w:pStyle w:val="BodyText"/>
+      </w:pPr>
+      <w:r>
+        <w:t xml:space="preserve">Across the toolkit, the annotation layer and the corpus samples are CC-BY-4.0; the tool code is Apache-2.0 (most modules), MIT (the Quarto pack and the Neo4j viewer), BSD-3-Clause (inherited from the upstream LightSIDE project), and GPL-3.0 (the upstream CWB indexer, retained on the index builder).</w:t>
+      </w:r>
+    </w:p>
+    <w:p>
+      <w:pPr>
+        <w:pStyle w:val="BodyText"/>
+      </w:pPr>
+      <w:r>
+        <w:t xml:space="preserve">Two automated gates run on every community pull request, namely a PROIEL XML 2.0 schema validator (which rejects UD-style labels such as nsubj, dobj, nmod, case) and a house-style check that enforces the project style guide.</w:t>
+      </w:r>
+    </w:p>
     <w:bookmarkEnd w:id="25"/>
-    <w:bookmarkStart w:id="26" w:name="X865201e721f3379b5250ae7a19b328bb9e630f2"/>
-    <w:p>
-      <w:pPr>
-        <w:pStyle w:val="Heading3"/>
-      </w:pPr>
-      <w:r>
-        <w:t xml:space="preserve">3.3 Retelling and retranslation chains: a worked case study</w:t>
+    <w:bookmarkEnd w:id="26"/>
+    <w:bookmarkStart w:id="27" w:name="related-work-and-positioning"/>
+    <w:p>
+      <w:pPr>
+        <w:pStyle w:val="Heading2"/>
+      </w:pPr>
+      <w:r>
+        <w:t xml:space="preserve">4. Related work and positioning</w:t>
       </w:r>
     </w:p>
     <w:p>
@@ -3239,7 +2576,7 @@
         <w:pStyle w:val="FirstParagraph"/>
       </w:pPr>
       <w:r>
-        <w:t xml:space="preserve">A retelling and retranslation chain is the central analytical structure of AthDGC. It is a directed sequence of nodes, where each node is the same canonical passage as it appears in a different period or a different language, annotated end-to-end in the PROIEL XML 2.0 schema, and connected by edges that record the type of relationship between adjacent nodes (retelling within Greek across periods, retranslation within Greek across registers, or retranslation cross-lingually across the Indo-European family). The chain is the unit on which the platform’s diachronic and comparative queries operate.</w:t>
+        <w:t xml:space="preserve">AthDGC sits in an ecosystem of openly licensed treebanks for older Indo-European languages, and we briefly describe where it differs from and where it complements each of them.</w:t>
       </w:r>
     </w:p>
     <w:p>
@@ -3247,55 +2584,7 @@
         <w:pStyle w:val="BodyText"/>
       </w:pPr>
       <w:r>
-        <w:t xml:space="preserve">Five chains are public on the Samples page at v0.4, namely the</w:t>
-      </w:r>
-      <w:r>
-        <w:t xml:space="preserve"> </w:t>
-      </w:r>
-      <w:r>
-        <w:rPr>
-          <w:i/>
-          <w:iCs/>
-        </w:rPr>
-        <w:t xml:space="preserve">Iliad</w:t>
-      </w:r>
-      <w:r>
-        <w:t xml:space="preserve"> </w:t>
-      </w:r>
-      <w:r>
-        <w:t xml:space="preserve">1.1 across reception (Homer, Tzetzes, Kazantzakis), the Septuagint Psalm 1:1 across Greek periods, the New Testament John 1:1 patristic and Modern reception, the Plato</w:t>
-      </w:r>
-      <w:r>
-        <w:t xml:space="preserve"> </w:t>
-      </w:r>
-      <w:r>
-        <w:rPr>
-          <w:i/>
-          <w:iCs/>
-        </w:rPr>
-        <w:t xml:space="preserve">Apology</w:t>
-      </w:r>
-      <w:r>
-        <w:t xml:space="preserve"> </w:t>
-      </w:r>
-      <w:r>
-        <w:t xml:space="preserve">17a across reception, and the Septuagint Genesis 1:1 across four Indo-European languages. We present the</w:t>
-      </w:r>
-      <w:r>
-        <w:t xml:space="preserve"> </w:t>
-      </w:r>
-      <w:r>
-        <w:rPr>
-          <w:i/>
-          <w:iCs/>
-        </w:rPr>
-        <w:t xml:space="preserve">Iliad</w:t>
-      </w:r>
-      <w:r>
-        <w:t xml:space="preserve"> </w:t>
-      </w:r>
-      <w:r>
-        <w:t xml:space="preserve">1.1 chain in detail because it is the most familiar to the comparative linguist and because it shows the analytical pay-off of the chain structure most clearly.</w:t>
+        <w:t xml:space="preserve">The PROIEL Treebank (Haug and Jøhndal 2008, 27–34; Eckhoff et al. 2018, 29–65), as discussed in §1.1, established the schema and the Koine-Greek anchor against which AthDGC is naturally measured. AthDGC adopts the PROIEL XML 2.0 schema verbatim (and publishes in that schema only), so that any sentence in AthDGC can be read by any tool already in the PROIEL ecosystem. The complementarity is that PROIEL covers the New Testament across four IE witnesses at a high annotation density, whereas AthDGC covers the entire diachronic span of Greek across eight periods and extends the cross-lingual alignment with the Classical Armenian witness now, and with Sanskrit, Old English, Avestan, Old Persian, and Ukrainian at v0.7.</w:t>
       </w:r>
     </w:p>
     <w:p>
@@ -3303,61 +2592,7 @@
         <w:pStyle w:val="BodyText"/>
       </w:pPr>
       <w:r>
-        <w:t xml:space="preserve">The first node of the chain is the Homeric original, μῆνιν ἄειδε θεὰ Πηληϊάδεω Ἀχιλῆος. Under AthDGC annotation, μῆνιν is the object (</w:t>
-      </w:r>
-      <w:r>
-        <w:rPr>
-          <w:rStyle w:val="VerbatimChar"/>
-        </w:rPr>
-        <w:t xml:space="preserve">obj</w:t>
-      </w:r>
-      <w:r>
-        <w:t xml:space="preserve">, accusative singular feminine), ἄειδε the predicate (imperative second person singular, active, imperfective), θεὰ the vocative addressee (</w:t>
-      </w:r>
-      <w:r>
-        <w:rPr>
-          <w:rStyle w:val="VerbatimChar"/>
-        </w:rPr>
-        <w:t xml:space="preserve">voc</w:t>
-      </w:r>
-      <w:r>
-        <w:t xml:space="preserve">), and the genitive pair Πηληϊάδεω Ἀχιλῆος a coordinated attribute (</w:t>
-      </w:r>
-      <w:r>
-        <w:rPr>
-          <w:rStyle w:val="VerbatimChar"/>
-        </w:rPr>
-        <w:t xml:space="preserve">atr</w:t>
-      </w:r>
-      <w:r>
-        <w:t xml:space="preserve">) hanging from the object noun. The argument-structure frame of the verb is</w:t>
-      </w:r>
-      <w:r>
-        <w:t xml:space="preserve"> </w:t>
-      </w:r>
-      <w:r>
-        <w:rPr>
-          <w:rStyle w:val="VerbatimChar"/>
-        </w:rPr>
-        <w:t xml:space="preserve">[sub:imp.2sg, obj:μῆνιν, voc:θεὰ, voice:active, aspect:imperfective]</w:t>
-      </w:r>
-      <w:r>
-        <w:t xml:space="preserve">, and the frame signature</w:t>
-      </w:r>
-      <w:r>
-        <w:t xml:space="preserve"> </w:t>
-      </w:r>
-      <w:r>
-        <w:rPr>
-          <w:rStyle w:val="VerbatimChar"/>
-        </w:rPr>
-        <w:t xml:space="preserve">[obj:acc, voc:voc]</w:t>
-      </w:r>
-      <w:r>
-        <w:t xml:space="preserve"> </w:t>
-      </w:r>
-      <w:r>
-        <w:t xml:space="preserve">is recorded as the chain’s characteristic frame against which subsequent nodes are compared.</w:t>
+        <w:t xml:space="preserve">The GLAUx Corpus (the Greek Language Automated, a large lemmatised classical-Greek corpus released by Toon Van Hal and collaborators) and the Diorisis Corpus (the lemmatised classical-Greek corpus by Vatri and McGillivray) provide lemmatised classical-Greek text at scale, but they do not provide a dependency-syntactic annotation layer and do not provide cross-lingual alignment. AthDGC re-uses the lemmatisation effort of both projects where their licences permit and adds the syntactic-annotation layer on top.</w:t>
       </w:r>
     </w:p>
     <w:p>
@@ -3365,22 +2600,7 @@
         <w:pStyle w:val="BodyText"/>
       </w:pPr>
       <w:r>
-        <w:t xml:space="preserve">The second node of the chain is the Byzantine epitome of Tzetzes (twelfth century), in which the same opening is reframed as a third-person prose narrative. Under AthDGC annotation, μῆνιν survives as a direct object, but the imperative-and-vocative dialogic frame collapses: the goddess is no longer addressed, and the verb of singing is replaced by a verb of narration. The characteristic frame</w:t>
-      </w:r>
-      <w:r>
-        <w:t xml:space="preserve"> </w:t>
-      </w:r>
-      <w:r>
-        <w:rPr>
-          <w:rStyle w:val="VerbatimChar"/>
-        </w:rPr>
-        <w:t xml:space="preserve">[obj:acc, voc:voc]</w:t>
-      </w:r>
-      <w:r>
-        <w:t xml:space="preserve"> </w:t>
-      </w:r>
-      <w:r>
-        <w:t xml:space="preserve">therefore loses one slot and the chain records a frame collapse between Homer and Tzetzes, of the kind that typically signals a generic reframing rather than a syntactic change in Greek per se.</w:t>
+        <w:t xml:space="preserve">The Ancient Greek Dependency Treebank (AGDT, the Perseus dependency treebank of classical and post-classical Greek) and the Pedalion treebank (the Leuven treebank of classical-Greek student-annotation material) provide dependency annotation for selected classical-Greek texts, but under different relation inventories from PROIEL (AGDT uses a hybrid Latin Dependency Treebank schema, Pedalion uses a pedagogical schema), and they do not provide cross-lingual alignment either. AthDGC publishes PROIEL XML 2.0 only, and we therefore do not re-ingest AGDT or Pedalion material at the syntactic-annotation layer; we treat them as comparison points for diachronic claims, not as input.</w:t>
       </w:r>
     </w:p>
     <w:p>
@@ -3388,47 +2608,25 @@
         <w:pStyle w:val="BodyText"/>
       </w:pPr>
       <w:r>
-        <w:t xml:space="preserve">The third node is the Kakridis-Kazantzakis prose translation of 1955, the canonical Modern Greek prose rendering of the</w:t>
-      </w:r>
-      <w:r>
-        <w:t xml:space="preserve"> </w:t>
-      </w:r>
-      <w:r>
-        <w:rPr>
-          <w:i/>
-          <w:iCs/>
-        </w:rPr>
-        <w:t xml:space="preserve">Iliad</w:t>
-      </w:r>
-      <w:r>
-        <w:t xml:space="preserve">. Under AthDGC annotation, the wrath remains a direct object in the Modern Greek accusative, the vocative of the goddess is restored, and the verb of singing returns. The characteristic frame</w:t>
-      </w:r>
-      <w:r>
-        <w:t xml:space="preserve"> </w:t>
-      </w:r>
-      <w:r>
-        <w:rPr>
-          <w:rStyle w:val="VerbatimChar"/>
-        </w:rPr>
-        <w:t xml:space="preserve">[obj:acc, voc:voc]</w:t>
-      </w:r>
-      <w:r>
-        <w:t xml:space="preserve"> </w:t>
-      </w:r>
-      <w:r>
-        <w:t xml:space="preserve">is therefore stable across 2,800 years in the direct Homer-to-Modern path; the frame collapse at the Tzetzes node is shown to be a feature of the Byzantine epitomising genre, not of the Greek language. This is the kind of finding that the chain structure makes immediate: without the chain, the reader would need to read each text manually and reason about the structural correspondence; with the chain, the platform produces the result in a single query of the form</w:t>
-      </w:r>
-      <w:r>
-        <w:t xml:space="preserve"> </w:t>
-      </w:r>
-      <w:r>
-        <w:rPr>
-          <w:rStyle w:val="VerbatimChar"/>
-        </w:rPr>
-        <w:t xml:space="preserve">frame-stability(Iliad 1.1, Homer, Modern)</w:t>
-      </w:r>
-      <w:r>
-        <w:t xml:space="preserve">.</w:t>
+        <w:t xml:space="preserve">In broad terms, AthDGC’s contribution is therefore three-fold. First, the extension of PROIEL-schema syntactic annotation to the full diachronic span of Greek, from Archaic to Modern, under one schema. Secondly, the systematic inclusion of retelling and retranslation chains as a first-class data structure, so that the diachronic stability of a syntactic pattern becomes a computable quantity. Thirdly, the extension of the cross-lingual alignment beyond the four PROIEL witnesses, with Classical Armenian arriving at v0.5 and five further IE witnesses (Sanskrit, Old English, Avestan, Old Persian, and Ukrainian) at v0.7.</w:t>
+      </w:r>
+    </w:p>
+    <w:bookmarkEnd w:id="27"/>
+    <w:bookmarkStart w:id="28" w:name="reuse-potential"/>
+    <w:p>
+      <w:pPr>
+        <w:pStyle w:val="Heading2"/>
+      </w:pPr>
+      <w:r>
+        <w:t xml:space="preserve">5. Reuse potential</w:t>
+      </w:r>
+    </w:p>
+    <w:p>
+      <w:pPr>
+        <w:pStyle w:val="FirstParagraph"/>
+      </w:pPr>
+      <w:r>
+        <w:t xml:space="preserve">AthDGC supports four primary reuse classes, which we describe in turn with concrete query examples.</w:t>
       </w:r>
     </w:p>
     <w:p>
@@ -3436,119 +2634,7 @@
         <w:pStyle w:val="BodyText"/>
       </w:pPr>
       <w:r>
-        <w:t xml:space="preserve">The Septuagint Psalm 1:1 retranslation chain shows the inverse pattern, namely the stability of</w:t>
-      </w:r>
-      <w:r>
-        <w:t xml:space="preserve"> </w:t>
-      </w:r>
-      <w:r>
-        <w:rPr>
-          <w:rStyle w:val="VerbatimChar"/>
-        </w:rPr>
-        <w:t xml:space="preserve">pred-nom + sub + atr.rel-cl</w:t>
-      </w:r>
-      <w:r>
-        <w:t xml:space="preserve"> </w:t>
-      </w:r>
-      <w:r>
-        <w:t xml:space="preserve">across the Septuagint, Byzantine, and Modern Greek nodes with two voice flips between the active and the mediopassive on the verb of walking, together with the lexical replacement of the Greek negation οὐκ by οὐ and then by δεν. The John 1:1 patristic and Modern chain shows the stability of the copular skeleton across 2,000 years, with the patristic nodes nesting under the</w:t>
-      </w:r>
-      <w:r>
-        <w:t xml:space="preserve"> </w:t>
-      </w:r>
-      <w:r>
-        <w:rPr>
-          <w:rStyle w:val="VerbatimChar"/>
-        </w:rPr>
-        <w:t xml:space="preserve">xcomp</w:t>
-      </w:r>
-      <w:r>
-        <w:t xml:space="preserve"> </w:t>
-      </w:r>
-      <w:r>
-        <w:t xml:space="preserve">of φησίν (</w:t>
-      </w:r>
-      <w:r>
-        <w:t xml:space="preserve">“he says”</w:t>
-      </w:r>
-      <w:r>
-        <w:t xml:space="preserve">), which is a structural reflex of the Late-Antique commentary register. The Plato</w:t>
-      </w:r>
-      <w:r>
-        <w:t xml:space="preserve"> </w:t>
-      </w:r>
-      <w:r>
-        <w:rPr>
-          <w:i/>
-          <w:iCs/>
-        </w:rPr>
-        <w:t xml:space="preserve">Apology</w:t>
-      </w:r>
-      <w:r>
-        <w:t xml:space="preserve"> </w:t>
-      </w:r>
-      <w:r>
-        <w:t xml:space="preserve">17a chain shows the preservation of the</w:t>
-      </w:r>
-      <w:r>
-        <w:t xml:space="preserve"> </w:t>
-      </w:r>
-      <w:r>
-        <w:rPr>
-          <w:rStyle w:val="VerbatimChar"/>
-        </w:rPr>
-        <w:t xml:space="preserve">pred + adv:neg + comp[sub, obl]</w:t>
-      </w:r>
-      <w:r>
-        <w:t xml:space="preserve"> </w:t>
-      </w:r>
-      <w:r>
-        <w:t xml:space="preserve">pattern across the Plato-to-Modern path, with the perfect aspect alternating between the synthetic Classical form and the analytic Modern Greek auxiliary plus participle. The Septuagint Genesis 1:1 cross-IE chain shows the stability of the</w:t>
-      </w:r>
-      <w:r>
-        <w:t xml:space="preserve"> </w:t>
-      </w:r>
-      <w:r>
-        <w:rPr>
-          <w:rStyle w:val="VerbatimChar"/>
-        </w:rPr>
-        <w:t xml:space="preserve">pred + sub + obl/adv + obj + coord</w:t>
-      </w:r>
-      <w:r>
-        <w:t xml:space="preserve"> </w:t>
-      </w:r>
-      <w:r>
-        <w:t xml:space="preserve">pattern across the Greek, Latin Vulgate, Gothic Wulfila, and Old Church Slavonic Marianus nodes, with only the</w:t>
-      </w:r>
-      <w:r>
-        <w:t xml:space="preserve"> </w:t>
-      </w:r>
-      <w:r>
-        <w:rPr>
-          <w:rStyle w:val="VerbatimChar"/>
-        </w:rPr>
-        <w:t xml:space="preserve">obl</w:t>
-      </w:r>
-      <w:r>
-        <w:t xml:space="preserve"> </w:t>
-      </w:r>
-      <w:r>
-        <w:t xml:space="preserve">and</w:t>
-      </w:r>
-      <w:r>
-        <w:t xml:space="preserve"> </w:t>
-      </w:r>
-      <w:r>
-        <w:rPr>
-          <w:rStyle w:val="VerbatimChar"/>
-        </w:rPr>
-        <w:t xml:space="preserve">adv</w:t>
-      </w:r>
-      <w:r>
-        <w:t xml:space="preserve"> </w:t>
-      </w:r>
-      <w:r>
-        <w:t xml:space="preserve">slots diverging in the OCS rendering, a divergence that reflects the well-known Slavic preference for adverbial expression where Greek and Latin use an oblique noun.</w:t>
+        <w:t xml:space="preserve">In the first place, historical syntactic research. Per-period dependency parses allow analysts to track argument-structure changes across three millennia of Greek. Examples include the active-to-mediopassive shifts of certain verbs of motion, the loss of the optative across the Hellenistic period, the rise of the periphrastic perfect over the synthetic perfect across the Byzantine and Early Modern periods, the accusative-to-genitive variation under verbs of perception across periods, and the gradual replacement of the postnominal genitive of possession by the prenominal genitive in Modern Greek. Accordingly, the colour-coded compact dependency overview on each sample page is designed for fast scanning of these patterns. A worked query example is for the verb ἀκούω (“hear”), is the object more often in the accusative or in the genitive at each period?, which the valency-frame database (v0.5) answers in a single line.</w:t>
       </w:r>
     </w:p>
     <w:p>
@@ -3556,17 +2642,63 @@
         <w:pStyle w:val="BodyText"/>
       </w:pPr>
       <w:r>
-        <w:t xml:space="preserve">The retelling and retranslation chain is, in this respect, the central contribution of AthDGC to diachronic-Greek and Indo-European comparative syntax: it is the data structure that makes the diachronic stability of a syntactic pattern computationally observable.</w:t>
-      </w:r>
-    </w:p>
-    <w:bookmarkEnd w:id="26"/>
-    <w:bookmarkStart w:id="29" w:name="tools-open-source"/>
-    <w:p>
-      <w:pPr>
-        <w:pStyle w:val="Heading3"/>
-      </w:pPr>
-      <w:r>
-        <w:t xml:space="preserve">3.4 Tools (open source)</w:t>
+        <w:t xml:space="preserve">Secondly, Indo-European comparative syntax. The verse-level cross-lingual alignment of the New Testament to Latin (Vulgate), Gothic (Wulfila), Old Church Slavonic (Marianus), and Classical Armenian provides aligned PROIEL parses across four sister Indo-European languages, with Sanskrit, Old English, Avestan, Old Persian, and Ukrainian queued at v0.7. In this respect, users can query the Neo4j alignment graph for typological correspondences. A worked query example is every Greek aorist active verb whose Latin Vulgate counterpart is passive, which is expressed in Cypher (Cypher is the query language of Neo4j, structurally analogous to SQL for relational databases, in which MATCH patterns are drawn directly with arrows between nodes) as MATCH (gk:Token {lang:</w:t>
+      </w:r>
+      <w:r>
+        <w:t xml:space="preserve">“grc”</w:t>
+      </w:r>
+      <w:r>
+        <w:t xml:space="preserve">, tense:</w:t>
+      </w:r>
+      <w:r>
+        <w:t xml:space="preserve">“aor”</w:t>
+      </w:r>
+      <w:r>
+        <w:t xml:space="preserve">, voice:</w:t>
+      </w:r>
+      <w:r>
+        <w:t xml:space="preserve">“act”</w:t>
+      </w:r>
+      <w:r>
+        <w:t xml:space="preserve">})-[:TRANSLATED_AS]-&gt;(la:Token {lang:</w:t>
+      </w:r>
+      <w:r>
+        <w:t xml:space="preserve">“lat”</w:t>
+      </w:r>
+      <w:r>
+        <w:t xml:space="preserve">, voice:</w:t>
+      </w:r>
+      <w:r>
+        <w:t xml:space="preserve">“pass”</w:t>
+      </w:r>
+      <w:r>
+        <w:t xml:space="preserve">}) RETURN gk, la, and which is answered across the entire NT-aligned partition in a single pass.</w:t>
+      </w:r>
+    </w:p>
+    <w:p>
+      <w:pPr>
+        <w:pStyle w:val="BodyText"/>
+      </w:pPr>
+      <w:r>
+        <w:t xml:space="preserve">Thirdly, computational diachronic NLP. The fine-tuned Stanza checkpoints (a checkpoint is a saved snapshot of a trained model’s numeric parameters, which can be loaded back into Stanza to parse new sentences without re-training) (grc_byz_proiel for Byzantine Greek, grc_lbem_proiel for Late Byzantine and Early Modern Greek, grc_mod_proiel for Modern Greek) are trained on ARIS; the Hugging Face model repositories under AthDGC/* exist now as private during the v0.5 audit pass and become public at v0.5 with the weight payloads (the trained parameter files that the checkpoints comprise) uploaded. In broad terms, the PyPI package athdgc-tools reserves the name with the stub 0.4.0.dev0, and the full toolkit replaces the stub at v0.5; the checkpoints can be loaded directly into Stanza for parsing new Greek diachronic data once the weights are published. Thereby the LightSIDE-AthDGC fork extends LightSIDE (the open-source text-mining workbench developed at Carnegie Mellon by Carolyn Rosé’s group) to operate on syntactic features, namely dependency arcs, argument-structure frames, and morphology bundles, opening a new feature space for the classification of diachronic stages. A worked query example is train an SVM classifier (Support Vector Machine, a standard classification algorithm) on grc_proiel argument-structure frames to distinguish Archaic from Classical from Koine Greek, and inspect the top-weighted frames per class, which is the kind of analysis that the LightSIDE-AthDGC fork makes a one-hour classroom exercise.</w:t>
+      </w:r>
+    </w:p>
+    <w:p>
+      <w:pPr>
+        <w:pStyle w:val="BodyText"/>
+      </w:pPr>
+      <w:r>
+        <w:t xml:space="preserve">Fourthly, digital editions and pedagogy. The showcase generator (51_build_showcase_site.py) produces browsable per-sample PROIEL trees from any JSONL (JSON Lines, the line-per-record plain-text format) corpus; the Quarto template pack (Quarto is an open-source publishing system that builds websites, slides, papers, and posters from a single source file) generates the whole multi-output site, namely HTML, Reveal.js slides, .docx, .pptx, Beamer, and an A0-format academic poster, from a single source. Both are open-source and reusable by other historical-treebank projects. The platform is taught as a KEDIVIM continuing-education course at NKUA, Ψηφιακά Εργαλεία για τη Διαχρονική Ανάλυση της Γλώσσας / Digital Tools for the Diachronic Analysis of Language, autumn 2026; see https://athdgc.github.io/training.html.</w:t>
+      </w:r>
+    </w:p>
+    <w:bookmarkEnd w:id="28"/>
+    <w:bookmarkStart w:id="29" w:name="access-and-format"/>
+    <w:p>
+      <w:pPr>
+        <w:pStyle w:val="Heading2"/>
+      </w:pPr>
+      <w:r>
+        <w:t xml:space="preserve">6. Access and format</w:t>
       </w:r>
     </w:p>
     <w:p>
@@ -3574,95 +2706,7 @@
         <w:pStyle w:val="FirstParagraph"/>
       </w:pPr>
       <w:r>
-        <w:t xml:space="preserve">The AthDGC toolkit is organised as a set of OSI-licensed modules in three readiness tiers. Five modules are LIVE in the public repository and can be cloned and run today. They are the Quarto pack that builds this Working Paper and the public site, the showcase generator that produces the browsable per-sample PROIEL trees, the corpus-fix toolkit that bulk-corrects annotation errors at scale, the PROIEL XML 2.0 exporter that runs inside the build workflow, and the Stanza annotation job script for the GRNET ARIS allocation. Eight modules are IN SETUP, working in the project’s internal pack and migrating to a unified public</w:t>
-      </w:r>
-      <w:r>
-        <w:t xml:space="preserve"> </w:t>
-      </w:r>
-      <w:r>
-        <w:rPr>
-          <w:rStyle w:val="VerbatimChar"/>
-        </w:rPr>
-        <w:t xml:space="preserve">tools/</w:t>
-      </w:r>
-      <w:r>
-        <w:t xml:space="preserve"> </w:t>
-      </w:r>
-      <w:r>
-        <w:t xml:space="preserve">directory at v0.5, namely the PROIEL XML 2.0 schema validator (which enforces the relation inventory and rejects UD-style labels such as</w:t>
-      </w:r>
-      <w:r>
-        <w:t xml:space="preserve"> </w:t>
-      </w:r>
-      <w:r>
-        <w:rPr>
-          <w:rStyle w:val="VerbatimChar"/>
-        </w:rPr>
-        <w:t xml:space="preserve">nsubj</w:t>
-      </w:r>
-      <w:r>
-        <w:t xml:space="preserve"> </w:t>
-      </w:r>
-      <w:r>
-        <w:t xml:space="preserve">and</w:t>
-      </w:r>
-      <w:r>
-        <w:t xml:space="preserve"> </w:t>
-      </w:r>
-      <w:r>
-        <w:rPr>
-          <w:rStyle w:val="VerbatimChar"/>
-        </w:rPr>
-        <w:t xml:space="preserve">dobj</w:t>
-      </w:r>
-      <w:r>
-        <w:t xml:space="preserve">; UD here is Universal Dependencies, the alternative treebanking framework whose label inventory is incompatible with PROIEL), the house-style check, the argument-frame extractor, the Stanza fine-tuning scripts, the</w:t>
-      </w:r>
-      <w:r>
-        <w:t xml:space="preserve"> </w:t>
-      </w:r>
-      <w:r>
-        <w:rPr>
-          <w:rStyle w:val="VerbatimChar"/>
-        </w:rPr>
-        <w:t xml:space="preserve">athdgc-tools</w:t>
-      </w:r>
-      <w:r>
-        <w:t xml:space="preserve"> </w:t>
-      </w:r>
-      <w:r>
-        <w:t xml:space="preserve">PyPI package, and the three Hugging Face model repositories whose weights upload at v0.5. The remaining modules are FORTHCOMING at v0.5: the LightSIDE-AthDGC syntactic-feature fork and its export scripts, the NoSketch-style CWB indexer, the Neo4j alignment viewer, the valency-frame database client, the retranslation-pair browser, and the retelling-chain explorer. The complete tier matrix per module is on the public Tools page at</w:t>
-      </w:r>
-      <w:r>
-        <w:t xml:space="preserve"> </w:t>
-      </w:r>
-      <w:hyperlink r:id="rId27">
-        <w:r>
-          <w:rPr>
-            <w:rStyle w:val="Hyperlink"/>
-          </w:rPr>
-          <w:t xml:space="preserve">https://athdgc.github.io/tools.html</w:t>
-        </w:r>
-      </w:hyperlink>
-      <w:r>
-        <w:t xml:space="preserve"> </w:t>
-      </w:r>
-      <w:r>
-        <w:t xml:space="preserve">and on the Status page at</w:t>
-      </w:r>
-      <w:r>
-        <w:t xml:space="preserve"> </w:t>
-      </w:r>
-      <w:hyperlink r:id="rId28">
-        <w:r>
-          <w:rPr>
-            <w:rStyle w:val="Hyperlink"/>
-          </w:rPr>
-          <w:t xml:space="preserve">https://athdgc.github.io/status.html</w:t>
-        </w:r>
-      </w:hyperlink>
-      <w:r>
-        <w:t xml:space="preserve">.</w:t>
+        <w:t xml:space="preserve">The public site at https://athdgc.github.io provides curated samples only for the v0.4 release. The full annotated corpus partitions remain under audit on the GRNET ARIS national HPC under allocation pa260305; they release at v0.5 as a separate Zenodo dataset record under CC-BY-4.0. The source-code snapshot at the v0.4.0 Zenodo record is Apache-2.0.</w:t>
       </w:r>
     </w:p>
     <w:p>
@@ -3670,7 +2714,25 @@
         <w:pStyle w:val="BodyText"/>
       </w:pPr>
       <w:r>
-        <w:t xml:space="preserve">Across the toolkit, the annotation layer and the corpus samples are CC-BY-4.0; the tool code is Apache-2.0 (most modules), MIT (the Quarto pack and the Neo4j viewer), BSD-3-Clause (inherited from the upstream LightSIDE project), and GPL-3.0 (the upstream CWB indexer, retained on the index builder).</w:t>
+        <w:t xml:space="preserve">The toolkit’s readiness per module is summarised in §3.4 and on the public Tools page at https://athdgc.github.io/tools.html. Five modules are LIVE today (the Quarto template pack, the showcase generator, the corpus-fix toolkit, the PROIEL XML 2.0 exporter inside the build workflow, and the Stanza annotation job script). Eight are IN SETUP and be included with the v0.5 release. The LightSIDE-AthDGC syntactic-feature fork, the NoSketch-style concordancer, the Neo4j alignment viewer, the valency-frame database client, the retranslation-pair browser, and the retelling-chain explorer are FORTHCOMING at v0.5.</w:t>
+      </w:r>
+    </w:p>
+    <w:bookmarkEnd w:id="29"/>
+    <w:bookmarkStart w:id="30" w:name="acknowledgements"/>
+    <w:p>
+      <w:pPr>
+        <w:pStyle w:val="Heading2"/>
+      </w:pPr>
+      <w:r>
+        <w:t xml:space="preserve">7. Acknowledgements</w:t>
+      </w:r>
+    </w:p>
+    <w:p>
+      <w:pPr>
+        <w:pStyle w:val="FirstParagraph"/>
+      </w:pPr>
+      <w:r>
+        <w:t xml:space="preserve">Funded by the Hellenic Foundation for Research and Innovation (HFRI) under the 3rd Call for HFRI Research Projects to support Post-Doctoral Researchers, Project No. 20577; with complementary support from the Greece 2.0 National Recovery and Resilience Plan. Compute supplied by GRNET ARIS, the Greek national high-performance computing cluster, under allocation pa260305.</w:t>
       </w:r>
     </w:p>
     <w:p>
@@ -3678,66 +2740,25 @@
         <w:pStyle w:val="BodyText"/>
       </w:pPr>
       <w:r>
-        <w:t xml:space="preserve">Two automated gates run on every community pull request, namely a PROIEL XML 2.0 schema validator (which rejects UD-style labels such as</w:t>
-      </w:r>
-      <w:r>
-        <w:t xml:space="preserve"> </w:t>
-      </w:r>
-      <w:r>
-        <w:rPr>
-          <w:rStyle w:val="VerbatimChar"/>
-        </w:rPr>
-        <w:t xml:space="preserve">nsubj</w:t>
-      </w:r>
-      <w:r>
-        <w:t xml:space="preserve">,</w:t>
-      </w:r>
-      <w:r>
-        <w:t xml:space="preserve"> </w:t>
-      </w:r>
-      <w:r>
-        <w:rPr>
-          <w:rStyle w:val="VerbatimChar"/>
-        </w:rPr>
-        <w:t xml:space="preserve">dobj</w:t>
-      </w:r>
-      <w:r>
-        <w:t xml:space="preserve">,</w:t>
-      </w:r>
-      <w:r>
-        <w:t xml:space="preserve"> </w:t>
-      </w:r>
-      <w:r>
-        <w:rPr>
-          <w:rStyle w:val="VerbatimChar"/>
-        </w:rPr>
-        <w:t xml:space="preserve">nmod</w:t>
-      </w:r>
-      <w:r>
-        <w:t xml:space="preserve">,</w:t>
-      </w:r>
-      <w:r>
-        <w:t xml:space="preserve"> </w:t>
-      </w:r>
-      <w:r>
-        <w:rPr>
-          <w:rStyle w:val="VerbatimChar"/>
-        </w:rPr>
-        <w:t xml:space="preserve">case</w:t>
-      </w:r>
-      <w:r>
-        <w:t xml:space="preserve">) and a house-style check that enforces the project style guide.</w:t>
-      </w:r>
-    </w:p>
-    <w:bookmarkEnd w:id="29"/>
+        <w:t xml:space="preserve">The funded project is CVL-CDSAML: A Corpus-based Valency Lexicon for a Contrastive and Diachronic Study of Ancient and Medieval Languages.</w:t>
+      </w:r>
+    </w:p>
+    <w:p>
+      <w:pPr>
+        <w:pStyle w:val="BodyText"/>
+      </w:pPr>
+      <w:r>
+        <w:t xml:space="preserve">The team comprises Prof. Nikolaos Lavidas (Principal Investigator, NKUA), Prof. Emerita Kiki Nikiforidou (NKUA; Co-Editor of the Genres and Influential Texts volume), Prof. Dag Haug (University of Oslo; PROIEL Project Director), Prof. Leonid Kulikov (Ghent University; diachronic typology, valency questionnaires), Dr. Vassiliki Geka (NKUA; Post-Doctoral Researcher; Co-Editor of the Genres and Influential Texts volume), Dr. Vassileios Symeonidis (NKUA; Post-Doctoral Researcher), Dr. Theodoros Michalareas (NKUA; Post-Doctoral Researcher), Sofia Chionidi (NKUA; PhD Candidate), Anastasia Tsiropina (NKUA; PhD Candidate), Eleni Plakoutsi (NKUA; PhD Candidate), and Evangelos Argyropoulos (NKUA; Research Assistant).</w:t>
+      </w:r>
+    </w:p>
     <w:bookmarkEnd w:id="30"/>
-    <w:bookmarkStart w:id="31" w:name="related-work-and-positioning"/>
+    <w:bookmarkStart w:id="31" w:name="references"/>
     <w:p>
       <w:pPr>
         <w:pStyle w:val="Heading2"/>
       </w:pPr>
       <w:r>
-        <w:t xml:space="preserve">4. Related work and positioning</w:t>
+        <w:t xml:space="preserve">References</w:t>
       </w:r>
     </w:p>
     <w:p>
@@ -3745,7 +2766,7 @@
         <w:pStyle w:val="FirstParagraph"/>
       </w:pPr>
       <w:r>
-        <w:t xml:space="preserve">AthDGC sits in an ecosystem of openly licensed treebanks for older Indo-European languages, and we briefly describe where it differs from and where it complements each of them.</w:t>
+        <w:t xml:space="preserve">Dou, Zi-Yi, and Graham Neubig. 2021. “Word Alignment by Fine-Tuning Embeddings on Parallel Corpora.” Proceedings of the 16th Conference of the European Chapter of the Association for Computational Linguistics: Main Volume (EACL 2021), 2112–28.</w:t>
       </w:r>
     </w:p>
     <w:p>
@@ -3753,16 +2774,7 @@
         <w:pStyle w:val="BodyText"/>
       </w:pPr>
       <w:r>
-        <w:t xml:space="preserve">The PROIEL Treebank</w:t>
-      </w:r>
-      <w:r>
-        <w:t xml:space="preserve"> </w:t>
-      </w:r>
-      <w:r>
-        <w:t xml:space="preserve">(Haug and Jøhndal 2008, 27–34; Eckhoff et al. 2018, 29–65)</w:t>
-      </w:r>
-      <w:r>
-        <w:t xml:space="preserve">, as discussed in §1.1, established the schema and the Koine-Greek anchor against which AthDGC is naturally measured. AthDGC adopts the PROIEL XML 2.0 schema verbatim (and publishes in that schema only), so that any sentence in AthDGC can be read by any tool already in the PROIEL ecosystem. The complementarity is that PROIEL covers the New Testament across four IE witnesses at a high annotation density, whereas AthDGC covers the entire diachronic span of Greek across eight periods and extends the cross-lingual alignment with the Classical Armenian witness now, and with Sanskrit, Old English, Avestan, Old Persian, and Ukrainian at v0.7.</w:t>
+        <w:t xml:space="preserve">Eckhoff, Hanne M., Kristin Bech, Gerlof Bouma, et al. 2018. “The PROIEL Treebank Family: A Standard for Early Attestations of Indo-European Languages.” Language Resources and Evaluation 52 (1): 29–65.</w:t>
       </w:r>
     </w:p>
     <w:p>
@@ -3770,7 +2782,7 @@
         <w:pStyle w:val="BodyText"/>
       </w:pPr>
       <w:r>
-        <w:t xml:space="preserve">The GLAUx Corpus (the Greek Language Automated, a large lemmatised classical-Greek corpus released by Toon Van Hal and collaborators) and the Diorisis Corpus (the lemmatised classical-Greek corpus by Vatri and McGillivray) provide lemmatised classical-Greek text at scale, but they do not provide a dependency-syntactic annotation layer and do not provide cross-lingual alignment. AthDGC re-uses the lemmatisation effort of both projects where their licences permit and adds the syntactic-annotation layer on top.</w:t>
+        <w:t xml:space="preserve">Feng, Fangxiaoyu, Yinfei Yang, Daniel Cer, Naveen Arivazhagan, and Wei Wang. 2022. “Language-Agnostic BERT Sentence Embedding.” Proceedings of the 60th Annual Meeting of the Association for Computational Linguistics (ACL 2022), Volume 1: Long Papers, 878–91.</w:t>
       </w:r>
     </w:p>
     <w:p>
@@ -3778,7 +2790,7 @@
         <w:pStyle w:val="BodyText"/>
       </w:pPr>
       <w:r>
-        <w:t xml:space="preserve">The Ancient Greek Dependency Treebank (AGDT, the Perseus dependency treebank of classical and post-classical Greek) and the Pedalion treebank (the Leuven treebank of classical-Greek student-annotation material) provide dependency annotation for selected classical-Greek texts, but under different relation inventories from PROIEL (AGDT uses a hybrid Latin Dependency Treebank schema, Pedalion uses a pedagogical schema), and they do not provide cross-lingual alignment either. AthDGC publishes PROIEL XML 2.0 only, and we therefore do not re-ingest AGDT or Pedalion material at the syntactic-annotation layer; we treat them as comparison points for diachronic claims, not as input.</w:t>
+        <w:t xml:space="preserve">Haug, Dag T. T., and Marius Jøhndal. 2008. “Creating a Parallel Treebank of the Old Indo-European Bible Translations.” Proceedings of the Second Workshop on Language Technology for Cultural Heritage Data (LaTeCH 2008), 27–34.</w:t>
       </w:r>
     </w:p>
     <w:p>
@@ -3786,552 +2798,29 @@
         <w:pStyle w:val="BodyText"/>
       </w:pPr>
       <w:r>
-        <w:t xml:space="preserve">In broad terms, AthDGC’s contribution is therefore three-fold. First, the extension of PROIEL-schema syntactic annotation to the full diachronic span of Greek, from Archaic to Modern, under one schema. Secondly, the systematic inclusion of retelling and retranslation chains as a first-class data structure, so that the diachronic stability of a syntactic pattern becomes a computable quantity. Thirdly, the extension of the cross-lingual alignment beyond the four PROIEL witnesses, with Classical Armenian arriving at v0.5 and five further IE witnesses (Sanskrit, Old English, Avestan, Old Persian, and Ukrainian) at v0.7.</w:t>
+        <w:t xml:space="preserve">List, Johann-Mattis. 2014. Sequence Comparison in Historical Linguistics. Düsseldorf University Press.</w:t>
+      </w:r>
+    </w:p>
+    <w:p>
+      <w:pPr>
+        <w:pStyle w:val="BodyText"/>
+      </w:pPr>
+      <w:r>
+        <w:t xml:space="preserve">Qi, Peng, Yuhao Zhang, Yuhui Zhang, Jason Bolton, and Christopher D. Manning. 2020. “Stanza: A Python Natural Language Processing Toolkit for Many Human Languages.” Proceedings of the 58th Annual Meeting of the Association for Computational Linguistics: System Demonstrations (ACL 2020), 101–8.</w:t>
       </w:r>
     </w:p>
     <w:bookmarkEnd w:id="31"/>
-    <w:bookmarkStart w:id="33" w:name="reuse-potential"/>
+    <w:bookmarkStart w:id="35" w:name="references-1"/>
     <w:p>
       <w:pPr>
         <w:pStyle w:val="Heading2"/>
       </w:pPr>
       <w:r>
-        <w:t xml:space="preserve">5. Reuse potential</w:t>
-      </w:r>
-    </w:p>
-    <w:p>
-      <w:pPr>
-        <w:pStyle w:val="FirstParagraph"/>
-      </w:pPr>
-      <w:r>
-        <w:t xml:space="preserve">AthDGC supports four primary reuse classes, which we describe in turn with concrete query examples.</w:t>
-      </w:r>
-    </w:p>
-    <w:p>
-      <w:pPr>
-        <w:pStyle w:val="BodyText"/>
-      </w:pPr>
-      <w:r>
-        <w:t xml:space="preserve">In the first place, historical syntactic research. Per-period dependency parses allow analysts to track argument-structure changes across three millennia of Greek. Examples include the active-to-mediopassive shifts of certain verbs of motion, the loss of the optative across the Hellenistic period, the rise of the periphrastic perfect over the synthetic perfect across the Byzantine and Early Modern periods, the accusative-to-genitive variation under verbs of perception across periods, and the gradual replacement of the postnominal genitive of possession by the prenominal genitive in Modern Greek. Accordingly, the colour-coded compact dependency overview on each sample page is designed for fast scanning of these patterns. A worked query example is</w:t>
-      </w:r>
-      <w:r>
-        <w:t xml:space="preserve"> </w:t>
-      </w:r>
-      <w:r>
-        <w:rPr>
-          <w:i/>
-          <w:iCs/>
-        </w:rPr>
-        <w:t xml:space="preserve">for the verb ἀκούω (</w:t>
-      </w:r>
-      <w:r>
-        <w:rPr>
-          <w:i/>
-          <w:iCs/>
-        </w:rPr>
-        <w:t xml:space="preserve">“hear”</w:t>
-      </w:r>
-      <w:r>
-        <w:rPr>
-          <w:i/>
-          <w:iCs/>
-        </w:rPr>
-        <w:t xml:space="preserve">), is the object more often in the accusative or in the genitive at each period?</w:t>
-      </w:r>
-      <w:r>
-        <w:t xml:space="preserve">, which the valency-frame database (v0.5) answers in a single line.</w:t>
-      </w:r>
-    </w:p>
-    <w:p>
-      <w:pPr>
-        <w:pStyle w:val="BodyText"/>
-      </w:pPr>
-      <w:r>
-        <w:t xml:space="preserve">Secondly, Indo-European comparative syntax. The verse-level cross-lingual alignment of the New Testament to Latin (Vulgate), Gothic (Wulfila), Old Church Slavonic (Marianus), and Classical Armenian provides aligned PROIEL parses across four sister Indo-European languages, with Sanskrit, Old English, Avestan, Old Persian, and Ukrainian queued at v0.7. In this respect, users can query the Neo4j alignment graph for typological correspondences. A worked query example is</w:t>
-      </w:r>
-      <w:r>
-        <w:t xml:space="preserve"> </w:t>
-      </w:r>
-      <w:r>
-        <w:rPr>
-          <w:i/>
-          <w:iCs/>
-        </w:rPr>
-        <w:t xml:space="preserve">every Greek aorist active verb whose Latin Vulgate counterpart is passive</w:t>
-      </w:r>
-      <w:r>
-        <w:t xml:space="preserve">, which is expressed in Cypher (Cypher is the query language of Neo4j, structurally analogous to SQL for relational databases, in which</w:t>
-      </w:r>
-      <w:r>
-        <w:t xml:space="preserve"> </w:t>
-      </w:r>
-      <w:r>
-        <w:rPr>
-          <w:rStyle w:val="VerbatimChar"/>
-        </w:rPr>
-        <w:t xml:space="preserve">MATCH</w:t>
-      </w:r>
-      <w:r>
-        <w:t xml:space="preserve"> </w:t>
-      </w:r>
-      <w:r>
-        <w:t xml:space="preserve">patterns are drawn directly with arrows between nodes) as</w:t>
-      </w:r>
-      <w:r>
-        <w:t xml:space="preserve"> </w:t>
-      </w:r>
-      <w:r>
-        <w:rPr>
-          <w:rStyle w:val="VerbatimChar"/>
-        </w:rPr>
-        <w:t xml:space="preserve">MATCH (gk:Token {lang:"grc", tense:"aor", voice:"act"})-[:TRANSLATED_AS]-&gt;(la:Token {lang:"lat", voice:"pass"}) RETURN gk, la</w:t>
-      </w:r>
-      <w:r>
-        <w:t xml:space="preserve">, and which is answered across the entire NT-aligned partition in a single pass.</w:t>
-      </w:r>
-    </w:p>
-    <w:p>
-      <w:pPr>
-        <w:pStyle w:val="BodyText"/>
-      </w:pPr>
-      <w:r>
-        <w:t xml:space="preserve">Thirdly, computational diachronic NLP. The fine-tuned Stanza checkpoints (a checkpoint is a saved snapshot of a trained model’s numeric parameters, which can be loaded back into Stanza to parse new sentences without re-training) (</w:t>
-      </w:r>
-      <w:r>
-        <w:rPr>
-          <w:rStyle w:val="VerbatimChar"/>
-        </w:rPr>
-        <w:t xml:space="preserve">grc_byz_proiel</w:t>
-      </w:r>
-      <w:r>
-        <w:t xml:space="preserve"> </w:t>
-      </w:r>
-      <w:r>
-        <w:t xml:space="preserve">for Byzantine Greek,</w:t>
-      </w:r>
-      <w:r>
-        <w:t xml:space="preserve"> </w:t>
-      </w:r>
-      <w:r>
-        <w:rPr>
-          <w:rStyle w:val="VerbatimChar"/>
-        </w:rPr>
-        <w:t xml:space="preserve">grc_lbem_proiel</w:t>
-      </w:r>
-      <w:r>
-        <w:t xml:space="preserve"> </w:t>
-      </w:r>
-      <w:r>
-        <w:t xml:space="preserve">for Late Byzantine and Early Modern Greek,</w:t>
-      </w:r>
-      <w:r>
-        <w:t xml:space="preserve"> </w:t>
-      </w:r>
-      <w:r>
-        <w:rPr>
-          <w:rStyle w:val="VerbatimChar"/>
-        </w:rPr>
-        <w:t xml:space="preserve">grc_mod_proiel</w:t>
-      </w:r>
-      <w:r>
-        <w:t xml:space="preserve"> </w:t>
-      </w:r>
-      <w:r>
-        <w:t xml:space="preserve">for Modern Greek) are trained on ARIS; the Hugging Face model repositories under</w:t>
-      </w:r>
-      <w:r>
-        <w:t xml:space="preserve"> </w:t>
-      </w:r>
-      <w:r>
-        <w:rPr>
-          <w:rStyle w:val="VerbatimChar"/>
-        </w:rPr>
-        <w:t xml:space="preserve">AthDGC/*</w:t>
-      </w:r>
-      <w:r>
-        <w:t xml:space="preserve"> </w:t>
-      </w:r>
-      <w:r>
-        <w:t xml:space="preserve">exist now as private during the v0.5 audit pass and become public at v0.5 with the weight payloads (the trained parameter files that the checkpoints comprise) uploaded. In broad terms, the PyPI package</w:t>
-      </w:r>
-      <w:r>
-        <w:t xml:space="preserve"> </w:t>
-      </w:r>
-      <w:r>
-        <w:rPr>
-          <w:rStyle w:val="VerbatimChar"/>
-        </w:rPr>
-        <w:t xml:space="preserve">athdgc-tools</w:t>
-      </w:r>
-      <w:r>
-        <w:t xml:space="preserve"> </w:t>
-      </w:r>
-      <w:r>
-        <w:t xml:space="preserve">reserves the name with the stub</w:t>
-      </w:r>
-      <w:r>
-        <w:t xml:space="preserve"> </w:t>
-      </w:r>
-      <w:r>
-        <w:rPr>
-          <w:rStyle w:val="VerbatimChar"/>
-        </w:rPr>
-        <w:t xml:space="preserve">0.4.0.dev0</w:t>
-      </w:r>
-      <w:r>
-        <w:t xml:space="preserve">, and the full toolkit replaces the stub at v0.5; the checkpoints can be loaded directly into Stanza for parsing new Greek diachronic data once the weights are published. Thereby the LightSIDE-AthDGC fork extends LightSIDE (the open-source text-mining workbench developed at Carnegie Mellon by Carolyn Rosé’s group) to operate on syntactic features, namely dependency arcs, argument-structure frames, and morphology bundles, opening a new feature space for the classification of diachronic stages. A worked query example is</w:t>
-      </w:r>
-      <w:r>
-        <w:t xml:space="preserve"> </w:t>
-      </w:r>
-      <w:r>
-        <w:rPr>
-          <w:i/>
-          <w:iCs/>
-        </w:rPr>
-        <w:t xml:space="preserve">train an SVM classifier (Support Vector Machine, a standard classification algorithm) on</w:t>
-      </w:r>
-      <w:r>
-        <w:rPr>
-          <w:i/>
-          <w:iCs/>
-        </w:rPr>
-        <w:t xml:space="preserve"> </w:t>
-      </w:r>
-      <w:r>
-        <w:rPr>
-          <w:rStyle w:val="VerbatimChar"/>
-          <w:i/>
-          <w:iCs/>
-        </w:rPr>
-        <w:t xml:space="preserve">grc_proiel</w:t>
-      </w:r>
-      <w:r>
-        <w:rPr>
-          <w:i/>
-          <w:iCs/>
-        </w:rPr>
-        <w:t xml:space="preserve"> </w:t>
-      </w:r>
-      <w:r>
-        <w:rPr>
-          <w:i/>
-          <w:iCs/>
-        </w:rPr>
-        <w:t xml:space="preserve">argument-structure frames to distinguish Archaic from Classical from Koine Greek, and inspect the top-weighted frames per class</w:t>
-      </w:r>
-      <w:r>
-        <w:t xml:space="preserve">, which is the kind of analysis that the LightSIDE-AthDGC fork makes a one-hour classroom exercise.</w:t>
-      </w:r>
-    </w:p>
-    <w:p>
-      <w:pPr>
-        <w:pStyle w:val="BodyText"/>
-      </w:pPr>
-      <w:r>
-        <w:t xml:space="preserve">Fourthly, digital editions and pedagogy. The showcase generator (</w:t>
-      </w:r>
-      <w:r>
-        <w:rPr>
-          <w:rStyle w:val="VerbatimChar"/>
-        </w:rPr>
-        <w:t xml:space="preserve">51_build_showcase_site.py</w:t>
-      </w:r>
-      <w:r>
-        <w:t xml:space="preserve">) produces browsable per-sample PROIEL trees from any JSONL (JSON Lines, the line-per-record plain-text format) corpus; the Quarto template pack (Quarto is an open-source publishing system that builds websites, slides, papers, and posters from a single source file) generates the whole multi-output site, namely HTML, Reveal.js slides,</w:t>
-      </w:r>
-      <w:r>
-        <w:t xml:space="preserve"> </w:t>
-      </w:r>
-      <w:r>
-        <w:rPr>
-          <w:rStyle w:val="VerbatimChar"/>
-        </w:rPr>
-        <w:t xml:space="preserve">.docx</w:t>
-      </w:r>
-      <w:r>
-        <w:t xml:space="preserve">,</w:t>
-      </w:r>
-      <w:r>
-        <w:t xml:space="preserve"> </w:t>
-      </w:r>
-      <w:r>
-        <w:rPr>
-          <w:rStyle w:val="VerbatimChar"/>
-        </w:rPr>
-        <w:t xml:space="preserve">.pptx</w:t>
-      </w:r>
-      <w:r>
-        <w:t xml:space="preserve">, Beamer, and an A0-format academic poster, from a single source. Both are open-source and reusable by other historical-treebank projects. The platform is taught as a KEDIVIM continuing-education course at NKUA,</w:t>
-      </w:r>
-      <w:r>
-        <w:t xml:space="preserve"> </w:t>
-      </w:r>
-      <w:r>
-        <w:rPr>
-          <w:i/>
-          <w:iCs/>
-        </w:rPr>
-        <w:t xml:space="preserve">Ψηφιακά Εργαλεία για τη Διαχρονική Ανάλυση της Γλώσσας / Digital Tools for the Diachronic Analysis of Language</w:t>
-      </w:r>
-      <w:r>
-        <w:t xml:space="preserve">, autumn 2026; see</w:t>
-      </w:r>
-      <w:r>
-        <w:t xml:space="preserve"> </w:t>
-      </w:r>
-      <w:hyperlink r:id="rId32">
-        <w:r>
-          <w:rPr>
-            <w:rStyle w:val="Hyperlink"/>
-          </w:rPr>
-          <w:t xml:space="preserve">https://athdgc.github.io/training.html</w:t>
-        </w:r>
-      </w:hyperlink>
-      <w:r>
-        <w:t xml:space="preserve">.</w:t>
-      </w:r>
-    </w:p>
-    <w:bookmarkEnd w:id="33"/>
-    <w:bookmarkStart w:id="34" w:name="access-and-format"/>
-    <w:p>
-      <w:pPr>
-        <w:pStyle w:val="Heading2"/>
-      </w:pPr>
-      <w:r>
-        <w:t xml:space="preserve">6. Access and format</w:t>
-      </w:r>
-    </w:p>
-    <w:p>
-      <w:pPr>
-        <w:pStyle w:val="FirstParagraph"/>
-      </w:pPr>
-      <w:r>
-        <w:t xml:space="preserve">The public site at</w:t>
-      </w:r>
-      <w:r>
-        <w:t xml:space="preserve"> </w:t>
-      </w:r>
-      <w:hyperlink r:id="rId10">
-        <w:r>
-          <w:rPr>
-            <w:rStyle w:val="Hyperlink"/>
-          </w:rPr>
-          <w:t xml:space="preserve">https://athdgc.github.io</w:t>
-        </w:r>
-      </w:hyperlink>
-      <w:r>
-        <w:t xml:space="preserve"> </w:t>
-      </w:r>
-      <w:r>
-        <w:t xml:space="preserve">provides curated samples only for the v0.4 release. The full annotated corpus partitions remain under audit on the GRNET ARIS national HPC under allocation</w:t>
-      </w:r>
-      <w:r>
-        <w:t xml:space="preserve"> </w:t>
-      </w:r>
-      <w:r>
-        <w:rPr>
-          <w:rStyle w:val="VerbatimChar"/>
-        </w:rPr>
-        <w:t xml:space="preserve">pa260305</w:t>
-      </w:r>
-      <w:r>
-        <w:t xml:space="preserve">; they release at v0.5 as a separate Zenodo dataset record under CC-BY-4.0. The source-code snapshot at the v0.4.0 Zenodo record is Apache-2.0.</w:t>
-      </w:r>
-    </w:p>
-    <w:p>
-      <w:pPr>
-        <w:pStyle w:val="BodyText"/>
-      </w:pPr>
-      <w:r>
-        <w:t xml:space="preserve">The toolkit’s readiness per module is summarised in §3.4 and on the public Tools page at</w:t>
-      </w:r>
-      <w:r>
-        <w:t xml:space="preserve"> </w:t>
-      </w:r>
-      <w:hyperlink r:id="rId27">
-        <w:r>
-          <w:rPr>
-            <w:rStyle w:val="Hyperlink"/>
-          </w:rPr>
-          <w:t xml:space="preserve">https://athdgc.github.io/tools.html</w:t>
-        </w:r>
-      </w:hyperlink>
-      <w:r>
-        <w:t xml:space="preserve">. Five modules are LIVE today (the Quarto template pack, the showcase generator, the corpus-fix toolkit, the PROIEL XML 2.0 exporter inside the build workflow, and the Stanza annotation job script). Eight are IN SETUP and be included with the v0.5 release. The LightSIDE-AthDGC syntactic-feature fork, the NoSketch-style concordancer, the Neo4j alignment viewer, the valency-frame database client, the retranslation-pair browser, and the retelling-chain explorer are FORTHCOMING at v0.5.</w:t>
-      </w:r>
-    </w:p>
-    <w:bookmarkEnd w:id="34"/>
-    <w:bookmarkStart w:id="35" w:name="acknowledgements"/>
-    <w:p>
-      <w:pPr>
-        <w:pStyle w:val="Heading2"/>
-      </w:pPr>
-      <w:r>
-        <w:t xml:space="preserve">7. Acknowledgements</w:t>
-      </w:r>
-    </w:p>
-    <w:p>
-      <w:pPr>
-        <w:pStyle w:val="FirstParagraph"/>
-      </w:pPr>
-      <w:r>
-        <w:t xml:space="preserve">Funded by the</w:t>
-      </w:r>
-      <w:r>
-        <w:t xml:space="preserve"> </w:t>
-      </w:r>
-      <w:r>
-        <w:rPr>
-          <w:b/>
-          <w:bCs/>
-        </w:rPr>
-        <w:t xml:space="preserve">Hellenic Foundation for Research and Innovation (HFRI)</w:t>
-      </w:r>
-      <w:r>
-        <w:t xml:space="preserve"> </w:t>
-      </w:r>
-      <w:r>
-        <w:t xml:space="preserve">under the 3rd Call for HFRI Research Projects to support Post-Doctoral Researchers,</w:t>
-      </w:r>
-      <w:r>
-        <w:t xml:space="preserve"> </w:t>
-      </w:r>
-      <w:r>
-        <w:rPr>
-          <w:b/>
-          <w:bCs/>
-        </w:rPr>
-        <w:t xml:space="preserve">Project No. 20577</w:t>
-      </w:r>
-      <w:r>
-        <w:t xml:space="preserve">; with complementary support from the</w:t>
-      </w:r>
-      <w:r>
-        <w:t xml:space="preserve"> </w:t>
-      </w:r>
-      <w:r>
-        <w:rPr>
-          <w:b/>
-          <w:bCs/>
-        </w:rPr>
-        <w:t xml:space="preserve">Greece 2.0 National Recovery and Resilience Plan</w:t>
-      </w:r>
-      <w:r>
-        <w:t xml:space="preserve">. Compute supplied by</w:t>
-      </w:r>
-      <w:r>
-        <w:t xml:space="preserve"> </w:t>
-      </w:r>
-      <w:r>
-        <w:rPr>
-          <w:b/>
-          <w:bCs/>
-        </w:rPr>
-        <w:t xml:space="preserve">GRNET ARIS</w:t>
-      </w:r>
-      <w:r>
-        <w:t xml:space="preserve">, the Greek national high-performance computing cluster, under allocation</w:t>
-      </w:r>
-      <w:r>
-        <w:t xml:space="preserve"> </w:t>
-      </w:r>
-      <w:r>
-        <w:rPr>
-          <w:rStyle w:val="VerbatimChar"/>
-        </w:rPr>
-        <w:t xml:space="preserve">pa260305</w:t>
-      </w:r>
-      <w:r>
-        <w:t xml:space="preserve">.</w:t>
-      </w:r>
-    </w:p>
-    <w:p>
-      <w:pPr>
-        <w:pStyle w:val="BodyText"/>
-      </w:pPr>
-      <w:r>
-        <w:t xml:space="preserve">The funded project is</w:t>
-      </w:r>
-      <w:r>
-        <w:t xml:space="preserve"> </w:t>
-      </w:r>
-      <w:r>
-        <w:rPr>
-          <w:b/>
-          <w:bCs/>
-        </w:rPr>
-        <w:t xml:space="preserve">CVL-CDSAML</w:t>
-      </w:r>
-      <w:r>
-        <w:t xml:space="preserve">:</w:t>
-      </w:r>
-      <w:r>
-        <w:t xml:space="preserve"> </w:t>
-      </w:r>
-      <w:r>
-        <w:rPr>
-          <w:i/>
-          <w:iCs/>
-        </w:rPr>
-        <w:t xml:space="preserve">A Corpus-based Valency Lexicon for a Contrastive and Diachronic Study of Ancient and Medieval Languages</w:t>
-      </w:r>
-      <w:r>
-        <w:t xml:space="preserve">.</w:t>
-      </w:r>
-    </w:p>
-    <w:p>
-      <w:pPr>
-        <w:pStyle w:val="BodyText"/>
-      </w:pPr>
-      <w:r>
-        <w:t xml:space="preserve">The team comprises Prof. Nikolaos Lavidas (Principal Investigator, NKUA), Prof. Emerita Kiki Nikiforidou (NKUA; Co-Editor of the</w:t>
-      </w:r>
-      <w:r>
-        <w:t xml:space="preserve"> </w:t>
-      </w:r>
-      <w:r>
-        <w:rPr>
-          <w:i/>
-          <w:iCs/>
-        </w:rPr>
-        <w:t xml:space="preserve">Genres and Influential Texts</w:t>
-      </w:r>
-      <w:r>
-        <w:t xml:space="preserve"> </w:t>
-      </w:r>
-      <w:r>
-        <w:t xml:space="preserve">volume), Prof. Dag Haug (University of Oslo; PROIEL Project Director), Prof. Leonid Kulikov (Ghent University; diachronic typology, valency questionnaires), Dr. Vassiliki Geka (NKUA; Post-Doctoral Researcher; Co-Editor of the</w:t>
-      </w:r>
-      <w:r>
-        <w:t xml:space="preserve"> </w:t>
-      </w:r>
-      <w:r>
-        <w:rPr>
-          <w:i/>
-          <w:iCs/>
-        </w:rPr>
-        <w:t xml:space="preserve">Genres and Influential Texts</w:t>
-      </w:r>
-      <w:r>
-        <w:t xml:space="preserve"> </w:t>
-      </w:r>
-      <w:r>
-        <w:t xml:space="preserve">volume), Dr. Vassileios Symeonidis (NKUA; Post-Doctoral Researcher), Dr. Theodoros Michalareas (NKUA; Post-Doctoral Researcher), Sofia Chionidi (NKUA; PhD Candidate), Anastasia Tsiropina (NKUA; PhD Candidate), Eleni Plakoutsi (NKUA; PhD Candidate), and Evangelos Argyropoulos (NKUA; Research Assistant).</w:t>
-      </w:r>
-    </w:p>
-    <w:bookmarkEnd w:id="35"/>
-    <w:bookmarkStart w:id="43" w:name="references"/>
-    <w:p>
-      <w:pPr>
-        <w:pStyle w:val="Heading2"/>
-      </w:pPr>
-      <w:r>
         <w:t xml:space="preserve">References</w:t>
       </w:r>
     </w:p>
-    <w:bookmarkStart w:id="42" w:name="refs"/>
-    <w:bookmarkStart w:id="36" w:name="ref-dou2021"/>
+    <w:bookmarkStart w:id="34" w:name="refs"/>
+    <w:bookmarkStart w:id="32" w:name="ref-dou2021"/>
     <w:p>
       <w:pPr>
         <w:pStyle w:val="Bibliography"/>
@@ -4359,152 +2848,8 @@
         <w:t xml:space="preserve">, 2112–28.</w:t>
       </w:r>
     </w:p>
-    <w:bookmarkEnd w:id="36"/>
-    <w:bookmarkStart w:id="37" w:name="ref-eckhoff2018"/>
-    <w:p>
-      <w:pPr>
-        <w:pStyle w:val="Bibliography"/>
-      </w:pPr>
-      <w:r>
-        <w:t xml:space="preserve">Eckhoff, Hanne M., Kristin Bech, Gerlof Bouma, et al. 2018.</w:t>
-      </w:r>
-      <w:r>
-        <w:t xml:space="preserve"> </w:t>
-      </w:r>
-      <w:r>
-        <w:t xml:space="preserve">“The</w:t>
-      </w:r>
-      <w:r>
-        <w:t xml:space="preserve"> </w:t>
-      </w:r>
-      <w:r>
-        <w:t xml:space="preserve">PROIEL</w:t>
-      </w:r>
-      <w:r>
-        <w:t xml:space="preserve"> </w:t>
-      </w:r>
-      <w:r>
-        <w:t xml:space="preserve">Treebank Family: A Standard for Early Attestations of</w:t>
-      </w:r>
-      <w:r>
-        <w:t xml:space="preserve"> </w:t>
-      </w:r>
-      <w:r>
-        <w:t xml:space="preserve">Indo-European</w:t>
-      </w:r>
-      <w:r>
-        <w:t xml:space="preserve"> </w:t>
-      </w:r>
-      <w:r>
-        <w:t xml:space="preserve">Languages.”</w:t>
-      </w:r>
-      <w:r>
-        <w:t xml:space="preserve"> </w:t>
-      </w:r>
-      <w:r>
-        <w:rPr>
-          <w:i/>
-          <w:iCs/>
-        </w:rPr>
-        <w:t xml:space="preserve">Language Resources and Evaluation</w:t>
-      </w:r>
-      <w:r>
-        <w:t xml:space="preserve"> </w:t>
-      </w:r>
-      <w:r>
-        <w:t xml:space="preserve">52 (1): 29–65.</w:t>
-      </w:r>
-    </w:p>
-    <w:bookmarkEnd w:id="37"/>
-    <w:bookmarkStart w:id="38" w:name="ref-feng2022"/>
-    <w:p>
-      <w:pPr>
-        <w:pStyle w:val="Bibliography"/>
-      </w:pPr>
-      <w:r>
-        <w:t xml:space="preserve">Feng, Fangxiaoyu, Yinfei Yang, Daniel Cer, Naveen Arivazhagan, and Wei Wang. 2022.</w:t>
-      </w:r>
-      <w:r>
-        <w:t xml:space="preserve"> </w:t>
-      </w:r>
-      <w:r>
-        <w:t xml:space="preserve">“Language-Agnostic</w:t>
-      </w:r>
-      <w:r>
-        <w:t xml:space="preserve"> </w:t>
-      </w:r>
-      <w:r>
-        <w:t xml:space="preserve">BERT</w:t>
-      </w:r>
-      <w:r>
-        <w:t xml:space="preserve"> </w:t>
-      </w:r>
-      <w:r>
-        <w:t xml:space="preserve">Sentence Embedding.”</w:t>
-      </w:r>
-      <w:r>
-        <w:t xml:space="preserve"> </w:t>
-      </w:r>
-      <w:r>
-        <w:rPr>
-          <w:i/>
-          <w:iCs/>
-        </w:rPr>
-        <w:t xml:space="preserve">Proceedings of the 60th Annual Meeting of the Association for Computational Linguistics (ACL 2022), Volume 1: Long Papers</w:t>
-      </w:r>
-      <w:r>
-        <w:t xml:space="preserve">, 878–91.</w:t>
-      </w:r>
-    </w:p>
-    <w:bookmarkEnd w:id="38"/>
-    <w:bookmarkStart w:id="39" w:name="ref-haug2008"/>
-    <w:p>
-      <w:pPr>
-        <w:pStyle w:val="Bibliography"/>
-      </w:pPr>
-      <w:r>
-        <w:t xml:space="preserve">Haug, Dag T. T., and Marius Jøhndal. 2008.</w:t>
-      </w:r>
-      <w:r>
-        <w:t xml:space="preserve"> </w:t>
-      </w:r>
-      <w:r>
-        <w:t xml:space="preserve">“Creating a Parallel Treebank of the Old</w:t>
-      </w:r>
-      <w:r>
-        <w:t xml:space="preserve"> </w:t>
-      </w:r>
-      <w:r>
-        <w:t xml:space="preserve">Indo-European</w:t>
-      </w:r>
-      <w:r>
-        <w:t xml:space="preserve"> </w:t>
-      </w:r>
-      <w:r>
-        <w:t xml:space="preserve">Bible</w:t>
-      </w:r>
-      <w:r>
-        <w:t xml:space="preserve"> </w:t>
-      </w:r>
-      <w:r>
-        <w:t xml:space="preserve">Translations.”</w:t>
-      </w:r>
-      <w:r>
-        <w:t xml:space="preserve"> </w:t>
-      </w:r>
-      <w:r>
-        <w:rPr>
-          <w:i/>
-          <w:iCs/>
-        </w:rPr>
-        <w:t xml:space="preserve">Proceedings of the Second Workshop on Language Technology for Cultural Heritage Data (LaTeCH 2008)</w:t>
-      </w:r>
-      <w:r>
-        <w:t xml:space="preserve">, 27–34.</w:t>
-      </w:r>
-    </w:p>
-    <w:bookmarkEnd w:id="39"/>
-    <w:bookmarkStart w:id="40" w:name="ref-list2014"/>
+    <w:bookmarkEnd w:id="32"/>
+    <w:bookmarkStart w:id="33" w:name="ref-list2014"/>
     <w:p>
       <w:pPr>
         <w:pStyle w:val="Bibliography"/>
@@ -4532,61 +2877,9 @@
         <w:t xml:space="preserve">sseldorf University Press.</w:t>
       </w:r>
     </w:p>
-    <w:bookmarkEnd w:id="40"/>
-    <w:bookmarkStart w:id="41" w:name="ref-qi2020"/>
-    <w:p>
-      <w:pPr>
-        <w:pStyle w:val="Bibliography"/>
-      </w:pPr>
-      <w:r>
-        <w:t xml:space="preserve">Qi, Peng, Yuhao Zhang, Yuhui Zhang, Jason Bolton, and Christopher D. Manning. 2020.</w:t>
-      </w:r>
-      <w:r>
-        <w:t xml:space="preserve"> </w:t>
-      </w:r>
-      <w:r>
-        <w:t xml:space="preserve">“</w:t>
-      </w:r>
-      <w:r>
-        <w:t xml:space="preserve">Stanza</w:t>
-      </w:r>
-      <w:r>
-        <w:t xml:space="preserve">: A</w:t>
-      </w:r>
-      <w:r>
-        <w:t xml:space="preserve"> </w:t>
-      </w:r>
-      <w:r>
-        <w:t xml:space="preserve">Python</w:t>
-      </w:r>
-      <w:r>
-        <w:t xml:space="preserve"> </w:t>
-      </w:r>
-      <w:r>
-        <w:t xml:space="preserve">Natural Language Processing Toolkit for Many Human Languages.”</w:t>
-      </w:r>
-      <w:r>
-        <w:t xml:space="preserve"> </w:t>
-      </w:r>
-      <w:r>
-        <w:rPr>
-          <w:i/>
-          <w:iCs/>
-        </w:rPr>
-        <w:t xml:space="preserve">Proceedings of the 58th Annual Meeting of the Association for Computational Linguistics: System Demonstrations (ACL 2020)</w:t>
-      </w:r>
-      <w:r>
-        <w:t xml:space="preserve">, 101–8.</w:t>
-      </w:r>
-    </w:p>
-    <w:bookmarkEnd w:id="41"/>
-    <w:bookmarkEnd w:id="42"/>
-    <w:p>
-      <w:pPr>
-        <w:pStyle w:val="BodyText"/>
-      </w:pPr>
-    </w:p>
-    <w:bookmarkEnd w:id="43"/>
+    <w:bookmarkEnd w:id="33"/>
+    <w:bookmarkEnd w:id="34"/>
+    <w:bookmarkEnd w:id="35"/>
     <w:sectPr>
       <w:footnotePr>
         <w:numRestart w:val="eachSect"/>

</xml_diff>

<commit_message>
AthDGC site update 2026-06-10 22:08 --- clean Quarto render, real Zenodo DOI 10.5281/zenodo.20439182, samples-only public release
</commit_message>
<xml_diff>
--- a/data_paper.docx
+++ b/data_paper.docx
@@ -450,7 +450,7 @@
         <w:pStyle w:val="FirstParagraph"/>
       </w:pPr>
       <w:r>
-        <w:t xml:space="preserve">Candidate texts are filtered by Greek-script ratio (at least 75% of alphabetic characters in the Greek Unicode blocks U+0370-U+03FF and U+1F00-U+1FFF), by a Path-B line filter (an in-house regular-expression filter that removes bilingual editorial apparatus such as Latin headers, page-number lines, and critical-edition footnote markers from the textual stream), and by content-hash deduplication (an SHA-256 hash of the normalised text is checked against a registry of previously ingested files, so that identical files discovered at multiple mirrors are ingested only once). A candidate that fails any of the three filters is rejected at this stage and logged for review; the audit logs are kept in the project’s internal working tree, and the v0.5 release notes will report per-archive rejection statistics.</w:t>
+        <w:t xml:space="preserve">Candidate texts are filtered by Greek-script ratio (at least 75% of alphabetic characters in the Greek Unicode blocks U+0370-U+03FF and U+1F00-U+1FFF), by a Path-B line filter (an in-house regular-expression filter that removes bilingual editorial apparatus such as Latin headers, page-number lines, and critical-edition footnote markers from the textual stream), and by content-hash deduplication (an SHA-256 hash of the normalised text is checked against a registry of previously ingested files, so that identical files discovered at multiple mirrors are ingested only once). A candidate that fails any of the three filters is rejected at this stage and logged for review; the v0.5 release notes will report per-archive rejection statistics.</w:t>
       </w:r>
     </w:p>
     <w:bookmarkEnd w:id="14"/>
@@ -2541,7 +2541,7 @@
         <w:pStyle w:val="FirstParagraph"/>
       </w:pPr>
       <w:r>
-        <w:t xml:space="preserve">The AthDGC toolkit is organised as a set of OSI-licensed modules in three readiness tiers. Five modules are LIVE in the public repository and can be cloned and run today. They are the Quarto pack that builds this Working Paper and the public site, the showcase generator that produces the browsable per-sample PROIEL trees, the corpus-fix toolkit that bulk-corrects annotation errors at scale, the PROIEL XML 2.0 exporter that runs inside the build workflow, and the Stanza annotation job script for the GRNET ARIS allocation. Eight modules are IN SETUP, working in the project’s internal pack and migrating to a unified public tools/ directory at v0.5, namely the PROIEL XML 2.0 schema validator (which enforces the relation inventory and rejects UD-style labels such as nsubj and dobj; UD here is Universal Dependencies, the alternative treebanking framework whose label inventory is incompatible with PROIEL), the house-style check, the argument-frame extractor, the Stanza fine-tuning scripts, the athdgc-tools PyPI package, and the three Hugging Face model repositories whose weights upload at v0.5. The remaining modules are FORTHCOMING at v0.5: the LightSIDE-AthDGC syntactic-feature fork and its export scripts, the NoSketch-style CWB indexer, the Neo4j alignment viewer, the valency-frame database client, the retranslation-pair browser, and the retelling-chain explorer. The complete tier matrix per module is on the public Tools page at https://athdgc.github.io/tools.html and on the Status page at https://athdgc.github.io/status.html.</w:t>
+        <w:t xml:space="preserve">The AthDGC toolkit is organised as a set of OSI-licensed modules in three readiness tiers. Five modules are LIVE in the public repository and can be cloned and run today. They are the Quarto pack that builds this Working Paper and the public site, the showcase generator that produces the browsable per-sample PROIEL trees, the corpus-fix toolkit that bulk-corrects annotation errors at scale, the PROIEL XML 2.0 exporter that runs inside the build workflow, and the Stanza annotation job script for the GRNET ARIS allocation. Eight modules are IN SETUP and become available with the v0.5 release, namely the PROIEL XML 2.0 schema validator (which enforces the relation inventory and rejects UD-style labels such as nsubj and dobj; UD here is Universal Dependencies, the alternative treebanking framework whose label inventory is incompatible with PROIEL), the house-style check, the argument-frame extractor, the Stanza fine-tuning scripts, the athdgc-tools PyPI package, and the three Hugging Face model repositories whose weights upload at v0.5. The remaining modules are FORTHCOMING at v0.5: the LightSIDE-AthDGC syntactic-feature fork and its export scripts, the NoSketch-style CWB indexer, the Neo4j alignment viewer, the valency-frame database client, the retranslation-pair browser, and the retelling-chain explorer. The complete tier matrix per module is on the public Tools page at https://athdgc.github.io/tools.html and on the Status page at https://athdgc.github.io/status.html.</w:t>
       </w:r>
     </w:p>
     <w:p>

</xml_diff>